<commit_message>
MasterThesis: Thesis: First 3 chapters completed
 - Added Chapter 4
 - Formating is on point
 - Image list and Chapters list up to date
 - Extra text from the template removed (except for table example)
</commit_message>
<xml_diff>
--- a/sumsala_diplomova_praca.docx
+++ b/sumsala_diplomova_praca.docx
@@ -1003,7 +1003,7 @@
         </w:rPr>
         <w:fldChar w:fldCharType="separate"/>
       </w:r>
-      <w:hyperlink w:anchor="_Toc227445262" w:history="1">
+      <w:hyperlink w:anchor="_Toc227449162" w:history="1">
         <w:r>
           <w:rPr>
             <w:rStyle w:val="Hyperlink"/>
@@ -1030,7 +1030,7 @@
             <w:noProof/>
             <w:webHidden/>
           </w:rPr>
-          <w:instrText xml:space="preserve"> PAGEREF _Toc227445262 \h </w:instrText>
+          <w:instrText xml:space="preserve"> PAGEREF _Toc227449162 \h </w:instrText>
         </w:r>
         <w:r>
           <w:rPr>
@@ -1071,7 +1071,7 @@
           <w:szCs w:val="24"/>
         </w:rPr>
       </w:pPr>
-      <w:hyperlink w:anchor="_Toc227445263" w:history="1">
+      <w:hyperlink w:anchor="_Toc227449163" w:history="1">
         <w:r>
           <w:rPr>
             <w:rStyle w:val="Hyperlink"/>
@@ -1098,7 +1098,7 @@
             <w:noProof/>
             <w:webHidden/>
           </w:rPr>
-          <w:instrText xml:space="preserve"> PAGEREF _Toc227445263 \h </w:instrText>
+          <w:instrText xml:space="preserve"> PAGEREF _Toc227449163 \h </w:instrText>
         </w:r>
         <w:r>
           <w:rPr>
@@ -1139,7 +1139,7 @@
           <w:szCs w:val="24"/>
         </w:rPr>
       </w:pPr>
-      <w:hyperlink w:anchor="_Toc227445264" w:history="1">
+      <w:hyperlink w:anchor="_Toc227449164" w:history="1">
         <w:r>
           <w:rPr>
             <w:rStyle w:val="Hyperlink"/>
@@ -1166,7 +1166,7 @@
             <w:noProof/>
             <w:webHidden/>
           </w:rPr>
-          <w:instrText xml:space="preserve"> PAGEREF _Toc227445264 \h </w:instrText>
+          <w:instrText xml:space="preserve"> PAGEREF _Toc227449164 \h </w:instrText>
         </w:r>
         <w:r>
           <w:rPr>
@@ -1210,7 +1210,7 @@
           <w:szCs w:val="24"/>
         </w:rPr>
       </w:pPr>
-      <w:hyperlink w:anchor="_Toc227445265" w:history="1">
+      <w:hyperlink w:anchor="_Toc227449165" w:history="1">
         <w:r>
           <w:rPr>
             <w:rStyle w:val="Hyperlink"/>
@@ -1237,7 +1237,7 @@
             <w:noProof/>
             <w:webHidden/>
           </w:rPr>
-          <w:instrText xml:space="preserve"> PAGEREF _Toc227445265 \h </w:instrText>
+          <w:instrText xml:space="preserve"> PAGEREF _Toc227449165 \h </w:instrText>
         </w:r>
         <w:r>
           <w:rPr>
@@ -1281,7 +1281,7 @@
           <w:szCs w:val="24"/>
         </w:rPr>
       </w:pPr>
-      <w:hyperlink w:anchor="_Toc227445266" w:history="1">
+      <w:hyperlink w:anchor="_Toc227449166" w:history="1">
         <w:r>
           <w:rPr>
             <w:rStyle w:val="Hyperlink"/>
@@ -1326,7 +1326,7 @@
             <w:noProof/>
             <w:webHidden/>
           </w:rPr>
-          <w:instrText xml:space="preserve"> PAGEREF _Toc227445266 \h </w:instrText>
+          <w:instrText xml:space="preserve"> PAGEREF _Toc227449166 \h </w:instrText>
         </w:r>
         <w:r>
           <w:rPr>
@@ -1367,7 +1367,7 @@
           <w:szCs w:val="24"/>
         </w:rPr>
       </w:pPr>
-      <w:hyperlink w:anchor="_Toc227445267" w:history="1">
+      <w:hyperlink w:anchor="_Toc227449167" w:history="1">
         <w:r>
           <w:rPr>
             <w:rStyle w:val="Hyperlink"/>
@@ -1394,7 +1394,7 @@
             <w:noProof/>
             <w:webHidden/>
           </w:rPr>
-          <w:instrText xml:space="preserve"> PAGEREF _Toc227445267 \h </w:instrText>
+          <w:instrText xml:space="preserve"> PAGEREF _Toc227449167 \h </w:instrText>
         </w:r>
         <w:r>
           <w:rPr>
@@ -1435,7 +1435,7 @@
           <w:szCs w:val="24"/>
         </w:rPr>
       </w:pPr>
-      <w:hyperlink w:anchor="_Toc227445268" w:history="1">
+      <w:hyperlink w:anchor="_Toc227449168" w:history="1">
         <w:r>
           <w:rPr>
             <w:rStyle w:val="Hyperlink"/>
@@ -1462,7 +1462,7 @@
             <w:noProof/>
             <w:webHidden/>
           </w:rPr>
-          <w:instrText xml:space="preserve"> PAGEREF _Toc227445268 \h </w:instrText>
+          <w:instrText xml:space="preserve"> PAGEREF _Toc227449168 \h </w:instrText>
         </w:r>
         <w:r>
           <w:rPr>
@@ -1503,7 +1503,7 @@
           <w:szCs w:val="24"/>
         </w:rPr>
       </w:pPr>
-      <w:hyperlink w:anchor="_Toc227445269" w:history="1">
+      <w:hyperlink w:anchor="_Toc227449169" w:history="1">
         <w:r>
           <w:rPr>
             <w:rStyle w:val="Hyperlink"/>
@@ -1530,7 +1530,7 @@
             <w:noProof/>
             <w:webHidden/>
           </w:rPr>
-          <w:instrText xml:space="preserve"> PAGEREF _Toc227445269 \h </w:instrText>
+          <w:instrText xml:space="preserve"> PAGEREF _Toc227449169 \h </w:instrText>
         </w:r>
         <w:r>
           <w:rPr>
@@ -1574,7 +1574,7 @@
           <w:szCs w:val="24"/>
         </w:rPr>
       </w:pPr>
-      <w:hyperlink w:anchor="_Toc227445270" w:history="1">
+      <w:hyperlink w:anchor="_Toc227449170" w:history="1">
         <w:r>
           <w:rPr>
             <w:rStyle w:val="Hyperlink"/>
@@ -1619,7 +1619,7 @@
             <w:noProof/>
             <w:webHidden/>
           </w:rPr>
-          <w:instrText xml:space="preserve"> PAGEREF _Toc227445270 \h </w:instrText>
+          <w:instrText xml:space="preserve"> PAGEREF _Toc227449170 \h </w:instrText>
         </w:r>
         <w:r>
           <w:rPr>
@@ -1660,7 +1660,7 @@
           <w:szCs w:val="24"/>
         </w:rPr>
       </w:pPr>
-      <w:hyperlink w:anchor="_Toc227445271" w:history="1">
+      <w:hyperlink w:anchor="_Toc227449171" w:history="1">
         <w:r>
           <w:rPr>
             <w:rStyle w:val="Hyperlink"/>
@@ -1687,7 +1687,7 @@
             <w:noProof/>
             <w:webHidden/>
           </w:rPr>
-          <w:instrText xml:space="preserve"> PAGEREF _Toc227445271 \h </w:instrText>
+          <w:instrText xml:space="preserve"> PAGEREF _Toc227449171 \h </w:instrText>
         </w:r>
         <w:r>
           <w:rPr>
@@ -1728,7 +1728,7 @@
           <w:szCs w:val="24"/>
         </w:rPr>
       </w:pPr>
-      <w:hyperlink w:anchor="_Toc227445272" w:history="1">
+      <w:hyperlink w:anchor="_Toc227449172" w:history="1">
         <w:r>
           <w:rPr>
             <w:rStyle w:val="Hyperlink"/>
@@ -1755,7 +1755,7 @@
             <w:noProof/>
             <w:webHidden/>
           </w:rPr>
-          <w:instrText xml:space="preserve"> PAGEREF _Toc227445272 \h </w:instrText>
+          <w:instrText xml:space="preserve"> PAGEREF _Toc227449172 \h </w:instrText>
         </w:r>
         <w:r>
           <w:rPr>
@@ -1799,7 +1799,7 @@
           <w:szCs w:val="24"/>
         </w:rPr>
       </w:pPr>
-      <w:hyperlink w:anchor="_Toc227445273" w:history="1">
+      <w:hyperlink w:anchor="_Toc227449173" w:history="1">
         <w:r>
           <w:rPr>
             <w:rStyle w:val="Hyperlink"/>
@@ -1844,7 +1844,7 @@
             <w:noProof/>
             <w:webHidden/>
           </w:rPr>
-          <w:instrText xml:space="preserve"> PAGEREF _Toc227445273 \h </w:instrText>
+          <w:instrText xml:space="preserve"> PAGEREF _Toc227449173 \h </w:instrText>
         </w:r>
         <w:r>
           <w:rPr>
@@ -1885,7 +1885,7 @@
           <w:szCs w:val="24"/>
         </w:rPr>
       </w:pPr>
-      <w:hyperlink w:anchor="_Toc227445274" w:history="1">
+      <w:hyperlink w:anchor="_Toc227449174" w:history="1">
         <w:r>
           <w:rPr>
             <w:rStyle w:val="Hyperlink"/>
@@ -1912,7 +1912,7 @@
             <w:noProof/>
             <w:webHidden/>
           </w:rPr>
-          <w:instrText xml:space="preserve"> PAGEREF _Toc227445274 \h </w:instrText>
+          <w:instrText xml:space="preserve"> PAGEREF _Toc227449174 \h </w:instrText>
         </w:r>
         <w:r>
           <w:rPr>
@@ -1952,7 +1952,7 @@
           <w:szCs w:val="24"/>
         </w:rPr>
       </w:pPr>
-      <w:hyperlink w:anchor="_Toc227445275" w:history="1">
+      <w:hyperlink w:anchor="_Toc227449175" w:history="1">
         <w:r>
           <w:rPr>
             <w:rStyle w:val="Hyperlink"/>
@@ -1979,7 +1979,7 @@
             <w:noProof/>
             <w:webHidden/>
           </w:rPr>
-          <w:instrText xml:space="preserve"> PAGEREF _Toc227445275 \h </w:instrText>
+          <w:instrText xml:space="preserve"> PAGEREF _Toc227449175 \h </w:instrText>
         </w:r>
         <w:r>
           <w:rPr>
@@ -2019,7 +2019,7 @@
           <w:szCs w:val="24"/>
         </w:rPr>
       </w:pPr>
-      <w:hyperlink w:anchor="_Toc227445276" w:history="1">
+      <w:hyperlink w:anchor="_Toc227449176" w:history="1">
         <w:r>
           <w:rPr>
             <w:rStyle w:val="Hyperlink"/>
@@ -2046,7 +2046,7 @@
             <w:noProof/>
             <w:webHidden/>
           </w:rPr>
-          <w:instrText xml:space="preserve"> PAGEREF _Toc227445276 \h </w:instrText>
+          <w:instrText xml:space="preserve"> PAGEREF _Toc227449176 \h </w:instrText>
         </w:r>
         <w:r>
           <w:rPr>
@@ -2086,7 +2086,7 @@
           <w:szCs w:val="24"/>
         </w:rPr>
       </w:pPr>
-      <w:hyperlink w:anchor="_Toc227445277" w:history="1">
+      <w:hyperlink w:anchor="_Toc227449177" w:history="1">
         <w:r>
           <w:rPr>
             <w:rStyle w:val="Hyperlink"/>
@@ -2113,7 +2113,7 @@
             <w:noProof/>
             <w:webHidden/>
           </w:rPr>
-          <w:instrText xml:space="preserve"> PAGEREF _Toc227445277 \h </w:instrText>
+          <w:instrText xml:space="preserve"> PAGEREF _Toc227449177 \h </w:instrText>
         </w:r>
         <w:r>
           <w:rPr>
@@ -2153,7 +2153,7 @@
           <w:szCs w:val="24"/>
         </w:rPr>
       </w:pPr>
-      <w:hyperlink w:anchor="_Toc227445278" w:history="1">
+      <w:hyperlink w:anchor="_Toc227449178" w:history="1">
         <w:r>
           <w:rPr>
             <w:rStyle w:val="Hyperlink"/>
@@ -2180,7 +2180,7 @@
             <w:noProof/>
             <w:webHidden/>
           </w:rPr>
-          <w:instrText xml:space="preserve"> PAGEREF _Toc227445278 \h </w:instrText>
+          <w:instrText xml:space="preserve"> PAGEREF _Toc227449178 \h </w:instrText>
         </w:r>
         <w:r>
           <w:rPr>
@@ -2220,7 +2220,7 @@
           <w:szCs w:val="24"/>
         </w:rPr>
       </w:pPr>
-      <w:hyperlink w:anchor="_Toc227445279" w:history="1">
+      <w:hyperlink w:anchor="_Toc227449179" w:history="1">
         <w:r>
           <w:rPr>
             <w:rStyle w:val="Hyperlink"/>
@@ -2247,7 +2247,7 @@
             <w:noProof/>
             <w:webHidden/>
           </w:rPr>
-          <w:instrText xml:space="preserve"> PAGEREF _Toc227445279 \h </w:instrText>
+          <w:instrText xml:space="preserve"> PAGEREF _Toc227449179 \h </w:instrText>
         </w:r>
         <w:r>
           <w:rPr>
@@ -2287,7 +2287,7 @@
           <w:szCs w:val="24"/>
         </w:rPr>
       </w:pPr>
-      <w:hyperlink w:anchor="_Toc227445280" w:history="1">
+      <w:hyperlink w:anchor="_Toc227449180" w:history="1">
         <w:r>
           <w:rPr>
             <w:rStyle w:val="Hyperlink"/>
@@ -2314,7 +2314,7 @@
             <w:noProof/>
             <w:webHidden/>
           </w:rPr>
-          <w:instrText xml:space="preserve"> PAGEREF _Toc227445280 \h </w:instrText>
+          <w:instrText xml:space="preserve"> PAGEREF _Toc227449180 \h </w:instrText>
         </w:r>
         <w:r>
           <w:rPr>
@@ -2354,7 +2354,7 @@
           <w:szCs w:val="24"/>
         </w:rPr>
       </w:pPr>
-      <w:hyperlink w:anchor="_Toc227445281" w:history="1">
+      <w:hyperlink w:anchor="_Toc227449181" w:history="1">
         <w:r>
           <w:rPr>
             <w:rStyle w:val="Hyperlink"/>
@@ -2381,7 +2381,7 @@
             <w:noProof/>
             <w:webHidden/>
           </w:rPr>
-          <w:instrText xml:space="preserve"> PAGEREF _Toc227445281 \h </w:instrText>
+          <w:instrText xml:space="preserve"> PAGEREF _Toc227449181 \h </w:instrText>
         </w:r>
         <w:r>
           <w:rPr>
@@ -2421,7 +2421,7 @@
           <w:szCs w:val="24"/>
         </w:rPr>
       </w:pPr>
-      <w:hyperlink w:anchor="_Toc227445282" w:history="1">
+      <w:hyperlink w:anchor="_Toc227449182" w:history="1">
         <w:r>
           <w:rPr>
             <w:rStyle w:val="Hyperlink"/>
@@ -2448,7 +2448,7 @@
             <w:noProof/>
             <w:webHidden/>
           </w:rPr>
-          <w:instrText xml:space="preserve"> PAGEREF _Toc227445282 \h </w:instrText>
+          <w:instrText xml:space="preserve"> PAGEREF _Toc227449182 \h </w:instrText>
         </w:r>
         <w:r>
           <w:rPr>
@@ -2489,7 +2489,7 @@
           <w:szCs w:val="24"/>
         </w:rPr>
       </w:pPr>
-      <w:hyperlink w:anchor="_Toc227445283" w:history="1">
+      <w:hyperlink w:anchor="_Toc227449183" w:history="1">
         <w:r>
           <w:rPr>
             <w:rStyle w:val="Hyperlink"/>
@@ -2516,7 +2516,7 @@
             <w:noProof/>
             <w:webHidden/>
           </w:rPr>
-          <w:instrText xml:space="preserve"> PAGEREF _Toc227445283 \h </w:instrText>
+          <w:instrText xml:space="preserve"> PAGEREF _Toc227449183 \h </w:instrText>
         </w:r>
         <w:r>
           <w:rPr>
@@ -2557,7 +2557,7 @@
           <w:szCs w:val="24"/>
         </w:rPr>
       </w:pPr>
-      <w:hyperlink w:anchor="_Toc227445284" w:history="1">
+      <w:hyperlink w:anchor="_Toc227449184" w:history="1">
         <w:r>
           <w:rPr>
             <w:rStyle w:val="Hyperlink"/>
@@ -2584,7 +2584,7 @@
             <w:noProof/>
             <w:webHidden/>
           </w:rPr>
-          <w:instrText xml:space="preserve"> PAGEREF _Toc227445284 \h </w:instrText>
+          <w:instrText xml:space="preserve"> PAGEREF _Toc227449184 \h </w:instrText>
         </w:r>
         <w:r>
           <w:rPr>
@@ -2624,7 +2624,7 @@
           <w:szCs w:val="24"/>
         </w:rPr>
       </w:pPr>
-      <w:hyperlink w:anchor="_Toc227445285" w:history="1">
+      <w:hyperlink w:anchor="_Toc227449185" w:history="1">
         <w:r>
           <w:rPr>
             <w:rStyle w:val="Hyperlink"/>
@@ -2651,7 +2651,7 @@
             <w:noProof/>
             <w:webHidden/>
           </w:rPr>
-          <w:instrText xml:space="preserve"> PAGEREF _Toc227445285 \h </w:instrText>
+          <w:instrText xml:space="preserve"> PAGEREF _Toc227449185 \h </w:instrText>
         </w:r>
         <w:r>
           <w:rPr>
@@ -2691,7 +2691,7 @@
           <w:szCs w:val="24"/>
         </w:rPr>
       </w:pPr>
-      <w:hyperlink w:anchor="_Toc227445286" w:history="1">
+      <w:hyperlink w:anchor="_Toc227449186" w:history="1">
         <w:r>
           <w:rPr>
             <w:rStyle w:val="Hyperlink"/>
@@ -2719,7 +2719,7 @@
             <w:noProof/>
             <w:webHidden/>
           </w:rPr>
-          <w:instrText xml:space="preserve"> PAGEREF _Toc227445286 \h </w:instrText>
+          <w:instrText xml:space="preserve"> PAGEREF _Toc227449186 \h </w:instrText>
         </w:r>
         <w:r>
           <w:rPr>
@@ -2759,7 +2759,7 @@
           <w:szCs w:val="24"/>
         </w:rPr>
       </w:pPr>
-      <w:hyperlink w:anchor="_Toc227445287" w:history="1">
+      <w:hyperlink w:anchor="_Toc227449187" w:history="1">
         <w:r>
           <w:rPr>
             <w:rStyle w:val="Hyperlink"/>
@@ -2787,7 +2787,7 @@
             <w:noProof/>
             <w:webHidden/>
           </w:rPr>
-          <w:instrText xml:space="preserve"> PAGEREF _Toc227445287 \h </w:instrText>
+          <w:instrText xml:space="preserve"> PAGEREF _Toc227449187 \h </w:instrText>
         </w:r>
         <w:r>
           <w:rPr>
@@ -2827,7 +2827,7 @@
           <w:szCs w:val="24"/>
         </w:rPr>
       </w:pPr>
-      <w:hyperlink w:anchor="_Toc227445288" w:history="1">
+      <w:hyperlink w:anchor="_Toc227449188" w:history="1">
         <w:r>
           <w:rPr>
             <w:rStyle w:val="Hyperlink"/>
@@ -2855,7 +2855,7 @@
             <w:noProof/>
             <w:webHidden/>
           </w:rPr>
-          <w:instrText xml:space="preserve"> PAGEREF _Toc227445288 \h </w:instrText>
+          <w:instrText xml:space="preserve"> PAGEREF _Toc227449188 \h </w:instrText>
         </w:r>
         <w:r>
           <w:rPr>
@@ -2896,7 +2896,7 @@
           <w:szCs w:val="24"/>
         </w:rPr>
       </w:pPr>
-      <w:hyperlink w:anchor="_Toc227445289" w:history="1">
+      <w:hyperlink w:anchor="_Toc227449189" w:history="1">
         <w:r>
           <w:rPr>
             <w:rStyle w:val="Hyperlink"/>
@@ -2938,7 +2938,7 @@
             <w:noProof/>
             <w:webHidden/>
           </w:rPr>
-          <w:instrText xml:space="preserve"> PAGEREF _Toc227445289 \h </w:instrText>
+          <w:instrText xml:space="preserve"> PAGEREF _Toc227449189 \h </w:instrText>
         </w:r>
         <w:r>
           <w:rPr>
@@ -2978,7 +2978,7 @@
           <w:szCs w:val="24"/>
         </w:rPr>
       </w:pPr>
-      <w:hyperlink w:anchor="_Toc227445290" w:history="1">
+      <w:hyperlink w:anchor="_Toc227449190" w:history="1">
         <w:r>
           <w:rPr>
             <w:rStyle w:val="Hyperlink"/>
@@ -3006,7 +3006,7 @@
             <w:noProof/>
             <w:webHidden/>
           </w:rPr>
-          <w:instrText xml:space="preserve"> PAGEREF _Toc227445290 \h </w:instrText>
+          <w:instrText xml:space="preserve"> PAGEREF _Toc227449190 \h </w:instrText>
         </w:r>
         <w:r>
           <w:rPr>
@@ -3046,7 +3046,7 @@
           <w:szCs w:val="24"/>
         </w:rPr>
       </w:pPr>
-      <w:hyperlink w:anchor="_Toc227445291" w:history="1">
+      <w:hyperlink w:anchor="_Toc227449191" w:history="1">
         <w:r>
           <w:rPr>
             <w:rStyle w:val="Hyperlink"/>
@@ -3074,7 +3074,7 @@
             <w:noProof/>
             <w:webHidden/>
           </w:rPr>
-          <w:instrText xml:space="preserve"> PAGEREF _Toc227445291 \h </w:instrText>
+          <w:instrText xml:space="preserve"> PAGEREF _Toc227449191 \h </w:instrText>
         </w:r>
         <w:r>
           <w:rPr>
@@ -3114,7 +3114,7 @@
           <w:szCs w:val="24"/>
         </w:rPr>
       </w:pPr>
-      <w:hyperlink w:anchor="_Toc227445292" w:history="1">
+      <w:hyperlink w:anchor="_Toc227449192" w:history="1">
         <w:r>
           <w:rPr>
             <w:rStyle w:val="Hyperlink"/>
@@ -3142,7 +3142,7 @@
             <w:noProof/>
             <w:webHidden/>
           </w:rPr>
-          <w:instrText xml:space="preserve"> PAGEREF _Toc227445292 \h </w:instrText>
+          <w:instrText xml:space="preserve"> PAGEREF _Toc227449192 \h </w:instrText>
         </w:r>
         <w:r>
           <w:rPr>
@@ -3183,7 +3183,7 @@
           <w:szCs w:val="24"/>
         </w:rPr>
       </w:pPr>
-      <w:hyperlink w:anchor="_Toc227445293" w:history="1">
+      <w:hyperlink w:anchor="_Toc227449193" w:history="1">
         <w:r>
           <w:rPr>
             <w:rStyle w:val="Hyperlink"/>
@@ -3218,7 +3218,7 @@
             <w:noProof/>
             <w:webHidden/>
           </w:rPr>
-          <w:instrText xml:space="preserve"> PAGEREF _Toc227445293 \h </w:instrText>
+          <w:instrText xml:space="preserve"> PAGEREF _Toc227449193 \h </w:instrText>
         </w:r>
         <w:r>
           <w:rPr>
@@ -3258,7 +3258,7 @@
           <w:szCs w:val="24"/>
         </w:rPr>
       </w:pPr>
-      <w:hyperlink w:anchor="_Toc227445294" w:history="1">
+      <w:hyperlink w:anchor="_Toc227449194" w:history="1">
         <w:r>
           <w:rPr>
             <w:rStyle w:val="Hyperlink"/>
@@ -3286,7 +3286,7 @@
             <w:noProof/>
             <w:webHidden/>
           </w:rPr>
-          <w:instrText xml:space="preserve"> PAGEREF _Toc227445294 \h </w:instrText>
+          <w:instrText xml:space="preserve"> PAGEREF _Toc227449194 \h </w:instrText>
         </w:r>
         <w:r>
           <w:rPr>
@@ -3326,7 +3326,7 @@
           <w:szCs w:val="24"/>
         </w:rPr>
       </w:pPr>
-      <w:hyperlink w:anchor="_Toc227445295" w:history="1">
+      <w:hyperlink w:anchor="_Toc227449195" w:history="1">
         <w:r>
           <w:rPr>
             <w:rStyle w:val="Hyperlink"/>
@@ -3354,7 +3354,7 @@
             <w:noProof/>
             <w:webHidden/>
           </w:rPr>
-          <w:instrText xml:space="preserve"> PAGEREF _Toc227445295 \h </w:instrText>
+          <w:instrText xml:space="preserve"> PAGEREF _Toc227449195 \h </w:instrText>
         </w:r>
         <w:r>
           <w:rPr>
@@ -3394,7 +3394,7 @@
           <w:szCs w:val="24"/>
         </w:rPr>
       </w:pPr>
-      <w:hyperlink w:anchor="_Toc227445296" w:history="1">
+      <w:hyperlink w:anchor="_Toc227449196" w:history="1">
         <w:r>
           <w:rPr>
             <w:rStyle w:val="Hyperlink"/>
@@ -3422,7 +3422,7 @@
             <w:noProof/>
             <w:webHidden/>
           </w:rPr>
-          <w:instrText xml:space="preserve"> PAGEREF _Toc227445296 \h </w:instrText>
+          <w:instrText xml:space="preserve"> PAGEREF _Toc227449196 \h </w:instrText>
         </w:r>
         <w:r>
           <w:rPr>
@@ -3462,7 +3462,7 @@
           <w:szCs w:val="24"/>
         </w:rPr>
       </w:pPr>
-      <w:hyperlink w:anchor="_Toc227445297" w:history="1">
+      <w:hyperlink w:anchor="_Toc227449197" w:history="1">
         <w:r>
           <w:rPr>
             <w:rStyle w:val="Hyperlink"/>
@@ -3490,7 +3490,7 @@
             <w:noProof/>
             <w:webHidden/>
           </w:rPr>
-          <w:instrText xml:space="preserve"> PAGEREF _Toc227445297 \h </w:instrText>
+          <w:instrText xml:space="preserve"> PAGEREF _Toc227449197 \h </w:instrText>
         </w:r>
         <w:r>
           <w:rPr>
@@ -3530,7 +3530,7 @@
           <w:szCs w:val="24"/>
         </w:rPr>
       </w:pPr>
-      <w:hyperlink w:anchor="_Toc227445298" w:history="1">
+      <w:hyperlink w:anchor="_Toc227449198" w:history="1">
         <w:r>
           <w:rPr>
             <w:rStyle w:val="Hyperlink"/>
@@ -3558,7 +3558,7 @@
             <w:noProof/>
             <w:webHidden/>
           </w:rPr>
-          <w:instrText xml:space="preserve"> PAGEREF _Toc227445298 \h </w:instrText>
+          <w:instrText xml:space="preserve"> PAGEREF _Toc227449198 \h </w:instrText>
         </w:r>
         <w:r>
           <w:rPr>
@@ -3602,11 +3602,12 @@
           <w:szCs w:val="24"/>
         </w:rPr>
       </w:pPr>
-      <w:hyperlink w:anchor="_Toc227445299" w:history="1">
+      <w:hyperlink w:anchor="_Toc227449199" w:history="1">
         <w:r>
           <w:rPr>
             <w:rStyle w:val="Hyperlink"/>
             <w:noProof/>
+            <w:lang w:val="sk-SK"/>
           </w:rPr>
           <w:t>4</w:t>
         </w:r>
@@ -3627,23 +3628,83 @@
             <w:noProof/>
             <w:lang w:val="sk-SK"/>
           </w:rPr>
-          <w:t>Metódy strojového uče</w:t>
-        </w:r>
+          <w:t>Predikcia slnečného žiarenia</w:t>
+        </w:r>
+        <w:r>
+          <w:rPr>
+            <w:noProof/>
+            <w:webHidden/>
+          </w:rPr>
+          <w:tab/>
+        </w:r>
+        <w:r>
+          <w:rPr>
+            <w:noProof/>
+            <w:webHidden/>
+          </w:rPr>
+          <w:fldChar w:fldCharType="begin"/>
+        </w:r>
+        <w:r>
+          <w:rPr>
+            <w:noProof/>
+            <w:webHidden/>
+          </w:rPr>
+          <w:instrText xml:space="preserve"> PAGEREF _Toc227449199 \h </w:instrText>
+        </w:r>
+        <w:r>
+          <w:rPr>
+            <w:noProof/>
+            <w:webHidden/>
+          </w:rPr>
+        </w:r>
+        <w:r>
+          <w:rPr>
+            <w:noProof/>
+            <w:webHidden/>
+          </w:rPr>
+          <w:fldChar w:fldCharType="separate"/>
+        </w:r>
+        <w:r>
+          <w:rPr>
+            <w:noProof/>
+            <w:webHidden/>
+          </w:rPr>
+          <w:t>26</w:t>
+        </w:r>
+        <w:r>
+          <w:rPr>
+            <w:noProof/>
+            <w:webHidden/>
+          </w:rPr>
+          <w:fldChar w:fldCharType="end"/>
+        </w:r>
+      </w:hyperlink>
+    </w:p>
+    <w:p>
+      <w:pPr>
+        <w:pStyle w:val="TOC2"/>
+        <w:rPr>
+          <w:rFonts w:asciiTheme="minorHAnsi" w:eastAsiaTheme="minorEastAsia" w:hAnsiTheme="minorHAnsi" w:cstheme="minorBidi"/>
+          <w:iCs w:val="0"/>
+          <w:noProof/>
+          <w:szCs w:val="24"/>
+        </w:rPr>
+      </w:pPr>
+      <w:hyperlink w:anchor="_Toc227449200" w:history="1">
         <w:r>
           <w:rPr>
             <w:rStyle w:val="Hyperlink"/>
             <w:noProof/>
+          </w:rPr>
+          <w:t>4.1</w:t>
+        </w:r>
+        <w:r>
+          <w:rPr>
+            <w:rStyle w:val="Hyperlink"/>
+            <w:noProof/>
             <w:lang w:val="sk-SK"/>
           </w:rPr>
-          <w:t>n</w:t>
-        </w:r>
-        <w:r>
-          <w:rPr>
-            <w:rStyle w:val="Hyperlink"/>
-            <w:noProof/>
-            <w:lang w:val="sk-SK"/>
-          </w:rPr>
-          <w:t>ia pre odhad slnečného žiarenia</w:t>
+          <w:t xml:space="preserve"> Tradičné prístupu a moderné metódy</w:t>
         </w:r>
         <w:r>
           <w:rPr>
@@ -3664,7 +3725,7 @@
             <w:noProof/>
             <w:webHidden/>
           </w:rPr>
-          <w:instrText xml:space="preserve"> PAGEREF _Toc227445299 \h </w:instrText>
+          <w:instrText xml:space="preserve"> PAGEREF _Toc227449200 \h </w:instrText>
         </w:r>
         <w:r>
           <w:rPr>
@@ -3704,13 +3765,21 @@
           <w:szCs w:val="24"/>
         </w:rPr>
       </w:pPr>
-      <w:hyperlink w:anchor="_Toc227445300" w:history="1">
+      <w:hyperlink w:anchor="_Toc227449201" w:history="1">
         <w:r>
           <w:rPr>
             <w:rStyle w:val="Hyperlink"/>
             <w:noProof/>
           </w:rPr>
-          <w:t>4.1.1 Záver</w:t>
+          <w:t>4.1.1</w:t>
+        </w:r>
+        <w:r>
+          <w:rPr>
+            <w:rStyle w:val="Hyperlink"/>
+            <w:noProof/>
+            <w:lang w:val="sk-SK"/>
+          </w:rPr>
+          <w:t xml:space="preserve"> Model perzistencie</w:t>
         </w:r>
         <w:r>
           <w:rPr>
@@ -3731,7 +3800,7 @@
             <w:noProof/>
             <w:webHidden/>
           </w:rPr>
-          <w:instrText xml:space="preserve"> PAGEREF _Toc227445300 \h </w:instrText>
+          <w:instrText xml:space="preserve"> PAGEREF _Toc227449201 \h </w:instrText>
         </w:r>
         <w:r>
           <w:rPr>
@@ -3752,6 +3821,438 @@
             <w:webHidden/>
           </w:rPr>
           <w:t>26</w:t>
+        </w:r>
+        <w:r>
+          <w:rPr>
+            <w:noProof/>
+            <w:webHidden/>
+          </w:rPr>
+          <w:fldChar w:fldCharType="end"/>
+        </w:r>
+      </w:hyperlink>
+    </w:p>
+    <w:p>
+      <w:pPr>
+        <w:pStyle w:val="TOC3"/>
+        <w:rPr>
+          <w:rFonts w:asciiTheme="minorHAnsi" w:eastAsiaTheme="minorEastAsia" w:hAnsiTheme="minorHAnsi" w:cstheme="minorBidi"/>
+          <w:noProof/>
+          <w:szCs w:val="24"/>
+        </w:rPr>
+      </w:pPr>
+      <w:hyperlink w:anchor="_Toc227449202" w:history="1">
+        <w:r>
+          <w:rPr>
+            <w:rStyle w:val="Hyperlink"/>
+            <w:noProof/>
+          </w:rPr>
+          <w:t>4.1.2</w:t>
+        </w:r>
+        <w:r>
+          <w:rPr>
+            <w:rStyle w:val="Hyperlink"/>
+            <w:noProof/>
+            <w:lang w:val="sk-SK"/>
+          </w:rPr>
+          <w:t xml:space="preserve"> Fyzikálne a satelitné modely</w:t>
+        </w:r>
+        <w:r>
+          <w:rPr>
+            <w:noProof/>
+            <w:webHidden/>
+          </w:rPr>
+          <w:tab/>
+        </w:r>
+        <w:r>
+          <w:rPr>
+            <w:noProof/>
+            <w:webHidden/>
+          </w:rPr>
+          <w:fldChar w:fldCharType="begin"/>
+        </w:r>
+        <w:r>
+          <w:rPr>
+            <w:noProof/>
+            <w:webHidden/>
+          </w:rPr>
+          <w:instrText xml:space="preserve"> PAGEREF _Toc227449202 \h </w:instrText>
+        </w:r>
+        <w:r>
+          <w:rPr>
+            <w:noProof/>
+            <w:webHidden/>
+          </w:rPr>
+        </w:r>
+        <w:r>
+          <w:rPr>
+            <w:noProof/>
+            <w:webHidden/>
+          </w:rPr>
+          <w:fldChar w:fldCharType="separate"/>
+        </w:r>
+        <w:r>
+          <w:rPr>
+            <w:noProof/>
+            <w:webHidden/>
+          </w:rPr>
+          <w:t>26</w:t>
+        </w:r>
+        <w:r>
+          <w:rPr>
+            <w:noProof/>
+            <w:webHidden/>
+          </w:rPr>
+          <w:fldChar w:fldCharType="end"/>
+        </w:r>
+      </w:hyperlink>
+    </w:p>
+    <w:p>
+      <w:pPr>
+        <w:pStyle w:val="TOC3"/>
+        <w:rPr>
+          <w:rFonts w:asciiTheme="minorHAnsi" w:eastAsiaTheme="minorEastAsia" w:hAnsiTheme="minorHAnsi" w:cstheme="minorBidi"/>
+          <w:noProof/>
+          <w:szCs w:val="24"/>
+        </w:rPr>
+      </w:pPr>
+      <w:hyperlink w:anchor="_Toc227449203" w:history="1">
+        <w:r>
+          <w:rPr>
+            <w:rStyle w:val="Hyperlink"/>
+            <w:noProof/>
+          </w:rPr>
+          <w:t>4.1.3</w:t>
+        </w:r>
+        <w:r>
+          <w:rPr>
+            <w:rStyle w:val="Hyperlink"/>
+            <w:noProof/>
+            <w:lang w:val="sk-SK"/>
+          </w:rPr>
+          <w:t xml:space="preserve"> Modely založené na celooblohových snímkach</w:t>
+        </w:r>
+        <w:r>
+          <w:rPr>
+            <w:noProof/>
+            <w:webHidden/>
+          </w:rPr>
+          <w:tab/>
+        </w:r>
+        <w:r>
+          <w:rPr>
+            <w:noProof/>
+            <w:webHidden/>
+          </w:rPr>
+          <w:fldChar w:fldCharType="begin"/>
+        </w:r>
+        <w:r>
+          <w:rPr>
+            <w:noProof/>
+            <w:webHidden/>
+          </w:rPr>
+          <w:instrText xml:space="preserve"> PAGEREF _Toc227449203 \h </w:instrText>
+        </w:r>
+        <w:r>
+          <w:rPr>
+            <w:noProof/>
+            <w:webHidden/>
+          </w:rPr>
+        </w:r>
+        <w:r>
+          <w:rPr>
+            <w:noProof/>
+            <w:webHidden/>
+          </w:rPr>
+          <w:fldChar w:fldCharType="separate"/>
+        </w:r>
+        <w:r>
+          <w:rPr>
+            <w:noProof/>
+            <w:webHidden/>
+          </w:rPr>
+          <w:t>27</w:t>
+        </w:r>
+        <w:r>
+          <w:rPr>
+            <w:noProof/>
+            <w:webHidden/>
+          </w:rPr>
+          <w:fldChar w:fldCharType="end"/>
+        </w:r>
+      </w:hyperlink>
+    </w:p>
+    <w:p>
+      <w:pPr>
+        <w:pStyle w:val="TOC2"/>
+        <w:rPr>
+          <w:rFonts w:asciiTheme="minorHAnsi" w:eastAsiaTheme="minorEastAsia" w:hAnsiTheme="minorHAnsi" w:cstheme="minorBidi"/>
+          <w:iCs w:val="0"/>
+          <w:noProof/>
+          <w:szCs w:val="24"/>
+        </w:rPr>
+      </w:pPr>
+      <w:hyperlink w:anchor="_Toc227449204" w:history="1">
+        <w:r>
+          <w:rPr>
+            <w:rStyle w:val="Hyperlink"/>
+            <w:noProof/>
+            <w:lang w:val="sk-SK"/>
+          </w:rPr>
+          <w:t>4.2 Extrakcia príznakov</w:t>
+        </w:r>
+        <w:r>
+          <w:rPr>
+            <w:noProof/>
+            <w:webHidden/>
+          </w:rPr>
+          <w:tab/>
+        </w:r>
+        <w:r>
+          <w:rPr>
+            <w:noProof/>
+            <w:webHidden/>
+          </w:rPr>
+          <w:fldChar w:fldCharType="begin"/>
+        </w:r>
+        <w:r>
+          <w:rPr>
+            <w:noProof/>
+            <w:webHidden/>
+          </w:rPr>
+          <w:instrText xml:space="preserve"> PAGEREF _Toc227449204 \h </w:instrText>
+        </w:r>
+        <w:r>
+          <w:rPr>
+            <w:noProof/>
+            <w:webHidden/>
+          </w:rPr>
+        </w:r>
+        <w:r>
+          <w:rPr>
+            <w:noProof/>
+            <w:webHidden/>
+          </w:rPr>
+          <w:fldChar w:fldCharType="separate"/>
+        </w:r>
+        <w:r>
+          <w:rPr>
+            <w:noProof/>
+            <w:webHidden/>
+          </w:rPr>
+          <w:t>27</w:t>
+        </w:r>
+        <w:r>
+          <w:rPr>
+            <w:noProof/>
+            <w:webHidden/>
+          </w:rPr>
+          <w:fldChar w:fldCharType="end"/>
+        </w:r>
+      </w:hyperlink>
+    </w:p>
+    <w:p>
+      <w:pPr>
+        <w:pStyle w:val="TOC3"/>
+        <w:rPr>
+          <w:rFonts w:asciiTheme="minorHAnsi" w:eastAsiaTheme="minorEastAsia" w:hAnsiTheme="minorHAnsi" w:cstheme="minorBidi"/>
+          <w:noProof/>
+          <w:szCs w:val="24"/>
+        </w:rPr>
+      </w:pPr>
+      <w:hyperlink w:anchor="_Toc227449205" w:history="1">
+        <w:r>
+          <w:rPr>
+            <w:rStyle w:val="Hyperlink"/>
+            <w:noProof/>
+          </w:rPr>
+          <w:t>4.2.1</w:t>
+        </w:r>
+        <w:r>
+          <w:rPr>
+            <w:rStyle w:val="Hyperlink"/>
+            <w:noProof/>
+            <w:lang w:val="sk-SK"/>
+          </w:rPr>
+          <w:t xml:space="preserve"> Porovnanie hlboké učenia (deep learning) a tradičných prístupov v kontexte extrakcie príznakov pri predikcii slnečného žiarenia</w:t>
+        </w:r>
+        <w:r>
+          <w:rPr>
+            <w:noProof/>
+            <w:webHidden/>
+          </w:rPr>
+          <w:tab/>
+        </w:r>
+        <w:r>
+          <w:rPr>
+            <w:noProof/>
+            <w:webHidden/>
+          </w:rPr>
+          <w:fldChar w:fldCharType="begin"/>
+        </w:r>
+        <w:r>
+          <w:rPr>
+            <w:noProof/>
+            <w:webHidden/>
+          </w:rPr>
+          <w:instrText xml:space="preserve"> PAGEREF _Toc227449205 \h </w:instrText>
+        </w:r>
+        <w:r>
+          <w:rPr>
+            <w:noProof/>
+            <w:webHidden/>
+          </w:rPr>
+        </w:r>
+        <w:r>
+          <w:rPr>
+            <w:noProof/>
+            <w:webHidden/>
+          </w:rPr>
+          <w:fldChar w:fldCharType="separate"/>
+        </w:r>
+        <w:r>
+          <w:rPr>
+            <w:noProof/>
+            <w:webHidden/>
+          </w:rPr>
+          <w:t>28</w:t>
+        </w:r>
+        <w:r>
+          <w:rPr>
+            <w:noProof/>
+            <w:webHidden/>
+          </w:rPr>
+          <w:fldChar w:fldCharType="end"/>
+        </w:r>
+      </w:hyperlink>
+    </w:p>
+    <w:p>
+      <w:pPr>
+        <w:pStyle w:val="TOC2"/>
+        <w:rPr>
+          <w:rFonts w:asciiTheme="minorHAnsi" w:eastAsiaTheme="minorEastAsia" w:hAnsiTheme="minorHAnsi" w:cstheme="minorBidi"/>
+          <w:iCs w:val="0"/>
+          <w:noProof/>
+          <w:szCs w:val="24"/>
+        </w:rPr>
+      </w:pPr>
+      <w:hyperlink w:anchor="_Toc227449206" w:history="1">
+        <w:r>
+          <w:rPr>
+            <w:rStyle w:val="Hyperlink"/>
+            <w:noProof/>
+            <w:lang w:val="sk-SK"/>
+          </w:rPr>
+          <w:t>4.3 Konvolučné neurónové siete (CNN)</w:t>
+        </w:r>
+        <w:r>
+          <w:rPr>
+            <w:noProof/>
+            <w:webHidden/>
+          </w:rPr>
+          <w:tab/>
+        </w:r>
+        <w:r>
+          <w:rPr>
+            <w:noProof/>
+            <w:webHidden/>
+          </w:rPr>
+          <w:fldChar w:fldCharType="begin"/>
+        </w:r>
+        <w:r>
+          <w:rPr>
+            <w:noProof/>
+            <w:webHidden/>
+          </w:rPr>
+          <w:instrText xml:space="preserve"> PAGEREF _Toc227449206 \h </w:instrText>
+        </w:r>
+        <w:r>
+          <w:rPr>
+            <w:noProof/>
+            <w:webHidden/>
+          </w:rPr>
+        </w:r>
+        <w:r>
+          <w:rPr>
+            <w:noProof/>
+            <w:webHidden/>
+          </w:rPr>
+          <w:fldChar w:fldCharType="separate"/>
+        </w:r>
+        <w:r>
+          <w:rPr>
+            <w:noProof/>
+            <w:webHidden/>
+          </w:rPr>
+          <w:t>28</w:t>
+        </w:r>
+        <w:r>
+          <w:rPr>
+            <w:noProof/>
+            <w:webHidden/>
+          </w:rPr>
+          <w:fldChar w:fldCharType="end"/>
+        </w:r>
+      </w:hyperlink>
+    </w:p>
+    <w:p>
+      <w:pPr>
+        <w:pStyle w:val="TOC2"/>
+        <w:rPr>
+          <w:rFonts w:asciiTheme="minorHAnsi" w:eastAsiaTheme="minorEastAsia" w:hAnsiTheme="minorHAnsi" w:cstheme="minorBidi"/>
+          <w:iCs w:val="0"/>
+          <w:noProof/>
+          <w:szCs w:val="24"/>
+        </w:rPr>
+      </w:pPr>
+      <w:hyperlink w:anchor="_Toc227449207" w:history="1">
+        <w:r>
+          <w:rPr>
+            <w:rStyle w:val="Hyperlink"/>
+            <w:noProof/>
+            <w:lang w:val="sk-SK"/>
+          </w:rPr>
+          <w:t>4.4 Vhodnosť CNN pre analýzu snímok oblohy</w:t>
+        </w:r>
+        <w:r>
+          <w:rPr>
+            <w:noProof/>
+            <w:webHidden/>
+          </w:rPr>
+          <w:tab/>
+        </w:r>
+        <w:r>
+          <w:rPr>
+            <w:noProof/>
+            <w:webHidden/>
+          </w:rPr>
+          <w:fldChar w:fldCharType="begin"/>
+        </w:r>
+        <w:r>
+          <w:rPr>
+            <w:noProof/>
+            <w:webHidden/>
+          </w:rPr>
+          <w:instrText xml:space="preserve"> PAGEREF _Toc227449207 \h </w:instrText>
+        </w:r>
+        <w:r>
+          <w:rPr>
+            <w:noProof/>
+            <w:webHidden/>
+          </w:rPr>
+        </w:r>
+        <w:r>
+          <w:rPr>
+            <w:noProof/>
+            <w:webHidden/>
+          </w:rPr>
+          <w:fldChar w:fldCharType="separate"/>
+        </w:r>
+        <w:r>
+          <w:rPr>
+            <w:noProof/>
+            <w:webHidden/>
+          </w:rPr>
+          <w:t>29</w:t>
         </w:r>
         <w:r>
           <w:rPr>
@@ -3775,23 +4276,43 @@
           <w:szCs w:val="24"/>
         </w:rPr>
       </w:pPr>
-      <w:hyperlink w:anchor="_Toc227445301" w:history="1">
+      <w:hyperlink w:anchor="_Toc227449208" w:history="1">
         <w:r>
           <w:rPr>
             <w:rStyle w:val="Hyperlink"/>
             <w:noProof/>
-          </w:rPr>
-          <w:t>Záver</w:t>
-        </w:r>
-        <w:r>
-          <w:rPr>
-            <w:noProof/>
-            <w:webHidden/>
+            <w:lang w:val="sk-SK"/>
+          </w:rPr>
+          <w:t>5</w:t>
+        </w:r>
+        <w:r>
+          <w:rPr>
+            <w:rFonts w:asciiTheme="minorHAnsi" w:eastAsiaTheme="minorEastAsia" w:hAnsiTheme="minorHAnsi" w:cstheme="minorBidi"/>
+            <w:b w:val="0"/>
+            <w:bCs w:val="0"/>
+            <w:noProof/>
+            <w:sz w:val="24"/>
+            <w:szCs w:val="24"/>
           </w:rPr>
           <w:tab/>
         </w:r>
         <w:r>
           <w:rPr>
+            <w:rStyle w:val="Hyperlink"/>
+            <w:noProof/>
+            <w:lang w:val="sk-SK"/>
+          </w:rPr>
+          <w:t>Hodnotiace metriky</w:t>
+        </w:r>
+        <w:r>
+          <w:rPr>
+            <w:noProof/>
+            <w:webHidden/>
+          </w:rPr>
+          <w:tab/>
+        </w:r>
+        <w:r>
+          <w:rPr>
             <w:noProof/>
             <w:webHidden/>
           </w:rPr>
@@ -3802,7 +4323,7 @@
             <w:noProof/>
             <w:webHidden/>
           </w:rPr>
-          <w:instrText xml:space="preserve"> PAGEREF _Toc227445301 \h </w:instrText>
+          <w:instrText xml:space="preserve"> PAGEREF _Toc227449208 \h </w:instrText>
         </w:r>
         <w:r>
           <w:rPr>
@@ -3822,7 +4343,74 @@
             <w:noProof/>
             <w:webHidden/>
           </w:rPr>
-          <w:t>27</w:t>
+          <w:t>30</w:t>
+        </w:r>
+        <w:r>
+          <w:rPr>
+            <w:noProof/>
+            <w:webHidden/>
+          </w:rPr>
+          <w:fldChar w:fldCharType="end"/>
+        </w:r>
+      </w:hyperlink>
+    </w:p>
+    <w:p>
+      <w:pPr>
+        <w:pStyle w:val="TOC3"/>
+        <w:rPr>
+          <w:rFonts w:asciiTheme="minorHAnsi" w:eastAsiaTheme="minorEastAsia" w:hAnsiTheme="minorHAnsi" w:cstheme="minorBidi"/>
+          <w:noProof/>
+          <w:szCs w:val="24"/>
+        </w:rPr>
+      </w:pPr>
+      <w:hyperlink w:anchor="_Toc227449209" w:history="1">
+        <w:r>
+          <w:rPr>
+            <w:rStyle w:val="Hyperlink"/>
+            <w:noProof/>
+          </w:rPr>
+          <w:t>5.1.1 Záver</w:t>
+        </w:r>
+        <w:r>
+          <w:rPr>
+            <w:noProof/>
+            <w:webHidden/>
+          </w:rPr>
+          <w:tab/>
+        </w:r>
+        <w:r>
+          <w:rPr>
+            <w:noProof/>
+            <w:webHidden/>
+          </w:rPr>
+          <w:fldChar w:fldCharType="begin"/>
+        </w:r>
+        <w:r>
+          <w:rPr>
+            <w:noProof/>
+            <w:webHidden/>
+          </w:rPr>
+          <w:instrText xml:space="preserve"> PAGEREF _Toc227449209 \h </w:instrText>
+        </w:r>
+        <w:r>
+          <w:rPr>
+            <w:noProof/>
+            <w:webHidden/>
+          </w:rPr>
+        </w:r>
+        <w:r>
+          <w:rPr>
+            <w:noProof/>
+            <w:webHidden/>
+          </w:rPr>
+          <w:fldChar w:fldCharType="separate"/>
+        </w:r>
+        <w:r>
+          <w:rPr>
+            <w:noProof/>
+            <w:webHidden/>
+          </w:rPr>
+          <w:t>30</w:t>
         </w:r>
         <w:r>
           <w:rPr>
@@ -3846,13 +4434,13 @@
           <w:szCs w:val="24"/>
         </w:rPr>
       </w:pPr>
-      <w:hyperlink w:anchor="_Toc227445302" w:history="1">
+      <w:hyperlink w:anchor="_Toc227449210" w:history="1">
         <w:r>
           <w:rPr>
             <w:rStyle w:val="Hyperlink"/>
             <w:noProof/>
           </w:rPr>
-          <w:t>Literatúra</w:t>
+          <w:t>Záver</w:t>
         </w:r>
         <w:r>
           <w:rPr>
@@ -3873,7 +4461,7 @@
             <w:noProof/>
             <w:webHidden/>
           </w:rPr>
-          <w:instrText xml:space="preserve"> PAGEREF _Toc227445302 \h </w:instrText>
+          <w:instrText xml:space="preserve"> PAGEREF _Toc227449210 \h </w:instrText>
         </w:r>
         <w:r>
           <w:rPr>
@@ -3893,7 +4481,7 @@
             <w:noProof/>
             <w:webHidden/>
           </w:rPr>
-          <w:t>28</w:t>
+          <w:t>31</w:t>
         </w:r>
         <w:r>
           <w:rPr>
@@ -3917,12 +4505,83 @@
           <w:szCs w:val="24"/>
         </w:rPr>
       </w:pPr>
-      <w:hyperlink w:anchor="_Toc227445303" w:history="1">
+      <w:hyperlink w:anchor="_Toc227449211" w:history="1">
         <w:r>
           <w:rPr>
             <w:rStyle w:val="Hyperlink"/>
             <w:noProof/>
           </w:rPr>
+          <w:t>Literatúra</w:t>
+        </w:r>
+        <w:r>
+          <w:rPr>
+            <w:noProof/>
+            <w:webHidden/>
+          </w:rPr>
+          <w:tab/>
+        </w:r>
+        <w:r>
+          <w:rPr>
+            <w:noProof/>
+            <w:webHidden/>
+          </w:rPr>
+          <w:fldChar w:fldCharType="begin"/>
+        </w:r>
+        <w:r>
+          <w:rPr>
+            <w:noProof/>
+            <w:webHidden/>
+          </w:rPr>
+          <w:instrText xml:space="preserve"> PAGEREF _Toc227449211 \h </w:instrText>
+        </w:r>
+        <w:r>
+          <w:rPr>
+            <w:noProof/>
+            <w:webHidden/>
+          </w:rPr>
+        </w:r>
+        <w:r>
+          <w:rPr>
+            <w:noProof/>
+            <w:webHidden/>
+          </w:rPr>
+          <w:fldChar w:fldCharType="separate"/>
+        </w:r>
+        <w:r>
+          <w:rPr>
+            <w:noProof/>
+            <w:webHidden/>
+          </w:rPr>
+          <w:t>32</w:t>
+        </w:r>
+        <w:r>
+          <w:rPr>
+            <w:noProof/>
+            <w:webHidden/>
+          </w:rPr>
+          <w:fldChar w:fldCharType="end"/>
+        </w:r>
+      </w:hyperlink>
+    </w:p>
+    <w:p>
+      <w:pPr>
+        <w:pStyle w:val="TOC1"/>
+        <w:spacing w:before="240"/>
+        <w:rPr>
+          <w:rFonts w:asciiTheme="minorHAnsi" w:eastAsiaTheme="minorEastAsia" w:hAnsiTheme="minorHAnsi" w:cstheme="minorBidi"/>
+          <w:b w:val="0"/>
+          <w:bCs w:val="0"/>
+          <w:noProof/>
+          <w:sz w:val="24"/>
+          <w:szCs w:val="24"/>
+        </w:rPr>
+      </w:pPr>
+      <w:hyperlink w:anchor="_Toc227449212" w:history="1">
+        <w:r>
+          <w:rPr>
+            <w:rStyle w:val="Hyperlink"/>
+            <w:noProof/>
+          </w:rPr>
           <w:t>Prílohy</w:t>
         </w:r>
         <w:r>
@@ -3944,7 +4603,7 @@
             <w:noProof/>
             <w:webHidden/>
           </w:rPr>
-          <w:instrText xml:space="preserve"> PAGEREF _Toc227445303 \h </w:instrText>
+          <w:instrText xml:space="preserve"> PAGEREF _Toc227449212 \h </w:instrText>
         </w:r>
         <w:r>
           <w:rPr>
@@ -3964,7 +4623,7 @@
             <w:noProof/>
             <w:webHidden/>
           </w:rPr>
-          <w:t>31</w:t>
+          <w:t>37</w:t>
         </w:r>
         <w:r>
           <w:rPr>
@@ -3992,7 +4651,7 @@
         <w:lastRenderedPageBreak/>
         <w:fldChar w:fldCharType="end"/>
       </w:r>
-      <w:bookmarkStart w:id="4" w:name="_Toc227445262"/>
+      <w:bookmarkStart w:id="4" w:name="_Toc227449162"/>
       <w:r>
         <w:t>Zoznam obrázkov</w:t>
       </w:r>
@@ -4025,7 +4684,7 @@
         </w:rPr>
         <w:fldChar w:fldCharType="separate"/>
       </w:r>
-      <w:hyperlink w:anchor="_Toc227445250" w:history="1">
+      <w:hyperlink w:anchor="_Toc227449150" w:history="1">
         <w:r>
           <w:rPr>
             <w:rStyle w:val="Hyperlink"/>
@@ -4053,7 +4712,7 @@
             <w:noProof/>
             <w:webHidden/>
           </w:rPr>
-          <w:instrText xml:space="preserve"> PAGEREF _Toc227445250 \h </w:instrText>
+          <w:instrText xml:space="preserve"> PAGEREF _Toc227449150 \h </w:instrText>
         </w:r>
         <w:r>
           <w:rPr>
@@ -4096,7 +4755,7 @@
           <w:noProof/>
         </w:rPr>
       </w:pPr>
-      <w:hyperlink w:anchor="_Toc227445251" w:history="1">
+      <w:hyperlink w:anchor="_Toc227449151" w:history="1">
         <w:r>
           <w:rPr>
             <w:rStyle w:val="Hyperlink"/>
@@ -4124,7 +4783,7 @@
             <w:noProof/>
             <w:webHidden/>
           </w:rPr>
-          <w:instrText xml:space="preserve"> PAGEREF _Toc227445251 \h </w:instrText>
+          <w:instrText xml:space="preserve"> PAGEREF _Toc227449151 \h </w:instrText>
         </w:r>
         <w:r>
           <w:rPr>
@@ -4167,7 +4826,7 @@
           <w:noProof/>
         </w:rPr>
       </w:pPr>
-      <w:hyperlink w:anchor="_Toc227445252" w:history="1">
+      <w:hyperlink w:anchor="_Toc227449152" w:history="1">
         <w:r>
           <w:rPr>
             <w:rStyle w:val="Hyperlink"/>
@@ -4195,7 +4854,7 @@
             <w:noProof/>
             <w:webHidden/>
           </w:rPr>
-          <w:instrText xml:space="preserve"> PAGEREF _Toc227445252 \h </w:instrText>
+          <w:instrText xml:space="preserve"> PAGEREF _Toc227449152 \h </w:instrText>
         </w:r>
         <w:r>
           <w:rPr>
@@ -4238,7 +4897,7 @@
           <w:noProof/>
         </w:rPr>
       </w:pPr>
-      <w:hyperlink w:anchor="_Toc227445253" w:history="1">
+      <w:hyperlink w:anchor="_Toc227449153" w:history="1">
         <w:r>
           <w:rPr>
             <w:rStyle w:val="Hyperlink"/>
@@ -4266,7 +4925,7 @@
             <w:noProof/>
             <w:webHidden/>
           </w:rPr>
-          <w:instrText xml:space="preserve"> PAGEREF _Toc227445253 \h </w:instrText>
+          <w:instrText xml:space="preserve"> PAGEREF _Toc227449153 \h </w:instrText>
         </w:r>
         <w:r>
           <w:rPr>
@@ -4309,7 +4968,7 @@
           <w:noProof/>
         </w:rPr>
       </w:pPr>
-      <w:hyperlink w:anchor="_Toc227445254" w:history="1">
+      <w:hyperlink w:anchor="_Toc227449154" w:history="1">
         <w:r>
           <w:rPr>
             <w:rStyle w:val="Hyperlink"/>
@@ -4337,7 +4996,7 @@
             <w:noProof/>
             <w:webHidden/>
           </w:rPr>
-          <w:instrText xml:space="preserve"> PAGEREF _Toc227445254 \h </w:instrText>
+          <w:instrText xml:space="preserve"> PAGEREF _Toc227449154 \h </w:instrText>
         </w:r>
         <w:r>
           <w:rPr>
@@ -4380,7 +5039,7 @@
           <w:noProof/>
         </w:rPr>
       </w:pPr>
-      <w:hyperlink w:anchor="_Toc227445255" w:history="1">
+      <w:hyperlink w:anchor="_Toc227449155" w:history="1">
         <w:r>
           <w:rPr>
             <w:rStyle w:val="Hyperlink"/>
@@ -4408,7 +5067,7 @@
             <w:noProof/>
             <w:webHidden/>
           </w:rPr>
-          <w:instrText xml:space="preserve"> PAGEREF _Toc227445255 \h </w:instrText>
+          <w:instrText xml:space="preserve"> PAGEREF _Toc227449155 \h </w:instrText>
         </w:r>
         <w:r>
           <w:rPr>
@@ -4451,7 +5110,7 @@
           <w:noProof/>
         </w:rPr>
       </w:pPr>
-      <w:hyperlink w:anchor="_Toc227445256" w:history="1">
+      <w:hyperlink w:anchor="_Toc227449156" w:history="1">
         <w:r>
           <w:rPr>
             <w:rStyle w:val="Hyperlink"/>
@@ -4479,7 +5138,7 @@
             <w:noProof/>
             <w:webHidden/>
           </w:rPr>
-          <w:instrText xml:space="preserve"> PAGEREF _Toc227445256 \h </w:instrText>
+          <w:instrText xml:space="preserve"> PAGEREF _Toc227449156 \h </w:instrText>
         </w:r>
         <w:r>
           <w:rPr>
@@ -4522,7 +5181,7 @@
           <w:noProof/>
         </w:rPr>
       </w:pPr>
-      <w:hyperlink w:anchor="_Toc227445257" w:history="1">
+      <w:hyperlink w:anchor="_Toc227449157" w:history="1">
         <w:r>
           <w:rPr>
             <w:rStyle w:val="Hyperlink"/>
@@ -4584,7 +5243,7 @@
             <w:noProof/>
             <w:webHidden/>
           </w:rPr>
-          <w:instrText xml:space="preserve"> PAGEREF _Toc227445257 \h </w:instrText>
+          <w:instrText xml:space="preserve"> PAGEREF _Toc227449157 \h </w:instrText>
         </w:r>
         <w:r>
           <w:rPr>
@@ -4627,7 +5286,7 @@
           <w:noProof/>
         </w:rPr>
       </w:pPr>
-      <w:hyperlink w:anchor="_Toc227445258" w:history="1">
+      <w:hyperlink w:anchor="_Toc227449158" w:history="1">
         <w:r>
           <w:rPr>
             <w:rStyle w:val="Hyperlink"/>
@@ -4689,7 +5348,7 @@
             <w:noProof/>
             <w:webHidden/>
           </w:rPr>
-          <w:instrText xml:space="preserve"> PAGEREF _Toc227445258 \h </w:instrText>
+          <w:instrText xml:space="preserve"> PAGEREF _Toc227449158 \h </w:instrText>
         </w:r>
         <w:r>
           <w:rPr>
@@ -4732,7 +5391,7 @@
           <w:noProof/>
         </w:rPr>
       </w:pPr>
-      <w:hyperlink w:anchor="_Toc227445259" w:history="1">
+      <w:hyperlink w:anchor="_Toc227449159" w:history="1">
         <w:r>
           <w:rPr>
             <w:rStyle w:val="Hyperlink"/>
@@ -4794,7 +5453,7 @@
             <w:noProof/>
             <w:webHidden/>
           </w:rPr>
-          <w:instrText xml:space="preserve"> PAGEREF _Toc227445259 \h </w:instrText>
+          <w:instrText xml:space="preserve"> PAGEREF _Toc227449159 \h </w:instrText>
         </w:r>
         <w:r>
           <w:rPr>
@@ -4837,7 +5496,7 @@
           <w:noProof/>
         </w:rPr>
       </w:pPr>
-      <w:hyperlink w:anchor="_Toc227445260" w:history="1">
+      <w:hyperlink w:anchor="_Toc227449160" w:history="1">
         <w:r>
           <w:rPr>
             <w:rStyle w:val="Hyperlink"/>
@@ -4899,7 +5558,7 @@
             <w:noProof/>
             <w:webHidden/>
           </w:rPr>
-          <w:instrText xml:space="preserve"> PAGEREF _Toc227445260 \h </w:instrText>
+          <w:instrText xml:space="preserve"> PAGEREF _Toc227449160 \h </w:instrText>
         </w:r>
         <w:r>
           <w:rPr>
@@ -4920,6 +5579,86 @@
             <w:webHidden/>
           </w:rPr>
           <w:t>25</w:t>
+        </w:r>
+        <w:r>
+          <w:rPr>
+            <w:noProof/>
+            <w:webHidden/>
+          </w:rPr>
+          <w:fldChar w:fldCharType="end"/>
+        </w:r>
+      </w:hyperlink>
+    </w:p>
+    <w:p>
+      <w:pPr>
+        <w:pStyle w:val="TableofFigures"/>
+        <w:tabs>
+          <w:tab w:val="right" w:leader="dot" w:pos="8778"/>
+        </w:tabs>
+        <w:spacing w:after="240"/>
+        <w:rPr>
+          <w:rFonts w:asciiTheme="minorHAnsi" w:eastAsiaTheme="minorEastAsia" w:hAnsiTheme="minorHAnsi" w:cstheme="minorBidi"/>
+          <w:noProof/>
+        </w:rPr>
+      </w:pPr>
+      <w:hyperlink w:anchor="_Toc227449161" w:history="1">
+        <w:r>
+          <w:rPr>
+            <w:rStyle w:val="Hyperlink"/>
+            <w:rFonts w:eastAsiaTheme="minorEastAsia"/>
+            <w:noProof/>
+          </w:rPr>
+          <w:t xml:space="preserve">Obr. 12: </w:t>
+        </w:r>
+        <w:r>
+          <w:rPr>
+            <w:rStyle w:val="Hyperlink"/>
+            <w:rFonts w:eastAsiaTheme="minorEastAsia"/>
+            <w:noProof/>
+            <w:lang w:val="sk-SK"/>
+          </w:rPr>
+          <w:t>Zjednodušený diagram konvolučnej neurónovej siete</w:t>
+        </w:r>
+        <w:r>
+          <w:rPr>
+            <w:noProof/>
+            <w:webHidden/>
+          </w:rPr>
+          <w:tab/>
+        </w:r>
+        <w:r>
+          <w:rPr>
+            <w:noProof/>
+            <w:webHidden/>
+          </w:rPr>
+          <w:fldChar w:fldCharType="begin"/>
+        </w:r>
+        <w:r>
+          <w:rPr>
+            <w:noProof/>
+            <w:webHidden/>
+          </w:rPr>
+          <w:instrText xml:space="preserve"> PAGEREF _Toc227449161 \h </w:instrText>
+        </w:r>
+        <w:r>
+          <w:rPr>
+            <w:noProof/>
+            <w:webHidden/>
+          </w:rPr>
+        </w:r>
+        <w:r>
+          <w:rPr>
+            <w:noProof/>
+            <w:webHidden/>
+          </w:rPr>
+          <w:fldChar w:fldCharType="separate"/>
+        </w:r>
+        <w:r>
+          <w:rPr>
+            <w:noProof/>
+            <w:webHidden/>
+          </w:rPr>
+          <w:t>29</w:t>
         </w:r>
         <w:r>
           <w:rPr>
@@ -4940,7 +5679,7 @@
         <w:lastRenderedPageBreak/>
         <w:fldChar w:fldCharType="end"/>
       </w:r>
-      <w:bookmarkStart w:id="5" w:name="_Toc227445263"/>
+      <w:bookmarkStart w:id="5" w:name="_Toc227449163"/>
       <w:r>
         <w:t>Zoznam tabuliek</w:t>
       </w:r>
@@ -5274,7 +6013,7 @@
         <w:lastRenderedPageBreak/>
         <w:fldChar w:fldCharType="end"/>
       </w:r>
-      <w:bookmarkStart w:id="6" w:name="_Toc227445264"/>
+      <w:bookmarkStart w:id="6" w:name="_Toc227449164"/>
       <w:r>
         <w:t>Zoznam značiek a skratiek</w:t>
       </w:r>
@@ -5438,158 +6177,176 @@
           <w:i/>
           <w:iCs/>
         </w:rPr>
-        <w:t xml:space="preserve">. </w:t>
+        <w:t>. D</w:t>
       </w:r>
       <w:r>
         <w:rPr>
           <w:i/>
           <w:iCs/>
         </w:rPr>
-        <w:t>D</w:t>
-      </w:r>
-      <w:r>
+        <w:t>irect Normal Irradiance</w:t>
+      </w:r>
+    </w:p>
+    <w:p>
+      <w:pPr>
+        <w:pStyle w:val="List"/>
         <w:rPr>
           <w:i/>
           <w:iCs/>
         </w:rPr>
-        <w:t>irect Normal Irradiance</w:t>
-      </w:r>
-    </w:p>
-    <w:p>
-      <w:pPr>
-        <w:pStyle w:val="List"/>
+      </w:pPr>
+      <w:r>
+        <w:t xml:space="preserve">DHI </w:t>
+      </w:r>
+      <w:r>
+        <w:rPr>
+          <w:rFonts w:eastAsiaTheme="minorEastAsia"/>
+          <w:iCs/>
+        </w:rPr>
+        <w:t>–</w:t>
+      </w:r>
+      <w:r>
+        <w:t xml:space="preserve"> </w:t>
+      </w:r>
+      <w:r>
+        <w:t>d</w:t>
+      </w:r>
+      <w:r>
+        <w:t xml:space="preserve">ifúzne horizontálne žiarenie </w:t>
+      </w:r>
+      <w:r>
+        <w:t>z angl.</w:t>
+      </w:r>
+      <w:r>
+        <w:t xml:space="preserve"> </w:t>
+      </w:r>
+      <w:r>
         <w:rPr>
           <w:i/>
           <w:iCs/>
         </w:rPr>
-      </w:pPr>
-      <w:r>
-        <w:t xml:space="preserve">DHI </w:t>
-      </w:r>
-      <w:r>
-        <w:rPr>
-          <w:rFonts w:eastAsiaTheme="minorEastAsia"/>
-          <w:iCs/>
-        </w:rPr>
-        <w:t>–</w:t>
-      </w:r>
-      <w:r>
-        <w:t xml:space="preserve"> </w:t>
-      </w:r>
-      <w:r>
-        <w:t>d</w:t>
-      </w:r>
-      <w:r>
-        <w:t xml:space="preserve">ifúzne horizontálne žiarenie </w:t>
-      </w:r>
-      <w:r>
-        <w:t>z</w:t>
-      </w:r>
-      <w:r>
-        <w:t> </w:t>
-      </w:r>
-      <w:r>
-        <w:t>angl</w:t>
-      </w:r>
-      <w:r>
-        <w:t>.</w:t>
-      </w:r>
-      <w:r>
-        <w:t xml:space="preserve"> </w:t>
-      </w:r>
-      <w:r>
+        <w:t>Diffuse Horizontal Irradiance</w:t>
+      </w:r>
+    </w:p>
+    <w:p>
+      <w:pPr>
+        <w:pStyle w:val="List"/>
+      </w:pPr>
+      <w:r>
+        <w:t>GW – gigawatt</w:t>
+      </w:r>
+    </w:p>
+    <w:p>
+      <w:pPr>
+        <w:pStyle w:val="List"/>
         <w:rPr>
           <w:i/>
           <w:iCs/>
         </w:rPr>
-        <w:t>Diffuse Horizontal Irradiance</w:t>
-      </w:r>
-    </w:p>
-    <w:p>
-      <w:pPr>
-        <w:pStyle w:val="List"/>
-      </w:pPr>
-      <w:r>
-        <w:t>GW – gigawatt</w:t>
-      </w:r>
-    </w:p>
-    <w:p>
-      <w:pPr>
-        <w:pStyle w:val="List"/>
+      </w:pPr>
+      <w:r>
+        <w:t xml:space="preserve">RGB – farebný priestor: červená, zelená, modrá z angl. </w:t>
+      </w:r>
+      <w:r>
         <w:rPr>
           <w:i/>
           <w:iCs/>
         </w:rPr>
-      </w:pPr>
-      <w:r>
-        <w:t xml:space="preserve">RGB – farebný priestor: červená, zelená, modrá z angl. </w:t>
-      </w:r>
-      <w:r>
+        <w:t>Red, Green, Blue</w:t>
+      </w:r>
+    </w:p>
+    <w:p>
+      <w:pPr>
+        <w:pStyle w:val="List"/>
         <w:rPr>
           <w:i/>
           <w:iCs/>
         </w:rPr>
-        <w:t>Red, Green, Blue</w:t>
-      </w:r>
-    </w:p>
-    <w:p>
-      <w:pPr>
-        <w:pStyle w:val="List"/>
+      </w:pPr>
+      <w:r>
+        <w:t xml:space="preserve">HSV – farebný priestor: odtieň, sýtosť, jase z angl. </w:t>
+      </w:r>
+      <w:r>
         <w:rPr>
           <w:i/>
           <w:iCs/>
         </w:rPr>
-      </w:pPr>
-      <w:r>
-        <w:t xml:space="preserve">HSV – farebný priestor: odtieň, sýtosť, jase z angl. </w:t>
-      </w:r>
-      <w:r>
+        <w:t>Hue, Saturation, Value</w:t>
+      </w:r>
+    </w:p>
+    <w:p>
+      <w:pPr>
+        <w:pStyle w:val="List"/>
         <w:rPr>
           <w:i/>
           <w:iCs/>
         </w:rPr>
-        <w:t>Hue, Saturation, Value</w:t>
-      </w:r>
-    </w:p>
-    <w:p>
-      <w:pPr>
-        <w:pStyle w:val="List"/>
+      </w:pPr>
+      <w:r>
+        <w:t>YCrCb – farebný priestor:</w:t>
+      </w:r>
+      <w:r>
+        <w:t xml:space="preserve"> jas, červená zložka, modrá zložka z angl.</w:t>
+      </w:r>
+      <w:r>
         <w:rPr>
           <w:i/>
           <w:iCs/>
         </w:rPr>
-      </w:pPr>
-      <w:r>
-        <w:t>YCrCb – farebný priestor:</w:t>
-      </w:r>
-      <w:r>
-        <w:t xml:space="preserve"> jas, červená zložka, modrá zložka z angl.</w:t>
-      </w:r>
-      <w:r>
+        <w:t xml:space="preserve"> Luma, Chroma Red, Chroma Blue</w:t>
+      </w:r>
+    </w:p>
+    <w:p>
+      <w:pPr>
+        <w:pStyle w:val="List"/>
         <w:rPr>
           <w:i/>
           <w:iCs/>
         </w:rPr>
-        <w:t xml:space="preserve"> Luma, Chroma Red, Chroma Blue</w:t>
-      </w:r>
-    </w:p>
-    <w:p>
-      <w:pPr>
-        <w:pStyle w:val="List"/>
+      </w:pPr>
+      <w:r>
+        <w:t xml:space="preserve">CMYK – farebný priestor: azúrová, purpurová, žltá, čierna z angl. </w:t>
+      </w:r>
+      <w:r>
         <w:rPr>
           <w:i/>
           <w:iCs/>
         </w:rPr>
-      </w:pPr>
-      <w:r>
-        <w:t xml:space="preserve">CMYK – farebný priestor: azúrová, purpurová, žltá, čierna z angl. </w:t>
+        <w:t>Cyan, Magenta, Yellow, Key/Black</w:t>
+      </w:r>
+    </w:p>
+    <w:p>
+      <w:pPr>
+        <w:pStyle w:val="List"/>
+        <w:rPr>
+          <w:lang w:val="sk-SK"/>
+        </w:rPr>
+      </w:pPr>
+      <w:r>
+        <w:rPr>
+          <w:lang w:val="sk-SK"/>
+        </w:rPr>
+        <w:t xml:space="preserve">SIFT – </w:t>
+      </w:r>
+      <w:r>
+        <w:rPr>
+          <w:lang w:val="sk-SK"/>
+        </w:rPr>
+        <w:t>i</w:t>
+      </w:r>
+      <w:r>
+        <w:rPr>
+          <w:lang w:val="sk-SK"/>
+        </w:rPr>
+        <w:t xml:space="preserve">nvariantná transformácia príznakov voči mierke z angl. </w:t>
       </w:r>
       <w:r>
         <w:rPr>
           <w:i/>
           <w:iCs/>
-        </w:rPr>
-        <w:t>Cyan, Magenta, Yellow, Key/Black</w:t>
+          <w:lang w:val="sk-SK"/>
+        </w:rPr>
+        <w:t>Scale-Invariant Feature Transform</w:t>
       </w:r>
     </w:p>
     <w:p>
@@ -5598,17 +6355,164 @@
         <w:rPr>
           <w:i/>
           <w:iCs/>
-        </w:rPr>
-      </w:pPr>
+          <w:lang w:val="sk-SK"/>
+        </w:rPr>
+      </w:pPr>
+      <w:r>
+        <w:rPr>
+          <w:lang w:val="sk-SK"/>
+        </w:rPr>
+        <w:t xml:space="preserve">SURF </w:t>
+      </w:r>
+      <w:r>
+        <w:rPr>
+          <w:lang w:val="sk-SK"/>
+        </w:rPr>
+        <w:t>–</w:t>
+      </w:r>
+      <w:r>
+        <w:rPr>
+          <w:lang w:val="sk-SK"/>
+        </w:rPr>
+        <w:t xml:space="preserve"> </w:t>
+      </w:r>
+      <w:r>
+        <w:rPr>
+          <w:lang w:val="sk-SK"/>
+        </w:rPr>
+        <w:t xml:space="preserve">zrýchlené robustné príznaky z angl. </w:t>
+      </w:r>
+      <w:r>
+        <w:rPr>
+          <w:i/>
+          <w:iCs/>
+          <w:lang w:val="sk-SK"/>
+        </w:rPr>
+        <w:t>Speeded-Up Robust Features</w:t>
+      </w:r>
     </w:p>
     <w:p>
       <w:pPr>
         <w:pStyle w:val="List"/>
+        <w:rPr>
+          <w:i/>
+          <w:iCs/>
+          <w:lang w:val="sk-SK"/>
+        </w:rPr>
+      </w:pPr>
+      <w:r>
+        <w:rPr>
+          <w:lang w:val="sk-SK"/>
+        </w:rPr>
+        <w:t>FAST</w:t>
+      </w:r>
+      <w:r>
+        <w:rPr>
+          <w:lang w:val="sk-SK"/>
+        </w:rPr>
+        <w:t xml:space="preserve"> – príznaky zrýchleného segmentového testu  z angl. </w:t>
+      </w:r>
+      <w:r>
+        <w:rPr>
+          <w:i/>
+          <w:iCs/>
+          <w:lang w:val="sk-SK"/>
+        </w:rPr>
+        <w:t>Features from Accelerated Segment Test</w:t>
+      </w:r>
+    </w:p>
+    <w:p>
+      <w:pPr>
+        <w:pStyle w:val="List"/>
+        <w:rPr>
+          <w:i/>
+          <w:iCs/>
+          <w:lang w:val="sk-SK"/>
+        </w:rPr>
+      </w:pPr>
+      <w:r>
+        <w:rPr>
+          <w:lang w:val="sk-SK"/>
+        </w:rPr>
+        <w:t>SVM – metóda podporných vektorov z angl</w:t>
+      </w:r>
+      <w:r>
+        <w:rPr>
+          <w:i/>
+          <w:iCs/>
+          <w:lang w:val="sk-SK"/>
+        </w:rPr>
+        <w:t>. Support Vector Machine</w:t>
+      </w:r>
+    </w:p>
+    <w:p>
+      <w:pPr>
+        <w:pStyle w:val="List"/>
+        <w:rPr>
+          <w:i/>
+          <w:iCs/>
+          <w:lang w:val="sk-SK"/>
+        </w:rPr>
+      </w:pPr>
+      <w:r>
+        <w:rPr>
+          <w:lang w:val="sk-SK"/>
+        </w:rPr>
+        <w:t xml:space="preserve">KNN </w:t>
+      </w:r>
+      <w:r>
+        <w:rPr>
+          <w:lang w:val="sk-SK"/>
+        </w:rPr>
+        <w:t>–</w:t>
+      </w:r>
+      <w:r>
+        <w:rPr>
+          <w:lang w:val="sk-SK"/>
+        </w:rPr>
+        <w:t xml:space="preserve"> </w:t>
+      </w:r>
+      <w:r>
+        <w:rPr>
+          <w:lang w:val="sk-SK"/>
+        </w:rPr>
+        <w:t xml:space="preserve">k-najbližších susedov z angl. </w:t>
+      </w:r>
+      <w:r>
+        <w:rPr>
+          <w:i/>
+          <w:iCs/>
+          <w:lang w:val="sk-SK"/>
+        </w:rPr>
+        <w:t>K-Nearest Neighbors</w:t>
+      </w:r>
+    </w:p>
+    <w:p>
+      <w:pPr>
+        <w:pStyle w:val="List"/>
+        <w:rPr>
+          <w:rFonts w:eastAsiaTheme="minorEastAsia"/>
+          <w:i/>
+          <w:iCs/>
+          <w:lang w:val="sk-SK"/>
+        </w:rPr>
+      </w:pPr>
+      <w:r>
         <w:rPr>
           <w:rFonts w:eastAsiaTheme="minorEastAsia"/>
           <w:lang w:val="sk-SK"/>
         </w:rPr>
-      </w:pPr>
+        <w:t xml:space="preserve">CNN – konvolučné neurónové siete z angl. </w:t>
+      </w:r>
+      <w:r>
+        <w:rPr>
+          <w:rFonts w:eastAsiaTheme="minorEastAsia"/>
+          <w:i/>
+          <w:iCs/>
+          <w:lang w:val="sk-SK"/>
+        </w:rPr>
+        <w:t xml:space="preserve">Convolutional Neural Network </w:t>
+      </w:r>
     </w:p>
     <w:p/>
     <w:p>
@@ -5618,7 +6522,7 @@
       </w:pPr>
       <w:bookmarkStart w:id="7" w:name="_Toc173791394"/>
       <w:bookmarkStart w:id="8" w:name="_Toc173791533"/>
-      <w:bookmarkStart w:id="9" w:name="_Toc227445265"/>
+      <w:bookmarkStart w:id="9" w:name="_Toc227449165"/>
       <w:r>
         <w:lastRenderedPageBreak/>
         <w:t>Úvod</w:t>
@@ -5838,7 +6742,7 @@
       <w:r>
         <w:fldChar w:fldCharType="end"/>
       </w:r>
-      <w:bookmarkStart w:id="11" w:name="_Toc227445266"/>
+      <w:bookmarkStart w:id="11" w:name="_Toc227449166"/>
       <w:r>
         <w:t>Slnečné žiarenie a jeho význam</w:t>
       </w:r>
@@ -5849,7 +6753,7 @@
         <w:pStyle w:val="Heading2"/>
         <w:spacing w:before="480" w:after="240"/>
       </w:pPr>
-      <w:bookmarkStart w:id="12" w:name="_Toc227445267"/>
+      <w:bookmarkStart w:id="12" w:name="_Toc227449167"/>
       <w:r>
         <w:t>Charakteristika slnečného žiarenia</w:t>
       </w:r>
@@ -5894,7 +6798,7 @@
         <w:pStyle w:val="Heading2"/>
         <w:spacing w:before="480" w:after="240"/>
       </w:pPr>
-      <w:bookmarkStart w:id="13" w:name="_Toc227445268"/>
+      <w:bookmarkStart w:id="13" w:name="_Toc227449168"/>
       <w:r>
         <w:t>Význam a využitie v energetike</w:t>
       </w:r>
@@ -6036,7 +6940,7 @@
           <w14:ligatures w14:val="standardContextual"/>
         </w:rPr>
       </w:pPr>
-      <w:bookmarkStart w:id="14" w:name="_Toc227445250"/>
+      <w:bookmarkStart w:id="14" w:name="_Toc227449150"/>
       <w:r>
         <w:t xml:space="preserve">Obr. </w:t>
       </w:r>
@@ -6141,7 +7045,7 @@
           <w14:ligatures w14:val="standardContextual"/>
         </w:rPr>
       </w:pPr>
-      <w:bookmarkStart w:id="15" w:name="_Toc227445251"/>
+      <w:bookmarkStart w:id="15" w:name="_Toc227449151"/>
       <w:r>
         <w:t xml:space="preserve">Obr. </w:t>
       </w:r>
@@ -6170,10 +7074,7 @@
         <w:t>:</w:t>
       </w:r>
       <w:r>
-        <w:t xml:space="preserve"> </w:t>
-      </w:r>
-      <w:r>
-        <w:t xml:space="preserve">Nárast kapacity obnoviteľných zdrojov energie v GW </w:t>
+        <w:t xml:space="preserve"> Nárast kapacity obnoviteľných zdrojov energie v GW </w:t>
       </w:r>
       <w:r>
         <w:t>[2]</w:t>
@@ -6241,7 +7142,7 @@
         <w:pStyle w:val="Heading2"/>
         <w:spacing w:before="480" w:after="240"/>
       </w:pPr>
-      <w:bookmarkStart w:id="16" w:name="_Toc227445269"/>
+      <w:bookmarkStart w:id="16" w:name="_Toc227449169"/>
       <w:r>
         <w:t>Meranie slnečného žiarenia</w:t>
       </w:r>
@@ -6301,7 +7202,7 @@
       <w:r>
         <w:fldChar w:fldCharType="end"/>
       </w:r>
-      <w:bookmarkStart w:id="17" w:name="_Toc227445270"/>
+      <w:bookmarkStart w:id="17" w:name="_Toc227449170"/>
       <w:r>
         <w:t>Celooblohové zobrazovacie systémy</w:t>
       </w:r>
@@ -6354,7 +7255,7 @@
         <w:pStyle w:val="Heading2"/>
         <w:spacing w:before="480" w:after="240"/>
       </w:pPr>
-      <w:bookmarkStart w:id="18" w:name="_Toc227445271"/>
+      <w:bookmarkStart w:id="18" w:name="_Toc227449171"/>
       <w:r>
         <w:t>Fisheye kamery</w:t>
       </w:r>
@@ -6380,7 +7281,7 @@
         <w:pStyle w:val="Heading2"/>
         <w:spacing w:before="480" w:after="240"/>
       </w:pPr>
-      <w:bookmarkStart w:id="19" w:name="_Toc227445272"/>
+      <w:bookmarkStart w:id="19" w:name="_Toc227449172"/>
       <w:r>
         <w:t>Geometrické skreslenie a charakteristiky obrazu</w:t>
       </w:r>
@@ -6519,7 +7420,7 @@
           <w14:ligatures w14:val="standardContextual"/>
         </w:rPr>
       </w:pPr>
-      <w:bookmarkStart w:id="20" w:name="_Toc227445252"/>
+      <w:bookmarkStart w:id="20" w:name="_Toc227449152"/>
       <w:r>
         <w:t xml:space="preserve">Obr. </w:t>
       </w:r>
@@ -6605,7 +7506,7 @@
       <w:r>
         <w:fldChar w:fldCharType="end"/>
       </w:r>
-      <w:bookmarkStart w:id="21" w:name="_Toc227445273"/>
+      <w:bookmarkStart w:id="21" w:name="_Toc227449173"/>
       <w:r>
         <w:t>Predspracovanie obrazových dát</w:t>
       </w:r>
@@ -6616,7 +7517,7 @@
         <w:pStyle w:val="Heading2"/>
         <w:spacing w:before="480" w:after="240"/>
       </w:pPr>
-      <w:bookmarkStart w:id="22" w:name="_Toc227445274"/>
+      <w:bookmarkStart w:id="22" w:name="_Toc227449174"/>
       <w:r>
         <w:t>Základný postup predspracovania</w:t>
       </w:r>
@@ -6703,7 +7604,7 @@
       <w:pPr>
         <w:pStyle w:val="Heading3"/>
       </w:pPr>
-      <w:bookmarkStart w:id="23" w:name="_Toc227445275"/>
+      <w:bookmarkStart w:id="23" w:name="_Toc227449175"/>
       <w:r>
         <w:t>Zmena veľkosti obrazu</w:t>
       </w:r>
@@ -6728,7 +7629,7 @@
       <w:pPr>
         <w:pStyle w:val="Heading3"/>
       </w:pPr>
-      <w:bookmarkStart w:id="24" w:name="_Toc227445276"/>
+      <w:bookmarkStart w:id="24" w:name="_Toc227449176"/>
       <w:r>
         <w:t>Transformácia farebného obrazu</w:t>
       </w:r>
@@ -6838,7 +7739,7 @@
       <w:pPr>
         <w:pStyle w:val="Heading3"/>
       </w:pPr>
-      <w:bookmarkStart w:id="25" w:name="_Toc227445277"/>
+      <w:bookmarkStart w:id="25" w:name="_Toc227449177"/>
       <w:r>
         <w:lastRenderedPageBreak/>
         <w:t>Farebné priestory – RGB</w:t>
@@ -6950,7 +7851,7 @@
           <w14:ligatures w14:val="standardContextual"/>
         </w:rPr>
       </w:pPr>
-      <w:bookmarkStart w:id="26" w:name="_Toc227445253"/>
+      <w:bookmarkStart w:id="26" w:name="_Toc227449153"/>
       <w:r>
         <w:t xml:space="preserve">Obr. </w:t>
       </w:r>
@@ -6999,12 +7900,9 @@
       <w:pPr>
         <w:pStyle w:val="Heading3"/>
       </w:pPr>
-      <w:bookmarkStart w:id="27" w:name="_Toc227445278"/>
-      <w:r>
-        <w:t xml:space="preserve">Farebné priestory – </w:t>
-      </w:r>
-      <w:r>
-        <w:t>HSV</w:t>
+      <w:bookmarkStart w:id="27" w:name="_Toc227449178"/>
+      <w:r>
+        <w:t>Farebné priestory – HSV</w:t>
       </w:r>
       <w:bookmarkEnd w:id="27"/>
     </w:p>
@@ -7107,7 +8005,7 @@
           <w14:ligatures w14:val="standardContextual"/>
         </w:rPr>
       </w:pPr>
-      <w:bookmarkStart w:id="28" w:name="_Toc227445254"/>
+      <w:bookmarkStart w:id="28" w:name="_Toc227449154"/>
       <w:r>
         <w:t xml:space="preserve">Obr. </w:t>
       </w:r>
@@ -7159,12 +8057,9 @@
       <w:pPr>
         <w:pStyle w:val="Heading3"/>
       </w:pPr>
-      <w:bookmarkStart w:id="29" w:name="_Toc227445279"/>
-      <w:r>
-        <w:t xml:space="preserve">Farebné priestory – </w:t>
-      </w:r>
-      <w:r>
-        <w:t>YCrCb</w:t>
+      <w:bookmarkStart w:id="29" w:name="_Toc227449179"/>
+      <w:r>
+        <w:t>Farebné priestory – YCrCb</w:t>
       </w:r>
       <w:bookmarkEnd w:id="29"/>
     </w:p>
@@ -7456,7 +8351,7 @@
           <w14:ligatures w14:val="standardContextual"/>
         </w:rPr>
       </w:pPr>
-      <w:bookmarkStart w:id="30" w:name="_Toc227445255"/>
+      <w:bookmarkStart w:id="30" w:name="_Toc227449155"/>
       <w:r>
         <w:t xml:space="preserve">Obr. </w:t>
       </w:r>
@@ -7485,10 +8380,7 @@
         <w:t xml:space="preserve">: </w:t>
       </w:r>
       <w:r>
-        <w:t>Vzorový obrázok a jeho Y, Cb a Cr zložky</w:t>
-      </w:r>
-      <w:r>
-        <w:t xml:space="preserve"> </w:t>
+        <w:t xml:space="preserve">Vzorový obrázok a jeho Y, Cb a Cr zložky </w:t>
       </w:r>
       <w:r>
         <w:t>[</w:t>
@@ -7505,12 +8397,9 @@
       <w:pPr>
         <w:pStyle w:val="Heading3"/>
       </w:pPr>
-      <w:bookmarkStart w:id="31" w:name="_Toc227445280"/>
-      <w:r>
-        <w:t xml:space="preserve">Farebné priestory – </w:t>
-      </w:r>
-      <w:r>
-        <w:t>CMYK</w:t>
+      <w:bookmarkStart w:id="31" w:name="_Toc227449180"/>
+      <w:r>
+        <w:t>Farebné priestory – CMYK</w:t>
       </w:r>
       <w:bookmarkEnd w:id="31"/>
     </w:p>
@@ -7636,7 +8525,7 @@
       <w:pPr>
         <w:pStyle w:val="Caption"/>
       </w:pPr>
-      <w:bookmarkStart w:id="32" w:name="_Toc227445256"/>
+      <w:bookmarkStart w:id="32" w:name="_Toc227449156"/>
       <w:r>
         <w:t xml:space="preserve">Obr. </w:t>
       </w:r>
@@ -7665,13 +8554,7 @@
         <w:t xml:space="preserve">: </w:t>
       </w:r>
       <w:r>
-        <w:t xml:space="preserve">Vizualizácia </w:t>
-      </w:r>
-      <w:r>
-        <w:t>CMYK</w:t>
-      </w:r>
-      <w:r>
-        <w:t xml:space="preserve"> farebného priestoru </w:t>
+        <w:t xml:space="preserve">Vizualizácia CMYK farebného priestoru </w:t>
       </w:r>
       <w:r>
         <w:t>[</w:t>
@@ -7688,7 +8571,7 @@
       <w:pPr>
         <w:pStyle w:val="Heading3"/>
       </w:pPr>
-      <w:bookmarkStart w:id="33" w:name="_Toc227445281"/>
+      <w:bookmarkStart w:id="33" w:name="_Toc227449181"/>
       <w:r>
         <w:t>Normalizácia dát</w:t>
       </w:r>
@@ -7731,7 +8614,7 @@
       <w:pPr>
         <w:pStyle w:val="Heading3"/>
       </w:pPr>
-      <w:bookmarkStart w:id="34" w:name="_Toc227445282"/>
+      <w:bookmarkStart w:id="34" w:name="_Toc227449182"/>
       <w:r>
         <w:lastRenderedPageBreak/>
         <w:t>Výber kanálu</w:t>
@@ -7761,7 +8644,7 @@
         <w:pStyle w:val="Heading2"/>
         <w:spacing w:before="480" w:after="240"/>
       </w:pPr>
-      <w:bookmarkStart w:id="35" w:name="_Toc227445283"/>
+      <w:bookmarkStart w:id="35" w:name="_Toc227449183"/>
       <w:r>
         <w:t>Dátové augmentácie</w:t>
       </w:r>
@@ -7805,10 +8688,7 @@
         <w:jc w:val="both"/>
       </w:pPr>
       <w:r>
-        <w:t>g</w:t>
-      </w:r>
-      <w:r>
-        <w:t>eometrické</w:t>
+        <w:t>geometrické</w:t>
       </w:r>
     </w:p>
     <w:p>
@@ -7844,12 +8724,9 @@
         <w:pStyle w:val="Heading2"/>
         <w:spacing w:before="480" w:after="240"/>
       </w:pPr>
-      <w:bookmarkStart w:id="36" w:name="_Toc227445284"/>
-      <w:r>
-        <w:t>Geometrické</w:t>
-      </w:r>
-      <w:r>
-        <w:t xml:space="preserve"> augmentácie</w:t>
+      <w:bookmarkStart w:id="36" w:name="_Toc227449184"/>
+      <w:r>
+        <w:t>Geometrické augmentácie</w:t>
       </w:r>
       <w:bookmarkEnd w:id="36"/>
     </w:p>
@@ -7866,7 +8743,7 @@
       <w:pPr>
         <w:pStyle w:val="Heading3"/>
       </w:pPr>
-      <w:bookmarkStart w:id="37" w:name="_Toc227445285"/>
+      <w:bookmarkStart w:id="37" w:name="_Toc227449185"/>
       <w:r>
         <w:t>Rotácia</w:t>
       </w:r>
@@ -7888,7 +8765,7 @@
           <w:lang w:val="sk-SK"/>
         </w:rPr>
       </w:pPr>
-      <w:bookmarkStart w:id="38" w:name="_Toc227445286"/>
+      <w:bookmarkStart w:id="38" w:name="_Toc227449186"/>
       <w:r>
         <w:rPr>
           <w:lang w:val="sk-SK"/>
@@ -7919,7 +8796,7 @@
           <w:lang w:val="sk-SK"/>
         </w:rPr>
       </w:pPr>
-      <w:bookmarkStart w:id="39" w:name="_Toc227445287"/>
+      <w:bookmarkStart w:id="39" w:name="_Toc227449187"/>
       <w:r>
         <w:rPr>
           <w:lang w:val="sk-SK"/>
@@ -7961,7 +8838,7 @@
           <w:lang w:val="sk-SK"/>
         </w:rPr>
       </w:pPr>
-      <w:bookmarkStart w:id="40" w:name="_Toc227445288"/>
+      <w:bookmarkStart w:id="40" w:name="_Toc227449188"/>
       <w:r>
         <w:rPr>
           <w:lang w:val="sk-SK"/>
@@ -7985,7 +8862,7 @@
         <w:pStyle w:val="Heading2"/>
         <w:spacing w:before="480" w:after="240"/>
       </w:pPr>
-      <w:bookmarkStart w:id="41" w:name="_Toc227445289"/>
+      <w:bookmarkStart w:id="41" w:name="_Toc227449189"/>
       <w:r>
         <w:rPr>
           <w:lang w:val="sk-SK"/>
@@ -8013,7 +8890,7 @@
           <w:lang w:val="sk-SK"/>
         </w:rPr>
       </w:pPr>
-      <w:bookmarkStart w:id="42" w:name="_Toc227445290"/>
+      <w:bookmarkStart w:id="42" w:name="_Toc227449190"/>
       <w:r>
         <w:rPr>
           <w:lang w:val="sk-SK"/>
@@ -8038,7 +8915,7 @@
           <w:lang w:val="sk-SK"/>
         </w:rPr>
       </w:pPr>
-      <w:bookmarkStart w:id="43" w:name="_Toc227445291"/>
+      <w:bookmarkStart w:id="43" w:name="_Toc227449191"/>
       <w:r>
         <w:rPr>
           <w:lang w:val="sk-SK"/>
@@ -8063,7 +8940,7 @@
           <w:lang w:val="sk-SK"/>
         </w:rPr>
       </w:pPr>
-      <w:bookmarkStart w:id="44" w:name="_Toc227445292"/>
+      <w:bookmarkStart w:id="44" w:name="_Toc227449192"/>
       <w:r>
         <w:rPr>
           <w:lang w:val="sk-SK"/>
@@ -8201,7 +9078,7 @@
       <w:pPr>
         <w:pStyle w:val="Caption"/>
       </w:pPr>
-      <w:bookmarkStart w:id="45" w:name="_Toc227445257"/>
+      <w:bookmarkStart w:id="45" w:name="_Toc227449157"/>
       <w:r>
         <w:t xml:space="preserve">Obr. </w:t>
       </w:r>
@@ -8257,7 +9134,7 @@
         <w:pStyle w:val="Heading2"/>
         <w:spacing w:before="480" w:after="240"/>
       </w:pPr>
-      <w:bookmarkStart w:id="46" w:name="_Toc227445293"/>
+      <w:bookmarkStart w:id="46" w:name="_Toc227449193"/>
       <w:r>
         <w:rPr>
           <w:lang w:val="sk-SK"/>
@@ -8283,7 +9160,7 @@
           <w:lang w:val="sk-SK"/>
         </w:rPr>
       </w:pPr>
-      <w:bookmarkStart w:id="47" w:name="_Toc227445294"/>
+      <w:bookmarkStart w:id="47" w:name="_Toc227449194"/>
       <w:r>
         <w:rPr>
           <w:lang w:val="sk-SK"/>
@@ -8309,7 +9186,7 @@
           <w:lang w:val="sk-SK"/>
         </w:rPr>
       </w:pPr>
-      <w:bookmarkStart w:id="48" w:name="_Toc227445295"/>
+      <w:bookmarkStart w:id="48" w:name="_Toc227449195"/>
       <w:r>
         <w:rPr>
           <w:lang w:val="sk-SK"/>
@@ -8343,7 +9220,7 @@
           <w:lang w:val="sk-SK"/>
         </w:rPr>
       </w:pPr>
-      <w:bookmarkStart w:id="49" w:name="_Toc227445296"/>
+      <w:bookmarkStart w:id="49" w:name="_Toc227449196"/>
       <w:r>
         <w:rPr>
           <w:lang w:val="sk-SK"/>
@@ -8424,7 +9301,7 @@
       <w:pPr>
         <w:pStyle w:val="Caption"/>
       </w:pPr>
-      <w:bookmarkStart w:id="50" w:name="_Toc227445258"/>
+      <w:bookmarkStart w:id="50" w:name="_Toc227449158"/>
       <w:r>
         <w:t xml:space="preserve">Obr. </w:t>
       </w:r>
@@ -8456,42 +9333,36 @@
         <w:rPr>
           <w:lang w:val="sk-SK"/>
         </w:rPr>
-        <w:t>Príklad obrázka po aplikova</w:t>
+        <w:t>Príklad obrázka po aplikovaní augmentácie, ktorá pridá do originálu šum</w:t>
       </w:r>
       <w:r>
         <w:rPr>
           <w:lang w:val="sk-SK"/>
         </w:rPr>
-        <w:t>ní augmentácie, ktorá pridá do originálu šum</w:t>
+        <w:t xml:space="preserve"> </w:t>
+      </w:r>
+      <w:r>
+        <w:t>[</w:t>
       </w:r>
       <w:r>
         <w:rPr>
           <w:lang w:val="sk-SK"/>
         </w:rPr>
-        <w:t xml:space="preserve"> </w:t>
-      </w:r>
-      <w:r>
-        <w:t>[</w:t>
-      </w:r>
-      <w:r>
+        <w:t>9</w:t>
+      </w:r>
+      <w:r>
+        <w:t>]</w:t>
+      </w:r>
+      <w:bookmarkEnd w:id="50"/>
+    </w:p>
+    <w:p>
+      <w:pPr>
+        <w:pStyle w:val="Heading3"/>
         <w:rPr>
           <w:lang w:val="sk-SK"/>
         </w:rPr>
-        <w:t>9</w:t>
-      </w:r>
-      <w:r>
-        <w:t>]</w:t>
-      </w:r>
-      <w:bookmarkEnd w:id="50"/>
-    </w:p>
-    <w:p>
-      <w:pPr>
-        <w:pStyle w:val="Heading3"/>
-        <w:rPr>
-          <w:lang w:val="sk-SK"/>
-        </w:rPr>
-      </w:pPr>
-      <w:bookmarkStart w:id="51" w:name="_Toc227445297"/>
+      </w:pPr>
+      <w:bookmarkStart w:id="51" w:name="_Toc227449197"/>
       <w:r>
         <w:rPr>
           <w:lang w:val="sk-SK"/>
@@ -8572,7 +9443,7 @@
       <w:pPr>
         <w:pStyle w:val="Caption"/>
       </w:pPr>
-      <w:bookmarkStart w:id="52" w:name="_Toc227445259"/>
+      <w:bookmarkStart w:id="52" w:name="_Toc227449159"/>
       <w:r>
         <w:t xml:space="preserve">Obr. </w:t>
       </w:r>
@@ -8604,13 +9475,7 @@
         <w:rPr>
           <w:lang w:val="sk-SK"/>
         </w:rPr>
-        <w:t xml:space="preserve">Príklad obrázka po aplikovaní </w:t>
-      </w:r>
-      <w:r>
-        <w:rPr>
-          <w:lang w:val="sk-SK"/>
-        </w:rPr>
-        <w:t>CutMix augmentácie</w:t>
+        <w:t>Príklad obrázka po aplikovaní CutMix augmentácie</w:t>
       </w:r>
       <w:r>
         <w:rPr>
@@ -8645,7 +9510,7 @@
           <w:lang w:val="sk-SK"/>
         </w:rPr>
       </w:pPr>
-      <w:bookmarkStart w:id="53" w:name="_Toc227445298"/>
+      <w:bookmarkStart w:id="53" w:name="_Toc227449198"/>
       <w:r>
         <w:rPr>
           <w:lang w:val="sk-SK"/>
@@ -8727,7 +9592,7 @@
       <w:pPr>
         <w:pStyle w:val="Caption"/>
       </w:pPr>
-      <w:bookmarkStart w:id="54" w:name="_Toc227445260"/>
+      <w:bookmarkStart w:id="54" w:name="_Toc227449160"/>
       <w:r>
         <w:t xml:space="preserve">Obr. </w:t>
       </w:r>
@@ -8759,19 +9624,7 @@
         <w:rPr>
           <w:lang w:val="sk-SK"/>
         </w:rPr>
-        <w:t>Príklad obrázka po aplikovaní augmentácie</w:t>
-      </w:r>
-      <w:r>
-        <w:rPr>
-          <w:lang w:val="sk-SK"/>
-        </w:rPr>
-        <w:t xml:space="preserve"> typu oklúzia</w:t>
-      </w:r>
-      <w:r>
-        <w:rPr>
-          <w:lang w:val="sk-SK"/>
-        </w:rPr>
-        <w:t xml:space="preserve"> </w:t>
+        <w:t xml:space="preserve">Príklad obrázka po aplikovaní augmentácie typu oklúzia </w:t>
       </w:r>
       <w:r>
         <w:t>[</w:t>
@@ -8795,6 +9648,9 @@
           <w:numId w:val="36"/>
         </w:numPr>
         <w:spacing w:after="480"/>
+        <w:rPr>
+          <w:lang w:val="sk-SK"/>
+        </w:rPr>
       </w:pPr>
       <w:r>
         <w:lastRenderedPageBreak/>
@@ -8806,72 +9662,794 @@
       <w:r>
         <w:fldChar w:fldCharType="end"/>
       </w:r>
-      <w:bookmarkStart w:id="55" w:name="_Toc227445299"/>
+      <w:bookmarkStart w:id="55" w:name="_Toc227449199"/>
       <w:r>
         <w:rPr>
           <w:lang w:val="sk-SK"/>
         </w:rPr>
-        <w:t>Metódy strojového učenia pre odhad slnečného žiarenia</w:t>
+        <w:t>Predikcia</w:t>
+      </w:r>
+      <w:r>
+        <w:rPr>
+          <w:lang w:val="sk-SK"/>
+        </w:rPr>
+        <w:t xml:space="preserve"> slnečného žiarenia</w:t>
       </w:r>
       <w:bookmarkEnd w:id="55"/>
     </w:p>
     <w:p>
       <w:pPr>
-        <w:pStyle w:val="Bezodsadenia"/>
-      </w:pPr>
-    </w:p>
-    <w:p>
-      <w:pPr>
-        <w:pStyle w:val="Bezodsadenia"/>
-      </w:pPr>
+        <w:pStyle w:val="Heading2"/>
+        <w:spacing w:before="480" w:after="240"/>
+      </w:pPr>
+      <w:bookmarkStart w:id="56" w:name="_Toc227449200"/>
+      <w:r>
+        <w:rPr>
+          <w:lang w:val="sk-SK"/>
+        </w:rPr>
+        <w:t>Tradičné prístupu a moderné metódy</w:t>
+      </w:r>
+      <w:bookmarkEnd w:id="56"/>
     </w:p>
     <w:p>
       <w:pPr>
         <w:spacing w:line="312" w:lineRule="auto"/>
         <w:jc w:val="both"/>
-      </w:pPr>
+        <w:rPr>
+          <w:lang w:val="sk-SK"/>
+        </w:rPr>
+      </w:pPr>
+      <w:r>
+        <w:t>Predikcia solárnej energie je spojená s vysokou mierou neistoty, čo predstavuje zásadnú výzvu pri zabezpečovaní spoľahlivej výroby elektrickej energie. Pre výber vhodného modelu je nevyhnutné využívať dostupné meteorologické údaje, testovať a porovnávať viaceré prístupy a dôkladne hodnotiť ich presnosť v konkrétnych podmienkach danej lokality. Neustály vývoj v oblasti spracovania dát prináša nové stratégie a prístupy, ktorých cieľom je znížiť mieru nepresnosti a zvýšiť spoľahlivosť predikcie. Tradičné štatistické metódy sú často založené na diferenciálnych výpočtoch a analytických modeloch, zatiaľ čo dostupnosť rozsiahlych databáz meteorologických meraní umožnila nasadenie metód umelej inteligencie, využívaných na výpočet a predikciu intenzity solárneho žiarenia [</w:t>
+      </w:r>
+      <w:r>
+        <w:rPr>
+          <w:lang w:val="sk-SK"/>
+        </w:rPr>
+        <w:t>10</w:t>
+      </w:r>
+      <w:r>
+        <w:t>]</w:t>
+      </w:r>
+      <w:r>
+        <w:rPr>
+          <w:lang w:val="sk-SK"/>
+        </w:rPr>
+        <w:t>.</w:t>
+      </w:r>
+    </w:p>
+    <w:p>
+      <w:pPr>
+        <w:pStyle w:val="Heading3"/>
+      </w:pPr>
+      <w:bookmarkStart w:id="57" w:name="_Toc227449201"/>
+      <w:r>
+        <w:rPr>
+          <w:lang w:val="sk-SK"/>
+        </w:rPr>
+        <w:t>Model perzistencie</w:t>
+      </w:r>
+      <w:bookmarkEnd w:id="57"/>
     </w:p>
     <w:p>
       <w:pPr>
         <w:spacing w:line="312" w:lineRule="auto"/>
         <w:jc w:val="both"/>
-      </w:pPr>
+        <w:rPr>
+          <w:lang w:val="sk-SK"/>
+        </w:rPr>
+      </w:pPr>
+      <w:r>
+        <w:t>Medzi najjednoduchšie prístupy patrí model perzistencie, ktorý predstavuje základný referenčný model pre hodnotenie pokročilejších metód. Jeho princíp spočíva v predpoklade, že budúce hodnoty žiarenia budú podobné aktuálne nameraným hodnotám. Model perzistencie predstavuje najjednoduchší a zároveň základný prístup k predikcii solárneho žiarenia a výkonu fotovoltických systémov, pričom sa často používa ako referenčný model na porovnanie s pokročilejšími metódami. Jeho princíp spočíva v predpoklade, že budúce hodnoty žiarenia budú rovnaké alebo veľmi podobné tým, ktoré boli namerané v nedávnej minulosti. V praxi sa tento model často vyjadruje prostredníctvom tzv. clear-sky indexu, ktorý umožňuje korigovať namerané údaje vzhľadom na ideálne podmienky bez oblačnosti. Perzistenčný model dosahuje relatívne dobrú presnosť počas jasných dní, kedy je intenzita slnečného žiarenia stabilná. Naopak, jeho presnosť výrazne klesá pri rýchlych zmenách oblačnosti, ktoré spôsobujú krátkodobé výkyvy žiarenia. Napriek svojej jednoduchosti zostáva tento model dôležitý ako základná referencia, pretože poskytuje minimálny štandard, ktorý musia pokročilejšie predikčné prístupy prekonať [</w:t>
+      </w:r>
+      <w:r>
+        <w:rPr>
+          <w:lang w:val="sk-SK"/>
+        </w:rPr>
+        <w:t>11</w:t>
+      </w:r>
+      <w:r>
+        <w:t>]</w:t>
+      </w:r>
+      <w:r>
+        <w:rPr>
+          <w:lang w:val="sk-SK"/>
+        </w:rPr>
+        <w:t>.</w:t>
+      </w:r>
+    </w:p>
+    <w:p>
+      <w:pPr>
+        <w:pStyle w:val="Heading3"/>
+      </w:pPr>
+      <w:bookmarkStart w:id="58" w:name="_Toc227449202"/>
+      <w:r>
+        <w:rPr>
+          <w:lang w:val="sk-SK"/>
+        </w:rPr>
+        <w:t>Fyzikálne a satelitné modely</w:t>
+      </w:r>
+      <w:bookmarkEnd w:id="58"/>
     </w:p>
     <w:p>
       <w:pPr>
         <w:spacing w:line="312" w:lineRule="auto"/>
         <w:jc w:val="both"/>
-      </w:pPr>
+        <w:rPr>
+          <w:lang w:val="sk-SK"/>
+        </w:rPr>
+      </w:pPr>
+      <w:r>
+        <w:t xml:space="preserve">Ďalšiu skupinu tvoria fyzikálne a satelitné modely, ktoré využívajú informácie o stave atmosféry získané zo satelitných snímok. Fyzikálne modely predstavujú prístup, ktorý využíva satelitné snímky na predikciu oblačnosti s vysokým priestorovým rozlíšením. Základom týchto modelov je identifikácia polohy oblakov a následné vyhodnotenie ich </w:t>
+      </w:r>
+      <w:r>
+        <w:lastRenderedPageBreak/>
+        <w:t>vlastností, najmä pokrytia a optickej hrúbky, ktoré zásadne ovplyvňujú presnosť predikcie. Fyzikálne satelitné modely umožňujú predpovedať intenzitu slnečného žiarenia spravidla s</w:t>
+      </w:r>
+      <w:r>
+        <w:rPr>
+          <w:lang w:val="sk-SK"/>
+        </w:rPr>
+        <w:t> </w:t>
+      </w:r>
+      <w:r>
+        <w:t>časovým horizontom do šiestich hodín dopredu, čo ich robí vhodnými najmä pre krátkodobé predikcie. Ich nevýhodou však môže byť nižšia časová presnosť v prípade rýchlo sa meniacej oblačnosti alebo pri lokálnych meteorologických javoch, ktoré satelitné merania nedokážu detailne zachytiť [</w:t>
+      </w:r>
+      <w:r>
+        <w:rPr>
+          <w:lang w:val="sk-SK"/>
+        </w:rPr>
+        <w:t>12</w:t>
+      </w:r>
+      <w:r>
+        <w:t>]</w:t>
+      </w:r>
+      <w:r>
+        <w:rPr>
+          <w:lang w:val="sk-SK"/>
+        </w:rPr>
+        <w:t>.</w:t>
+      </w:r>
+    </w:p>
+    <w:p>
+      <w:pPr>
+        <w:pStyle w:val="Heading3"/>
+      </w:pPr>
+      <w:bookmarkStart w:id="59" w:name="_Toc227449203"/>
+      <w:r>
+        <w:rPr>
+          <w:lang w:val="sk-SK"/>
+        </w:rPr>
+        <w:t>Modely založené na celooblohových snímkach</w:t>
+      </w:r>
+      <w:bookmarkEnd w:id="59"/>
     </w:p>
     <w:p>
       <w:pPr>
         <w:spacing w:line="312" w:lineRule="auto"/>
         <w:jc w:val="both"/>
       </w:pPr>
+      <w:r>
+        <w:t>Špecifickú kategóriu predstavujú modely založené na celooblohových snímkach. Modely založené na snímkach oblohy (Sky Image) sa odlišujú od numerických predikčných modelov a satelitných modelov a sú obzvlášť užitočné pre predikcie solárneho žiarenia s</w:t>
+      </w:r>
+      <w:r>
+        <w:rPr>
+          <w:lang w:val="sk-SK"/>
+        </w:rPr>
+        <w:t> </w:t>
+      </w:r>
+      <w:r>
+        <w:t>krátkym časovým horizontom, napríklad v rámci hodiny. Fyzikálne prístupy využívajúce snímky oblohy zahŕňajú sledovanie pohybu oblakov, detekciu a klasifikáciu oblačnosti. Intenzita slnečného žiarenia dopadajúceho na povrch Zeme je veľmi citlivá na prítomnosť oblakov, zatiaľ čo iné zložky atmosféry, ako vodná para, aerosóly či vzduch, majú menší vplyv. Snímky oblohy poskytujú informácie o vlastnostiach oblakov, ako sú jas, veľkosť, tvar, spektrum a textúra, pričom textúra popisuje priestorové rozloženie pixelov v</w:t>
+      </w:r>
+      <w:r>
+        <w:rPr>
+          <w:lang w:val="sk-SK"/>
+        </w:rPr>
+        <w:t> </w:t>
+      </w:r>
+      <w:r>
+        <w:t>obraze.</w:t>
+      </w:r>
+    </w:p>
+    <w:p>
+      <w:pPr>
+        <w:spacing w:line="312" w:lineRule="auto"/>
+        <w:ind w:firstLine="426"/>
+        <w:jc w:val="both"/>
+        <w:rPr>
+          <w:lang w:val="sk-SK"/>
+        </w:rPr>
+      </w:pPr>
+      <w:r>
+        <w:t>Z pohľadu predikcie umožňujú samotné snímky vykonávať regionálne prognózy pre rôzne časové horizonty pomocou jednej kamery. Sky imager pozostáva hlavne z kamery a</w:t>
+      </w:r>
+      <w:r>
+        <w:rPr>
+          <w:lang w:val="sk-SK"/>
+        </w:rPr>
+        <w:t> </w:t>
+      </w:r>
+      <w:r>
+        <w:t xml:space="preserve">hemisférického zrkadla, pričom slnečný štít chráni kameru pred priamym slnečným žiarením. Na </w:t>
+      </w:r>
+      <w:r>
+        <w:rPr>
+          <w:lang w:val="sk-SK"/>
+        </w:rPr>
+        <w:t xml:space="preserve">fotovoltickej </w:t>
+      </w:r>
+      <w:r>
+        <w:t>elektrárni sú okrem kamery umiestnené aj senzory žiarenia, ktoré súčasne merajú intenzitu dopadajúceho žiarenia a zaznamenávajú snímky oblohy. Niektoré časti snímky môžu spôsobovať nežiaduci šum a znižovať presnosť predikcie, preto je potrebné tieto časti identifikovať a odstrániť pred spracovaním dát</w:t>
+      </w:r>
+      <w:r>
+        <w:rPr>
+          <w:lang w:val="sk-SK"/>
+        </w:rPr>
+        <w:t xml:space="preserve"> </w:t>
+      </w:r>
+      <w:r>
+        <w:t>[</w:t>
+      </w:r>
+      <w:r>
+        <w:rPr>
+          <w:lang w:val="sk-SK"/>
+        </w:rPr>
+        <w:t>13</w:t>
+      </w:r>
+      <w:r>
+        <w:t>]</w:t>
+      </w:r>
+      <w:r>
+        <w:rPr>
+          <w:lang w:val="sk-SK"/>
+        </w:rPr>
+        <w:t>.</w:t>
+      </w:r>
+    </w:p>
+    <w:p>
+      <w:pPr>
+        <w:pStyle w:val="Heading2"/>
+        <w:spacing w:before="480" w:after="240"/>
+        <w:rPr>
+          <w:lang w:val="sk-SK"/>
+        </w:rPr>
+      </w:pPr>
+      <w:bookmarkStart w:id="60" w:name="_Toc227449204"/>
+      <w:r>
+        <w:rPr>
+          <w:lang w:val="sk-SK"/>
+        </w:rPr>
+        <w:t>Extrakcia príznakov</w:t>
+      </w:r>
+      <w:bookmarkEnd w:id="60"/>
+      <w:r>
+        <w:rPr>
+          <w:lang w:val="sk-SK"/>
+        </w:rPr>
+        <w:t xml:space="preserve"> </w:t>
+      </w:r>
     </w:p>
     <w:p>
       <w:pPr>
         <w:spacing w:line="312" w:lineRule="auto"/>
         <w:jc w:val="both"/>
       </w:pPr>
+      <w:r>
+        <w:t>Extrakcia príznakov predstavuje proces transformácie surových dát do kompaktnejšej a</w:t>
+      </w:r>
+      <w:r>
+        <w:rPr>
+          <w:lang w:val="sk-SK"/>
+        </w:rPr>
+        <w:t> </w:t>
+      </w:r>
+      <w:r>
+        <w:t>informatívnejšej reprezentácie, ktorá je vhodná pre ďalšie spracovanie alebo klasifikáciu. V kontexte obrazových dát ide o identifikáciu a výber charakteristických vlastností obrazu, ako sú hrany, textúry, tvary alebo farebné rozloženie, ktoré nesú relevantnú informáciu o</w:t>
+      </w:r>
+      <w:r>
+        <w:rPr>
+          <w:lang w:val="sk-SK"/>
+        </w:rPr>
+        <w:t> </w:t>
+      </w:r>
+      <w:r>
+        <w:t>jeho obsahu. Cieľom extrakcie príznakov je zjednodušiť vstupné dáta pri zachovaní ich najdôležitejších vlastností, čím sa znižuje výpočtová náročnosť a zároveň zvyšuje efektivita a presnosť modelov strojového učenia. V tradičných prístupoch sú príznaky definované manuálne, zatiaľ čo v hlbokom učení sú tieto príznaky učené automaticky priamo z dát.</w:t>
+      </w:r>
+    </w:p>
+    <w:p>
+      <w:pPr>
+        <w:pStyle w:val="Bezodsadenia"/>
+        <w:spacing w:line="312" w:lineRule="auto"/>
+        <w:rPr>
+          <w:lang w:val="sk-SK"/>
+        </w:rPr>
+      </w:pPr>
+    </w:p>
+    <w:p>
+      <w:pPr>
+        <w:pStyle w:val="Heading3"/>
+      </w:pPr>
+      <w:bookmarkStart w:id="61" w:name="_Toc227449205"/>
+      <w:r>
+        <w:rPr>
+          <w:lang w:val="sk-SK"/>
+        </w:rPr>
+        <w:lastRenderedPageBreak/>
+        <w:t>Porovnanie h</w:t>
+      </w:r>
+      <w:r>
+        <w:rPr>
+          <w:lang w:val="sk-SK"/>
+        </w:rPr>
+        <w:t>lboké učeni</w:t>
+      </w:r>
+      <w:r>
+        <w:rPr>
+          <w:lang w:val="sk-SK"/>
+        </w:rPr>
+        <w:t>a</w:t>
+      </w:r>
+      <w:r>
+        <w:rPr>
+          <w:lang w:val="sk-SK"/>
+        </w:rPr>
+        <w:t xml:space="preserve"> (deep learning)</w:t>
+      </w:r>
+      <w:r>
+        <w:rPr>
+          <w:lang w:val="sk-SK"/>
+        </w:rPr>
+        <w:t xml:space="preserve"> a tradičných </w:t>
+      </w:r>
+      <w:r>
+        <w:rPr>
+          <w:lang w:val="sk-SK"/>
+        </w:rPr>
+        <w:t xml:space="preserve">prístupov </w:t>
+      </w:r>
+      <w:r>
+        <w:rPr>
+          <w:lang w:val="sk-SK"/>
+        </w:rPr>
+        <w:t>v kontexte extrakcie príznakov pri predikcii slnečného žiarenia</w:t>
+      </w:r>
+      <w:bookmarkEnd w:id="61"/>
     </w:p>
     <w:p>
       <w:pPr>
         <w:spacing w:line="312" w:lineRule="auto"/>
         <w:jc w:val="both"/>
-      </w:pPr>
+        <w:rPr>
+          <w:lang w:val="sk-SK"/>
+        </w:rPr>
+      </w:pPr>
+      <w:r>
+        <w:t>Hlboké učenie (Deep Learning) výrazne posunulo hranice možností digitálneho spracovania obrazov a umožnilo automatickú extrakciu komplexných a abstraktných príznakov, ktoré boli tradičnými metódami ťažko dosiahnuteľné. Napriek tomu tradičné techniky počítačového videnia nezanikli a stále nachádzajú uplatnenie. Klasické metódy, ako extrakcia hrán, histogramy farieb alebo textúrne deskriptory, sú rýchle, interpretovateľné a</w:t>
+      </w:r>
+      <w:r>
+        <w:rPr>
+          <w:lang w:val="sk-SK"/>
+        </w:rPr>
+        <w:t> </w:t>
+      </w:r>
+      <w:r>
+        <w:t>vhodné pre menšie datasety. Naopak, ich nevýhodou je obmedzená schopnosť zachytiť komplexné vzory a kontextuálne informácie, ktoré hlboké neurónové siete zvládajú efektívne [</w:t>
+      </w:r>
+      <w:r>
+        <w:rPr>
+          <w:lang w:val="sk-SK"/>
+        </w:rPr>
+        <w:t>14</w:t>
+      </w:r>
+      <w:r>
+        <w:t>]</w:t>
+      </w:r>
+      <w:r>
+        <w:rPr>
+          <w:lang w:val="sk-SK"/>
+        </w:rPr>
+        <w:t>.</w:t>
+      </w:r>
+    </w:p>
+    <w:p>
+      <w:pPr>
+        <w:spacing w:line="312" w:lineRule="auto"/>
+        <w:ind w:firstLine="426"/>
+        <w:jc w:val="both"/>
+        <w:rPr>
+          <w:lang w:val="sk-SK"/>
+        </w:rPr>
+      </w:pPr>
+      <w:r>
+        <w:t>Tradičné metódy počítačového videnia využívajú explicitne definované príznaky, ako napríklad SIFT, SURF alebo FAST, ktoré sú následne spracované klasifikačnými algoritmami, napríklad SVM alebo KNN. Tieto prístupy sú výhodné najmä z hľadiska interpretovateľnosti a nižších výpočtových nárokov, avšak vyžadujú odborné znalosti pri</w:t>
+      </w:r>
+      <w:r>
+        <w:rPr>
+          <w:lang w:val="sk-SK"/>
+        </w:rPr>
+        <w:t> </w:t>
+      </w:r>
+      <w:r>
+        <w:t>návrhu príznakov a často nedokážu zachytiť komplexné vzory v dátach [</w:t>
+      </w:r>
+      <w:r>
+        <w:rPr>
+          <w:lang w:val="sk-SK"/>
+        </w:rPr>
+        <w:t>15</w:t>
+      </w:r>
+      <w:r>
+        <w:t>]</w:t>
+      </w:r>
+      <w:r>
+        <w:rPr>
+          <w:lang w:val="sk-SK"/>
+        </w:rPr>
+        <w:t>.</w:t>
+      </w:r>
+    </w:p>
+    <w:p>
+      <w:pPr>
+        <w:spacing w:line="312" w:lineRule="auto"/>
+        <w:ind w:firstLine="426"/>
+        <w:jc w:val="both"/>
+      </w:pPr>
+      <w:r>
+        <w:t>Na druhej strane, hlboké učenie umožňuje end-to-end prístup, pri ktorom model automaticky extrahuje príznaky priamo zo vstupných dát. Výhodou je vyššia presnosť, flexibilita a schopnosť pracovať s veľkým množstvom dát, pričom sa eliminuje potreba manuálnej extrakcie príznakov. Nevýhodou sú vyššie výpočtové nároky a nižšia interpretovateľnosť modelov. Medzi najvýznamnejšie prístupy hlbokého učenia v oblasti spracovania obrazov patria konvolučné neurónové siete (CNN), ktoré sú špeciálne navrhnuté na analýzu obrazových dát a umožňujú efektívnu extrakciu priestorových príznakov</w:t>
+      </w:r>
+      <w:r>
+        <w:rPr>
+          <w:lang w:val="sk-SK"/>
+        </w:rPr>
+        <w:t xml:space="preserve"> </w:t>
+      </w:r>
+      <w:r>
+        <w:t>[</w:t>
+      </w:r>
+      <w:r>
+        <w:rPr>
+          <w:lang w:val="sk-SK"/>
+        </w:rPr>
+        <w:t>1</w:t>
+      </w:r>
+      <w:r>
+        <w:rPr>
+          <w:lang w:val="sk-SK"/>
+        </w:rPr>
+        <w:t>6</w:t>
+      </w:r>
+      <w:r>
+        <w:t>]</w:t>
+      </w:r>
+      <w:r>
+        <w:rPr>
+          <w:lang w:val="sk-SK"/>
+        </w:rPr>
+        <w:t>.</w:t>
+      </w:r>
+      <w:r>
+        <w:t xml:space="preserve"> </w:t>
+      </w:r>
+    </w:p>
+    <w:p>
+      <w:pPr>
+        <w:spacing w:line="312" w:lineRule="auto"/>
+        <w:ind w:firstLine="426"/>
+        <w:jc w:val="both"/>
+        <w:rPr>
+          <w:lang w:val="sk-SK"/>
+        </w:rPr>
+      </w:pPr>
+      <w:r>
+        <w:t>V súčasnosti sa čoraz častejšie uplatňujú hybridné prístupy, ktoré kombinujú výhody oboch paradigiem. Takéto riešenia umožňujú dosiahnuť vysokú presnosť pri súčasnom znížení výpočtovej náročnosti a lepšej interpretovateľnosti výsledkov</w:t>
+      </w:r>
+      <w:r>
+        <w:rPr>
+          <w:lang w:val="sk-SK"/>
+        </w:rPr>
+        <w:t xml:space="preserve"> </w:t>
+      </w:r>
+      <w:r>
+        <w:t>[</w:t>
+      </w:r>
+      <w:r>
+        <w:rPr>
+          <w:lang w:val="sk-SK"/>
+        </w:rPr>
+        <w:t>1</w:t>
+      </w:r>
+      <w:r>
+        <w:rPr>
+          <w:lang w:val="sk-SK"/>
+        </w:rPr>
+        <w:t>7</w:t>
+      </w:r>
+      <w:r>
+        <w:t>]</w:t>
+      </w:r>
+      <w:r>
+        <w:rPr>
+          <w:lang w:val="sk-SK"/>
+        </w:rPr>
+        <w:t>.</w:t>
+      </w:r>
+    </w:p>
+    <w:p>
+      <w:pPr>
+        <w:pStyle w:val="Heading2"/>
+        <w:spacing w:before="480" w:after="240"/>
+        <w:rPr>
+          <w:lang w:val="sk-SK"/>
+        </w:rPr>
+      </w:pPr>
+      <w:bookmarkStart w:id="62" w:name="_Toc227449206"/>
+      <w:r>
+        <w:rPr>
+          <w:lang w:val="sk-SK"/>
+        </w:rPr>
+        <w:t>Konvolučné neurónové siete</w:t>
+      </w:r>
+      <w:r>
+        <w:rPr>
+          <w:lang w:val="sk-SK"/>
+        </w:rPr>
+        <w:t xml:space="preserve"> (CNN)</w:t>
+      </w:r>
+      <w:bookmarkEnd w:id="62"/>
     </w:p>
     <w:p>
       <w:pPr>
         <w:spacing w:line="312" w:lineRule="auto"/>
         <w:jc w:val="both"/>
       </w:pPr>
+      <w:r>
+        <w:t>Konvolučné neurónové siete (CNN) predstavujú špecializovanú triedu neurónových sietí navrhnutých na spracovanie obrazových dát. Ich základným stavebným prvkom je konvolučná vrstva, ktorá aplikuje filtre na vstupný obraz s cieľom extrahovať lokálne príznaky, ako sú hrany, textúry alebo tvary. Tieto príznaky sú následne kombinované vo</w:t>
+      </w:r>
+      <w:r>
+        <w:rPr>
+          <w:lang w:val="sk-SK"/>
+        </w:rPr>
+        <w:t> </w:t>
+      </w:r>
+      <w:r>
+        <w:t>vyšších vrstvách siete, čím vzniká hierarchická reprezentácia obrazu.</w:t>
+      </w:r>
+    </w:p>
+    <w:p>
+      <w:pPr>
+        <w:spacing w:line="312" w:lineRule="auto"/>
+        <w:ind w:firstLine="426"/>
+        <w:jc w:val="both"/>
+      </w:pPr>
+      <w:r>
+        <w:t>Okrem konvolučných vrstiev obsahujú CNN aj pooling vrstvy, ktoré znižujú rozlíšenie dát a tým aj výpočtovú náročnosť, a aktivačné funkcie, ktoré zavádzajú nelinearitu do modelu. Výsledkom je schopnosť modelu učiť sa komplexné vzory priamo z dát bez potreby manuálneho zásahu.</w:t>
+      </w:r>
+    </w:p>
+    <w:p>
+      <w:pPr>
+        <w:pStyle w:val="Obrzok"/>
+        <w:spacing w:before="240"/>
+      </w:pPr>
+      <w:r>
+        <w:rPr>
+          <w:noProof/>
+        </w:rPr>
+        <w:lastRenderedPageBreak/>
+        <w:drawing>
+          <wp:inline distT="0" distB="0" distL="0" distR="0" wp14:anchorId="17E81D9D" wp14:editId="2FADEC62">
+            <wp:extent cx="4806950" cy="1856672"/>
+            <wp:effectExtent l="0" t="0" r="0" b="0"/>
+            <wp:docPr id="1" name="Obrázok 1"/>
+            <wp:cNvGraphicFramePr>
+              <a:graphicFrameLocks xmlns:a="http://schemas.openxmlformats.org/drawingml/2006/main" noChangeAspect="1"/>
+            </wp:cNvGraphicFramePr>
+            <a:graphic xmlns:a="http://schemas.openxmlformats.org/drawingml/2006/main">
+              <a:graphicData uri="http://schemas.openxmlformats.org/drawingml/2006/picture">
+                <pic:pic xmlns:pic="http://schemas.openxmlformats.org/drawingml/2006/picture">
+                  <pic:nvPicPr>
+                    <pic:cNvPr id="1" name="Obrázok 1"/>
+                    <pic:cNvPicPr/>
+                  </pic:nvPicPr>
+                  <pic:blipFill rotWithShape="1">
+                    <a:blip r:embed="rId28">
+                      <a:extLst>
+                        <a:ext uri="{28A0092B-C50C-407E-A947-70E740481C1C}">
+                          <a14:useLocalDpi xmlns:a14="http://schemas.microsoft.com/office/drawing/2010/main" val="0"/>
+                        </a:ext>
+                      </a:extLst>
+                    </a:blip>
+                    <a:srcRect l="1016" r="1447"/>
+                    <a:stretch/>
+                  </pic:blipFill>
+                  <pic:spPr bwMode="auto">
+                    <a:xfrm>
+                      <a:off x="0" y="0"/>
+                      <a:ext cx="4859880" cy="1877116"/>
+                    </a:xfrm>
+                    <a:prstGeom prst="rect">
+                      <a:avLst/>
+                    </a:prstGeom>
+                    <a:ln>
+                      <a:noFill/>
+                    </a:ln>
+                    <a:extLst>
+                      <a:ext uri="{53640926-AAD7-44D8-BBD7-CCE9431645EC}">
+                        <a14:shadowObscured xmlns:a14="http://schemas.microsoft.com/office/drawing/2010/main"/>
+                      </a:ext>
+                    </a:extLst>
+                  </pic:spPr>
+                </pic:pic>
+              </a:graphicData>
+            </a:graphic>
+          </wp:inline>
+        </w:drawing>
+      </w:r>
+    </w:p>
+    <w:p>
+      <w:pPr>
+        <w:pStyle w:val="Caption"/>
+      </w:pPr>
+      <w:bookmarkStart w:id="63" w:name="_Toc227449161"/>
+      <w:r>
+        <w:t xml:space="preserve">Obr. </w:t>
+      </w:r>
+      <w:r>
+        <w:fldChar w:fldCharType="begin"/>
+      </w:r>
+      <w:r>
+        <w:instrText xml:space="preserve"> SEQ Obrázok \* ARABIC </w:instrText>
+      </w:r>
+      <w:r>
+        <w:fldChar w:fldCharType="separate"/>
+      </w:r>
+      <w:r>
+        <w:rPr>
+          <w:noProof/>
+        </w:rPr>
+        <w:t>12</w:t>
+      </w:r>
+      <w:r>
+        <w:rPr>
+          <w:noProof/>
+        </w:rPr>
+        <w:fldChar w:fldCharType="end"/>
+      </w:r>
+      <w:r>
+        <w:t xml:space="preserve">: </w:t>
+      </w:r>
+      <w:r>
+        <w:rPr>
+          <w:lang w:val="sk-SK"/>
+        </w:rPr>
+        <w:t>Zjednodušený diagram konvolučnej neurónovej siete</w:t>
+      </w:r>
+      <w:bookmarkEnd w:id="63"/>
+      <w:r>
+        <w:rPr>
+          <w:lang w:val="sk-SK"/>
+        </w:rPr>
+        <w:t xml:space="preserve"> </w:t>
+      </w:r>
+    </w:p>
+    <w:p>
+      <w:pPr>
+        <w:pStyle w:val="Heading2"/>
+        <w:spacing w:before="480" w:after="240"/>
+        <w:rPr>
+          <w:lang w:val="sk-SK"/>
+        </w:rPr>
+      </w:pPr>
+      <w:bookmarkStart w:id="64" w:name="_Toc227449207"/>
+      <w:r>
+        <w:rPr>
+          <w:lang w:val="sk-SK"/>
+        </w:rPr>
+        <w:t xml:space="preserve">Vhodnosť </w:t>
+      </w:r>
+      <w:r>
+        <w:rPr>
+          <w:lang w:val="sk-SK"/>
+        </w:rPr>
+        <w:t>CNN pre analýzu snímok oblohy</w:t>
+      </w:r>
+      <w:bookmarkEnd w:id="64"/>
     </w:p>
     <w:p>
       <w:pPr>
         <w:spacing w:line="312" w:lineRule="auto"/>
         <w:jc w:val="both"/>
       </w:pPr>
+      <w:r>
+        <w:t>Použitie konvolučných neurónových sietí je obzvlášť vhodné pre analýzu celooblohových snímok, keďže tieto obrazy obsahujú komplexné priestorové vzory, ktoré sú ťažko popísateľné tradičnými metódami. CNN dokážu efektívne extrahovať príznaky spojené s</w:t>
+      </w:r>
+      <w:r>
+        <w:rPr>
+          <w:lang w:val="sk-SK"/>
+        </w:rPr>
+        <w:t> </w:t>
+      </w:r>
+      <w:r>
+        <w:t>oblačnosťou, jej štruktúrou, pohybom a jasovými charakteristikami, ktoré priamo ovplyvňujú intenzitu slnečného žiarenia.</w:t>
+      </w:r>
+    </w:p>
+    <w:p>
+      <w:pPr>
+        <w:spacing w:line="312" w:lineRule="auto"/>
+        <w:ind w:firstLine="426"/>
+        <w:jc w:val="both"/>
+      </w:pPr>
+      <w:r>
+        <w:t>Významnou výhodou je schopnosť pracovať s celým obrazom ako vstupom a automaticky identifikovať relevantné oblasti bez potreby explicitného definovania príznakov. Zároveň dokážu zachytiť nelineárne vzťahy medzi obrazovými dátami a cieľovou veličinou, čo je v</w:t>
+      </w:r>
+      <w:r>
+        <w:rPr>
+          <w:lang w:val="sk-SK"/>
+        </w:rPr>
+        <w:t> </w:t>
+      </w:r>
+      <w:r>
+        <w:t>prípade odhadu slnečného žiarenia kľúčové</w:t>
+      </w:r>
+    </w:p>
+    <w:p>
+      <w:pPr>
+        <w:spacing w:line="312" w:lineRule="auto"/>
+        <w:ind w:firstLine="426"/>
+        <w:jc w:val="both"/>
+      </w:pPr>
+      <w:r>
+        <w:t>Napriek týmto výhodám je potrebné zohľadniť aj obmedzenia hlbokého učenia, najmä vysoké nároky na dáta a výpočtové zdroje, ako aj citlivosť na kvalitu vstupných dát. Práve preto zohráva predspracovanie obrazov zásadnú úlohu pri dosahovaní kvalitných výsledkov.</w:t>
+      </w:r>
+    </w:p>
+    <w:p>
+      <w:pPr>
+        <w:pStyle w:val="Heading1"/>
+        <w:numPr>
+          <w:ilvl w:val="0"/>
+          <w:numId w:val="36"/>
+        </w:numPr>
+        <w:spacing w:after="480"/>
+        <w:rPr>
+          <w:lang w:val="sk-SK"/>
+        </w:rPr>
+      </w:pPr>
+      <w:r>
+        <w:lastRenderedPageBreak/>
+        <w:fldChar w:fldCharType="begin"/>
+      </w:r>
+      <w:r>
+        <w:instrText xml:space="preserve">  </w:instrText>
+      </w:r>
+      <w:r>
+        <w:fldChar w:fldCharType="end"/>
+      </w:r>
+      <w:bookmarkStart w:id="65" w:name="_Toc227449208"/>
+      <w:r>
+        <w:rPr>
+          <w:lang w:val="sk-SK"/>
+        </w:rPr>
+        <w:t>Hodnotiace metriky</w:t>
+      </w:r>
+      <w:bookmarkEnd w:id="65"/>
+    </w:p>
+    <w:p>
+      <w:pPr>
+        <w:pStyle w:val="Bezodsadenia"/>
+        <w:spacing w:line="312" w:lineRule="auto"/>
+        <w:rPr>
+          <w:lang w:val="sk-SK"/>
+        </w:rPr>
+      </w:pPr>
+    </w:p>
+    <w:p>
+      <w:pPr>
+        <w:pStyle w:val="Bezodsadenia"/>
+      </w:pPr>
+    </w:p>
+    <w:p>
+      <w:pPr>
+        <w:pStyle w:val="Bezodsadenia"/>
+      </w:pPr>
     </w:p>
     <w:p>
       <w:pPr>
@@ -8887,6 +10465,54 @@
     </w:p>
     <w:p>
       <w:pPr>
+        <w:spacing w:line="312" w:lineRule="auto"/>
+        <w:jc w:val="both"/>
+      </w:pPr>
+    </w:p>
+    <w:p>
+      <w:pPr>
+        <w:spacing w:line="312" w:lineRule="auto"/>
+        <w:jc w:val="both"/>
+      </w:pPr>
+    </w:p>
+    <w:p>
+      <w:pPr>
+        <w:spacing w:line="312" w:lineRule="auto"/>
+        <w:jc w:val="both"/>
+      </w:pPr>
+    </w:p>
+    <w:p>
+      <w:pPr>
+        <w:spacing w:line="312" w:lineRule="auto"/>
+        <w:jc w:val="both"/>
+      </w:pPr>
+    </w:p>
+    <w:p>
+      <w:pPr>
+        <w:spacing w:line="312" w:lineRule="auto"/>
+        <w:jc w:val="both"/>
+      </w:pPr>
+    </w:p>
+    <w:p>
+      <w:pPr>
+        <w:spacing w:line="312" w:lineRule="auto"/>
+        <w:jc w:val="both"/>
+      </w:pPr>
+    </w:p>
+    <w:p>
+      <w:pPr>
+        <w:spacing w:line="312" w:lineRule="auto"/>
+        <w:jc w:val="both"/>
+      </w:pPr>
+    </w:p>
+    <w:p>
+      <w:pPr>
+        <w:spacing w:line="312" w:lineRule="auto"/>
+        <w:jc w:val="both"/>
+      </w:pPr>
+    </w:p>
+    <w:p>
+      <w:pPr>
         <w:pStyle w:val="Bezodsadenia"/>
       </w:pPr>
     </w:p>
@@ -8894,11 +10520,11 @@
       <w:pPr>
         <w:pStyle w:val="Heading3"/>
       </w:pPr>
-      <w:bookmarkStart w:id="56" w:name="_Toc227445300"/>
+      <w:bookmarkStart w:id="66" w:name="_Toc227449209"/>
       <w:r>
         <w:t>Záver</w:t>
       </w:r>
-      <w:bookmarkEnd w:id="56"/>
+      <w:bookmarkEnd w:id="66"/>
     </w:p>
     <w:p>
       <w:pPr>
@@ -8908,10 +10534,10 @@
           <w:bCs/>
         </w:rPr>
       </w:pPr>
-      <w:bookmarkStart w:id="57" w:name="_Toc173791406"/>
-      <w:bookmarkStart w:id="58" w:name="_Toc173791545"/>
-      <w:bookmarkStart w:id="59" w:name="_Ref178418312"/>
-      <w:bookmarkStart w:id="60" w:name="_Toc181225510"/>
+      <w:bookmarkStart w:id="67" w:name="_Ref178418312"/>
+      <w:bookmarkStart w:id="68" w:name="_Toc181225510"/>
+      <w:bookmarkStart w:id="69" w:name="_Toc173791406"/>
+      <w:bookmarkStart w:id="70" w:name="_Toc173791545"/>
       <w:r>
         <w:rPr>
           <w:b/>
@@ -8956,7 +10582,7 @@
         </w:rPr>
         <w:fldChar w:fldCharType="end"/>
       </w:r>
-      <w:bookmarkEnd w:id="59"/>
+      <w:bookmarkEnd w:id="67"/>
       <w:r>
         <w:rPr>
           <w:b/>
@@ -9033,7 +10659,7 @@
         </w:rPr>
         <w:t>.</w:t>
       </w:r>
-      <w:bookmarkEnd w:id="60"/>
+      <w:bookmarkEnd w:id="68"/>
     </w:p>
     <w:tbl>
       <w:tblPr>
@@ -9612,12 +11238,12 @@
         <w:pStyle w:val="Nadpis1bezslovania"/>
         <w:spacing w:before="1440" w:after="480"/>
       </w:pPr>
-      <w:bookmarkStart w:id="61" w:name="_Toc227445301"/>
+      <w:bookmarkStart w:id="71" w:name="_Toc227449210"/>
       <w:r>
         <w:lastRenderedPageBreak/>
         <w:t>Záver</w:t>
       </w:r>
-      <w:bookmarkEnd w:id="61"/>
+      <w:bookmarkEnd w:id="71"/>
     </w:p>
     <w:p>
       <w:pPr>
@@ -9690,15 +11316,15 @@
         <w:pStyle w:val="Nadpis1bezslovania"/>
         <w:spacing w:before="1440" w:after="480"/>
       </w:pPr>
-      <w:bookmarkStart w:id="62" w:name="_Toc227445302"/>
+      <w:bookmarkStart w:id="72" w:name="_Toc227449211"/>
       <w:r>
         <w:lastRenderedPageBreak/>
         <w:t>Literatúra</w:t>
       </w:r>
-      <w:bookmarkEnd w:id="62"/>
-    </w:p>
-    <w:bookmarkEnd w:id="57"/>
-    <w:bookmarkEnd w:id="58"/>
+      <w:bookmarkEnd w:id="72"/>
+    </w:p>
+    <w:bookmarkEnd w:id="69"/>
+    <w:bookmarkEnd w:id="70"/>
     <w:p>
       <w:pPr>
         <w:pStyle w:val="NormalWeb"/>
@@ -10543,6 +12169,7 @@
     <w:p>
       <w:pPr>
         <w:pStyle w:val="TableofAuthorities"/>
+        <w:spacing w:line="312" w:lineRule="auto"/>
       </w:pPr>
       <w:r>
         <w:t>[4]</w:t>
@@ -10557,6 +12184,7 @@
     <w:p>
       <w:pPr>
         <w:pStyle w:val="TableofAuthorities"/>
+        <w:spacing w:line="312" w:lineRule="auto"/>
       </w:pPr>
       <w:r>
         <w:t>[</w:t>
@@ -10571,108 +12199,602 @@
         <w:tab/>
       </w:r>
       <w:r>
-        <w:t>https://en.wikipedia.org/wiki/HSL_and_HSV</w:t>
-      </w:r>
-      <w:r>
+        <w:t xml:space="preserve">https://en.wikipedia.org/wiki/HSL_and_HSV </w:t>
+      </w:r>
+    </w:p>
+    <w:p>
+      <w:pPr>
+        <w:pStyle w:val="TableofAuthorities"/>
+        <w:spacing w:line="312" w:lineRule="auto"/>
+      </w:pPr>
+      <w:r>
+        <w:t>[</w:t>
+      </w:r>
+      <w:r>
+        <w:t>6</w:t>
+      </w:r>
+      <w:r>
+        <w:t>]</w:t>
+      </w:r>
+      <w:r>
+        <w:tab/>
+      </w:r>
+      <w:r>
+        <w:t>https://en.wikipedia.org/wiki/YCbCr</w:t>
+      </w:r>
+    </w:p>
+    <w:p>
+      <w:pPr>
+        <w:pStyle w:val="TableofAuthorities"/>
+        <w:spacing w:line="312" w:lineRule="auto"/>
+      </w:pPr>
+      <w:r>
+        <w:t>[</w:t>
+      </w:r>
+      <w:r>
+        <w:t>7</w:t>
+      </w:r>
+      <w:r>
+        <w:t>]</w:t>
+      </w:r>
+      <w:r>
+        <w:tab/>
+      </w:r>
+      <w:r>
+        <w:t xml:space="preserve">https://en.wikipedia.org/wiki/CMYK_color_model </w:t>
+      </w:r>
+    </w:p>
+    <w:p>
+      <w:pPr>
+        <w:pStyle w:val="TableofAuthorities"/>
+        <w:spacing w:line="312" w:lineRule="auto"/>
+      </w:pPr>
+      <w:r>
+        <w:t>[</w:t>
+      </w:r>
+      <w:r>
+        <w:t>8</w:t>
+      </w:r>
+      <w:r>
+        <w:t>]</w:t>
+      </w:r>
+      <w:r>
+        <w:tab/>
+      </w:r>
+      <w:r>
+        <w:t>https://imagemagick.org/clahe/#gsc.tab=0</w:t>
+      </w:r>
+    </w:p>
+    <w:p>
+      <w:pPr>
+        <w:pStyle w:val="TableofAuthorities"/>
+        <w:spacing w:line="312" w:lineRule="auto"/>
+      </w:pPr>
+      <w:r>
+        <w:t>[</w:t>
+      </w:r>
+      <w:r>
+        <w:t>9</w:t>
+      </w:r>
+      <w:r>
+        <w:t>]</w:t>
+      </w:r>
+      <w:r>
+        <w:tab/>
+      </w:r>
+      <w:r>
+        <w:t>https://medium.com/@muyandiritujr/noise-in-image-processing-and-how-to-add-it-to-images-in-python-456a434dcc3f</w:t>
+      </w:r>
+    </w:p>
+    <w:p>
+      <w:pPr>
+        <w:pStyle w:val="TableofAuthorities"/>
+        <w:spacing w:line="312" w:lineRule="auto"/>
+      </w:pPr>
+      <w:r>
+        <w:t>[10]</w:t>
+      </w:r>
+      <w:r>
+        <w:tab/>
+      </w:r>
+      <w:hyperlink r:id="rId29" w:history="1">
+        <w:r>
+          <w:rPr>
+            <w:rStyle w:val="Hyperlink"/>
+          </w:rPr>
+          <w:t>https://sarthakforwet.medium.com/cutmix-a-new-strategy-for-data-augmentation-bbc1c3d29aab</w:t>
+        </w:r>
+      </w:hyperlink>
+    </w:p>
+    <w:p>
+      <w:pPr>
+        <w:pStyle w:val="NormalWeb"/>
+        <w:shd w:val="clear" w:color="auto" w:fill="FFFFFF"/>
+        <w:spacing w:line="312" w:lineRule="auto"/>
+        <w:ind w:left="709" w:hanging="709"/>
+      </w:pPr>
+      <w:r>
+        <w:t>[10]</w:t>
+      </w:r>
+      <w:r>
+        <w:rPr>
+          <w:rFonts w:ascii="TimesNewRomanPSMT" w:hAnsi="TimesNewRomanPSMT"/>
+        </w:rPr>
         <w:t xml:space="preserve"> </w:t>
       </w:r>
+      <w:r>
+        <w:rPr>
+          <w:rFonts w:ascii="TimesNewRomanPSMT" w:hAnsi="TimesNewRomanPSMT"/>
+        </w:rPr>
+        <w:tab/>
+      </w:r>
+      <w:r>
+        <w:rPr>
+          <w:rFonts w:ascii="TimesNewRomanPSMT" w:hAnsi="TimesNewRomanPSMT"/>
+        </w:rPr>
+        <w:t xml:space="preserve">(PDF in Articles Folder) </w:t>
+      </w:r>
+      <w:r>
+        <w:rPr>
+          <w:rFonts w:ascii="Calibri" w:hAnsi="Calibri" w:cs="Calibri"/>
+        </w:rPr>
+        <w:t xml:space="preserve">Systematic Review on Impact of Different Irradiance Forecasting Techniques for Solar Energy Prediction, </w:t>
+      </w:r>
+      <w:r>
+        <w:rPr>
+          <w:rFonts w:ascii="TimesNewRomanPSMT" w:hAnsi="TimesNewRomanPSMT"/>
+        </w:rPr>
+        <w:t xml:space="preserve">Big Data and Advanced Analytics in Energy Systems and Applications , edited by: Prof. Dr. Constantinos S. Psomopoulos, Dr. Helen C. Leligou, Prof. Dr. Ferdinanda Ponci, Prof. Dr. Josep M. Guerrero and Prof. Dr. Elisa Peñalvo-López, str.: 1 </w:t>
+      </w:r>
+    </w:p>
+    <w:p>
+      <w:pPr>
+        <w:pStyle w:val="NormalWeb"/>
+        <w:shd w:val="clear" w:color="auto" w:fill="FFFFFF"/>
+        <w:spacing w:line="312" w:lineRule="auto"/>
+        <w:ind w:left="709" w:hanging="709"/>
+      </w:pPr>
+      <w:r>
+        <w:t>[1</w:t>
+      </w:r>
+      <w:r>
+        <w:rPr>
+          <w:lang w:val="sk-SK"/>
+        </w:rPr>
+        <w:t>1</w:t>
+      </w:r>
+      <w:r>
+        <w:t>]</w:t>
+      </w:r>
+      <w:r>
+        <w:rPr>
+          <w:rFonts w:ascii="TimesNewRomanPSMT" w:hAnsi="TimesNewRomanPSMT"/>
+        </w:rPr>
+        <w:t xml:space="preserve"> </w:t>
+      </w:r>
+      <w:r>
+        <w:rPr>
+          <w:rFonts w:ascii="TimesNewRomanPSMT" w:hAnsi="TimesNewRomanPSMT"/>
+        </w:rPr>
+        <w:tab/>
+        <w:t xml:space="preserve">(PDF in Articles Folder) </w:t>
+      </w:r>
+      <w:r>
+        <w:rPr>
+          <w:rFonts w:ascii="Calibri" w:hAnsi="Calibri" w:cs="Calibri"/>
+        </w:rPr>
+        <w:t xml:space="preserve">Systematic Review on Impact of Different Irradiance Forecasting Techniques for Solar Energy Prediction, </w:t>
+      </w:r>
+      <w:r>
+        <w:rPr>
+          <w:rFonts w:ascii="TimesNewRomanPSMT" w:hAnsi="TimesNewRomanPSMT"/>
+        </w:rPr>
+        <w:t xml:space="preserve">Big Data and Advanced Analytics in Energy Systems and Applications , edited by: Prof. Dr. Constantinos </w:t>
+      </w:r>
+      <w:r>
+        <w:rPr>
+          <w:rFonts w:ascii="TimesNewRomanPSMT" w:hAnsi="TimesNewRomanPSMT"/>
+        </w:rPr>
+        <w:lastRenderedPageBreak/>
+        <w:t>S. Psomopoulos, Dr. Helen C. Leligou, Prof. Dr. Ferdinanda Ponci, Prof. Dr. Josep M. Guerrero and Prof. Dr. Elisa Peñalvo-López, str.: 1</w:t>
+      </w:r>
+      <w:r>
+        <w:rPr>
+          <w:rFonts w:ascii="TimesNewRomanPSMT" w:hAnsi="TimesNewRomanPSMT"/>
+          <w:lang w:val="sk-SK"/>
+        </w:rPr>
+        <w:t>1-12</w:t>
+      </w:r>
+      <w:r>
+        <w:rPr>
+          <w:rFonts w:ascii="TimesNewRomanPSMT" w:hAnsi="TimesNewRomanPSMT"/>
+        </w:rPr>
+        <w:t xml:space="preserve"> </w:t>
+      </w:r>
+    </w:p>
+    <w:p>
+      <w:pPr>
+        <w:pStyle w:val="NormalWeb"/>
+        <w:shd w:val="clear" w:color="auto" w:fill="FFFFFF"/>
+        <w:spacing w:line="312" w:lineRule="auto"/>
+        <w:ind w:left="709" w:hanging="709"/>
+      </w:pPr>
+      <w:r>
+        <w:t>[1</w:t>
+      </w:r>
+      <w:r>
+        <w:rPr>
+          <w:lang w:val="sk-SK"/>
+        </w:rPr>
+        <w:t>2</w:t>
+      </w:r>
+      <w:r>
+        <w:t>]</w:t>
+      </w:r>
+      <w:r>
+        <w:rPr>
+          <w:rFonts w:ascii="TimesNewRomanPSMT" w:hAnsi="TimesNewRomanPSMT"/>
+        </w:rPr>
+        <w:t xml:space="preserve"> </w:t>
+      </w:r>
+      <w:r>
+        <w:rPr>
+          <w:rFonts w:ascii="TimesNewRomanPSMT" w:hAnsi="TimesNewRomanPSMT"/>
+        </w:rPr>
+        <w:tab/>
+        <w:t xml:space="preserve">(PDF in Articles Folder) </w:t>
+      </w:r>
+      <w:r>
+        <w:rPr>
+          <w:rFonts w:ascii="Calibri" w:hAnsi="Calibri" w:cs="Calibri"/>
+        </w:rPr>
+        <w:t xml:space="preserve">Systematic Review on Impact of Different Irradiance Forecasting Techniques for Solar Energy Prediction, </w:t>
+      </w:r>
+      <w:r>
+        <w:rPr>
+          <w:rFonts w:ascii="TimesNewRomanPSMT" w:hAnsi="TimesNewRomanPSMT"/>
+        </w:rPr>
+        <w:t xml:space="preserve">Big Data and Advanced Analytics in Energy Systems and Applications , edited by: Prof. Dr. Constantinos S. Psomopoulos, Dr. Helen C. Leligou, Prof. Dr. Ferdinanda Ponci, Prof. Dr. Josep M. Guerrero and Prof. Dr. Elisa Peñalvo-López, str.: </w:t>
+      </w:r>
+      <w:r>
+        <w:rPr>
+          <w:rFonts w:ascii="TimesNewRomanPSMT" w:hAnsi="TimesNewRomanPSMT"/>
+          <w:lang w:val="sk-SK"/>
+        </w:rPr>
+        <w:t>12</w:t>
+      </w:r>
+      <w:r>
+        <w:rPr>
+          <w:rFonts w:ascii="TimesNewRomanPSMT" w:hAnsi="TimesNewRomanPSMT"/>
+        </w:rPr>
+        <w:t xml:space="preserve"> </w:t>
+      </w:r>
+    </w:p>
+    <w:p>
+      <w:pPr>
+        <w:pStyle w:val="NormalWeb"/>
+        <w:shd w:val="clear" w:color="auto" w:fill="FFFFFF"/>
+        <w:spacing w:line="312" w:lineRule="auto"/>
+        <w:ind w:left="709" w:hanging="709"/>
+      </w:pPr>
+      <w:r>
+        <w:t>[1</w:t>
+      </w:r>
+      <w:r>
+        <w:rPr>
+          <w:lang w:val="sk-SK"/>
+        </w:rPr>
+        <w:t>3</w:t>
+      </w:r>
+      <w:r>
+        <w:t>]</w:t>
+      </w:r>
+      <w:r>
+        <w:rPr>
+          <w:rFonts w:ascii="TimesNewRomanPSMT" w:hAnsi="TimesNewRomanPSMT"/>
+        </w:rPr>
+        <w:t xml:space="preserve"> </w:t>
+      </w:r>
+      <w:r>
+        <w:rPr>
+          <w:rFonts w:ascii="TimesNewRomanPSMT" w:hAnsi="TimesNewRomanPSMT"/>
+        </w:rPr>
+        <w:tab/>
+        <w:t xml:space="preserve">(PDF in Articles Folder) </w:t>
+      </w:r>
+      <w:r>
+        <w:rPr>
+          <w:rFonts w:ascii="Calibri" w:hAnsi="Calibri" w:cs="Calibri"/>
+        </w:rPr>
+        <w:t xml:space="preserve">Systematic Review on Impact of Different Irradiance Forecasting Techniques for Solar Energy Prediction, </w:t>
+      </w:r>
+      <w:r>
+        <w:rPr>
+          <w:rFonts w:ascii="TimesNewRomanPSMT" w:hAnsi="TimesNewRomanPSMT"/>
+        </w:rPr>
+        <w:t xml:space="preserve">Big Data and Advanced Analytics in Energy Systems and Applications , edited by: Prof. Dr. Constantinos S. Psomopoulos, Dr. Helen C. Leligou, Prof. Dr. Ferdinanda Ponci, Prof. Dr. Josep M. Guerrero and Prof. Dr. Elisa Peñalvo-López, str.: </w:t>
+      </w:r>
+      <w:r>
+        <w:rPr>
+          <w:rFonts w:ascii="TimesNewRomanPSMT" w:hAnsi="TimesNewRomanPSMT"/>
+          <w:lang w:val="sk-SK"/>
+        </w:rPr>
+        <w:t>1</w:t>
+      </w:r>
+      <w:r>
+        <w:rPr>
+          <w:rFonts w:ascii="TimesNewRomanPSMT" w:hAnsi="TimesNewRomanPSMT"/>
+          <w:lang w:val="sk-SK"/>
+        </w:rPr>
+        <w:t>3</w:t>
+      </w:r>
+      <w:r>
+        <w:rPr>
+          <w:rFonts w:ascii="TimesNewRomanPSMT" w:hAnsi="TimesNewRomanPSMT"/>
+        </w:rPr>
+        <w:t xml:space="preserve"> </w:t>
+      </w:r>
+    </w:p>
+    <w:p>
+      <w:pPr>
+        <w:pStyle w:val="NormalWeb"/>
+        <w:spacing w:line="312" w:lineRule="auto"/>
+        <w:ind w:left="567" w:hanging="567"/>
+      </w:pPr>
+      <w:r>
+        <w:t>[1</w:t>
+      </w:r>
+      <w:r>
+        <w:rPr>
+          <w:lang w:val="sk-SK"/>
+        </w:rPr>
+        <w:t>4</w:t>
+      </w:r>
+      <w:r>
+        <w:t>]</w:t>
+      </w:r>
+      <w:r>
+        <w:rPr>
+          <w:rFonts w:ascii="TimesNewRomanPSMT" w:hAnsi="TimesNewRomanPSMT"/>
+        </w:rPr>
+        <w:t xml:space="preserve"> </w:t>
+      </w:r>
+      <w:r>
+        <w:rPr>
+          <w:rFonts w:ascii="TimesNewRomanPSMT" w:hAnsi="TimesNewRomanPSMT"/>
+        </w:rPr>
+        <w:tab/>
+      </w:r>
+      <w:r>
+        <w:rPr>
+          <w:rFonts w:ascii="TimesNewRomanPSMT" w:hAnsi="TimesNewRomanPSMT"/>
+          <w:lang w:val="sk-SK"/>
+        </w:rPr>
+        <w:t>(</w:t>
+      </w:r>
+      <w:r>
+        <w:rPr>
+          <w:rFonts w:ascii="TimesNewRomanPSMT" w:hAnsi="TimesNewRomanPSMT"/>
+        </w:rPr>
+        <w:t xml:space="preserve">PDF in Articles Folder) </w:t>
+      </w:r>
+      <w:r>
+        <w:rPr>
+          <w:rFonts w:ascii="Calibri" w:hAnsi="Calibri" w:cs="Calibri"/>
+        </w:rPr>
+        <w:t xml:space="preserve">Deep Learning vs. Traditional Computer Vision, Niall O’ Mahony, Sean Campbell, Anderson Carvalho, Suman Harapanahalli, Gustavo Velasco Hernandez, Lenka Krpalkova, Daniel Riordan, Joseph Walsh, IMaR Technology Gateway, Institute of Technology Tralee, Tralee, Ireland, str.: 1 </w:t>
+      </w:r>
+    </w:p>
+    <w:p>
+      <w:pPr>
+        <w:pStyle w:val="NormalWeb"/>
+        <w:spacing w:line="312" w:lineRule="auto"/>
+        <w:ind w:left="567" w:hanging="567"/>
+      </w:pPr>
+      <w:r>
+        <w:t>[1</w:t>
+      </w:r>
+      <w:r>
+        <w:rPr>
+          <w:lang w:val="sk-SK"/>
+        </w:rPr>
+        <w:t>5</w:t>
+      </w:r>
+      <w:r>
+        <w:t>]</w:t>
+      </w:r>
+      <w:r>
+        <w:rPr>
+          <w:rFonts w:ascii="TimesNewRomanPSMT" w:hAnsi="TimesNewRomanPSMT"/>
+        </w:rPr>
+        <w:t xml:space="preserve"> </w:t>
+      </w:r>
+      <w:r>
+        <w:rPr>
+          <w:rFonts w:ascii="TimesNewRomanPSMT" w:hAnsi="TimesNewRomanPSMT"/>
+        </w:rPr>
+        <w:tab/>
+      </w:r>
+      <w:r>
+        <w:rPr>
+          <w:rFonts w:ascii="TimesNewRomanPSMT" w:hAnsi="TimesNewRomanPSMT"/>
+          <w:lang w:val="sk-SK"/>
+        </w:rPr>
+        <w:t>(</w:t>
+      </w:r>
+      <w:r>
+        <w:rPr>
+          <w:rFonts w:ascii="TimesNewRomanPSMT" w:hAnsi="TimesNewRomanPSMT"/>
+        </w:rPr>
+        <w:t xml:space="preserve">PDF in Articles Folder) </w:t>
+      </w:r>
+      <w:r>
+        <w:rPr>
+          <w:rFonts w:ascii="Calibri" w:hAnsi="Calibri" w:cs="Calibri"/>
+        </w:rPr>
+        <w:t xml:space="preserve">Deep Learning vs. Traditional Computer Vision, Niall O’ Mahony, Sean Campbell, Anderson Carvalho, Suman Harapanahalli, Gustavo Velasco Hernandez, Lenka Krpalkova, Daniel Riordan, Joseph Walsh, IMaR Technology Gateway, Institute of Technology Tralee, Tralee, Ireland, str.: </w:t>
+      </w:r>
+      <w:r>
+        <w:rPr>
+          <w:rFonts w:ascii="Calibri" w:hAnsi="Calibri" w:cs="Calibri"/>
+          <w:lang w:val="sk-SK"/>
+        </w:rPr>
+        <w:t>5-6</w:t>
+      </w:r>
+      <w:r>
+        <w:rPr>
+          <w:rFonts w:ascii="Calibri" w:hAnsi="Calibri" w:cs="Calibri"/>
+        </w:rPr>
+        <w:t xml:space="preserve"> </w:t>
+      </w:r>
+    </w:p>
+    <w:p>
+      <w:pPr>
+        <w:pStyle w:val="NormalWeb"/>
+        <w:spacing w:line="312" w:lineRule="auto"/>
+        <w:ind w:left="567" w:hanging="567"/>
+      </w:pPr>
+      <w:r>
+        <w:t>[1</w:t>
+      </w:r>
+      <w:r>
+        <w:rPr>
+          <w:lang w:val="sk-SK"/>
+        </w:rPr>
+        <w:t>6</w:t>
+      </w:r>
+      <w:r>
+        <w:t>]</w:t>
+      </w:r>
+      <w:r>
+        <w:rPr>
+          <w:rFonts w:ascii="TimesNewRomanPSMT" w:hAnsi="TimesNewRomanPSMT"/>
+        </w:rPr>
+        <w:t xml:space="preserve"> </w:t>
+      </w:r>
+      <w:r>
+        <w:rPr>
+          <w:rFonts w:ascii="TimesNewRomanPSMT" w:hAnsi="TimesNewRomanPSMT"/>
+        </w:rPr>
+        <w:tab/>
+      </w:r>
+      <w:r>
+        <w:rPr>
+          <w:rFonts w:ascii="TimesNewRomanPSMT" w:hAnsi="TimesNewRomanPSMT"/>
+          <w:lang w:val="sk-SK"/>
+        </w:rPr>
+        <w:t>(</w:t>
+      </w:r>
+      <w:r>
+        <w:rPr>
+          <w:rFonts w:ascii="TimesNewRomanPSMT" w:hAnsi="TimesNewRomanPSMT"/>
+        </w:rPr>
+        <w:t xml:space="preserve">PDF in Articles Folder) </w:t>
+      </w:r>
+      <w:r>
+        <w:rPr>
+          <w:rFonts w:ascii="Calibri" w:hAnsi="Calibri" w:cs="Calibri"/>
+        </w:rPr>
+        <w:t xml:space="preserve">Deep Learning vs. Traditional Computer Vision, Niall O’ Mahony, Sean Campbell, Anderson Carvalho, Suman Harapanahalli, Gustavo Velasco Hernandez, Lenka Krpalkova, Daniel Riordan, Joseph Walsh, IMaR Technology Gateway, Institute of Technology Tralee, Tralee, Ireland, str.: </w:t>
+      </w:r>
+      <w:r>
+        <w:rPr>
+          <w:rFonts w:ascii="Calibri" w:hAnsi="Calibri" w:cs="Calibri"/>
+          <w:lang w:val="sk-SK"/>
+        </w:rPr>
+        <w:t>3</w:t>
+      </w:r>
+      <w:r>
+        <w:rPr>
+          <w:rFonts w:ascii="Calibri" w:hAnsi="Calibri" w:cs="Calibri"/>
+        </w:rPr>
+        <w:t xml:space="preserve"> </w:t>
+      </w:r>
+    </w:p>
+    <w:p>
+      <w:pPr>
+        <w:pStyle w:val="NormalWeb"/>
+        <w:spacing w:line="312" w:lineRule="auto"/>
+        <w:ind w:left="567" w:hanging="567"/>
+      </w:pPr>
+      <w:r>
+        <w:t>[1</w:t>
+      </w:r>
+      <w:r>
+        <w:rPr>
+          <w:lang w:val="sk-SK"/>
+        </w:rPr>
+        <w:t>7</w:t>
+      </w:r>
+      <w:r>
+        <w:t>]</w:t>
+      </w:r>
+      <w:r>
+        <w:rPr>
+          <w:rFonts w:ascii="TimesNewRomanPSMT" w:hAnsi="TimesNewRomanPSMT"/>
+        </w:rPr>
+        <w:t xml:space="preserve"> </w:t>
+      </w:r>
+      <w:r>
+        <w:rPr>
+          <w:rFonts w:ascii="TimesNewRomanPSMT" w:hAnsi="TimesNewRomanPSMT"/>
+        </w:rPr>
+        <w:tab/>
+      </w:r>
+      <w:r>
+        <w:rPr>
+          <w:rFonts w:ascii="TimesNewRomanPSMT" w:hAnsi="TimesNewRomanPSMT"/>
+          <w:lang w:val="sk-SK"/>
+        </w:rPr>
+        <w:t>(</w:t>
+      </w:r>
+      <w:r>
+        <w:rPr>
+          <w:rFonts w:ascii="TimesNewRomanPSMT" w:hAnsi="TimesNewRomanPSMT"/>
+        </w:rPr>
+        <w:t xml:space="preserve">PDF in Articles Folder) </w:t>
+      </w:r>
+      <w:r>
+        <w:rPr>
+          <w:rFonts w:ascii="Calibri" w:hAnsi="Calibri" w:cs="Calibri"/>
+        </w:rPr>
+        <w:t xml:space="preserve">Deep Learning vs. Traditional Computer Vision, Niall O’ Mahony, Sean Campbell, Anderson Carvalho, Suman Harapanahalli, Gustavo Velasco Hernandez, Lenka Krpalkova, Daniel Riordan, Joseph Walsh, IMaR Technology Gateway, Institute of Technology Tralee, Tralee, Ireland, str.: </w:t>
+      </w:r>
+      <w:r>
+        <w:rPr>
+          <w:rFonts w:ascii="Calibri" w:hAnsi="Calibri" w:cs="Calibri"/>
+          <w:lang w:val="sk-SK"/>
+        </w:rPr>
+        <w:t>6-8</w:t>
+      </w:r>
+      <w:r>
+        <w:rPr>
+          <w:rFonts w:ascii="Calibri" w:hAnsi="Calibri" w:cs="Calibri"/>
+        </w:rPr>
+        <w:t xml:space="preserve"> </w:t>
+      </w:r>
+    </w:p>
+    <w:p>
+      <w:pPr>
+        <w:pStyle w:val="NormalWeb"/>
+        <w:shd w:val="clear" w:color="auto" w:fill="FFFFFF"/>
+        <w:spacing w:line="312" w:lineRule="auto"/>
+        <w:ind w:left="709" w:hanging="709"/>
+      </w:pPr>
+    </w:p>
+    <w:p>
+      <w:pPr>
+        <w:pStyle w:val="NormalWeb"/>
+        <w:shd w:val="clear" w:color="auto" w:fill="FFFFFF"/>
+        <w:spacing w:line="312" w:lineRule="auto"/>
+        <w:ind w:left="709" w:hanging="709"/>
+      </w:pPr>
     </w:p>
     <w:p>
       <w:pPr>
         <w:pStyle w:val="TableofAuthorities"/>
-      </w:pPr>
-      <w:r>
-        <w:t>[</w:t>
-      </w:r>
-      <w:r>
-        <w:t>6</w:t>
-      </w:r>
-      <w:r>
-        <w:t>]</w:t>
-      </w:r>
-      <w:r>
-        <w:tab/>
-      </w:r>
-      <w:r>
-        <w:t>https://en.wikipedia.org/wiki/YCbCr</w:t>
-      </w:r>
-    </w:p>
-    <w:p>
-      <w:pPr>
-        <w:pStyle w:val="TableofAuthorities"/>
-      </w:pPr>
-      <w:r>
-        <w:t>[</w:t>
-      </w:r>
-      <w:r>
-        <w:t>7</w:t>
-      </w:r>
-      <w:r>
-        <w:t>]</w:t>
-      </w:r>
-      <w:r>
-        <w:tab/>
-      </w:r>
-      <w:r>
-        <w:t>https://en.wikipedia.org/wiki/CMYK_color_model</w:t>
-      </w:r>
-      <w:r>
-        <w:t xml:space="preserve"> </w:t>
-      </w:r>
-    </w:p>
-    <w:p>
-      <w:pPr>
-        <w:pStyle w:val="TableofAuthorities"/>
-      </w:pPr>
-      <w:r>
-        <w:t>[</w:t>
-      </w:r>
-      <w:r>
-        <w:t>8</w:t>
-      </w:r>
-      <w:r>
-        <w:t>]</w:t>
-      </w:r>
-      <w:r>
-        <w:tab/>
-      </w:r>
-      <w:r>
-        <w:t>https://imagemagick.org/clahe/#gsc.tab=0</w:t>
-      </w:r>
-    </w:p>
-    <w:p>
-      <w:pPr>
-        <w:pStyle w:val="TableofAuthorities"/>
-      </w:pPr>
-      <w:r>
-        <w:t>[</w:t>
-      </w:r>
-      <w:r>
-        <w:t>9</w:t>
-      </w:r>
-      <w:r>
-        <w:t>]</w:t>
-      </w:r>
-      <w:r>
-        <w:tab/>
-      </w:r>
-      <w:r>
-        <w:t>https://medium.com/@muyandiritujr/noise-in-image-processing-and-how-to-add-it-to-images-in-python-456a434dcc3f</w:t>
-      </w:r>
-    </w:p>
-    <w:p>
-      <w:pPr>
-        <w:pStyle w:val="TableofAuthorities"/>
-      </w:pPr>
-      <w:r>
-        <w:t>[10]</w:t>
-      </w:r>
-      <w:r>
-        <w:tab/>
-      </w:r>
-      <w:r>
-        <w:t>https://sarthakforwet.medium.com/cutmix-a-new-strategy-for-data-augmentation-bbc1c3d29aab</w:t>
-      </w:r>
+        <w:spacing w:line="312" w:lineRule="auto"/>
+      </w:pPr>
     </w:p>
     <w:p>
       <w:pPr>
@@ -11092,12 +13214,12 @@
         <w:pStyle w:val="Nadpis1bezslovania"/>
         <w:spacing w:after="480"/>
       </w:pPr>
-      <w:bookmarkStart w:id="63" w:name="_Toc227445303"/>
+      <w:bookmarkStart w:id="73" w:name="_Toc227449212"/>
       <w:r>
         <w:lastRenderedPageBreak/>
         <w:t>Prílohy</w:t>
       </w:r>
-      <w:bookmarkEnd w:id="63"/>
+      <w:bookmarkEnd w:id="73"/>
     </w:p>
     <w:p>
       <w:pPr>
@@ -11140,7 +13262,7 @@
       </w:pPr>
     </w:p>
     <w:sectPr>
-      <w:footerReference w:type="default" r:id="rId28"/>
+      <w:footerReference w:type="default" r:id="rId30"/>
       <w:type w:val="continuous"/>
       <w:pgSz w:w="11906" w:h="16838"/>
       <w:pgMar w:top="1701" w:right="1559" w:bottom="1701" w:left="1559" w:header="709" w:footer="709" w:gutter="0"/>
@@ -15138,7 +17260,7 @@
   <w:style w:type="paragraph" w:default="1" w:styleId="Normal">
     <w:name w:val="Normal"/>
     <w:qFormat/>
-    <w:rsid w:val="00885068"/>
+    <w:rsid w:val="0073293F"/>
     <w:pPr>
       <w:spacing w:line="240" w:lineRule="auto"/>
     </w:pPr>

</xml_diff>

<commit_message>
MasterThesis: Thesis: First 7 chapters = theory part completed
     - Added Chapter 7
     - Formating is on point
     - Image list and Chapters list up to date
</commit_message>
<xml_diff>
--- a/sumsala_diplomova_praca.docx
+++ b/sumsala_diplomova_praca.docx
@@ -1003,7 +1003,7 @@
         </w:rPr>
         <w:fldChar w:fldCharType="separate"/>
       </w:r>
-      <w:hyperlink w:anchor="_Toc227512556" w:history="1">
+      <w:hyperlink w:anchor="_Toc227514379" w:history="1">
         <w:r>
           <w:rPr>
             <w:rStyle w:val="Hyperlink"/>
@@ -1030,7 +1030,7 @@
             <w:noProof/>
             <w:webHidden/>
           </w:rPr>
-          <w:instrText xml:space="preserve"> PAGEREF _Toc227512556 \h </w:instrText>
+          <w:instrText xml:space="preserve"> PAGEREF _Toc227514379 \h </w:instrText>
         </w:r>
         <w:r>
           <w:rPr>
@@ -1071,7 +1071,7 @@
           <w:szCs w:val="24"/>
         </w:rPr>
       </w:pPr>
-      <w:hyperlink w:anchor="_Toc227512557" w:history="1">
+      <w:hyperlink w:anchor="_Toc227514380" w:history="1">
         <w:r>
           <w:rPr>
             <w:rStyle w:val="Hyperlink"/>
@@ -1098,7 +1098,7 @@
             <w:noProof/>
             <w:webHidden/>
           </w:rPr>
-          <w:instrText xml:space="preserve"> PAGEREF _Toc227512557 \h </w:instrText>
+          <w:instrText xml:space="preserve"> PAGEREF _Toc227514380 \h </w:instrText>
         </w:r>
         <w:r>
           <w:rPr>
@@ -1139,7 +1139,7 @@
           <w:szCs w:val="24"/>
         </w:rPr>
       </w:pPr>
-      <w:hyperlink w:anchor="_Toc227512558" w:history="1">
+      <w:hyperlink w:anchor="_Toc227514381" w:history="1">
         <w:r>
           <w:rPr>
             <w:rStyle w:val="Hyperlink"/>
@@ -1166,7 +1166,7 @@
             <w:noProof/>
             <w:webHidden/>
           </w:rPr>
-          <w:instrText xml:space="preserve"> PAGEREF _Toc227512558 \h </w:instrText>
+          <w:instrText xml:space="preserve"> PAGEREF _Toc227514381 \h </w:instrText>
         </w:r>
         <w:r>
           <w:rPr>
@@ -1210,7 +1210,7 @@
           <w:szCs w:val="24"/>
         </w:rPr>
       </w:pPr>
-      <w:hyperlink w:anchor="_Toc227512559" w:history="1">
+      <w:hyperlink w:anchor="_Toc227514382" w:history="1">
         <w:r>
           <w:rPr>
             <w:rStyle w:val="Hyperlink"/>
@@ -1237,7 +1237,7 @@
             <w:noProof/>
             <w:webHidden/>
           </w:rPr>
-          <w:instrText xml:space="preserve"> PAGEREF _Toc227512559 \h </w:instrText>
+          <w:instrText xml:space="preserve"> PAGEREF _Toc227514382 \h </w:instrText>
         </w:r>
         <w:r>
           <w:rPr>
@@ -1281,7 +1281,7 @@
           <w:szCs w:val="24"/>
         </w:rPr>
       </w:pPr>
-      <w:hyperlink w:anchor="_Toc227512560" w:history="1">
+      <w:hyperlink w:anchor="_Toc227514383" w:history="1">
         <w:r>
           <w:rPr>
             <w:rStyle w:val="Hyperlink"/>
@@ -1326,7 +1326,7 @@
             <w:noProof/>
             <w:webHidden/>
           </w:rPr>
-          <w:instrText xml:space="preserve"> PAGEREF _Toc227512560 \h </w:instrText>
+          <w:instrText xml:space="preserve"> PAGEREF _Toc227514383 \h </w:instrText>
         </w:r>
         <w:r>
           <w:rPr>
@@ -1367,7 +1367,7 @@
           <w:szCs w:val="24"/>
         </w:rPr>
       </w:pPr>
-      <w:hyperlink w:anchor="_Toc227512561" w:history="1">
+      <w:hyperlink w:anchor="_Toc227514384" w:history="1">
         <w:r>
           <w:rPr>
             <w:rStyle w:val="Hyperlink"/>
@@ -1394,7 +1394,7 @@
             <w:noProof/>
             <w:webHidden/>
           </w:rPr>
-          <w:instrText xml:space="preserve"> PAGEREF _Toc227512561 \h </w:instrText>
+          <w:instrText xml:space="preserve"> PAGEREF _Toc227514384 \h </w:instrText>
         </w:r>
         <w:r>
           <w:rPr>
@@ -1435,7 +1435,7 @@
           <w:szCs w:val="24"/>
         </w:rPr>
       </w:pPr>
-      <w:hyperlink w:anchor="_Toc227512562" w:history="1">
+      <w:hyperlink w:anchor="_Toc227514385" w:history="1">
         <w:r>
           <w:rPr>
             <w:rStyle w:val="Hyperlink"/>
@@ -1462,7 +1462,7 @@
             <w:noProof/>
             <w:webHidden/>
           </w:rPr>
-          <w:instrText xml:space="preserve"> PAGEREF _Toc227512562 \h </w:instrText>
+          <w:instrText xml:space="preserve"> PAGEREF _Toc227514385 \h </w:instrText>
         </w:r>
         <w:r>
           <w:rPr>
@@ -1503,7 +1503,7 @@
           <w:szCs w:val="24"/>
         </w:rPr>
       </w:pPr>
-      <w:hyperlink w:anchor="_Toc227512563" w:history="1">
+      <w:hyperlink w:anchor="_Toc227514386" w:history="1">
         <w:r>
           <w:rPr>
             <w:rStyle w:val="Hyperlink"/>
@@ -1530,7 +1530,7 @@
             <w:noProof/>
             <w:webHidden/>
           </w:rPr>
-          <w:instrText xml:space="preserve"> PAGEREF _Toc227512563 \h </w:instrText>
+          <w:instrText xml:space="preserve"> PAGEREF _Toc227514386 \h </w:instrText>
         </w:r>
         <w:r>
           <w:rPr>
@@ -1574,7 +1574,7 @@
           <w:szCs w:val="24"/>
         </w:rPr>
       </w:pPr>
-      <w:hyperlink w:anchor="_Toc227512564" w:history="1">
+      <w:hyperlink w:anchor="_Toc227514387" w:history="1">
         <w:r>
           <w:rPr>
             <w:rStyle w:val="Hyperlink"/>
@@ -1619,7 +1619,7 @@
             <w:noProof/>
             <w:webHidden/>
           </w:rPr>
-          <w:instrText xml:space="preserve"> PAGEREF _Toc227512564 \h </w:instrText>
+          <w:instrText xml:space="preserve"> PAGEREF _Toc227514387 \h </w:instrText>
         </w:r>
         <w:r>
           <w:rPr>
@@ -1660,7 +1660,7 @@
           <w:szCs w:val="24"/>
         </w:rPr>
       </w:pPr>
-      <w:hyperlink w:anchor="_Toc227512565" w:history="1">
+      <w:hyperlink w:anchor="_Toc227514388" w:history="1">
         <w:r>
           <w:rPr>
             <w:rStyle w:val="Hyperlink"/>
@@ -1687,7 +1687,7 @@
             <w:noProof/>
             <w:webHidden/>
           </w:rPr>
-          <w:instrText xml:space="preserve"> PAGEREF _Toc227512565 \h </w:instrText>
+          <w:instrText xml:space="preserve"> PAGEREF _Toc227514388 \h </w:instrText>
         </w:r>
         <w:r>
           <w:rPr>
@@ -1728,7 +1728,7 @@
           <w:szCs w:val="24"/>
         </w:rPr>
       </w:pPr>
-      <w:hyperlink w:anchor="_Toc227512566" w:history="1">
+      <w:hyperlink w:anchor="_Toc227514389" w:history="1">
         <w:r>
           <w:rPr>
             <w:rStyle w:val="Hyperlink"/>
@@ -1755,7 +1755,7 @@
             <w:noProof/>
             <w:webHidden/>
           </w:rPr>
-          <w:instrText xml:space="preserve"> PAGEREF _Toc227512566 \h </w:instrText>
+          <w:instrText xml:space="preserve"> PAGEREF _Toc227514389 \h </w:instrText>
         </w:r>
         <w:r>
           <w:rPr>
@@ -1799,7 +1799,7 @@
           <w:szCs w:val="24"/>
         </w:rPr>
       </w:pPr>
-      <w:hyperlink w:anchor="_Toc227512567" w:history="1">
+      <w:hyperlink w:anchor="_Toc227514390" w:history="1">
         <w:r>
           <w:rPr>
             <w:rStyle w:val="Hyperlink"/>
@@ -1844,7 +1844,7 @@
             <w:noProof/>
             <w:webHidden/>
           </w:rPr>
-          <w:instrText xml:space="preserve"> PAGEREF _Toc227512567 \h </w:instrText>
+          <w:instrText xml:space="preserve"> PAGEREF _Toc227514390 \h </w:instrText>
         </w:r>
         <w:r>
           <w:rPr>
@@ -1885,7 +1885,7 @@
           <w:szCs w:val="24"/>
         </w:rPr>
       </w:pPr>
-      <w:hyperlink w:anchor="_Toc227512568" w:history="1">
+      <w:hyperlink w:anchor="_Toc227514391" w:history="1">
         <w:r>
           <w:rPr>
             <w:rStyle w:val="Hyperlink"/>
@@ -1912,7 +1912,7 @@
             <w:noProof/>
             <w:webHidden/>
           </w:rPr>
-          <w:instrText xml:space="preserve"> PAGEREF _Toc227512568 \h </w:instrText>
+          <w:instrText xml:space="preserve"> PAGEREF _Toc227514391 \h </w:instrText>
         </w:r>
         <w:r>
           <w:rPr>
@@ -1952,7 +1952,7 @@
           <w:szCs w:val="24"/>
         </w:rPr>
       </w:pPr>
-      <w:hyperlink w:anchor="_Toc227512569" w:history="1">
+      <w:hyperlink w:anchor="_Toc227514392" w:history="1">
         <w:r>
           <w:rPr>
             <w:rStyle w:val="Hyperlink"/>
@@ -1979,7 +1979,7 @@
             <w:noProof/>
             <w:webHidden/>
           </w:rPr>
-          <w:instrText xml:space="preserve"> PAGEREF _Toc227512569 \h </w:instrText>
+          <w:instrText xml:space="preserve"> PAGEREF _Toc227514392 \h </w:instrText>
         </w:r>
         <w:r>
           <w:rPr>
@@ -2019,7 +2019,7 @@
           <w:szCs w:val="24"/>
         </w:rPr>
       </w:pPr>
-      <w:hyperlink w:anchor="_Toc227512570" w:history="1">
+      <w:hyperlink w:anchor="_Toc227514393" w:history="1">
         <w:r>
           <w:rPr>
             <w:rStyle w:val="Hyperlink"/>
@@ -2046,7 +2046,7 @@
             <w:noProof/>
             <w:webHidden/>
           </w:rPr>
-          <w:instrText xml:space="preserve"> PAGEREF _Toc227512570 \h </w:instrText>
+          <w:instrText xml:space="preserve"> PAGEREF _Toc227514393 \h </w:instrText>
         </w:r>
         <w:r>
           <w:rPr>
@@ -2086,7 +2086,7 @@
           <w:szCs w:val="24"/>
         </w:rPr>
       </w:pPr>
-      <w:hyperlink w:anchor="_Toc227512571" w:history="1">
+      <w:hyperlink w:anchor="_Toc227514394" w:history="1">
         <w:r>
           <w:rPr>
             <w:rStyle w:val="Hyperlink"/>
@@ -2113,7 +2113,7 @@
             <w:noProof/>
             <w:webHidden/>
           </w:rPr>
-          <w:instrText xml:space="preserve"> PAGEREF _Toc227512571 \h </w:instrText>
+          <w:instrText xml:space="preserve"> PAGEREF _Toc227514394 \h </w:instrText>
         </w:r>
         <w:r>
           <w:rPr>
@@ -2153,7 +2153,7 @@
           <w:szCs w:val="24"/>
         </w:rPr>
       </w:pPr>
-      <w:hyperlink w:anchor="_Toc227512572" w:history="1">
+      <w:hyperlink w:anchor="_Toc227514395" w:history="1">
         <w:r>
           <w:rPr>
             <w:rStyle w:val="Hyperlink"/>
@@ -2180,7 +2180,7 @@
             <w:noProof/>
             <w:webHidden/>
           </w:rPr>
-          <w:instrText xml:space="preserve"> PAGEREF _Toc227512572 \h </w:instrText>
+          <w:instrText xml:space="preserve"> PAGEREF _Toc227514395 \h </w:instrText>
         </w:r>
         <w:r>
           <w:rPr>
@@ -2220,7 +2220,7 @@
           <w:szCs w:val="24"/>
         </w:rPr>
       </w:pPr>
-      <w:hyperlink w:anchor="_Toc227512573" w:history="1">
+      <w:hyperlink w:anchor="_Toc227514396" w:history="1">
         <w:r>
           <w:rPr>
             <w:rStyle w:val="Hyperlink"/>
@@ -2247,7 +2247,7 @@
             <w:noProof/>
             <w:webHidden/>
           </w:rPr>
-          <w:instrText xml:space="preserve"> PAGEREF _Toc227512573 \h </w:instrText>
+          <w:instrText xml:space="preserve"> PAGEREF _Toc227514396 \h </w:instrText>
         </w:r>
         <w:r>
           <w:rPr>
@@ -2287,7 +2287,7 @@
           <w:szCs w:val="24"/>
         </w:rPr>
       </w:pPr>
-      <w:hyperlink w:anchor="_Toc227512574" w:history="1">
+      <w:hyperlink w:anchor="_Toc227514397" w:history="1">
         <w:r>
           <w:rPr>
             <w:rStyle w:val="Hyperlink"/>
@@ -2314,7 +2314,7 @@
             <w:noProof/>
             <w:webHidden/>
           </w:rPr>
-          <w:instrText xml:space="preserve"> PAGEREF _Toc227512574 \h </w:instrText>
+          <w:instrText xml:space="preserve"> PAGEREF _Toc227514397 \h </w:instrText>
         </w:r>
         <w:r>
           <w:rPr>
@@ -2354,7 +2354,7 @@
           <w:szCs w:val="24"/>
         </w:rPr>
       </w:pPr>
-      <w:hyperlink w:anchor="_Toc227512575" w:history="1">
+      <w:hyperlink w:anchor="_Toc227514398" w:history="1">
         <w:r>
           <w:rPr>
             <w:rStyle w:val="Hyperlink"/>
@@ -2381,7 +2381,7 @@
             <w:noProof/>
             <w:webHidden/>
           </w:rPr>
-          <w:instrText xml:space="preserve"> PAGEREF _Toc227512575 \h </w:instrText>
+          <w:instrText xml:space="preserve"> PAGEREF _Toc227514398 \h </w:instrText>
         </w:r>
         <w:r>
           <w:rPr>
@@ -2421,7 +2421,7 @@
           <w:szCs w:val="24"/>
         </w:rPr>
       </w:pPr>
-      <w:hyperlink w:anchor="_Toc227512576" w:history="1">
+      <w:hyperlink w:anchor="_Toc227514399" w:history="1">
         <w:r>
           <w:rPr>
             <w:rStyle w:val="Hyperlink"/>
@@ -2448,7 +2448,7 @@
             <w:noProof/>
             <w:webHidden/>
           </w:rPr>
-          <w:instrText xml:space="preserve"> PAGEREF _Toc227512576 \h </w:instrText>
+          <w:instrText xml:space="preserve"> PAGEREF _Toc227514399 \h </w:instrText>
         </w:r>
         <w:r>
           <w:rPr>
@@ -2489,7 +2489,7 @@
           <w:szCs w:val="24"/>
         </w:rPr>
       </w:pPr>
-      <w:hyperlink w:anchor="_Toc227512577" w:history="1">
+      <w:hyperlink w:anchor="_Toc227514400" w:history="1">
         <w:r>
           <w:rPr>
             <w:rStyle w:val="Hyperlink"/>
@@ -2516,7 +2516,7 @@
             <w:noProof/>
             <w:webHidden/>
           </w:rPr>
-          <w:instrText xml:space="preserve"> PAGEREF _Toc227512577 \h </w:instrText>
+          <w:instrText xml:space="preserve"> PAGEREF _Toc227514400 \h </w:instrText>
         </w:r>
         <w:r>
           <w:rPr>
@@ -2557,7 +2557,7 @@
           <w:szCs w:val="24"/>
         </w:rPr>
       </w:pPr>
-      <w:hyperlink w:anchor="_Toc227512578" w:history="1">
+      <w:hyperlink w:anchor="_Toc227514401" w:history="1">
         <w:r>
           <w:rPr>
             <w:rStyle w:val="Hyperlink"/>
@@ -2584,7 +2584,7 @@
             <w:noProof/>
             <w:webHidden/>
           </w:rPr>
-          <w:instrText xml:space="preserve"> PAGEREF _Toc227512578 \h </w:instrText>
+          <w:instrText xml:space="preserve"> PAGEREF _Toc227514401 \h </w:instrText>
         </w:r>
         <w:r>
           <w:rPr>
@@ -2624,7 +2624,7 @@
           <w:szCs w:val="24"/>
         </w:rPr>
       </w:pPr>
-      <w:hyperlink w:anchor="_Toc227512579" w:history="1">
+      <w:hyperlink w:anchor="_Toc227514402" w:history="1">
         <w:r>
           <w:rPr>
             <w:rStyle w:val="Hyperlink"/>
@@ -2651,7 +2651,7 @@
             <w:noProof/>
             <w:webHidden/>
           </w:rPr>
-          <w:instrText xml:space="preserve"> PAGEREF _Toc227512579 \h </w:instrText>
+          <w:instrText xml:space="preserve"> PAGEREF _Toc227514402 \h </w:instrText>
         </w:r>
         <w:r>
           <w:rPr>
@@ -2691,7 +2691,7 @@
           <w:szCs w:val="24"/>
         </w:rPr>
       </w:pPr>
-      <w:hyperlink w:anchor="_Toc227512580" w:history="1">
+      <w:hyperlink w:anchor="_Toc227514403" w:history="1">
         <w:r>
           <w:rPr>
             <w:rStyle w:val="Hyperlink"/>
@@ -2719,7 +2719,7 @@
             <w:noProof/>
             <w:webHidden/>
           </w:rPr>
-          <w:instrText xml:space="preserve"> PAGEREF _Toc227512580 \h </w:instrText>
+          <w:instrText xml:space="preserve"> PAGEREF _Toc227514403 \h </w:instrText>
         </w:r>
         <w:r>
           <w:rPr>
@@ -2759,7 +2759,7 @@
           <w:szCs w:val="24"/>
         </w:rPr>
       </w:pPr>
-      <w:hyperlink w:anchor="_Toc227512581" w:history="1">
+      <w:hyperlink w:anchor="_Toc227514404" w:history="1">
         <w:r>
           <w:rPr>
             <w:rStyle w:val="Hyperlink"/>
@@ -2787,7 +2787,7 @@
             <w:noProof/>
             <w:webHidden/>
           </w:rPr>
-          <w:instrText xml:space="preserve"> PAGEREF _Toc227512581 \h </w:instrText>
+          <w:instrText xml:space="preserve"> PAGEREF _Toc227514404 \h </w:instrText>
         </w:r>
         <w:r>
           <w:rPr>
@@ -2827,7 +2827,7 @@
           <w:szCs w:val="24"/>
         </w:rPr>
       </w:pPr>
-      <w:hyperlink w:anchor="_Toc227512582" w:history="1">
+      <w:hyperlink w:anchor="_Toc227514405" w:history="1">
         <w:r>
           <w:rPr>
             <w:rStyle w:val="Hyperlink"/>
@@ -2855,7 +2855,7 @@
             <w:noProof/>
             <w:webHidden/>
           </w:rPr>
-          <w:instrText xml:space="preserve"> PAGEREF _Toc227512582 \h </w:instrText>
+          <w:instrText xml:space="preserve"> PAGEREF _Toc227514405 \h </w:instrText>
         </w:r>
         <w:r>
           <w:rPr>
@@ -2896,7 +2896,7 @@
           <w:szCs w:val="24"/>
         </w:rPr>
       </w:pPr>
-      <w:hyperlink w:anchor="_Toc227512583" w:history="1">
+      <w:hyperlink w:anchor="_Toc227514406" w:history="1">
         <w:r>
           <w:rPr>
             <w:rStyle w:val="Hyperlink"/>
@@ -2938,7 +2938,7 @@
             <w:noProof/>
             <w:webHidden/>
           </w:rPr>
-          <w:instrText xml:space="preserve"> PAGEREF _Toc227512583 \h </w:instrText>
+          <w:instrText xml:space="preserve"> PAGEREF _Toc227514406 \h </w:instrText>
         </w:r>
         <w:r>
           <w:rPr>
@@ -2978,7 +2978,7 @@
           <w:szCs w:val="24"/>
         </w:rPr>
       </w:pPr>
-      <w:hyperlink w:anchor="_Toc227512584" w:history="1">
+      <w:hyperlink w:anchor="_Toc227514407" w:history="1">
         <w:r>
           <w:rPr>
             <w:rStyle w:val="Hyperlink"/>
@@ -3006,7 +3006,7 @@
             <w:noProof/>
             <w:webHidden/>
           </w:rPr>
-          <w:instrText xml:space="preserve"> PAGEREF _Toc227512584 \h </w:instrText>
+          <w:instrText xml:space="preserve"> PAGEREF _Toc227514407 \h </w:instrText>
         </w:r>
         <w:r>
           <w:rPr>
@@ -3046,7 +3046,7 @@
           <w:szCs w:val="24"/>
         </w:rPr>
       </w:pPr>
-      <w:hyperlink w:anchor="_Toc227512585" w:history="1">
+      <w:hyperlink w:anchor="_Toc227514408" w:history="1">
         <w:r>
           <w:rPr>
             <w:rStyle w:val="Hyperlink"/>
@@ -3074,7 +3074,7 @@
             <w:noProof/>
             <w:webHidden/>
           </w:rPr>
-          <w:instrText xml:space="preserve"> PAGEREF _Toc227512585 \h </w:instrText>
+          <w:instrText xml:space="preserve"> PAGEREF _Toc227514408 \h </w:instrText>
         </w:r>
         <w:r>
           <w:rPr>
@@ -3114,7 +3114,7 @@
           <w:szCs w:val="24"/>
         </w:rPr>
       </w:pPr>
-      <w:hyperlink w:anchor="_Toc227512586" w:history="1">
+      <w:hyperlink w:anchor="_Toc227514409" w:history="1">
         <w:r>
           <w:rPr>
             <w:rStyle w:val="Hyperlink"/>
@@ -3142,7 +3142,7 @@
             <w:noProof/>
             <w:webHidden/>
           </w:rPr>
-          <w:instrText xml:space="preserve"> PAGEREF _Toc227512586 \h </w:instrText>
+          <w:instrText xml:space="preserve"> PAGEREF _Toc227514409 \h </w:instrText>
         </w:r>
         <w:r>
           <w:rPr>
@@ -3183,7 +3183,7 @@
           <w:szCs w:val="24"/>
         </w:rPr>
       </w:pPr>
-      <w:hyperlink w:anchor="_Toc227512587" w:history="1">
+      <w:hyperlink w:anchor="_Toc227514410" w:history="1">
         <w:r>
           <w:rPr>
             <w:rStyle w:val="Hyperlink"/>
@@ -3218,7 +3218,7 @@
             <w:noProof/>
             <w:webHidden/>
           </w:rPr>
-          <w:instrText xml:space="preserve"> PAGEREF _Toc227512587 \h </w:instrText>
+          <w:instrText xml:space="preserve"> PAGEREF _Toc227514410 \h </w:instrText>
         </w:r>
         <w:r>
           <w:rPr>
@@ -3258,7 +3258,7 @@
           <w:szCs w:val="24"/>
         </w:rPr>
       </w:pPr>
-      <w:hyperlink w:anchor="_Toc227512588" w:history="1">
+      <w:hyperlink w:anchor="_Toc227514411" w:history="1">
         <w:r>
           <w:rPr>
             <w:rStyle w:val="Hyperlink"/>
@@ -3286,7 +3286,7 @@
             <w:noProof/>
             <w:webHidden/>
           </w:rPr>
-          <w:instrText xml:space="preserve"> PAGEREF _Toc227512588 \h </w:instrText>
+          <w:instrText xml:space="preserve"> PAGEREF _Toc227514411 \h </w:instrText>
         </w:r>
         <w:r>
           <w:rPr>
@@ -3326,7 +3326,7 @@
           <w:szCs w:val="24"/>
         </w:rPr>
       </w:pPr>
-      <w:hyperlink w:anchor="_Toc227512589" w:history="1">
+      <w:hyperlink w:anchor="_Toc227514412" w:history="1">
         <w:r>
           <w:rPr>
             <w:rStyle w:val="Hyperlink"/>
@@ -3354,7 +3354,7 @@
             <w:noProof/>
             <w:webHidden/>
           </w:rPr>
-          <w:instrText xml:space="preserve"> PAGEREF _Toc227512589 \h </w:instrText>
+          <w:instrText xml:space="preserve"> PAGEREF _Toc227514412 \h </w:instrText>
         </w:r>
         <w:r>
           <w:rPr>
@@ -3394,7 +3394,7 @@
           <w:szCs w:val="24"/>
         </w:rPr>
       </w:pPr>
-      <w:hyperlink w:anchor="_Toc227512590" w:history="1">
+      <w:hyperlink w:anchor="_Toc227514413" w:history="1">
         <w:r>
           <w:rPr>
             <w:rStyle w:val="Hyperlink"/>
@@ -3422,7 +3422,7 @@
             <w:noProof/>
             <w:webHidden/>
           </w:rPr>
-          <w:instrText xml:space="preserve"> PAGEREF _Toc227512590 \h </w:instrText>
+          <w:instrText xml:space="preserve"> PAGEREF _Toc227514413 \h </w:instrText>
         </w:r>
         <w:r>
           <w:rPr>
@@ -3462,7 +3462,7 @@
           <w:szCs w:val="24"/>
         </w:rPr>
       </w:pPr>
-      <w:hyperlink w:anchor="_Toc227512591" w:history="1">
+      <w:hyperlink w:anchor="_Toc227514414" w:history="1">
         <w:r>
           <w:rPr>
             <w:rStyle w:val="Hyperlink"/>
@@ -3490,7 +3490,7 @@
             <w:noProof/>
             <w:webHidden/>
           </w:rPr>
-          <w:instrText xml:space="preserve"> PAGEREF _Toc227512591 \h </w:instrText>
+          <w:instrText xml:space="preserve"> PAGEREF _Toc227514414 \h </w:instrText>
         </w:r>
         <w:r>
           <w:rPr>
@@ -3530,7 +3530,7 @@
           <w:szCs w:val="24"/>
         </w:rPr>
       </w:pPr>
-      <w:hyperlink w:anchor="_Toc227512592" w:history="1">
+      <w:hyperlink w:anchor="_Toc227514415" w:history="1">
         <w:r>
           <w:rPr>
             <w:rStyle w:val="Hyperlink"/>
@@ -3558,7 +3558,7 @@
             <w:noProof/>
             <w:webHidden/>
           </w:rPr>
-          <w:instrText xml:space="preserve"> PAGEREF _Toc227512592 \h </w:instrText>
+          <w:instrText xml:space="preserve"> PAGEREF _Toc227514415 \h </w:instrText>
         </w:r>
         <w:r>
           <w:rPr>
@@ -3602,7 +3602,7 @@
           <w:szCs w:val="24"/>
         </w:rPr>
       </w:pPr>
-      <w:hyperlink w:anchor="_Toc227512593" w:history="1">
+      <w:hyperlink w:anchor="_Toc227514416" w:history="1">
         <w:r>
           <w:rPr>
             <w:rStyle w:val="Hyperlink"/>
@@ -3649,7 +3649,7 @@
             <w:noProof/>
             <w:webHidden/>
           </w:rPr>
-          <w:instrText xml:space="preserve"> PAGEREF _Toc227512593 \h </w:instrText>
+          <w:instrText xml:space="preserve"> PAGEREF _Toc227514416 \h </w:instrText>
         </w:r>
         <w:r>
           <w:rPr>
@@ -3690,7 +3690,7 @@
           <w:szCs w:val="24"/>
         </w:rPr>
       </w:pPr>
-      <w:hyperlink w:anchor="_Toc227512594" w:history="1">
+      <w:hyperlink w:anchor="_Toc227514417" w:history="1">
         <w:r>
           <w:rPr>
             <w:rStyle w:val="Hyperlink"/>
@@ -3725,7 +3725,7 @@
             <w:noProof/>
             <w:webHidden/>
           </w:rPr>
-          <w:instrText xml:space="preserve"> PAGEREF _Toc227512594 \h </w:instrText>
+          <w:instrText xml:space="preserve"> PAGEREF _Toc227514417 \h </w:instrText>
         </w:r>
         <w:r>
           <w:rPr>
@@ -3765,7 +3765,7 @@
           <w:szCs w:val="24"/>
         </w:rPr>
       </w:pPr>
-      <w:hyperlink w:anchor="_Toc227512595" w:history="1">
+      <w:hyperlink w:anchor="_Toc227514418" w:history="1">
         <w:r>
           <w:rPr>
             <w:rStyle w:val="Hyperlink"/>
@@ -3800,7 +3800,7 @@
             <w:noProof/>
             <w:webHidden/>
           </w:rPr>
-          <w:instrText xml:space="preserve"> PAGEREF _Toc227512595 \h </w:instrText>
+          <w:instrText xml:space="preserve"> PAGEREF _Toc227514418 \h </w:instrText>
         </w:r>
         <w:r>
           <w:rPr>
@@ -3840,7 +3840,7 @@
           <w:szCs w:val="24"/>
         </w:rPr>
       </w:pPr>
-      <w:hyperlink w:anchor="_Toc227512596" w:history="1">
+      <w:hyperlink w:anchor="_Toc227514419" w:history="1">
         <w:r>
           <w:rPr>
             <w:rStyle w:val="Hyperlink"/>
@@ -3875,7 +3875,7 @@
             <w:noProof/>
             <w:webHidden/>
           </w:rPr>
-          <w:instrText xml:space="preserve"> PAGEREF _Toc227512596 \h </w:instrText>
+          <w:instrText xml:space="preserve"> PAGEREF _Toc227514419 \h </w:instrText>
         </w:r>
         <w:r>
           <w:rPr>
@@ -3915,7 +3915,7 @@
           <w:szCs w:val="24"/>
         </w:rPr>
       </w:pPr>
-      <w:hyperlink w:anchor="_Toc227512597" w:history="1">
+      <w:hyperlink w:anchor="_Toc227514420" w:history="1">
         <w:r>
           <w:rPr>
             <w:rStyle w:val="Hyperlink"/>
@@ -3950,7 +3950,7 @@
             <w:noProof/>
             <w:webHidden/>
           </w:rPr>
-          <w:instrText xml:space="preserve"> PAGEREF _Toc227512597 \h </w:instrText>
+          <w:instrText xml:space="preserve"> PAGEREF _Toc227514420 \h </w:instrText>
         </w:r>
         <w:r>
           <w:rPr>
@@ -3991,7 +3991,7 @@
           <w:szCs w:val="24"/>
         </w:rPr>
       </w:pPr>
-      <w:hyperlink w:anchor="_Toc227512598" w:history="1">
+      <w:hyperlink w:anchor="_Toc227514421" w:history="1">
         <w:r>
           <w:rPr>
             <w:rStyle w:val="Hyperlink"/>
@@ -4019,7 +4019,7 @@
             <w:noProof/>
             <w:webHidden/>
           </w:rPr>
-          <w:instrText xml:space="preserve"> PAGEREF _Toc227512598 \h </w:instrText>
+          <w:instrText xml:space="preserve"> PAGEREF _Toc227514421 \h </w:instrText>
         </w:r>
         <w:r>
           <w:rPr>
@@ -4059,7 +4059,7 @@
           <w:szCs w:val="24"/>
         </w:rPr>
       </w:pPr>
-      <w:hyperlink w:anchor="_Toc227512599" w:history="1">
+      <w:hyperlink w:anchor="_Toc227514422" w:history="1">
         <w:r>
           <w:rPr>
             <w:rStyle w:val="Hyperlink"/>
@@ -4094,7 +4094,7 @@
             <w:noProof/>
             <w:webHidden/>
           </w:rPr>
-          <w:instrText xml:space="preserve"> PAGEREF _Toc227512599 \h </w:instrText>
+          <w:instrText xml:space="preserve"> PAGEREF _Toc227514422 \h </w:instrText>
         </w:r>
         <w:r>
           <w:rPr>
@@ -4135,7 +4135,7 @@
           <w:szCs w:val="24"/>
         </w:rPr>
       </w:pPr>
-      <w:hyperlink w:anchor="_Toc227512600" w:history="1">
+      <w:hyperlink w:anchor="_Toc227514423" w:history="1">
         <w:r>
           <w:rPr>
             <w:rStyle w:val="Hyperlink"/>
@@ -4163,7 +4163,7 @@
             <w:noProof/>
             <w:webHidden/>
           </w:rPr>
-          <w:instrText xml:space="preserve"> PAGEREF _Toc227512600 \h </w:instrText>
+          <w:instrText xml:space="preserve"> PAGEREF _Toc227514423 \h </w:instrText>
         </w:r>
         <w:r>
           <w:rPr>
@@ -4203,7 +4203,7 @@
           <w:szCs w:val="24"/>
         </w:rPr>
       </w:pPr>
-      <w:hyperlink w:anchor="_Toc227512601" w:history="1">
+      <w:hyperlink w:anchor="_Toc227514424" w:history="1">
         <w:r>
           <w:rPr>
             <w:rStyle w:val="Hyperlink"/>
@@ -4231,7 +4231,7 @@
             <w:noProof/>
             <w:webHidden/>
           </w:rPr>
-          <w:instrText xml:space="preserve"> PAGEREF _Toc227512601 \h </w:instrText>
+          <w:instrText xml:space="preserve"> PAGEREF _Toc227514424 \h </w:instrText>
         </w:r>
         <w:r>
           <w:rPr>
@@ -4271,7 +4271,7 @@
           <w:szCs w:val="24"/>
         </w:rPr>
       </w:pPr>
-      <w:hyperlink w:anchor="_Toc227512602" w:history="1">
+      <w:hyperlink w:anchor="_Toc227514425" w:history="1">
         <w:r>
           <w:rPr>
             <w:rStyle w:val="Hyperlink"/>
@@ -4299,7 +4299,7 @@
             <w:noProof/>
             <w:webHidden/>
           </w:rPr>
-          <w:instrText xml:space="preserve"> PAGEREF _Toc227512602 \h </w:instrText>
+          <w:instrText xml:space="preserve"> PAGEREF _Toc227514425 \h </w:instrText>
         </w:r>
         <w:r>
           <w:rPr>
@@ -4339,7 +4339,7 @@
           <w:szCs w:val="24"/>
         </w:rPr>
       </w:pPr>
-      <w:hyperlink w:anchor="_Toc227512603" w:history="1">
+      <w:hyperlink w:anchor="_Toc227514426" w:history="1">
         <w:r>
           <w:rPr>
             <w:rStyle w:val="Hyperlink"/>
@@ -4367,7 +4367,7 @@
             <w:noProof/>
             <w:webHidden/>
           </w:rPr>
-          <w:instrText xml:space="preserve"> PAGEREF _Toc227512603 \h </w:instrText>
+          <w:instrText xml:space="preserve"> PAGEREF _Toc227514426 \h </w:instrText>
         </w:r>
         <w:r>
           <w:rPr>
@@ -4407,7 +4407,7 @@
           <w:szCs w:val="24"/>
         </w:rPr>
       </w:pPr>
-      <w:hyperlink w:anchor="_Toc227512604" w:history="1">
+      <w:hyperlink w:anchor="_Toc227514427" w:history="1">
         <w:r>
           <w:rPr>
             <w:rStyle w:val="Hyperlink"/>
@@ -4435,7 +4435,7 @@
             <w:noProof/>
             <w:webHidden/>
           </w:rPr>
-          <w:instrText xml:space="preserve"> PAGEREF _Toc227512604 \h </w:instrText>
+          <w:instrText xml:space="preserve"> PAGEREF _Toc227514427 \h </w:instrText>
         </w:r>
         <w:r>
           <w:rPr>
@@ -4476,7 +4476,7 @@
           <w:szCs w:val="24"/>
         </w:rPr>
       </w:pPr>
-      <w:hyperlink w:anchor="_Toc227512605" w:history="1">
+      <w:hyperlink w:anchor="_Toc227514428" w:history="1">
         <w:r>
           <w:rPr>
             <w:rStyle w:val="Hyperlink"/>
@@ -4504,7 +4504,7 @@
             <w:noProof/>
             <w:webHidden/>
           </w:rPr>
-          <w:instrText xml:space="preserve"> PAGEREF _Toc227512605 \h </w:instrText>
+          <w:instrText xml:space="preserve"> PAGEREF _Toc227514428 \h </w:instrText>
         </w:r>
         <w:r>
           <w:rPr>
@@ -4548,7 +4548,7 @@
           <w:szCs w:val="24"/>
         </w:rPr>
       </w:pPr>
-      <w:hyperlink w:anchor="_Toc227512606" w:history="1">
+      <w:hyperlink w:anchor="_Toc227514429" w:history="1">
         <w:r>
           <w:rPr>
             <w:rStyle w:val="Hyperlink"/>
@@ -4595,7 +4595,7 @@
             <w:noProof/>
             <w:webHidden/>
           </w:rPr>
-          <w:instrText xml:space="preserve"> PAGEREF _Toc227512606 \h </w:instrText>
+          <w:instrText xml:space="preserve"> PAGEREF _Toc227514429 \h </w:instrText>
         </w:r>
         <w:r>
           <w:rPr>
@@ -4636,7 +4636,7 @@
           <w:szCs w:val="24"/>
         </w:rPr>
       </w:pPr>
-      <w:hyperlink w:anchor="_Toc227512607" w:history="1">
+      <w:hyperlink w:anchor="_Toc227514430" w:history="1">
         <w:r>
           <w:rPr>
             <w:rStyle w:val="Hyperlink"/>
@@ -4664,7 +4664,7 @@
             <w:noProof/>
             <w:webHidden/>
           </w:rPr>
-          <w:instrText xml:space="preserve"> PAGEREF _Toc227512607 \h </w:instrText>
+          <w:instrText xml:space="preserve"> PAGEREF _Toc227514430 \h </w:instrText>
         </w:r>
         <w:r>
           <w:rPr>
@@ -4705,7 +4705,7 @@
           <w:szCs w:val="24"/>
         </w:rPr>
       </w:pPr>
-      <w:hyperlink w:anchor="_Toc227512608" w:history="1">
+      <w:hyperlink w:anchor="_Toc227514431" w:history="1">
         <w:r>
           <w:rPr>
             <w:rStyle w:val="Hyperlink"/>
@@ -4733,7 +4733,7 @@
             <w:noProof/>
             <w:webHidden/>
           </w:rPr>
-          <w:instrText xml:space="preserve"> PAGEREF _Toc227512608 \h </w:instrText>
+          <w:instrText xml:space="preserve"> PAGEREF _Toc227514431 \h </w:instrText>
         </w:r>
         <w:r>
           <w:rPr>
@@ -4774,7 +4774,7 @@
           <w:szCs w:val="24"/>
         </w:rPr>
       </w:pPr>
-      <w:hyperlink w:anchor="_Toc227512609" w:history="1">
+      <w:hyperlink w:anchor="_Toc227514432" w:history="1">
         <w:r>
           <w:rPr>
             <w:rStyle w:val="Hyperlink"/>
@@ -4832,7 +4832,7 @@
             <w:noProof/>
             <w:webHidden/>
           </w:rPr>
-          <w:instrText xml:space="preserve"> PAGEREF _Toc227512609 \h </w:instrText>
+          <w:instrText xml:space="preserve"> PAGEREF _Toc227514432 \h </w:instrText>
         </w:r>
         <w:r>
           <w:rPr>
@@ -4876,7 +4876,7 @@
           <w:szCs w:val="24"/>
         </w:rPr>
       </w:pPr>
-      <w:hyperlink w:anchor="_Toc227512610" w:history="1">
+      <w:hyperlink w:anchor="_Toc227514433" w:history="1">
         <w:r>
           <w:rPr>
             <w:rStyle w:val="Hyperlink"/>
@@ -4923,7 +4923,7 @@
             <w:noProof/>
             <w:webHidden/>
           </w:rPr>
-          <w:instrText xml:space="preserve"> PAGEREF _Toc227512610 \h </w:instrText>
+          <w:instrText xml:space="preserve"> PAGEREF _Toc227514433 \h </w:instrText>
         </w:r>
         <w:r>
           <w:rPr>
@@ -4944,73 +4944,6 @@
             <w:webHidden/>
           </w:rPr>
           <w:t>33</w:t>
-        </w:r>
-        <w:r>
-          <w:rPr>
-            <w:noProof/>
-            <w:webHidden/>
-          </w:rPr>
-          <w:fldChar w:fldCharType="end"/>
-        </w:r>
-      </w:hyperlink>
-    </w:p>
-    <w:p>
-      <w:pPr>
-        <w:pStyle w:val="TOC3"/>
-        <w:rPr>
-          <w:rFonts w:asciiTheme="minorHAnsi" w:eastAsiaTheme="minorEastAsia" w:hAnsiTheme="minorHAnsi" w:cstheme="minorBidi"/>
-          <w:noProof/>
-          <w:szCs w:val="24"/>
-        </w:rPr>
-      </w:pPr>
-      <w:hyperlink w:anchor="_Toc227512611" w:history="1">
-        <w:r>
-          <w:rPr>
-            <w:rStyle w:val="Hyperlink"/>
-            <w:noProof/>
-          </w:rPr>
-          <w:t>6.1.1 Záver</w:t>
-        </w:r>
-        <w:r>
-          <w:rPr>
-            <w:noProof/>
-            <w:webHidden/>
-          </w:rPr>
-          <w:tab/>
-        </w:r>
-        <w:r>
-          <w:rPr>
-            <w:noProof/>
-            <w:webHidden/>
-          </w:rPr>
-          <w:fldChar w:fldCharType="begin"/>
-        </w:r>
-        <w:r>
-          <w:rPr>
-            <w:noProof/>
-            <w:webHidden/>
-          </w:rPr>
-          <w:instrText xml:space="preserve"> PAGEREF _Toc227512611 \h </w:instrText>
-        </w:r>
-        <w:r>
-          <w:rPr>
-            <w:noProof/>
-            <w:webHidden/>
-          </w:rPr>
-        </w:r>
-        <w:r>
-          <w:rPr>
-            <w:noProof/>
-            <w:webHidden/>
-          </w:rPr>
-          <w:fldChar w:fldCharType="separate"/>
-        </w:r>
-        <w:r>
-          <w:rPr>
-            <w:noProof/>
-            <w:webHidden/>
-          </w:rPr>
-          <w:t>34</w:t>
         </w:r>
         <w:r>
           <w:rPr>
@@ -5034,23 +4967,43 @@
           <w:szCs w:val="24"/>
         </w:rPr>
       </w:pPr>
-      <w:hyperlink w:anchor="_Toc227512612" w:history="1">
+      <w:hyperlink w:anchor="_Toc227514434" w:history="1">
         <w:r>
           <w:rPr>
             <w:rStyle w:val="Hyperlink"/>
             <w:noProof/>
-          </w:rPr>
-          <w:t>Záver</w:t>
-        </w:r>
-        <w:r>
-          <w:rPr>
-            <w:noProof/>
-            <w:webHidden/>
+            <w:lang w:val="sk-SK"/>
+          </w:rPr>
+          <w:t>7</w:t>
+        </w:r>
+        <w:r>
+          <w:rPr>
+            <w:rFonts w:asciiTheme="minorHAnsi" w:eastAsiaTheme="minorEastAsia" w:hAnsiTheme="minorHAnsi" w:cstheme="minorBidi"/>
+            <w:b w:val="0"/>
+            <w:bCs w:val="0"/>
+            <w:noProof/>
+            <w:sz w:val="24"/>
+            <w:szCs w:val="24"/>
           </w:rPr>
           <w:tab/>
         </w:r>
         <w:r>
           <w:rPr>
+            <w:rStyle w:val="Hyperlink"/>
+            <w:noProof/>
+            <w:lang w:val="sk-SK"/>
+          </w:rPr>
+          <w:t>Optimalizácia hyperparametrov pomocou frameworku Optuna</w:t>
+        </w:r>
+        <w:r>
+          <w:rPr>
+            <w:noProof/>
+            <w:webHidden/>
+          </w:rPr>
+          <w:tab/>
+        </w:r>
+        <w:r>
+          <w:rPr>
             <w:noProof/>
             <w:webHidden/>
           </w:rPr>
@@ -5061,7 +5014,7 @@
             <w:noProof/>
             <w:webHidden/>
           </w:rPr>
-          <w:instrText xml:space="preserve"> PAGEREF _Toc227512612 \h </w:instrText>
+          <w:instrText xml:space="preserve"> PAGEREF _Toc227514434 \h </w:instrText>
         </w:r>
         <w:r>
           <w:rPr>
@@ -5081,7 +5034,688 @@
             <w:noProof/>
             <w:webHidden/>
           </w:rPr>
+          <w:t>34</w:t>
+        </w:r>
+        <w:r>
+          <w:rPr>
+            <w:noProof/>
+            <w:webHidden/>
+          </w:rPr>
+          <w:fldChar w:fldCharType="end"/>
+        </w:r>
+      </w:hyperlink>
+    </w:p>
+    <w:p>
+      <w:pPr>
+        <w:pStyle w:val="TOC2"/>
+        <w:rPr>
+          <w:rFonts w:asciiTheme="minorHAnsi" w:eastAsiaTheme="minorEastAsia" w:hAnsiTheme="minorHAnsi" w:cstheme="minorBidi"/>
+          <w:iCs w:val="0"/>
+          <w:noProof/>
+          <w:szCs w:val="24"/>
+        </w:rPr>
+      </w:pPr>
+      <w:hyperlink w:anchor="_Toc227514435" w:history="1">
+        <w:r>
+          <w:rPr>
+            <w:rStyle w:val="Hyperlink"/>
+            <w:noProof/>
+            <w:lang w:val="sk-SK"/>
+          </w:rPr>
+          <w:t>7.1 Optuna framework</w:t>
+        </w:r>
+        <w:r>
+          <w:rPr>
+            <w:noProof/>
+            <w:webHidden/>
+          </w:rPr>
+          <w:tab/>
+        </w:r>
+        <w:r>
+          <w:rPr>
+            <w:noProof/>
+            <w:webHidden/>
+          </w:rPr>
+          <w:fldChar w:fldCharType="begin"/>
+        </w:r>
+        <w:r>
+          <w:rPr>
+            <w:noProof/>
+            <w:webHidden/>
+          </w:rPr>
+          <w:instrText xml:space="preserve"> PAGEREF _Toc227514435 \h </w:instrText>
+        </w:r>
+        <w:r>
+          <w:rPr>
+            <w:noProof/>
+            <w:webHidden/>
+          </w:rPr>
+        </w:r>
+        <w:r>
+          <w:rPr>
+            <w:noProof/>
+            <w:webHidden/>
+          </w:rPr>
+          <w:fldChar w:fldCharType="separate"/>
+        </w:r>
+        <w:r>
+          <w:rPr>
+            <w:noProof/>
+            <w:webHidden/>
+          </w:rPr>
+          <w:t>34</w:t>
+        </w:r>
+        <w:r>
+          <w:rPr>
+            <w:noProof/>
+            <w:webHidden/>
+          </w:rPr>
+          <w:fldChar w:fldCharType="end"/>
+        </w:r>
+      </w:hyperlink>
+    </w:p>
+    <w:p>
+      <w:pPr>
+        <w:pStyle w:val="TOC2"/>
+        <w:rPr>
+          <w:rFonts w:asciiTheme="minorHAnsi" w:eastAsiaTheme="minorEastAsia" w:hAnsiTheme="minorHAnsi" w:cstheme="minorBidi"/>
+          <w:iCs w:val="0"/>
+          <w:noProof/>
+          <w:szCs w:val="24"/>
+        </w:rPr>
+      </w:pPr>
+      <w:hyperlink w:anchor="_Toc227514436" w:history="1">
+        <w:r>
+          <w:rPr>
+            <w:rStyle w:val="Hyperlink"/>
+            <w:noProof/>
+            <w:lang w:val="sk-SK"/>
+          </w:rPr>
+          <w:t>7.2 Optimalizované hyperparametre v tejto práci</w:t>
+        </w:r>
+        <w:r>
+          <w:rPr>
+            <w:noProof/>
+            <w:webHidden/>
+          </w:rPr>
+          <w:tab/>
+        </w:r>
+        <w:r>
+          <w:rPr>
+            <w:noProof/>
+            <w:webHidden/>
+          </w:rPr>
+          <w:fldChar w:fldCharType="begin"/>
+        </w:r>
+        <w:r>
+          <w:rPr>
+            <w:noProof/>
+            <w:webHidden/>
+          </w:rPr>
+          <w:instrText xml:space="preserve"> PAGEREF _Toc227514436 \h </w:instrText>
+        </w:r>
+        <w:r>
+          <w:rPr>
+            <w:noProof/>
+            <w:webHidden/>
+          </w:rPr>
+        </w:r>
+        <w:r>
+          <w:rPr>
+            <w:noProof/>
+            <w:webHidden/>
+          </w:rPr>
+          <w:fldChar w:fldCharType="separate"/>
+        </w:r>
+        <w:r>
+          <w:rPr>
+            <w:noProof/>
+            <w:webHidden/>
+          </w:rPr>
+          <w:t>34</w:t>
+        </w:r>
+        <w:r>
+          <w:rPr>
+            <w:noProof/>
+            <w:webHidden/>
+          </w:rPr>
+          <w:fldChar w:fldCharType="end"/>
+        </w:r>
+      </w:hyperlink>
+    </w:p>
+    <w:p>
+      <w:pPr>
+        <w:pStyle w:val="TOC3"/>
+        <w:rPr>
+          <w:rFonts w:asciiTheme="minorHAnsi" w:eastAsiaTheme="minorEastAsia" w:hAnsiTheme="minorHAnsi" w:cstheme="minorBidi"/>
+          <w:noProof/>
+          <w:szCs w:val="24"/>
+        </w:rPr>
+      </w:pPr>
+      <w:hyperlink w:anchor="_Toc227514437" w:history="1">
+        <w:r>
+          <w:rPr>
+            <w:rStyle w:val="Hyperlink"/>
+            <w:noProof/>
+            <w:lang w:val="sk-SK"/>
+          </w:rPr>
+          <w:t>7.2.1 Počet konvolučných vrstiev</w:t>
+        </w:r>
+        <w:r>
+          <w:rPr>
+            <w:noProof/>
+            <w:webHidden/>
+          </w:rPr>
+          <w:tab/>
+        </w:r>
+        <w:r>
+          <w:rPr>
+            <w:noProof/>
+            <w:webHidden/>
+          </w:rPr>
+          <w:fldChar w:fldCharType="begin"/>
+        </w:r>
+        <w:r>
+          <w:rPr>
+            <w:noProof/>
+            <w:webHidden/>
+          </w:rPr>
+          <w:instrText xml:space="preserve"> PAGEREF _Toc227514437 \h </w:instrText>
+        </w:r>
+        <w:r>
+          <w:rPr>
+            <w:noProof/>
+            <w:webHidden/>
+          </w:rPr>
+        </w:r>
+        <w:r>
+          <w:rPr>
+            <w:noProof/>
+            <w:webHidden/>
+          </w:rPr>
+          <w:fldChar w:fldCharType="separate"/>
+        </w:r>
+        <w:r>
+          <w:rPr>
+            <w:noProof/>
+            <w:webHidden/>
+          </w:rPr>
           <w:t>35</w:t>
+        </w:r>
+        <w:r>
+          <w:rPr>
+            <w:noProof/>
+            <w:webHidden/>
+          </w:rPr>
+          <w:fldChar w:fldCharType="end"/>
+        </w:r>
+      </w:hyperlink>
+    </w:p>
+    <w:p>
+      <w:pPr>
+        <w:pStyle w:val="TOC3"/>
+        <w:rPr>
+          <w:rFonts w:asciiTheme="minorHAnsi" w:eastAsiaTheme="minorEastAsia" w:hAnsiTheme="minorHAnsi" w:cstheme="minorBidi"/>
+          <w:noProof/>
+          <w:szCs w:val="24"/>
+        </w:rPr>
+      </w:pPr>
+      <w:hyperlink w:anchor="_Toc227514438" w:history="1">
+        <w:r>
+          <w:rPr>
+            <w:rStyle w:val="Hyperlink"/>
+            <w:noProof/>
+            <w:lang w:val="sk-SK"/>
+          </w:rPr>
+          <w:t>7.2.2 Počet epoch</w:t>
+        </w:r>
+        <w:r>
+          <w:rPr>
+            <w:noProof/>
+            <w:webHidden/>
+          </w:rPr>
+          <w:tab/>
+        </w:r>
+        <w:r>
+          <w:rPr>
+            <w:noProof/>
+            <w:webHidden/>
+          </w:rPr>
+          <w:fldChar w:fldCharType="begin"/>
+        </w:r>
+        <w:r>
+          <w:rPr>
+            <w:noProof/>
+            <w:webHidden/>
+          </w:rPr>
+          <w:instrText xml:space="preserve"> PAGEREF _Toc227514438 \h </w:instrText>
+        </w:r>
+        <w:r>
+          <w:rPr>
+            <w:noProof/>
+            <w:webHidden/>
+          </w:rPr>
+        </w:r>
+        <w:r>
+          <w:rPr>
+            <w:noProof/>
+            <w:webHidden/>
+          </w:rPr>
+          <w:fldChar w:fldCharType="separate"/>
+        </w:r>
+        <w:r>
+          <w:rPr>
+            <w:noProof/>
+            <w:webHidden/>
+          </w:rPr>
+          <w:t>35</w:t>
+        </w:r>
+        <w:r>
+          <w:rPr>
+            <w:noProof/>
+            <w:webHidden/>
+          </w:rPr>
+          <w:fldChar w:fldCharType="end"/>
+        </w:r>
+      </w:hyperlink>
+    </w:p>
+    <w:p>
+      <w:pPr>
+        <w:pStyle w:val="TOC3"/>
+        <w:rPr>
+          <w:rFonts w:asciiTheme="minorHAnsi" w:eastAsiaTheme="minorEastAsia" w:hAnsiTheme="minorHAnsi" w:cstheme="minorBidi"/>
+          <w:noProof/>
+          <w:szCs w:val="24"/>
+        </w:rPr>
+      </w:pPr>
+      <w:hyperlink w:anchor="_Toc227514439" w:history="1">
+        <w:r>
+          <w:rPr>
+            <w:rStyle w:val="Hyperlink"/>
+            <w:noProof/>
+            <w:lang w:val="sk-SK"/>
+          </w:rPr>
+          <w:t>7.2.3 Batch normalizácia</w:t>
+        </w:r>
+        <w:r>
+          <w:rPr>
+            <w:noProof/>
+            <w:webHidden/>
+          </w:rPr>
+          <w:tab/>
+        </w:r>
+        <w:r>
+          <w:rPr>
+            <w:noProof/>
+            <w:webHidden/>
+          </w:rPr>
+          <w:fldChar w:fldCharType="begin"/>
+        </w:r>
+        <w:r>
+          <w:rPr>
+            <w:noProof/>
+            <w:webHidden/>
+          </w:rPr>
+          <w:instrText xml:space="preserve"> PAGEREF _Toc227514439 \h </w:instrText>
+        </w:r>
+        <w:r>
+          <w:rPr>
+            <w:noProof/>
+            <w:webHidden/>
+          </w:rPr>
+        </w:r>
+        <w:r>
+          <w:rPr>
+            <w:noProof/>
+            <w:webHidden/>
+          </w:rPr>
+          <w:fldChar w:fldCharType="separate"/>
+        </w:r>
+        <w:r>
+          <w:rPr>
+            <w:noProof/>
+            <w:webHidden/>
+          </w:rPr>
+          <w:t>35</w:t>
+        </w:r>
+        <w:r>
+          <w:rPr>
+            <w:noProof/>
+            <w:webHidden/>
+          </w:rPr>
+          <w:fldChar w:fldCharType="end"/>
+        </w:r>
+      </w:hyperlink>
+    </w:p>
+    <w:p>
+      <w:pPr>
+        <w:pStyle w:val="TOC3"/>
+        <w:rPr>
+          <w:rFonts w:asciiTheme="minorHAnsi" w:eastAsiaTheme="minorEastAsia" w:hAnsiTheme="minorHAnsi" w:cstheme="minorBidi"/>
+          <w:noProof/>
+          <w:szCs w:val="24"/>
+        </w:rPr>
+      </w:pPr>
+      <w:hyperlink w:anchor="_Toc227514440" w:history="1">
+        <w:r>
+          <w:rPr>
+            <w:rStyle w:val="Hyperlink"/>
+            <w:noProof/>
+            <w:lang w:val="sk-SK"/>
+          </w:rPr>
+          <w:t>7.2.4 Veľkosť konvolučného jadra (kernel size)</w:t>
+        </w:r>
+        <w:r>
+          <w:rPr>
+            <w:noProof/>
+            <w:webHidden/>
+          </w:rPr>
+          <w:tab/>
+        </w:r>
+        <w:r>
+          <w:rPr>
+            <w:noProof/>
+            <w:webHidden/>
+          </w:rPr>
+          <w:fldChar w:fldCharType="begin"/>
+        </w:r>
+        <w:r>
+          <w:rPr>
+            <w:noProof/>
+            <w:webHidden/>
+          </w:rPr>
+          <w:instrText xml:space="preserve"> PAGEREF _Toc227514440 \h </w:instrText>
+        </w:r>
+        <w:r>
+          <w:rPr>
+            <w:noProof/>
+            <w:webHidden/>
+          </w:rPr>
+        </w:r>
+        <w:r>
+          <w:rPr>
+            <w:noProof/>
+            <w:webHidden/>
+          </w:rPr>
+          <w:fldChar w:fldCharType="separate"/>
+        </w:r>
+        <w:r>
+          <w:rPr>
+            <w:noProof/>
+            <w:webHidden/>
+          </w:rPr>
+          <w:t>35</w:t>
+        </w:r>
+        <w:r>
+          <w:rPr>
+            <w:noProof/>
+            <w:webHidden/>
+          </w:rPr>
+          <w:fldChar w:fldCharType="end"/>
+        </w:r>
+      </w:hyperlink>
+    </w:p>
+    <w:p>
+      <w:pPr>
+        <w:pStyle w:val="TOC3"/>
+        <w:rPr>
+          <w:rFonts w:asciiTheme="minorHAnsi" w:eastAsiaTheme="minorEastAsia" w:hAnsiTheme="minorHAnsi" w:cstheme="minorBidi"/>
+          <w:noProof/>
+          <w:szCs w:val="24"/>
+        </w:rPr>
+      </w:pPr>
+      <w:hyperlink w:anchor="_Toc227514441" w:history="1">
+        <w:r>
+          <w:rPr>
+            <w:rStyle w:val="Hyperlink"/>
+            <w:noProof/>
+            <w:lang w:val="sk-SK"/>
+          </w:rPr>
+          <w:t>7.2.5 Počet filtrov v prvej vrstve</w:t>
+        </w:r>
+        <w:r>
+          <w:rPr>
+            <w:noProof/>
+            <w:webHidden/>
+          </w:rPr>
+          <w:tab/>
+        </w:r>
+        <w:r>
+          <w:rPr>
+            <w:noProof/>
+            <w:webHidden/>
+          </w:rPr>
+          <w:fldChar w:fldCharType="begin"/>
+        </w:r>
+        <w:r>
+          <w:rPr>
+            <w:noProof/>
+            <w:webHidden/>
+          </w:rPr>
+          <w:instrText xml:space="preserve"> PAGEREF _Toc227514441 \h </w:instrText>
+        </w:r>
+        <w:r>
+          <w:rPr>
+            <w:noProof/>
+            <w:webHidden/>
+          </w:rPr>
+        </w:r>
+        <w:r>
+          <w:rPr>
+            <w:noProof/>
+            <w:webHidden/>
+          </w:rPr>
+          <w:fldChar w:fldCharType="separate"/>
+        </w:r>
+        <w:r>
+          <w:rPr>
+            <w:noProof/>
+            <w:webHidden/>
+          </w:rPr>
+          <w:t>35</w:t>
+        </w:r>
+        <w:r>
+          <w:rPr>
+            <w:noProof/>
+            <w:webHidden/>
+          </w:rPr>
+          <w:fldChar w:fldCharType="end"/>
+        </w:r>
+      </w:hyperlink>
+    </w:p>
+    <w:p>
+      <w:pPr>
+        <w:pStyle w:val="TOC3"/>
+        <w:rPr>
+          <w:rFonts w:asciiTheme="minorHAnsi" w:eastAsiaTheme="minorEastAsia" w:hAnsiTheme="minorHAnsi" w:cstheme="minorBidi"/>
+          <w:noProof/>
+          <w:szCs w:val="24"/>
+        </w:rPr>
+      </w:pPr>
+      <w:hyperlink w:anchor="_Toc227514442" w:history="1">
+        <w:r>
+          <w:rPr>
+            <w:rStyle w:val="Hyperlink"/>
+            <w:noProof/>
+            <w:lang w:val="sk-SK"/>
+          </w:rPr>
+          <w:t>7.2.6 Veľkosť vstupného obrazu</w:t>
+        </w:r>
+        <w:r>
+          <w:rPr>
+            <w:noProof/>
+            <w:webHidden/>
+          </w:rPr>
+          <w:tab/>
+        </w:r>
+        <w:r>
+          <w:rPr>
+            <w:noProof/>
+            <w:webHidden/>
+          </w:rPr>
+          <w:fldChar w:fldCharType="begin"/>
+        </w:r>
+        <w:r>
+          <w:rPr>
+            <w:noProof/>
+            <w:webHidden/>
+          </w:rPr>
+          <w:instrText xml:space="preserve"> PAGEREF _Toc227514442 \h </w:instrText>
+        </w:r>
+        <w:r>
+          <w:rPr>
+            <w:noProof/>
+            <w:webHidden/>
+          </w:rPr>
+        </w:r>
+        <w:r>
+          <w:rPr>
+            <w:noProof/>
+            <w:webHidden/>
+          </w:rPr>
+          <w:fldChar w:fldCharType="separate"/>
+        </w:r>
+        <w:r>
+          <w:rPr>
+            <w:noProof/>
+            <w:webHidden/>
+          </w:rPr>
+          <w:t>35</w:t>
+        </w:r>
+        <w:r>
+          <w:rPr>
+            <w:noProof/>
+            <w:webHidden/>
+          </w:rPr>
+          <w:fldChar w:fldCharType="end"/>
+        </w:r>
+      </w:hyperlink>
+    </w:p>
+    <w:p>
+      <w:pPr>
+        <w:pStyle w:val="TOC3"/>
+        <w:rPr>
+          <w:rFonts w:asciiTheme="minorHAnsi" w:eastAsiaTheme="minorEastAsia" w:hAnsiTheme="minorHAnsi" w:cstheme="minorBidi"/>
+          <w:noProof/>
+          <w:szCs w:val="24"/>
+        </w:rPr>
+      </w:pPr>
+      <w:hyperlink w:anchor="_Toc227514443" w:history="1">
+        <w:r>
+          <w:rPr>
+            <w:rStyle w:val="Hyperlink"/>
+            <w:noProof/>
+            <w:lang w:val="sk-SK"/>
+          </w:rPr>
+          <w:t>7.2.7 Learning rate</w:t>
+        </w:r>
+        <w:r>
+          <w:rPr>
+            <w:noProof/>
+            <w:webHidden/>
+          </w:rPr>
+          <w:tab/>
+        </w:r>
+        <w:r>
+          <w:rPr>
+            <w:noProof/>
+            <w:webHidden/>
+          </w:rPr>
+          <w:fldChar w:fldCharType="begin"/>
+        </w:r>
+        <w:r>
+          <w:rPr>
+            <w:noProof/>
+            <w:webHidden/>
+          </w:rPr>
+          <w:instrText xml:space="preserve"> PAGEREF _Toc227514443 \h </w:instrText>
+        </w:r>
+        <w:r>
+          <w:rPr>
+            <w:noProof/>
+            <w:webHidden/>
+          </w:rPr>
+        </w:r>
+        <w:r>
+          <w:rPr>
+            <w:noProof/>
+            <w:webHidden/>
+          </w:rPr>
+          <w:fldChar w:fldCharType="separate"/>
+        </w:r>
+        <w:r>
+          <w:rPr>
+            <w:noProof/>
+            <w:webHidden/>
+          </w:rPr>
+          <w:t>36</w:t>
+        </w:r>
+        <w:r>
+          <w:rPr>
+            <w:noProof/>
+            <w:webHidden/>
+          </w:rPr>
+          <w:fldChar w:fldCharType="end"/>
+        </w:r>
+      </w:hyperlink>
+    </w:p>
+    <w:p>
+      <w:pPr>
+        <w:pStyle w:val="TOC3"/>
+        <w:rPr>
+          <w:rFonts w:asciiTheme="minorHAnsi" w:eastAsiaTheme="minorEastAsia" w:hAnsiTheme="minorHAnsi" w:cstheme="minorBidi"/>
+          <w:noProof/>
+          <w:szCs w:val="24"/>
+        </w:rPr>
+      </w:pPr>
+      <w:hyperlink w:anchor="_Toc227514444" w:history="1">
+        <w:r>
+          <w:rPr>
+            <w:rStyle w:val="Hyperlink"/>
+            <w:noProof/>
+          </w:rPr>
+          <w:t>7.2.8 Záver</w:t>
+        </w:r>
+        <w:r>
+          <w:rPr>
+            <w:noProof/>
+            <w:webHidden/>
+          </w:rPr>
+          <w:tab/>
+        </w:r>
+        <w:r>
+          <w:rPr>
+            <w:noProof/>
+            <w:webHidden/>
+          </w:rPr>
+          <w:fldChar w:fldCharType="begin"/>
+        </w:r>
+        <w:r>
+          <w:rPr>
+            <w:noProof/>
+            <w:webHidden/>
+          </w:rPr>
+          <w:instrText xml:space="preserve"> PAGEREF _Toc227514444 \h </w:instrText>
+        </w:r>
+        <w:r>
+          <w:rPr>
+            <w:noProof/>
+            <w:webHidden/>
+          </w:rPr>
+        </w:r>
+        <w:r>
+          <w:rPr>
+            <w:noProof/>
+            <w:webHidden/>
+          </w:rPr>
+          <w:fldChar w:fldCharType="separate"/>
+        </w:r>
+        <w:r>
+          <w:rPr>
+            <w:noProof/>
+            <w:webHidden/>
+          </w:rPr>
+          <w:t>36</w:t>
         </w:r>
         <w:r>
           <w:rPr>
@@ -5105,13 +5739,13 @@
           <w:szCs w:val="24"/>
         </w:rPr>
       </w:pPr>
-      <w:hyperlink w:anchor="_Toc227512613" w:history="1">
+      <w:hyperlink w:anchor="_Toc227514445" w:history="1">
         <w:r>
           <w:rPr>
             <w:rStyle w:val="Hyperlink"/>
             <w:noProof/>
           </w:rPr>
-          <w:t>Literatúra</w:t>
+          <w:t>Záver</w:t>
         </w:r>
         <w:r>
           <w:rPr>
@@ -5132,7 +5766,7 @@
             <w:noProof/>
             <w:webHidden/>
           </w:rPr>
-          <w:instrText xml:space="preserve"> PAGEREF _Toc227512613 \h </w:instrText>
+          <w:instrText xml:space="preserve"> PAGEREF _Toc227514445 \h </w:instrText>
         </w:r>
         <w:r>
           <w:rPr>
@@ -5152,7 +5786,7 @@
             <w:noProof/>
             <w:webHidden/>
           </w:rPr>
-          <w:t>36</w:t>
+          <w:t>37</w:t>
         </w:r>
         <w:r>
           <w:rPr>
@@ -5176,12 +5810,83 @@
           <w:szCs w:val="24"/>
         </w:rPr>
       </w:pPr>
-      <w:hyperlink w:anchor="_Toc227512614" w:history="1">
+      <w:hyperlink w:anchor="_Toc227514446" w:history="1">
         <w:r>
           <w:rPr>
             <w:rStyle w:val="Hyperlink"/>
             <w:noProof/>
           </w:rPr>
+          <w:t>Literatúra</w:t>
+        </w:r>
+        <w:r>
+          <w:rPr>
+            <w:noProof/>
+            <w:webHidden/>
+          </w:rPr>
+          <w:tab/>
+        </w:r>
+        <w:r>
+          <w:rPr>
+            <w:noProof/>
+            <w:webHidden/>
+          </w:rPr>
+          <w:fldChar w:fldCharType="begin"/>
+        </w:r>
+        <w:r>
+          <w:rPr>
+            <w:noProof/>
+            <w:webHidden/>
+          </w:rPr>
+          <w:instrText xml:space="preserve"> PAGEREF _Toc227514446 \h </w:instrText>
+        </w:r>
+        <w:r>
+          <w:rPr>
+            <w:noProof/>
+            <w:webHidden/>
+          </w:rPr>
+        </w:r>
+        <w:r>
+          <w:rPr>
+            <w:noProof/>
+            <w:webHidden/>
+          </w:rPr>
+          <w:fldChar w:fldCharType="separate"/>
+        </w:r>
+        <w:r>
+          <w:rPr>
+            <w:noProof/>
+            <w:webHidden/>
+          </w:rPr>
+          <w:t>38</w:t>
+        </w:r>
+        <w:r>
+          <w:rPr>
+            <w:noProof/>
+            <w:webHidden/>
+          </w:rPr>
+          <w:fldChar w:fldCharType="end"/>
+        </w:r>
+      </w:hyperlink>
+    </w:p>
+    <w:p>
+      <w:pPr>
+        <w:pStyle w:val="TOC1"/>
+        <w:spacing w:before="240"/>
+        <w:rPr>
+          <w:rFonts w:asciiTheme="minorHAnsi" w:eastAsiaTheme="minorEastAsia" w:hAnsiTheme="minorHAnsi" w:cstheme="minorBidi"/>
+          <w:b w:val="0"/>
+          <w:bCs w:val="0"/>
+          <w:noProof/>
+          <w:sz w:val="24"/>
+          <w:szCs w:val="24"/>
+        </w:rPr>
+      </w:pPr>
+      <w:hyperlink w:anchor="_Toc227514447" w:history="1">
+        <w:r>
+          <w:rPr>
+            <w:rStyle w:val="Hyperlink"/>
+            <w:noProof/>
+          </w:rPr>
           <w:t>Prílohy</w:t>
         </w:r>
         <w:r>
@@ -5203,7 +5908,7 @@
             <w:noProof/>
             <w:webHidden/>
           </w:rPr>
-          <w:instrText xml:space="preserve"> PAGEREF _Toc227512614 \h </w:instrText>
+          <w:instrText xml:space="preserve"> PAGEREF _Toc227514447 \h </w:instrText>
         </w:r>
         <w:r>
           <w:rPr>
@@ -5223,7 +5928,7 @@
             <w:noProof/>
             <w:webHidden/>
           </w:rPr>
-          <w:t>41</w:t>
+          <w:t>43</w:t>
         </w:r>
         <w:r>
           <w:rPr>
@@ -5251,7 +5956,7 @@
         <w:lastRenderedPageBreak/>
         <w:fldChar w:fldCharType="end"/>
       </w:r>
-      <w:bookmarkStart w:id="4" w:name="_Toc227512556"/>
+      <w:bookmarkStart w:id="4" w:name="_Toc227514379"/>
       <w:r>
         <w:t>Zoznam obrázkov</w:t>
       </w:r>
@@ -5284,7 +5989,7 @@
         </w:rPr>
         <w:fldChar w:fldCharType="separate"/>
       </w:r>
-      <w:hyperlink w:anchor="_Toc227512543" w:history="1">
+      <w:hyperlink w:anchor="_Toc227514366" w:history="1">
         <w:r>
           <w:rPr>
             <w:rStyle w:val="Hyperlink"/>
@@ -5312,7 +6017,7 @@
             <w:noProof/>
             <w:webHidden/>
           </w:rPr>
-          <w:instrText xml:space="preserve"> PAGEREF _Toc227512543 \h </w:instrText>
+          <w:instrText xml:space="preserve"> PAGEREF _Toc227514366 \h </w:instrText>
         </w:r>
         <w:r>
           <w:rPr>
@@ -5355,7 +6060,7 @@
           <w:noProof/>
         </w:rPr>
       </w:pPr>
-      <w:hyperlink w:anchor="_Toc227512544" w:history="1">
+      <w:hyperlink w:anchor="_Toc227514367" w:history="1">
         <w:r>
           <w:rPr>
             <w:rStyle w:val="Hyperlink"/>
@@ -5383,7 +6088,7 @@
             <w:noProof/>
             <w:webHidden/>
           </w:rPr>
-          <w:instrText xml:space="preserve"> PAGEREF _Toc227512544 \h </w:instrText>
+          <w:instrText xml:space="preserve"> PAGEREF _Toc227514367 \h </w:instrText>
         </w:r>
         <w:r>
           <w:rPr>
@@ -5426,7 +6131,7 @@
           <w:noProof/>
         </w:rPr>
       </w:pPr>
-      <w:hyperlink w:anchor="_Toc227512545" w:history="1">
+      <w:hyperlink w:anchor="_Toc227514368" w:history="1">
         <w:r>
           <w:rPr>
             <w:rStyle w:val="Hyperlink"/>
@@ -5454,7 +6159,7 @@
             <w:noProof/>
             <w:webHidden/>
           </w:rPr>
-          <w:instrText xml:space="preserve"> PAGEREF _Toc227512545 \h </w:instrText>
+          <w:instrText xml:space="preserve"> PAGEREF _Toc227514368 \h </w:instrText>
         </w:r>
         <w:r>
           <w:rPr>
@@ -5497,7 +6202,7 @@
           <w:noProof/>
         </w:rPr>
       </w:pPr>
-      <w:hyperlink w:anchor="_Toc227512546" w:history="1">
+      <w:hyperlink w:anchor="_Toc227514369" w:history="1">
         <w:r>
           <w:rPr>
             <w:rStyle w:val="Hyperlink"/>
@@ -5525,7 +6230,7 @@
             <w:noProof/>
             <w:webHidden/>
           </w:rPr>
-          <w:instrText xml:space="preserve"> PAGEREF _Toc227512546 \h </w:instrText>
+          <w:instrText xml:space="preserve"> PAGEREF _Toc227514369 \h </w:instrText>
         </w:r>
         <w:r>
           <w:rPr>
@@ -5568,7 +6273,7 @@
           <w:noProof/>
         </w:rPr>
       </w:pPr>
-      <w:hyperlink w:anchor="_Toc227512547" w:history="1">
+      <w:hyperlink w:anchor="_Toc227514370" w:history="1">
         <w:r>
           <w:rPr>
             <w:rStyle w:val="Hyperlink"/>
@@ -5596,7 +6301,7 @@
             <w:noProof/>
             <w:webHidden/>
           </w:rPr>
-          <w:instrText xml:space="preserve"> PAGEREF _Toc227512547 \h </w:instrText>
+          <w:instrText xml:space="preserve"> PAGEREF _Toc227514370 \h </w:instrText>
         </w:r>
         <w:r>
           <w:rPr>
@@ -5639,7 +6344,7 @@
           <w:noProof/>
         </w:rPr>
       </w:pPr>
-      <w:hyperlink w:anchor="_Toc227512548" w:history="1">
+      <w:hyperlink w:anchor="_Toc227514371" w:history="1">
         <w:r>
           <w:rPr>
             <w:rStyle w:val="Hyperlink"/>
@@ -5667,7 +6372,7 @@
             <w:noProof/>
             <w:webHidden/>
           </w:rPr>
-          <w:instrText xml:space="preserve"> PAGEREF _Toc227512548 \h </w:instrText>
+          <w:instrText xml:space="preserve"> PAGEREF _Toc227514371 \h </w:instrText>
         </w:r>
         <w:r>
           <w:rPr>
@@ -5710,7 +6415,7 @@
           <w:noProof/>
         </w:rPr>
       </w:pPr>
-      <w:hyperlink w:anchor="_Toc227512549" w:history="1">
+      <w:hyperlink w:anchor="_Toc227514372" w:history="1">
         <w:r>
           <w:rPr>
             <w:rStyle w:val="Hyperlink"/>
@@ -5738,7 +6443,7 @@
             <w:noProof/>
             <w:webHidden/>
           </w:rPr>
-          <w:instrText xml:space="preserve"> PAGEREF _Toc227512549 \h </w:instrText>
+          <w:instrText xml:space="preserve"> PAGEREF _Toc227514372 \h </w:instrText>
         </w:r>
         <w:r>
           <w:rPr>
@@ -5781,7 +6486,7 @@
           <w:noProof/>
         </w:rPr>
       </w:pPr>
-      <w:hyperlink w:anchor="_Toc227512550" w:history="1">
+      <w:hyperlink w:anchor="_Toc227514373" w:history="1">
         <w:r>
           <w:rPr>
             <w:rStyle w:val="Hyperlink"/>
@@ -5843,7 +6548,7 @@
             <w:noProof/>
             <w:webHidden/>
           </w:rPr>
-          <w:instrText xml:space="preserve"> PAGEREF _Toc227512550 \h </w:instrText>
+          <w:instrText xml:space="preserve"> PAGEREF _Toc227514373 \h </w:instrText>
         </w:r>
         <w:r>
           <w:rPr>
@@ -5886,7 +6591,7 @@
           <w:noProof/>
         </w:rPr>
       </w:pPr>
-      <w:hyperlink w:anchor="_Toc227512551" w:history="1">
+      <w:hyperlink w:anchor="_Toc227514374" w:history="1">
         <w:r>
           <w:rPr>
             <w:rStyle w:val="Hyperlink"/>
@@ -5948,7 +6653,7 @@
             <w:noProof/>
             <w:webHidden/>
           </w:rPr>
-          <w:instrText xml:space="preserve"> PAGEREF _Toc227512551 \h </w:instrText>
+          <w:instrText xml:space="preserve"> PAGEREF _Toc227514374 \h </w:instrText>
         </w:r>
         <w:r>
           <w:rPr>
@@ -5991,7 +6696,7 @@
           <w:noProof/>
         </w:rPr>
       </w:pPr>
-      <w:hyperlink w:anchor="_Toc227512552" w:history="1">
+      <w:hyperlink w:anchor="_Toc227514375" w:history="1">
         <w:r>
           <w:rPr>
             <w:rStyle w:val="Hyperlink"/>
@@ -6053,7 +6758,7 @@
             <w:noProof/>
             <w:webHidden/>
           </w:rPr>
-          <w:instrText xml:space="preserve"> PAGEREF _Toc227512552 \h </w:instrText>
+          <w:instrText xml:space="preserve"> PAGEREF _Toc227514375 \h </w:instrText>
         </w:r>
         <w:r>
           <w:rPr>
@@ -6096,7 +6801,7 @@
           <w:noProof/>
         </w:rPr>
       </w:pPr>
-      <w:hyperlink w:anchor="_Toc227512553" w:history="1">
+      <w:hyperlink w:anchor="_Toc227514376" w:history="1">
         <w:r>
           <w:rPr>
             <w:rStyle w:val="Hyperlink"/>
@@ -6158,7 +6863,7 @@
             <w:noProof/>
             <w:webHidden/>
           </w:rPr>
-          <w:instrText xml:space="preserve"> PAGEREF _Toc227512553 \h </w:instrText>
+          <w:instrText xml:space="preserve"> PAGEREF _Toc227514376 \h </w:instrText>
         </w:r>
         <w:r>
           <w:rPr>
@@ -6201,7 +6906,7 @@
           <w:noProof/>
         </w:rPr>
       </w:pPr>
-      <w:hyperlink w:anchor="_Toc227512554" w:history="1">
+      <w:hyperlink w:anchor="_Toc227514377" w:history="1">
         <w:r>
           <w:rPr>
             <w:rStyle w:val="Hyperlink"/>
@@ -6238,7 +6943,7 @@
             <w:noProof/>
             <w:webHidden/>
           </w:rPr>
-          <w:instrText xml:space="preserve"> PAGEREF _Toc227512554 \h </w:instrText>
+          <w:instrText xml:space="preserve"> PAGEREF _Toc227514377 \h </w:instrText>
         </w:r>
         <w:r>
           <w:rPr>
@@ -6281,7 +6986,7 @@
           <w:noProof/>
         </w:rPr>
       </w:pPr>
-      <w:hyperlink w:anchor="_Toc227512555" w:history="1">
+      <w:hyperlink w:anchor="_Toc227514378" w:history="1">
         <w:r>
           <w:rPr>
             <w:rStyle w:val="Hyperlink"/>
@@ -6318,7 +7023,7 @@
             <w:noProof/>
             <w:webHidden/>
           </w:rPr>
-          <w:instrText xml:space="preserve"> PAGEREF _Toc227512555 \h </w:instrText>
+          <w:instrText xml:space="preserve"> PAGEREF _Toc227514378 \h </w:instrText>
         </w:r>
         <w:r>
           <w:rPr>
@@ -6359,7 +7064,7 @@
         <w:lastRenderedPageBreak/>
         <w:fldChar w:fldCharType="end"/>
       </w:r>
-      <w:bookmarkStart w:id="5" w:name="_Toc227512557"/>
+      <w:bookmarkStart w:id="5" w:name="_Toc227514380"/>
       <w:r>
         <w:t>Zoznam tabuliek</w:t>
       </w:r>
@@ -6693,7 +7398,7 @@
         <w:lastRenderedPageBreak/>
         <w:fldChar w:fldCharType="end"/>
       </w:r>
-      <w:bookmarkStart w:id="6" w:name="_Toc227512558"/>
+      <w:bookmarkStart w:id="6" w:name="_Toc227514381"/>
       <w:r>
         <w:t>Zoznam značiek a skratiek</w:t>
       </w:r>
@@ -7295,14 +8000,7 @@
           <w:rFonts w:eastAsiaTheme="minorEastAsia"/>
           <w:lang w:val="sk-SK"/>
         </w:rPr>
-        <w:t>–</w:t>
-      </w:r>
-      <w:r>
-        <w:rPr>
-          <w:rFonts w:eastAsiaTheme="minorEastAsia"/>
-          <w:lang w:val="sk-SK"/>
-        </w:rPr>
-        <w:t xml:space="preserve"> koeficient determinácie</w:t>
+        <w:t>– koeficient determinácie</w:t>
       </w:r>
     </w:p>
     <w:p>
@@ -7321,7 +8019,7 @@
       </w:pPr>
       <w:bookmarkStart w:id="7" w:name="_Toc173791394"/>
       <w:bookmarkStart w:id="8" w:name="_Toc173791533"/>
-      <w:bookmarkStart w:id="9" w:name="_Toc227512559"/>
+      <w:bookmarkStart w:id="9" w:name="_Toc227514382"/>
       <w:r>
         <w:lastRenderedPageBreak/>
         <w:t>Úvod</w:t>
@@ -7541,7 +8239,7 @@
       <w:r>
         <w:fldChar w:fldCharType="end"/>
       </w:r>
-      <w:bookmarkStart w:id="11" w:name="_Toc227512560"/>
+      <w:bookmarkStart w:id="11" w:name="_Toc227514383"/>
       <w:r>
         <w:t>Slnečné žiarenie a jeho význam</w:t>
       </w:r>
@@ -7552,7 +8250,7 @@
         <w:pStyle w:val="Heading2"/>
         <w:spacing w:before="480" w:after="240"/>
       </w:pPr>
-      <w:bookmarkStart w:id="12" w:name="_Toc227512561"/>
+      <w:bookmarkStart w:id="12" w:name="_Toc227514384"/>
       <w:r>
         <w:t>Charakteristika slnečného žiarenia</w:t>
       </w:r>
@@ -7597,7 +8295,7 @@
         <w:pStyle w:val="Heading2"/>
         <w:spacing w:before="480" w:after="240"/>
       </w:pPr>
-      <w:bookmarkStart w:id="13" w:name="_Toc227512562"/>
+      <w:bookmarkStart w:id="13" w:name="_Toc227514385"/>
       <w:r>
         <w:t>Význam a využitie v energetike</w:t>
       </w:r>
@@ -7739,7 +8437,7 @@
           <w14:ligatures w14:val="standardContextual"/>
         </w:rPr>
       </w:pPr>
-      <w:bookmarkStart w:id="14" w:name="_Toc227512543"/>
+      <w:bookmarkStart w:id="14" w:name="_Toc227514366"/>
       <w:r>
         <w:t xml:space="preserve">Obr. </w:t>
       </w:r>
@@ -7844,7 +8542,7 @@
           <w14:ligatures w14:val="standardContextual"/>
         </w:rPr>
       </w:pPr>
-      <w:bookmarkStart w:id="15" w:name="_Toc227512544"/>
+      <w:bookmarkStart w:id="15" w:name="_Toc227514367"/>
       <w:r>
         <w:t xml:space="preserve">Obr. </w:t>
       </w:r>
@@ -7942,7 +8640,7 @@
         <w:pStyle w:val="Heading2"/>
         <w:spacing w:before="480" w:after="240"/>
       </w:pPr>
-      <w:bookmarkStart w:id="16" w:name="_Toc227512563"/>
+      <w:bookmarkStart w:id="16" w:name="_Toc227514386"/>
       <w:r>
         <w:lastRenderedPageBreak/>
         <w:t>Meranie slnečného žiarenia</w:t>
@@ -7999,7 +8697,7 @@
       <w:r>
         <w:fldChar w:fldCharType="end"/>
       </w:r>
-      <w:bookmarkStart w:id="17" w:name="_Toc227512564"/>
+      <w:bookmarkStart w:id="17" w:name="_Toc227514387"/>
       <w:r>
         <w:t>Celooblohové zobrazovacie systémy</w:t>
       </w:r>
@@ -8052,7 +8750,7 @@
         <w:pStyle w:val="Heading2"/>
         <w:spacing w:before="480" w:after="240"/>
       </w:pPr>
-      <w:bookmarkStart w:id="18" w:name="_Toc227512565"/>
+      <w:bookmarkStart w:id="18" w:name="_Toc227514388"/>
       <w:r>
         <w:t>Fisheye kamery</w:t>
       </w:r>
@@ -8078,7 +8776,7 @@
         <w:pStyle w:val="Heading2"/>
         <w:spacing w:before="480" w:after="240"/>
       </w:pPr>
-      <w:bookmarkStart w:id="19" w:name="_Toc227512566"/>
+      <w:bookmarkStart w:id="19" w:name="_Toc227514389"/>
       <w:r>
         <w:t>Geometrické skreslenie a charakteristiky obrazu</w:t>
       </w:r>
@@ -8217,7 +8915,7 @@
           <w14:ligatures w14:val="standardContextual"/>
         </w:rPr>
       </w:pPr>
-      <w:bookmarkStart w:id="20" w:name="_Toc227512545"/>
+      <w:bookmarkStart w:id="20" w:name="_Toc227514368"/>
       <w:r>
         <w:t xml:space="preserve">Obr. </w:t>
       </w:r>
@@ -8303,7 +9001,7 @@
       <w:r>
         <w:fldChar w:fldCharType="end"/>
       </w:r>
-      <w:bookmarkStart w:id="21" w:name="_Toc227512567"/>
+      <w:bookmarkStart w:id="21" w:name="_Toc227514390"/>
       <w:r>
         <w:t>Predspracovanie obrazových dát</w:t>
       </w:r>
@@ -8314,7 +9012,7 @@
         <w:pStyle w:val="Heading2"/>
         <w:spacing w:before="480" w:after="240"/>
       </w:pPr>
-      <w:bookmarkStart w:id="22" w:name="_Toc227512568"/>
+      <w:bookmarkStart w:id="22" w:name="_Toc227514391"/>
       <w:r>
         <w:t>Základný postup predspracovania</w:t>
       </w:r>
@@ -8401,7 +9099,7 @@
       <w:pPr>
         <w:pStyle w:val="Heading3"/>
       </w:pPr>
-      <w:bookmarkStart w:id="23" w:name="_Toc227512569"/>
+      <w:bookmarkStart w:id="23" w:name="_Toc227514392"/>
       <w:r>
         <w:t>Zmena veľkosti obrazu</w:t>
       </w:r>
@@ -8426,7 +9124,7 @@
       <w:pPr>
         <w:pStyle w:val="Heading3"/>
       </w:pPr>
-      <w:bookmarkStart w:id="24" w:name="_Toc227512570"/>
+      <w:bookmarkStart w:id="24" w:name="_Toc227514393"/>
       <w:r>
         <w:t>Transformácia farebného obrazu</w:t>
       </w:r>
@@ -8536,7 +9234,7 @@
       <w:pPr>
         <w:pStyle w:val="Heading3"/>
       </w:pPr>
-      <w:bookmarkStart w:id="25" w:name="_Toc227512571"/>
+      <w:bookmarkStart w:id="25" w:name="_Toc227514394"/>
       <w:r>
         <w:lastRenderedPageBreak/>
         <w:t>Farebné priestory – RGB</w:t>
@@ -8648,7 +9346,7 @@
           <w14:ligatures w14:val="standardContextual"/>
         </w:rPr>
       </w:pPr>
-      <w:bookmarkStart w:id="26" w:name="_Toc227512546"/>
+      <w:bookmarkStart w:id="26" w:name="_Toc227514369"/>
       <w:r>
         <w:t xml:space="preserve">Obr. </w:t>
       </w:r>
@@ -8697,7 +9395,7 @@
       <w:pPr>
         <w:pStyle w:val="Heading3"/>
       </w:pPr>
-      <w:bookmarkStart w:id="27" w:name="_Toc227512572"/>
+      <w:bookmarkStart w:id="27" w:name="_Toc227514395"/>
       <w:r>
         <w:t>Farebné priestory – HSV</w:t>
       </w:r>
@@ -8802,7 +9500,7 @@
           <w14:ligatures w14:val="standardContextual"/>
         </w:rPr>
       </w:pPr>
-      <w:bookmarkStart w:id="28" w:name="_Toc227512547"/>
+      <w:bookmarkStart w:id="28" w:name="_Toc227514370"/>
       <w:r>
         <w:t xml:space="preserve">Obr. </w:t>
       </w:r>
@@ -8854,7 +9552,7 @@
       <w:pPr>
         <w:pStyle w:val="Heading3"/>
       </w:pPr>
-      <w:bookmarkStart w:id="29" w:name="_Toc227512573"/>
+      <w:bookmarkStart w:id="29" w:name="_Toc227514396"/>
       <w:r>
         <w:t>Farebné priestory – YCrCb</w:t>
       </w:r>
@@ -9148,7 +9846,7 @@
           <w14:ligatures w14:val="standardContextual"/>
         </w:rPr>
       </w:pPr>
-      <w:bookmarkStart w:id="30" w:name="_Toc227512548"/>
+      <w:bookmarkStart w:id="30" w:name="_Toc227514371"/>
       <w:r>
         <w:t xml:space="preserve">Obr. </w:t>
       </w:r>
@@ -9194,7 +9892,7 @@
       <w:pPr>
         <w:pStyle w:val="Heading3"/>
       </w:pPr>
-      <w:bookmarkStart w:id="31" w:name="_Toc227512574"/>
+      <w:bookmarkStart w:id="31" w:name="_Toc227514397"/>
       <w:r>
         <w:t>Farebné priestory – CMYK</w:t>
       </w:r>
@@ -9322,7 +10020,7 @@
       <w:pPr>
         <w:pStyle w:val="Caption"/>
       </w:pPr>
-      <w:bookmarkStart w:id="32" w:name="_Toc227512549"/>
+      <w:bookmarkStart w:id="32" w:name="_Toc227514372"/>
       <w:r>
         <w:t xml:space="preserve">Obr. </w:t>
       </w:r>
@@ -9368,7 +10066,7 @@
       <w:pPr>
         <w:pStyle w:val="Heading3"/>
       </w:pPr>
-      <w:bookmarkStart w:id="33" w:name="_Toc227512575"/>
+      <w:bookmarkStart w:id="33" w:name="_Toc227514398"/>
       <w:r>
         <w:t>Normalizácia dát</w:t>
       </w:r>
@@ -9411,7 +10109,7 @@
       <w:pPr>
         <w:pStyle w:val="Heading3"/>
       </w:pPr>
-      <w:bookmarkStart w:id="34" w:name="_Toc227512576"/>
+      <w:bookmarkStart w:id="34" w:name="_Toc227514399"/>
       <w:r>
         <w:lastRenderedPageBreak/>
         <w:t>Výber kanálu</w:t>
@@ -9441,7 +10139,7 @@
         <w:pStyle w:val="Heading2"/>
         <w:spacing w:before="480" w:after="240"/>
       </w:pPr>
-      <w:bookmarkStart w:id="35" w:name="_Toc227512577"/>
+      <w:bookmarkStart w:id="35" w:name="_Toc227514400"/>
       <w:r>
         <w:t>Dátové augmentácie</w:t>
       </w:r>
@@ -9521,7 +10219,7 @@
         <w:pStyle w:val="Heading2"/>
         <w:spacing w:before="480" w:after="240"/>
       </w:pPr>
-      <w:bookmarkStart w:id="36" w:name="_Toc227512578"/>
+      <w:bookmarkStart w:id="36" w:name="_Toc227514401"/>
       <w:r>
         <w:t>Geometrické augmentácie</w:t>
       </w:r>
@@ -9540,7 +10238,7 @@
       <w:pPr>
         <w:pStyle w:val="Heading3"/>
       </w:pPr>
-      <w:bookmarkStart w:id="37" w:name="_Toc227512579"/>
+      <w:bookmarkStart w:id="37" w:name="_Toc227514402"/>
       <w:r>
         <w:t>Rotácia</w:t>
       </w:r>
@@ -9562,7 +10260,7 @@
           <w:lang w:val="sk-SK"/>
         </w:rPr>
       </w:pPr>
-      <w:bookmarkStart w:id="38" w:name="_Toc227512580"/>
+      <w:bookmarkStart w:id="38" w:name="_Toc227514403"/>
       <w:r>
         <w:rPr>
           <w:lang w:val="sk-SK"/>
@@ -9593,7 +10291,7 @@
           <w:lang w:val="sk-SK"/>
         </w:rPr>
       </w:pPr>
-      <w:bookmarkStart w:id="39" w:name="_Toc227512581"/>
+      <w:bookmarkStart w:id="39" w:name="_Toc227514404"/>
       <w:r>
         <w:rPr>
           <w:lang w:val="sk-SK"/>
@@ -9635,7 +10333,7 @@
           <w:lang w:val="sk-SK"/>
         </w:rPr>
       </w:pPr>
-      <w:bookmarkStart w:id="40" w:name="_Toc227512582"/>
+      <w:bookmarkStart w:id="40" w:name="_Toc227514405"/>
       <w:r>
         <w:rPr>
           <w:lang w:val="sk-SK"/>
@@ -9659,7 +10357,7 @@
         <w:pStyle w:val="Heading2"/>
         <w:spacing w:before="480" w:after="240"/>
       </w:pPr>
-      <w:bookmarkStart w:id="41" w:name="_Toc227512583"/>
+      <w:bookmarkStart w:id="41" w:name="_Toc227514406"/>
       <w:r>
         <w:rPr>
           <w:lang w:val="sk-SK"/>
@@ -9687,7 +10385,7 @@
           <w:lang w:val="sk-SK"/>
         </w:rPr>
       </w:pPr>
-      <w:bookmarkStart w:id="42" w:name="_Toc227512584"/>
+      <w:bookmarkStart w:id="42" w:name="_Toc227514407"/>
       <w:r>
         <w:rPr>
           <w:lang w:val="sk-SK"/>
@@ -9712,7 +10410,7 @@
           <w:lang w:val="sk-SK"/>
         </w:rPr>
       </w:pPr>
-      <w:bookmarkStart w:id="43" w:name="_Toc227512585"/>
+      <w:bookmarkStart w:id="43" w:name="_Toc227514408"/>
       <w:r>
         <w:rPr>
           <w:lang w:val="sk-SK"/>
@@ -9737,7 +10435,7 @@
           <w:lang w:val="sk-SK"/>
         </w:rPr>
       </w:pPr>
-      <w:bookmarkStart w:id="44" w:name="_Toc227512586"/>
+      <w:bookmarkStart w:id="44" w:name="_Toc227514409"/>
       <w:r>
         <w:rPr>
           <w:lang w:val="sk-SK"/>
@@ -9875,7 +10573,7 @@
       <w:pPr>
         <w:pStyle w:val="Caption"/>
       </w:pPr>
-      <w:bookmarkStart w:id="45" w:name="_Toc227512550"/>
+      <w:bookmarkStart w:id="45" w:name="_Toc227514373"/>
       <w:r>
         <w:t xml:space="preserve">Obr. </w:t>
       </w:r>
@@ -9931,7 +10629,7 @@
         <w:pStyle w:val="Heading2"/>
         <w:spacing w:before="480" w:after="240"/>
       </w:pPr>
-      <w:bookmarkStart w:id="46" w:name="_Toc227512587"/>
+      <w:bookmarkStart w:id="46" w:name="_Toc227514410"/>
       <w:r>
         <w:rPr>
           <w:lang w:val="sk-SK"/>
@@ -9957,7 +10655,7 @@
           <w:lang w:val="sk-SK"/>
         </w:rPr>
       </w:pPr>
-      <w:bookmarkStart w:id="47" w:name="_Toc227512588"/>
+      <w:bookmarkStart w:id="47" w:name="_Toc227514411"/>
       <w:r>
         <w:rPr>
           <w:lang w:val="sk-SK"/>
@@ -9983,7 +10681,7 @@
           <w:lang w:val="sk-SK"/>
         </w:rPr>
       </w:pPr>
-      <w:bookmarkStart w:id="48" w:name="_Toc227512589"/>
+      <w:bookmarkStart w:id="48" w:name="_Toc227514412"/>
       <w:r>
         <w:rPr>
           <w:lang w:val="sk-SK"/>
@@ -10017,7 +10715,7 @@
           <w:lang w:val="sk-SK"/>
         </w:rPr>
       </w:pPr>
-      <w:bookmarkStart w:id="49" w:name="_Toc227512590"/>
+      <w:bookmarkStart w:id="49" w:name="_Toc227514413"/>
       <w:r>
         <w:rPr>
           <w:lang w:val="sk-SK"/>
@@ -10098,7 +10796,7 @@
       <w:pPr>
         <w:pStyle w:val="Caption"/>
       </w:pPr>
-      <w:bookmarkStart w:id="50" w:name="_Toc227512551"/>
+      <w:bookmarkStart w:id="50" w:name="_Toc227514374"/>
       <w:r>
         <w:t xml:space="preserve">Obr. </w:t>
       </w:r>
@@ -10159,7 +10857,7 @@
           <w:lang w:val="sk-SK"/>
         </w:rPr>
       </w:pPr>
-      <w:bookmarkStart w:id="51" w:name="_Toc227512591"/>
+      <w:bookmarkStart w:id="51" w:name="_Toc227514414"/>
       <w:r>
         <w:rPr>
           <w:lang w:val="sk-SK"/>
@@ -10240,7 +10938,7 @@
       <w:pPr>
         <w:pStyle w:val="Caption"/>
       </w:pPr>
-      <w:bookmarkStart w:id="52" w:name="_Toc227512552"/>
+      <w:bookmarkStart w:id="52" w:name="_Toc227514375"/>
       <w:r>
         <w:t xml:space="preserve">Obr. </w:t>
       </w:r>
@@ -10307,7 +11005,7 @@
           <w:lang w:val="sk-SK"/>
         </w:rPr>
       </w:pPr>
-      <w:bookmarkStart w:id="53" w:name="_Toc227512592"/>
+      <w:bookmarkStart w:id="53" w:name="_Toc227514415"/>
       <w:r>
         <w:rPr>
           <w:lang w:val="sk-SK"/>
@@ -10323,7 +11021,16 @@
         <w:jc w:val="both"/>
       </w:pPr>
       <w:r>
-        <w:t>Simuluje zakrytie časti obrazu, čím núti model učiť sa robustné reprezentácie aj pri</w:t>
+        <w:t>Simuluje zakrytie časti obrazu, čím núti model učiť sa robustné reprezentácie aj</w:t>
+      </w:r>
+      <w:r>
+        <w:rPr>
+          <w:lang w:val="sk-SK"/>
+        </w:rPr>
+        <w:t> </w:t>
+      </w:r>
+      <w:r>
+        <w:t>pri</w:t>
       </w:r>
       <w:r>
         <w:rPr>
@@ -10398,7 +11105,7 @@
       <w:pPr>
         <w:pStyle w:val="Caption"/>
       </w:pPr>
-      <w:bookmarkStart w:id="54" w:name="_Toc227512553"/>
+      <w:bookmarkStart w:id="54" w:name="_Toc227514376"/>
       <w:r>
         <w:t xml:space="preserve">Obr. </w:t>
       </w:r>
@@ -10468,7 +11175,7 @@
       <w:r>
         <w:fldChar w:fldCharType="end"/>
       </w:r>
-      <w:bookmarkStart w:id="55" w:name="_Toc227512593"/>
+      <w:bookmarkStart w:id="55" w:name="_Toc227514416"/>
       <w:r>
         <w:rPr>
           <w:lang w:val="sk-SK"/>
@@ -10488,7 +11195,7 @@
         <w:pStyle w:val="Heading2"/>
         <w:spacing w:before="480" w:after="240"/>
       </w:pPr>
-      <w:bookmarkStart w:id="56" w:name="_Toc227512594"/>
+      <w:bookmarkStart w:id="56" w:name="_Toc227514417"/>
       <w:r>
         <w:rPr>
           <w:lang w:val="sk-SK"/>
@@ -10528,7 +11235,7 @@
       <w:pPr>
         <w:pStyle w:val="Heading3"/>
       </w:pPr>
-      <w:bookmarkStart w:id="57" w:name="_Toc227512595"/>
+      <w:bookmarkStart w:id="57" w:name="_Toc227514418"/>
       <w:r>
         <w:rPr>
           <w:lang w:val="sk-SK"/>
@@ -10568,7 +11275,7 @@
       <w:pPr>
         <w:pStyle w:val="Heading3"/>
       </w:pPr>
-      <w:bookmarkStart w:id="58" w:name="_Toc227512596"/>
+      <w:bookmarkStart w:id="58" w:name="_Toc227514419"/>
       <w:r>
         <w:rPr>
           <w:lang w:val="sk-SK"/>
@@ -10630,7 +11337,7 @@
       <w:pPr>
         <w:pStyle w:val="Heading3"/>
       </w:pPr>
-      <w:bookmarkStart w:id="59" w:name="_Toc227512597"/>
+      <w:bookmarkStart w:id="59" w:name="_Toc227514420"/>
       <w:r>
         <w:rPr>
           <w:lang w:val="sk-SK"/>
@@ -10729,7 +11436,7 @@
           <w:lang w:val="sk-SK"/>
         </w:rPr>
       </w:pPr>
-      <w:bookmarkStart w:id="60" w:name="_Toc227512598"/>
+      <w:bookmarkStart w:id="60" w:name="_Toc227514421"/>
       <w:r>
         <w:rPr>
           <w:lang w:val="sk-SK"/>
@@ -10784,7 +11491,7 @@
       <w:pPr>
         <w:pStyle w:val="Heading3"/>
       </w:pPr>
-      <w:bookmarkStart w:id="61" w:name="_Toc227512599"/>
+      <w:bookmarkStart w:id="61" w:name="_Toc227514422"/>
       <w:r>
         <w:rPr>
           <w:lang w:val="sk-SK"/>
@@ -10991,7 +11698,7 @@
           <w:lang w:val="sk-SK"/>
         </w:rPr>
       </w:pPr>
-      <w:bookmarkStart w:id="62" w:name="_Toc227512600"/>
+      <w:bookmarkStart w:id="62" w:name="_Toc227514423"/>
       <w:r>
         <w:rPr>
           <w:lang w:val="sk-SK"/>
@@ -11072,7 +11779,7 @@
           <w:lang w:val="sk-SK"/>
         </w:rPr>
       </w:pPr>
-      <w:bookmarkStart w:id="63" w:name="_Toc227512601"/>
+      <w:bookmarkStart w:id="63" w:name="_Toc227514424"/>
       <w:r>
         <w:rPr>
           <w:lang w:val="sk-SK"/>
@@ -11136,7 +11843,7 @@
           <w:lang w:val="sk-SK"/>
         </w:rPr>
       </w:pPr>
-      <w:bookmarkStart w:id="64" w:name="_Toc227512602"/>
+      <w:bookmarkStart w:id="64" w:name="_Toc227514425"/>
       <w:r>
         <w:rPr>
           <w:lang w:val="sk-SK"/>
@@ -11191,18 +11898,12 @@
           <w:lang w:val="sk-SK"/>
         </w:rPr>
       </w:pPr>
-      <w:bookmarkStart w:id="65" w:name="_Toc227512603"/>
-      <w:r>
-        <w:rPr>
-          <w:lang w:val="sk-SK"/>
-        </w:rPr>
-        <w:t>Husto prepojená</w:t>
-      </w:r>
-      <w:r>
-        <w:rPr>
-          <w:lang w:val="sk-SK"/>
-        </w:rPr>
-        <w:t xml:space="preserve"> vrstva</w:t>
+      <w:bookmarkStart w:id="65" w:name="_Toc227514426"/>
+      <w:r>
+        <w:rPr>
+          <w:lang w:val="sk-SK"/>
+        </w:rPr>
+        <w:t>Husto prepojená vrstva</w:t>
       </w:r>
       <w:bookmarkEnd w:id="65"/>
     </w:p>
@@ -11244,7 +11945,7 @@
           <w:lang w:val="sk-SK"/>
         </w:rPr>
       </w:pPr>
-      <w:bookmarkStart w:id="66" w:name="_Toc227512604"/>
+      <w:bookmarkStart w:id="66" w:name="_Toc227514427"/>
       <w:r>
         <w:rPr>
           <w:lang w:val="sk-SK"/>
@@ -11355,7 +12056,7 @@
       <w:pPr>
         <w:pStyle w:val="Caption"/>
       </w:pPr>
-      <w:bookmarkStart w:id="67" w:name="_Toc227512554"/>
+      <w:bookmarkStart w:id="67" w:name="_Toc227514377"/>
       <w:r>
         <w:t xml:space="preserve">Obr. </w:t>
       </w:r>
@@ -11405,7 +12106,7 @@
           <w:lang w:val="sk-SK"/>
         </w:rPr>
       </w:pPr>
-      <w:bookmarkStart w:id="68" w:name="_Toc227512605"/>
+      <w:bookmarkStart w:id="68" w:name="_Toc227514428"/>
       <w:r>
         <w:rPr>
           <w:lang w:val="sk-SK"/>
@@ -11498,7 +12199,7 @@
       <w:r>
         <w:fldChar w:fldCharType="end"/>
       </w:r>
-      <w:bookmarkStart w:id="69" w:name="_Toc227512606"/>
+      <w:bookmarkStart w:id="69" w:name="_Toc227514429"/>
       <w:r>
         <w:rPr>
           <w:lang w:val="sk-SK"/>
@@ -11545,7 +12246,7 @@
           <w:lang w:val="sk-SK"/>
         </w:rPr>
       </w:pPr>
-      <w:bookmarkStart w:id="70" w:name="_Toc227512607"/>
+      <w:bookmarkStart w:id="70" w:name="_Toc227514430"/>
       <w:r>
         <w:rPr>
           <w:lang w:val="sk-SK"/>
@@ -11877,66 +12578,12 @@
           <w:lang w:val="sk-SK"/>
         </w:rPr>
       </w:pPr>
-      <w:bookmarkStart w:id="71" w:name="_Toc227512608"/>
-      <w:r>
-        <w:rPr>
-          <w:lang w:val="sk-SK"/>
-        </w:rPr>
-        <w:t>Koreň s</w:t>
-      </w:r>
-      <w:r>
-        <w:rPr>
-          <w:lang w:val="sk-SK"/>
-        </w:rPr>
-        <w:t>tredn</w:t>
-      </w:r>
-      <w:r>
-        <w:rPr>
-          <w:lang w:val="sk-SK"/>
-        </w:rPr>
-        <w:t>ej</w:t>
-      </w:r>
-      <w:r>
-        <w:rPr>
-          <w:lang w:val="sk-SK"/>
-        </w:rPr>
-        <w:t xml:space="preserve"> </w:t>
-      </w:r>
-      <w:r>
-        <w:rPr>
-          <w:lang w:val="sk-SK"/>
-        </w:rPr>
-        <w:t>kvadratickej</w:t>
-      </w:r>
-      <w:r>
-        <w:rPr>
-          <w:lang w:val="sk-SK"/>
-        </w:rPr>
-        <w:t xml:space="preserve"> chyb</w:t>
-      </w:r>
-      <w:r>
-        <w:rPr>
-          <w:lang w:val="sk-SK"/>
-        </w:rPr>
-        <w:t>y</w:t>
-      </w:r>
-      <w:r>
-        <w:rPr>
-          <w:lang w:val="sk-SK"/>
-        </w:rPr>
-        <w:t xml:space="preserve"> (</w:t>
-      </w:r>
-      <w:r>
-        <w:rPr>
-          <w:lang w:val="sk-SK"/>
-        </w:rPr>
-        <w:t>RMSE</w:t>
-      </w:r>
-      <w:r>
-        <w:rPr>
-          <w:lang w:val="sk-SK"/>
-        </w:rPr>
-        <w:t>)</w:t>
+      <w:bookmarkStart w:id="71" w:name="_Toc227514431"/>
+      <w:r>
+        <w:rPr>
+          <w:lang w:val="sk-SK"/>
+        </w:rPr>
+        <w:t>Koreň strednej kvadratickej chyby (RMSE)</w:t>
       </w:r>
       <w:bookmarkEnd w:id="71"/>
     </w:p>
@@ -12146,6 +12793,7 @@
     </w:p>
     <w:p>
       <w:pPr>
+        <w:spacing w:line="312" w:lineRule="auto"/>
         <w:jc w:val="both"/>
       </w:pPr>
       <w:r>
@@ -12284,7 +12932,7 @@
           <w:lang w:val="sk-SK"/>
         </w:rPr>
       </w:pPr>
-      <w:bookmarkStart w:id="72" w:name="_Toc227512609"/>
+      <w:bookmarkStart w:id="72" w:name="_Toc227514432"/>
       <w:r>
         <w:rPr>
           <w:lang w:val="sk-SK"/>
@@ -12361,16 +13009,7 @@
             <w:rPr>
               <w:rFonts w:ascii="Cambria Math" w:hAnsi="Cambria Math"/>
             </w:rPr>
-            <m:t>=</m:t>
-          </m:r>
-          <m:r>
-            <m:rPr>
-              <m:sty m:val="p"/>
-            </m:rPr>
-            <w:rPr>
-              <w:rFonts w:ascii="Cambria Math" w:hAnsi="Cambria Math"/>
-            </w:rPr>
-            <m:t>1-</m:t>
+            <m:t>=1-</m:t>
           </m:r>
           <m:f>
             <m:fPr>
@@ -12818,7 +13457,7 @@
       <w:r>
         <w:fldChar w:fldCharType="end"/>
       </w:r>
-      <w:bookmarkStart w:id="73" w:name="_Toc227512610"/>
+      <w:bookmarkStart w:id="73" w:name="_Toc227514433"/>
       <w:r>
         <w:rPr>
           <w:lang w:val="sk-SK"/>
@@ -12938,7 +13577,7 @@
       <w:pPr>
         <w:pStyle w:val="Caption"/>
       </w:pPr>
-      <w:bookmarkStart w:id="74" w:name="_Toc227512555"/>
+      <w:bookmarkStart w:id="74" w:name="_Toc227514378"/>
       <w:r>
         <w:t xml:space="preserve">Obr. </w:t>
       </w:r>
@@ -12979,6 +13618,474 @@
         </w:rPr>
         <w:t xml:space="preserve"> </w:t>
       </w:r>
+    </w:p>
+    <w:p>
+      <w:pPr>
+        <w:pStyle w:val="Heading1"/>
+        <w:numPr>
+          <w:ilvl w:val="0"/>
+          <w:numId w:val="36"/>
+        </w:numPr>
+        <w:spacing w:after="480"/>
+        <w:rPr>
+          <w:lang w:val="sk-SK"/>
+        </w:rPr>
+      </w:pPr>
+      <w:r>
+        <w:lastRenderedPageBreak/>
+        <w:fldChar w:fldCharType="begin"/>
+      </w:r>
+      <w:r>
+        <w:instrText xml:space="preserve">  </w:instrText>
+      </w:r>
+      <w:r>
+        <w:fldChar w:fldCharType="end"/>
+      </w:r>
+      <w:bookmarkStart w:id="75" w:name="_Toc227514434"/>
+      <w:r>
+        <w:rPr>
+          <w:lang w:val="sk-SK"/>
+        </w:rPr>
+        <w:t>Optimalizácia hyperparametrov pomocou frameworku Optuna</w:t>
+      </w:r>
+      <w:bookmarkEnd w:id="75"/>
+    </w:p>
+    <w:p>
+      <w:pPr>
+        <w:spacing w:line="312" w:lineRule="auto"/>
+        <w:jc w:val="both"/>
+      </w:pPr>
+      <w:r>
+        <w:t>Na základe vyhodnotenia modelu pomocou metrík (MAE, RMSE, R²) a validačných postupov je ďalším krokom optimalizácia jeho hyperparametrov. Keďže výkon konvolučných neurónových sietí je výrazne závislý od nastavenia jednotlivých parametrov architektúry a procesu učenia, v tejto práci bol na ich automatické vyhľadávanie použitý framework Optuna. Cieľom bolo nájsť kombináciu parametrov, ktorá minimalizuje chybu modelu a zároveň zlepšuje jeho generalizačnú schopnosť.</w:t>
+      </w:r>
+    </w:p>
+    <w:p>
+      <w:pPr>
+        <w:pStyle w:val="Heading2"/>
+        <w:spacing w:before="480" w:after="240"/>
+        <w:rPr>
+          <w:lang w:val="sk-SK"/>
+        </w:rPr>
+      </w:pPr>
+      <w:bookmarkStart w:id="76" w:name="_Toc227514435"/>
+      <w:r>
+        <w:rPr>
+          <w:lang w:val="sk-SK"/>
+        </w:rPr>
+        <w:t>Optuna framework</w:t>
+      </w:r>
+      <w:bookmarkEnd w:id="76"/>
+    </w:p>
+    <w:p>
+      <w:pPr>
+        <w:spacing w:line="312" w:lineRule="auto"/>
+        <w:jc w:val="both"/>
+      </w:pPr>
+      <w:r>
+        <w:t>Optuna predstavuje moderný framework pre automatickú optimalizáciu hyperparametrov v</w:t>
+      </w:r>
+      <w:r>
+        <w:rPr>
+          <w:lang w:val="sk-SK"/>
+        </w:rPr>
+        <w:t> </w:t>
+      </w:r>
+      <w:r>
+        <w:t>strojovom učení. Je založený na princípe definovania vyhľadávacieho priestoru priamo v</w:t>
+      </w:r>
+      <w:r>
+        <w:rPr>
+          <w:lang w:val="sk-SK"/>
+        </w:rPr>
+        <w:t> </w:t>
+      </w:r>
+      <w:r>
+        <w:t>kóde (tzv. define-by-run prístup), čo umožňuje dynamické a flexibilné nastavovanie optimalizačného procesu. Framework využíva efektívne algoritmy pre vyhľadávanie optimálnych konfigurácií, a zároveň podporuje tzv. pruning, teda predčasné ukončenie menej perspektívnych pokusov s cieľom znížiť výpočtovú náročnosť. Vďaka týmto vlastnostiam je Optuna vhodná najmä pre optimalizáciu hlbokých neurónových sietí.</w:t>
+      </w:r>
+    </w:p>
+    <w:p>
+      <w:pPr>
+        <w:spacing w:line="312" w:lineRule="auto"/>
+        <w:ind w:firstLine="425"/>
+        <w:jc w:val="both"/>
+        <w:rPr>
+          <w:lang w:val="sk-SK"/>
+        </w:rPr>
+      </w:pPr>
+      <w:r>
+        <w:t>V tejto práci bola použitá implementácia frameworku Optuna podľa štandardnej metodiky uvedenej v [</w:t>
+      </w:r>
+      <w:r>
+        <w:rPr>
+          <w:lang w:val="sk-SK"/>
+        </w:rPr>
+        <w:t>20</w:t>
+      </w:r>
+      <w:r>
+        <w:t>]</w:t>
+      </w:r>
+      <w:r>
+        <w:rPr>
+          <w:lang w:val="sk-SK"/>
+        </w:rPr>
+        <w:t>.</w:t>
+      </w:r>
+    </w:p>
+    <w:p>
+      <w:pPr>
+        <w:pStyle w:val="Heading2"/>
+        <w:spacing w:before="480" w:after="240"/>
+        <w:rPr>
+          <w:lang w:val="sk-SK"/>
+        </w:rPr>
+      </w:pPr>
+      <w:bookmarkStart w:id="77" w:name="_Toc227514436"/>
+      <w:r>
+        <w:rPr>
+          <w:lang w:val="sk-SK"/>
+        </w:rPr>
+        <w:t>Optimalizované hyperparametre v tejto práci</w:t>
+      </w:r>
+      <w:bookmarkEnd w:id="77"/>
+    </w:p>
+    <w:p>
+      <w:pPr>
+        <w:spacing w:line="312" w:lineRule="auto"/>
+        <w:jc w:val="both"/>
+      </w:pPr>
+      <w:r>
+        <w:t>V rámci experimentov boli pomocou Optuna optimalizované nasledujúce parametre:</w:t>
+      </w:r>
+    </w:p>
+    <w:p>
+      <w:pPr>
+        <w:pStyle w:val="ListParagraph"/>
+        <w:numPr>
+          <w:ilvl w:val="0"/>
+          <w:numId w:val="41"/>
+        </w:numPr>
+        <w:spacing w:line="312" w:lineRule="auto"/>
+        <w:jc w:val="both"/>
+      </w:pPr>
+      <w:r>
+        <w:rPr>
+          <w:lang w:val="sk-SK"/>
+        </w:rPr>
+        <w:t>počet konvolučných vrstiev</w:t>
+      </w:r>
+    </w:p>
+    <w:p>
+      <w:pPr>
+        <w:pStyle w:val="ListParagraph"/>
+        <w:numPr>
+          <w:ilvl w:val="0"/>
+          <w:numId w:val="41"/>
+        </w:numPr>
+        <w:spacing w:line="312" w:lineRule="auto"/>
+        <w:jc w:val="both"/>
+      </w:pPr>
+      <w:r>
+        <w:rPr>
+          <w:lang w:val="sk-SK"/>
+        </w:rPr>
+        <w:t>počet epoch</w:t>
+      </w:r>
+    </w:p>
+    <w:p>
+      <w:pPr>
+        <w:pStyle w:val="ListParagraph"/>
+        <w:numPr>
+          <w:ilvl w:val="0"/>
+          <w:numId w:val="41"/>
+        </w:numPr>
+        <w:spacing w:line="312" w:lineRule="auto"/>
+        <w:jc w:val="both"/>
+      </w:pPr>
+      <w:r>
+        <w:rPr>
+          <w:lang w:val="sk-SK"/>
+        </w:rPr>
+        <w:t>použitie batch normalizácie</w:t>
+      </w:r>
+    </w:p>
+    <w:p>
+      <w:pPr>
+        <w:pStyle w:val="ListParagraph"/>
+        <w:numPr>
+          <w:ilvl w:val="0"/>
+          <w:numId w:val="41"/>
+        </w:numPr>
+        <w:spacing w:line="312" w:lineRule="auto"/>
+        <w:jc w:val="both"/>
+      </w:pPr>
+      <w:r>
+        <w:rPr>
+          <w:lang w:val="sk-SK"/>
+        </w:rPr>
+        <w:t>veľkosť konvolučného jadra (kernel size)</w:t>
+      </w:r>
+    </w:p>
+    <w:p>
+      <w:pPr>
+        <w:pStyle w:val="ListParagraph"/>
+        <w:numPr>
+          <w:ilvl w:val="0"/>
+          <w:numId w:val="41"/>
+        </w:numPr>
+        <w:spacing w:line="312" w:lineRule="auto"/>
+        <w:jc w:val="both"/>
+      </w:pPr>
+      <w:r>
+        <w:rPr>
+          <w:lang w:val="sk-SK"/>
+        </w:rPr>
+        <w:t>počet filtrov v prvej konvolučnej vrstve</w:t>
+      </w:r>
+    </w:p>
+    <w:p>
+      <w:pPr>
+        <w:pStyle w:val="ListParagraph"/>
+        <w:numPr>
+          <w:ilvl w:val="0"/>
+          <w:numId w:val="41"/>
+        </w:numPr>
+        <w:spacing w:line="312" w:lineRule="auto"/>
+        <w:jc w:val="both"/>
+      </w:pPr>
+      <w:r>
+        <w:rPr>
+          <w:lang w:val="sk-SK"/>
+        </w:rPr>
+        <w:t>veľkosť vstupného obrazu</w:t>
+      </w:r>
+    </w:p>
+    <w:p>
+      <w:pPr>
+        <w:pStyle w:val="ListParagraph"/>
+        <w:numPr>
+          <w:ilvl w:val="0"/>
+          <w:numId w:val="41"/>
+        </w:numPr>
+        <w:spacing w:line="312" w:lineRule="auto"/>
+        <w:jc w:val="both"/>
+      </w:pPr>
+      <w:r>
+        <w:rPr>
+          <w:lang w:val="sk-SK"/>
+        </w:rPr>
+        <w:t>learning rate</w:t>
+      </w:r>
+    </w:p>
+    <w:p>
+      <w:pPr>
+        <w:pStyle w:val="Heading3"/>
+        <w:rPr>
+          <w:lang w:val="sk-SK"/>
+        </w:rPr>
+      </w:pPr>
+      <w:bookmarkStart w:id="78" w:name="_Toc227514437"/>
+      <w:r>
+        <w:rPr>
+          <w:lang w:val="sk-SK"/>
+        </w:rPr>
+        <w:lastRenderedPageBreak/>
+        <w:t>Počet konvolučných vrstiev</w:t>
+      </w:r>
+      <w:bookmarkEnd w:id="78"/>
+    </w:p>
+    <w:p>
+      <w:pPr>
+        <w:spacing w:line="312" w:lineRule="auto"/>
+        <w:jc w:val="both"/>
+      </w:pPr>
+      <w:r>
+        <w:t>Počet konvolučných vrstiev určuje hĺbku neurónovej siete. Vyšší počet vrstiev umožňuje modelu zachytiť komplexnejšie a abstraktnejšie príznaky, avšak zároveň zvyšuje riziko preučenia a výpočtovú náročnosť.</w:t>
+      </w:r>
+    </w:p>
+    <w:p>
+      <w:pPr>
+        <w:pStyle w:val="Heading3"/>
+        <w:rPr>
+          <w:lang w:val="sk-SK"/>
+        </w:rPr>
+      </w:pPr>
+      <w:bookmarkStart w:id="79" w:name="_Toc227514438"/>
+      <w:r>
+        <w:rPr>
+          <w:lang w:val="sk-SK"/>
+        </w:rPr>
+        <w:t xml:space="preserve">Počet </w:t>
+      </w:r>
+      <w:r>
+        <w:rPr>
+          <w:lang w:val="sk-SK"/>
+        </w:rPr>
+        <w:t>epoc</w:t>
+      </w:r>
+      <w:r>
+        <w:rPr>
+          <w:lang w:val="sk-SK"/>
+        </w:rPr>
+        <w:t>h</w:t>
+      </w:r>
+      <w:bookmarkEnd w:id="79"/>
+    </w:p>
+    <w:p>
+      <w:pPr>
+        <w:spacing w:line="312" w:lineRule="auto"/>
+        <w:jc w:val="both"/>
+      </w:pPr>
+      <w:r>
+        <w:t>Počet epoch predstavuje počet prechodov modelu cez celý tréningový dataset. Vyšší počet epoch môže zlepšiť presnosť modelu, avšak pri nadmernej hodnote môže dôjsť k preučeniu (overfittingu).</w:t>
+      </w:r>
+    </w:p>
+    <w:p>
+      <w:pPr>
+        <w:pStyle w:val="Heading3"/>
+        <w:rPr>
+          <w:lang w:val="sk-SK"/>
+        </w:rPr>
+      </w:pPr>
+      <w:bookmarkStart w:id="80" w:name="_Toc227514439"/>
+      <w:r>
+        <w:rPr>
+          <w:lang w:val="sk-SK"/>
+        </w:rPr>
+        <w:t>Batch normalizácia</w:t>
+      </w:r>
+      <w:bookmarkEnd w:id="80"/>
+    </w:p>
+    <w:p>
+      <w:pPr>
+        <w:spacing w:line="312" w:lineRule="auto"/>
+        <w:jc w:val="both"/>
+      </w:pPr>
+      <w:r>
+        <w:t>Batch normalizácia slúži na stabilizáciu a zrýchlenie procesu učenia. Normalizuje aktivácie jednotlivých vrstiev počas tréningu, čím znižuje citlivosť modelu na počiatočné nastavenia váh.</w:t>
+      </w:r>
+    </w:p>
+    <w:p>
+      <w:pPr>
+        <w:pStyle w:val="Heading3"/>
+        <w:rPr>
+          <w:lang w:val="sk-SK"/>
+        </w:rPr>
+      </w:pPr>
+      <w:bookmarkStart w:id="81" w:name="_Toc227514440"/>
+      <w:r>
+        <w:rPr>
+          <w:lang w:val="sk-SK"/>
+        </w:rPr>
+        <w:t>Veľkosť konvolučného jadra (kernel size)</w:t>
+      </w:r>
+      <w:bookmarkEnd w:id="81"/>
+    </w:p>
+    <w:p>
+      <w:pPr>
+        <w:spacing w:line="312" w:lineRule="auto"/>
+        <w:jc w:val="both"/>
+      </w:pPr>
+      <w:r>
+        <w:t>Veľkosť konvolučného jadra určuje rozsah lokálneho okolia, z ktorého sa extrahujú príznaky. Menšie jadrá zachytávajú jemnejšie detaily, zatiaľ čo väčšie jadrá umožňujú zachytiť širšie kontextové informácie.</w:t>
+      </w:r>
+    </w:p>
+    <w:p>
+      <w:pPr>
+        <w:pStyle w:val="Heading3"/>
+        <w:rPr>
+          <w:lang w:val="sk-SK"/>
+        </w:rPr>
+      </w:pPr>
+      <w:bookmarkStart w:id="82" w:name="_Toc227514441"/>
+      <w:r>
+        <w:rPr>
+          <w:lang w:val="sk-SK"/>
+        </w:rPr>
+        <w:t>Počet filtrov v prvej vrstve</w:t>
+      </w:r>
+      <w:bookmarkEnd w:id="82"/>
+    </w:p>
+    <w:p>
+      <w:pPr>
+        <w:spacing w:line="312" w:lineRule="auto"/>
+        <w:jc w:val="both"/>
+      </w:pPr>
+      <w:r>
+        <w:t>Počet filtrov určuje, koľko rôznych príznakov sa extrahuje v prvej konvolučnej vrstve. Vyšší počet filtrov zvyšuje kapacitu modelu, ale zároveň zvyšuje výpočtové nároky.</w:t>
+      </w:r>
+    </w:p>
+    <w:p>
+      <w:pPr>
+        <w:pStyle w:val="Heading3"/>
+        <w:rPr>
+          <w:lang w:val="sk-SK"/>
+        </w:rPr>
+      </w:pPr>
+      <w:bookmarkStart w:id="83" w:name="_Toc227514442"/>
+      <w:r>
+        <w:rPr>
+          <w:lang w:val="sk-SK"/>
+        </w:rPr>
+        <w:t>Veľkosť vstupného obrazu</w:t>
+      </w:r>
+      <w:bookmarkEnd w:id="83"/>
+    </w:p>
+    <w:p>
+      <w:pPr>
+        <w:spacing w:line="312" w:lineRule="auto"/>
+        <w:jc w:val="both"/>
+      </w:pPr>
+      <w:r>
+        <w:t>Veľkosť vstupného obrazu ovplyvňuje množstvo dostupných informácií pre model. Väčšie rozlíšenie môže obsahovať viac detailov, ale zároveň zvyšuje výpočtovú záťaž.</w:t>
+      </w:r>
+    </w:p>
+    <w:p>
+      <w:pPr>
+        <w:pStyle w:val="Heading3"/>
+        <w:rPr>
+          <w:lang w:val="sk-SK"/>
+        </w:rPr>
+      </w:pPr>
+      <w:bookmarkStart w:id="84" w:name="_Toc227514443"/>
+      <w:r>
+        <w:rPr>
+          <w:lang w:val="sk-SK"/>
+        </w:rPr>
+        <w:lastRenderedPageBreak/>
+        <w:t>Learning rate</w:t>
+      </w:r>
+      <w:bookmarkEnd w:id="84"/>
+    </w:p>
+    <w:p>
+      <w:pPr>
+        <w:spacing w:line="312" w:lineRule="auto"/>
+        <w:jc w:val="both"/>
+      </w:pPr>
+      <w:r>
+        <w:t>Learning rate určuje rýchlosť aktualizácie váh počas tréningu. Príliš vysoká hodnota môže spôsobiť nestabilné učenie, zatiaľ čo príliš nízka hodnota môže spomaliť konvergenciu modelu.</w:t>
+      </w:r>
+    </w:p>
+    <w:p>
+      <w:pPr>
+        <w:rPr>
+          <w:lang w:val="sk-SK"/>
+        </w:rPr>
+      </w:pPr>
+    </w:p>
+    <w:p>
+      <w:pPr>
+        <w:rPr>
+          <w:lang w:val="sk-SK"/>
+        </w:rPr>
+      </w:pPr>
+    </w:p>
+    <w:p>
+      <w:pPr>
+        <w:pStyle w:val="Bezodsadenia"/>
+        <w:rPr>
+          <w:lang w:val="sk-SK"/>
+        </w:rPr>
+      </w:pPr>
     </w:p>
     <w:p>
       <w:pPr>
@@ -13069,11 +14176,11 @@
       <w:pPr>
         <w:pStyle w:val="Heading3"/>
       </w:pPr>
-      <w:bookmarkStart w:id="75" w:name="_Toc227512611"/>
+      <w:bookmarkStart w:id="85" w:name="_Toc227514444"/>
       <w:r>
         <w:t>Záver</w:t>
       </w:r>
-      <w:bookmarkEnd w:id="75"/>
+      <w:bookmarkEnd w:id="85"/>
     </w:p>
     <w:p>
       <w:pPr>
@@ -13083,10 +14190,10 @@
           <w:bCs/>
         </w:rPr>
       </w:pPr>
-      <w:bookmarkStart w:id="76" w:name="_Ref178418312"/>
-      <w:bookmarkStart w:id="77" w:name="_Toc181225510"/>
-      <w:bookmarkStart w:id="78" w:name="_Toc173791406"/>
-      <w:bookmarkStart w:id="79" w:name="_Toc173791545"/>
+      <w:bookmarkStart w:id="86" w:name="_Ref178418312"/>
+      <w:bookmarkStart w:id="87" w:name="_Toc181225510"/>
+      <w:bookmarkStart w:id="88" w:name="_Toc173791406"/>
+      <w:bookmarkStart w:id="89" w:name="_Toc173791545"/>
       <w:r>
         <w:rPr>
           <w:b/>
@@ -13131,7 +14238,7 @@
         </w:rPr>
         <w:fldChar w:fldCharType="end"/>
       </w:r>
-      <w:bookmarkEnd w:id="76"/>
+      <w:bookmarkEnd w:id="86"/>
       <w:r>
         <w:rPr>
           <w:b/>
@@ -13208,7 +14315,7 @@
         </w:rPr>
         <w:t>.</w:t>
       </w:r>
-      <w:bookmarkEnd w:id="77"/>
+      <w:bookmarkEnd w:id="87"/>
     </w:p>
     <w:tbl>
       <w:tblPr>
@@ -13787,12 +14894,12 @@
         <w:pStyle w:val="Nadpis1bezslovania"/>
         <w:spacing w:before="1440" w:after="480"/>
       </w:pPr>
-      <w:bookmarkStart w:id="80" w:name="_Toc227512612"/>
+      <w:bookmarkStart w:id="90" w:name="_Toc227514445"/>
       <w:r>
         <w:lastRenderedPageBreak/>
         <w:t>Záver</w:t>
       </w:r>
-      <w:bookmarkEnd w:id="80"/>
+      <w:bookmarkEnd w:id="90"/>
     </w:p>
     <w:p>
       <w:pPr>
@@ -13865,15 +14972,15 @@
         <w:pStyle w:val="Nadpis1bezslovania"/>
         <w:spacing w:before="1440" w:after="480"/>
       </w:pPr>
-      <w:bookmarkStart w:id="81" w:name="_Toc227512613"/>
+      <w:bookmarkStart w:id="91" w:name="_Toc227514446"/>
       <w:r>
         <w:lastRenderedPageBreak/>
         <w:t>Literatúra</w:t>
       </w:r>
-      <w:bookmarkEnd w:id="81"/>
-    </w:p>
-    <w:bookmarkEnd w:id="78"/>
-    <w:bookmarkEnd w:id="79"/>
+      <w:bookmarkEnd w:id="91"/>
+    </w:p>
+    <w:bookmarkEnd w:id="88"/>
+    <w:bookmarkEnd w:id="89"/>
     <w:p>
       <w:pPr>
         <w:pStyle w:val="NormalWeb"/>
@@ -13893,8 +15000,9 @@
           <w:lang w:val="sk-SK" w:eastAsia="en-US"/>
           <w14:ligatures w14:val="standardContextual"/>
         </w:rPr>
-        <w:t>(PDF in Articles Folder) Irradiance Forecasting for the Power Prediction</w:t>
-      </w:r>
+        <w:t xml:space="preserve">(PDF in </w:t>
+      </w:r>
+      <w:proofErr w:type="spellStart"/>
       <w:r>
         <w:rPr>
           <w:rFonts w:asciiTheme="minorHAnsi" w:eastAsiaTheme="minorHAnsi" w:hAnsiTheme="minorHAnsi" w:cstheme="minorBidi"/>
@@ -13902,8 +15010,307 @@
           <w:lang w:val="sk-SK" w:eastAsia="en-US"/>
           <w14:ligatures w14:val="standardContextual"/>
         </w:rPr>
+        <w:t>Articles</w:t>
+      </w:r>
+      <w:proofErr w:type="spellEnd"/>
+      <w:r>
+        <w:rPr>
+          <w:rFonts w:asciiTheme="minorHAnsi" w:eastAsiaTheme="minorHAnsi" w:hAnsiTheme="minorHAnsi" w:cstheme="minorBidi"/>
+          <w:kern w:val="2"/>
+          <w:lang w:val="sk-SK" w:eastAsia="en-US"/>
+          <w14:ligatures w14:val="standardContextual"/>
+        </w:rPr>
+        <w:t xml:space="preserve"> </w:t>
+      </w:r>
+      <w:proofErr w:type="spellStart"/>
+      <w:r>
+        <w:rPr>
+          <w:rFonts w:asciiTheme="minorHAnsi" w:eastAsiaTheme="minorHAnsi" w:hAnsiTheme="minorHAnsi" w:cstheme="minorBidi"/>
+          <w:kern w:val="2"/>
+          <w:lang w:val="sk-SK" w:eastAsia="en-US"/>
+          <w14:ligatures w14:val="standardContextual"/>
+        </w:rPr>
+        <w:t>Folder</w:t>
+      </w:r>
+      <w:proofErr w:type="spellEnd"/>
+      <w:r>
+        <w:rPr>
+          <w:rFonts w:asciiTheme="minorHAnsi" w:eastAsiaTheme="minorHAnsi" w:hAnsiTheme="minorHAnsi" w:cstheme="minorBidi"/>
+          <w:kern w:val="2"/>
+          <w:lang w:val="sk-SK" w:eastAsia="en-US"/>
+          <w14:ligatures w14:val="standardContextual"/>
+        </w:rPr>
+        <w:t xml:space="preserve">) </w:t>
+      </w:r>
+      <w:proofErr w:type="spellStart"/>
+      <w:r>
+        <w:rPr>
+          <w:rFonts w:asciiTheme="minorHAnsi" w:eastAsiaTheme="minorHAnsi" w:hAnsiTheme="minorHAnsi" w:cstheme="minorBidi"/>
+          <w:kern w:val="2"/>
+          <w:lang w:val="sk-SK" w:eastAsia="en-US"/>
+          <w14:ligatures w14:val="standardContextual"/>
+        </w:rPr>
+        <w:t>Irradiance</w:t>
+      </w:r>
+      <w:proofErr w:type="spellEnd"/>
+      <w:r>
+        <w:rPr>
+          <w:rFonts w:asciiTheme="minorHAnsi" w:eastAsiaTheme="minorHAnsi" w:hAnsiTheme="minorHAnsi" w:cstheme="minorBidi"/>
+          <w:kern w:val="2"/>
+          <w:lang w:val="sk-SK" w:eastAsia="en-US"/>
+          <w14:ligatures w14:val="standardContextual"/>
+        </w:rPr>
+        <w:t xml:space="preserve"> </w:t>
+      </w:r>
+      <w:proofErr w:type="spellStart"/>
+      <w:r>
+        <w:rPr>
+          <w:rFonts w:asciiTheme="minorHAnsi" w:eastAsiaTheme="minorHAnsi" w:hAnsiTheme="minorHAnsi" w:cstheme="minorBidi"/>
+          <w:kern w:val="2"/>
+          <w:lang w:val="sk-SK" w:eastAsia="en-US"/>
+          <w14:ligatures w14:val="standardContextual"/>
+        </w:rPr>
+        <w:t>Forecasting</w:t>
+      </w:r>
+      <w:proofErr w:type="spellEnd"/>
+      <w:r>
+        <w:rPr>
+          <w:rFonts w:asciiTheme="minorHAnsi" w:eastAsiaTheme="minorHAnsi" w:hAnsiTheme="minorHAnsi" w:cstheme="minorBidi"/>
+          <w:kern w:val="2"/>
+          <w:lang w:val="sk-SK" w:eastAsia="en-US"/>
+          <w14:ligatures w14:val="standardContextual"/>
+        </w:rPr>
+        <w:t xml:space="preserve"> for the </w:t>
+      </w:r>
+      <w:proofErr w:type="spellStart"/>
+      <w:r>
+        <w:rPr>
+          <w:rFonts w:asciiTheme="minorHAnsi" w:eastAsiaTheme="minorHAnsi" w:hAnsiTheme="minorHAnsi" w:cstheme="minorBidi"/>
+          <w:kern w:val="2"/>
+          <w:lang w:val="sk-SK" w:eastAsia="en-US"/>
+          <w14:ligatures w14:val="standardContextual"/>
+        </w:rPr>
+        <w:t>Power</w:t>
+      </w:r>
+      <w:proofErr w:type="spellEnd"/>
+      <w:r>
+        <w:rPr>
+          <w:rFonts w:asciiTheme="minorHAnsi" w:eastAsiaTheme="minorHAnsi" w:hAnsiTheme="minorHAnsi" w:cstheme="minorBidi"/>
+          <w:kern w:val="2"/>
+          <w:lang w:val="sk-SK" w:eastAsia="en-US"/>
+          <w14:ligatures w14:val="standardContextual"/>
+        </w:rPr>
+        <w:t xml:space="preserve"> Prediction</w:t>
+      </w:r>
+      <w:r>
+        <w:rPr>
+          <w:rFonts w:asciiTheme="minorHAnsi" w:eastAsiaTheme="minorHAnsi" w:hAnsiTheme="minorHAnsi" w:cstheme="minorBidi"/>
+          <w:kern w:val="2"/>
+          <w:lang w:val="sk-SK" w:eastAsia="en-US"/>
+          <w14:ligatures w14:val="standardContextual"/>
+        </w:rPr>
         <w:br/>
-        <w:t>of Grid-Connected Photovoltaic Systems: Elke Lorenz, Johannes Hurka, Detlev Heinemann, and Hans Georg Beyer, str.: 1</w:t>
+        <w:t>of Grid-</w:t>
+      </w:r>
+      <w:proofErr w:type="spellStart"/>
+      <w:r>
+        <w:rPr>
+          <w:rFonts w:asciiTheme="minorHAnsi" w:eastAsiaTheme="minorHAnsi" w:hAnsiTheme="minorHAnsi" w:cstheme="minorBidi"/>
+          <w:kern w:val="2"/>
+          <w:lang w:val="sk-SK" w:eastAsia="en-US"/>
+          <w14:ligatures w14:val="standardContextual"/>
+        </w:rPr>
+        <w:t>Connected</w:t>
+      </w:r>
+      <w:proofErr w:type="spellEnd"/>
+      <w:r>
+        <w:rPr>
+          <w:rFonts w:asciiTheme="minorHAnsi" w:eastAsiaTheme="minorHAnsi" w:hAnsiTheme="minorHAnsi" w:cstheme="minorBidi"/>
+          <w:kern w:val="2"/>
+          <w:lang w:val="sk-SK" w:eastAsia="en-US"/>
+          <w14:ligatures w14:val="standardContextual"/>
+        </w:rPr>
+        <w:t xml:space="preserve"> </w:t>
+      </w:r>
+      <w:proofErr w:type="spellStart"/>
+      <w:r>
+        <w:rPr>
+          <w:rFonts w:asciiTheme="minorHAnsi" w:eastAsiaTheme="minorHAnsi" w:hAnsiTheme="minorHAnsi" w:cstheme="minorBidi"/>
+          <w:kern w:val="2"/>
+          <w:lang w:val="sk-SK" w:eastAsia="en-US"/>
+          <w14:ligatures w14:val="standardContextual"/>
+        </w:rPr>
+        <w:t>Photovoltaic</w:t>
+      </w:r>
+      <w:proofErr w:type="spellEnd"/>
+      <w:r>
+        <w:rPr>
+          <w:rFonts w:asciiTheme="minorHAnsi" w:eastAsiaTheme="minorHAnsi" w:hAnsiTheme="minorHAnsi" w:cstheme="minorBidi"/>
+          <w:kern w:val="2"/>
+          <w:lang w:val="sk-SK" w:eastAsia="en-US"/>
+          <w14:ligatures w14:val="standardContextual"/>
+        </w:rPr>
+        <w:t xml:space="preserve"> Systems: </w:t>
+      </w:r>
+      <w:proofErr w:type="spellStart"/>
+      <w:r>
+        <w:rPr>
+          <w:rFonts w:asciiTheme="minorHAnsi" w:eastAsiaTheme="minorHAnsi" w:hAnsiTheme="minorHAnsi" w:cstheme="minorBidi"/>
+          <w:kern w:val="2"/>
+          <w:lang w:val="sk-SK" w:eastAsia="en-US"/>
+          <w14:ligatures w14:val="standardContextual"/>
+        </w:rPr>
+        <w:t>Elke</w:t>
+      </w:r>
+      <w:proofErr w:type="spellEnd"/>
+      <w:r>
+        <w:rPr>
+          <w:rFonts w:asciiTheme="minorHAnsi" w:eastAsiaTheme="minorHAnsi" w:hAnsiTheme="minorHAnsi" w:cstheme="minorBidi"/>
+          <w:kern w:val="2"/>
+          <w:lang w:val="sk-SK" w:eastAsia="en-US"/>
+          <w14:ligatures w14:val="standardContextual"/>
+        </w:rPr>
+        <w:t xml:space="preserve"> </w:t>
+      </w:r>
+      <w:proofErr w:type="spellStart"/>
+      <w:r>
+        <w:rPr>
+          <w:rFonts w:asciiTheme="minorHAnsi" w:eastAsiaTheme="minorHAnsi" w:hAnsiTheme="minorHAnsi" w:cstheme="minorBidi"/>
+          <w:kern w:val="2"/>
+          <w:lang w:val="sk-SK" w:eastAsia="en-US"/>
+          <w14:ligatures w14:val="standardContextual"/>
+        </w:rPr>
+        <w:t>Lorenz</w:t>
+      </w:r>
+      <w:proofErr w:type="spellEnd"/>
+      <w:r>
+        <w:rPr>
+          <w:rFonts w:asciiTheme="minorHAnsi" w:eastAsiaTheme="minorHAnsi" w:hAnsiTheme="minorHAnsi" w:cstheme="minorBidi"/>
+          <w:kern w:val="2"/>
+          <w:lang w:val="sk-SK" w:eastAsia="en-US"/>
+          <w14:ligatures w14:val="standardContextual"/>
+        </w:rPr>
+        <w:t xml:space="preserve">, </w:t>
+      </w:r>
+      <w:proofErr w:type="spellStart"/>
+      <w:r>
+        <w:rPr>
+          <w:rFonts w:asciiTheme="minorHAnsi" w:eastAsiaTheme="minorHAnsi" w:hAnsiTheme="minorHAnsi" w:cstheme="minorBidi"/>
+          <w:kern w:val="2"/>
+          <w:lang w:val="sk-SK" w:eastAsia="en-US"/>
+          <w14:ligatures w14:val="standardContextual"/>
+        </w:rPr>
+        <w:t>Johannes</w:t>
+      </w:r>
+      <w:proofErr w:type="spellEnd"/>
+      <w:r>
+        <w:rPr>
+          <w:rFonts w:asciiTheme="minorHAnsi" w:eastAsiaTheme="minorHAnsi" w:hAnsiTheme="minorHAnsi" w:cstheme="minorBidi"/>
+          <w:kern w:val="2"/>
+          <w:lang w:val="sk-SK" w:eastAsia="en-US"/>
+          <w14:ligatures w14:val="standardContextual"/>
+        </w:rPr>
+        <w:t xml:space="preserve"> Hurka, </w:t>
+      </w:r>
+      <w:proofErr w:type="spellStart"/>
+      <w:r>
+        <w:rPr>
+          <w:rFonts w:asciiTheme="minorHAnsi" w:eastAsiaTheme="minorHAnsi" w:hAnsiTheme="minorHAnsi" w:cstheme="minorBidi"/>
+          <w:kern w:val="2"/>
+          <w:lang w:val="sk-SK" w:eastAsia="en-US"/>
+          <w14:ligatures w14:val="standardContextual"/>
+        </w:rPr>
+        <w:t>Detlev</w:t>
+      </w:r>
+      <w:proofErr w:type="spellEnd"/>
+      <w:r>
+        <w:rPr>
+          <w:rFonts w:asciiTheme="minorHAnsi" w:eastAsiaTheme="minorHAnsi" w:hAnsiTheme="minorHAnsi" w:cstheme="minorBidi"/>
+          <w:kern w:val="2"/>
+          <w:lang w:val="sk-SK" w:eastAsia="en-US"/>
+          <w14:ligatures w14:val="standardContextual"/>
+        </w:rPr>
+        <w:t xml:space="preserve"> </w:t>
+      </w:r>
+      <w:proofErr w:type="spellStart"/>
+      <w:r>
+        <w:rPr>
+          <w:rFonts w:asciiTheme="minorHAnsi" w:eastAsiaTheme="minorHAnsi" w:hAnsiTheme="minorHAnsi" w:cstheme="minorBidi"/>
+          <w:kern w:val="2"/>
+          <w:lang w:val="sk-SK" w:eastAsia="en-US"/>
+          <w14:ligatures w14:val="standardContextual"/>
+        </w:rPr>
+        <w:t>Heinemann</w:t>
+      </w:r>
+      <w:proofErr w:type="spellEnd"/>
+      <w:r>
+        <w:rPr>
+          <w:rFonts w:asciiTheme="minorHAnsi" w:eastAsiaTheme="minorHAnsi" w:hAnsiTheme="minorHAnsi" w:cstheme="minorBidi"/>
+          <w:kern w:val="2"/>
+          <w:lang w:val="sk-SK" w:eastAsia="en-US"/>
+          <w14:ligatures w14:val="standardContextual"/>
+        </w:rPr>
+        <w:t xml:space="preserve">, and </w:t>
+      </w:r>
+      <w:proofErr w:type="spellStart"/>
+      <w:r>
+        <w:rPr>
+          <w:rFonts w:asciiTheme="minorHAnsi" w:eastAsiaTheme="minorHAnsi" w:hAnsiTheme="minorHAnsi" w:cstheme="minorBidi"/>
+          <w:kern w:val="2"/>
+          <w:lang w:val="sk-SK" w:eastAsia="en-US"/>
+          <w14:ligatures w14:val="standardContextual"/>
+        </w:rPr>
+        <w:t>Hans</w:t>
+      </w:r>
+      <w:proofErr w:type="spellEnd"/>
+      <w:r>
+        <w:rPr>
+          <w:rFonts w:asciiTheme="minorHAnsi" w:eastAsiaTheme="minorHAnsi" w:hAnsiTheme="minorHAnsi" w:cstheme="minorBidi"/>
+          <w:kern w:val="2"/>
+          <w:lang w:val="sk-SK" w:eastAsia="en-US"/>
+          <w14:ligatures w14:val="standardContextual"/>
+        </w:rPr>
+        <w:t xml:space="preserve"> </w:t>
+      </w:r>
+      <w:proofErr w:type="spellStart"/>
+      <w:r>
+        <w:rPr>
+          <w:rFonts w:asciiTheme="minorHAnsi" w:eastAsiaTheme="minorHAnsi" w:hAnsiTheme="minorHAnsi" w:cstheme="minorBidi"/>
+          <w:kern w:val="2"/>
+          <w:lang w:val="sk-SK" w:eastAsia="en-US"/>
+          <w14:ligatures w14:val="standardContextual"/>
+        </w:rPr>
+        <w:t>Georg</w:t>
+      </w:r>
+      <w:proofErr w:type="spellEnd"/>
+      <w:r>
+        <w:rPr>
+          <w:rFonts w:asciiTheme="minorHAnsi" w:eastAsiaTheme="minorHAnsi" w:hAnsiTheme="minorHAnsi" w:cstheme="minorBidi"/>
+          <w:kern w:val="2"/>
+          <w:lang w:val="sk-SK" w:eastAsia="en-US"/>
+          <w14:ligatures w14:val="standardContextual"/>
+        </w:rPr>
+        <w:t xml:space="preserve"> </w:t>
+      </w:r>
+      <w:proofErr w:type="spellStart"/>
+      <w:r>
+        <w:rPr>
+          <w:rFonts w:asciiTheme="minorHAnsi" w:eastAsiaTheme="minorHAnsi" w:hAnsiTheme="minorHAnsi" w:cstheme="minorBidi"/>
+          <w:kern w:val="2"/>
+          <w:lang w:val="sk-SK" w:eastAsia="en-US"/>
+          <w14:ligatures w14:val="standardContextual"/>
+        </w:rPr>
+        <w:t>Beyer</w:t>
+      </w:r>
+      <w:proofErr w:type="spellEnd"/>
+      <w:r>
+        <w:rPr>
+          <w:rFonts w:asciiTheme="minorHAnsi" w:eastAsiaTheme="minorHAnsi" w:hAnsiTheme="minorHAnsi" w:cstheme="minorBidi"/>
+          <w:kern w:val="2"/>
+          <w:lang w:val="sk-SK" w:eastAsia="en-US"/>
+          <w14:ligatures w14:val="standardContextual"/>
+        </w:rPr>
+        <w:t>, str.: 1</w:t>
       </w:r>
       <w:r>
         <w:rPr>
@@ -13938,7 +15345,427 @@
           <w:lang w:val="sk-SK" w:eastAsia="en-US"/>
           <w14:ligatures w14:val="standardContextual"/>
         </w:rPr>
-        <w:t>PDF in Articles Folder) Systematic Review on Impact of Different Irradiance Forecasting Techniques for Solar Energy Prediction, Big Data and Advanced Analytics in Energy Systems and Applications , edited by: Prof. Dr. Constantinos S. Psomopoulos, Dr. Helen C. Leligou, Prof. Dr. Ferdinanda Ponci, Prof. Dr. Josep M. Guerrero and Prof. Dr. Elisa Peñalvo-López, str.: 1</w:t>
+        <w:t xml:space="preserve">PDF in </w:t>
+      </w:r>
+      <w:proofErr w:type="spellStart"/>
+      <w:r>
+        <w:rPr>
+          <w:rFonts w:asciiTheme="minorHAnsi" w:eastAsiaTheme="minorHAnsi" w:hAnsiTheme="minorHAnsi" w:cstheme="minorBidi"/>
+          <w:kern w:val="2"/>
+          <w:lang w:val="sk-SK" w:eastAsia="en-US"/>
+          <w14:ligatures w14:val="standardContextual"/>
+        </w:rPr>
+        <w:t>Articles</w:t>
+      </w:r>
+      <w:proofErr w:type="spellEnd"/>
+      <w:r>
+        <w:rPr>
+          <w:rFonts w:asciiTheme="minorHAnsi" w:eastAsiaTheme="minorHAnsi" w:hAnsiTheme="minorHAnsi" w:cstheme="minorBidi"/>
+          <w:kern w:val="2"/>
+          <w:lang w:val="sk-SK" w:eastAsia="en-US"/>
+          <w14:ligatures w14:val="standardContextual"/>
+        </w:rPr>
+        <w:t xml:space="preserve"> </w:t>
+      </w:r>
+      <w:proofErr w:type="spellStart"/>
+      <w:r>
+        <w:rPr>
+          <w:rFonts w:asciiTheme="minorHAnsi" w:eastAsiaTheme="minorHAnsi" w:hAnsiTheme="minorHAnsi" w:cstheme="minorBidi"/>
+          <w:kern w:val="2"/>
+          <w:lang w:val="sk-SK" w:eastAsia="en-US"/>
+          <w14:ligatures w14:val="standardContextual"/>
+        </w:rPr>
+        <w:t>Folder</w:t>
+      </w:r>
+      <w:proofErr w:type="spellEnd"/>
+      <w:r>
+        <w:rPr>
+          <w:rFonts w:asciiTheme="minorHAnsi" w:eastAsiaTheme="minorHAnsi" w:hAnsiTheme="minorHAnsi" w:cstheme="minorBidi"/>
+          <w:kern w:val="2"/>
+          <w:lang w:val="sk-SK" w:eastAsia="en-US"/>
+          <w14:ligatures w14:val="standardContextual"/>
+        </w:rPr>
+        <w:t xml:space="preserve">) </w:t>
+      </w:r>
+      <w:proofErr w:type="spellStart"/>
+      <w:r>
+        <w:rPr>
+          <w:rFonts w:asciiTheme="minorHAnsi" w:eastAsiaTheme="minorHAnsi" w:hAnsiTheme="minorHAnsi" w:cstheme="minorBidi"/>
+          <w:kern w:val="2"/>
+          <w:lang w:val="sk-SK" w:eastAsia="en-US"/>
+          <w14:ligatures w14:val="standardContextual"/>
+        </w:rPr>
+        <w:t>Systematic</w:t>
+      </w:r>
+      <w:proofErr w:type="spellEnd"/>
+      <w:r>
+        <w:rPr>
+          <w:rFonts w:asciiTheme="minorHAnsi" w:eastAsiaTheme="minorHAnsi" w:hAnsiTheme="minorHAnsi" w:cstheme="minorBidi"/>
+          <w:kern w:val="2"/>
+          <w:lang w:val="sk-SK" w:eastAsia="en-US"/>
+          <w14:ligatures w14:val="standardContextual"/>
+        </w:rPr>
+        <w:t xml:space="preserve"> </w:t>
+      </w:r>
+      <w:proofErr w:type="spellStart"/>
+      <w:r>
+        <w:rPr>
+          <w:rFonts w:asciiTheme="minorHAnsi" w:eastAsiaTheme="minorHAnsi" w:hAnsiTheme="minorHAnsi" w:cstheme="minorBidi"/>
+          <w:kern w:val="2"/>
+          <w:lang w:val="sk-SK" w:eastAsia="en-US"/>
+          <w14:ligatures w14:val="standardContextual"/>
+        </w:rPr>
+        <w:t>Review</w:t>
+      </w:r>
+      <w:proofErr w:type="spellEnd"/>
+      <w:r>
+        <w:rPr>
+          <w:rFonts w:asciiTheme="minorHAnsi" w:eastAsiaTheme="minorHAnsi" w:hAnsiTheme="minorHAnsi" w:cstheme="minorBidi"/>
+          <w:kern w:val="2"/>
+          <w:lang w:val="sk-SK" w:eastAsia="en-US"/>
+          <w14:ligatures w14:val="standardContextual"/>
+        </w:rPr>
+        <w:t xml:space="preserve"> on </w:t>
+      </w:r>
+      <w:proofErr w:type="spellStart"/>
+      <w:r>
+        <w:rPr>
+          <w:rFonts w:asciiTheme="minorHAnsi" w:eastAsiaTheme="minorHAnsi" w:hAnsiTheme="minorHAnsi" w:cstheme="minorBidi"/>
+          <w:kern w:val="2"/>
+          <w:lang w:val="sk-SK" w:eastAsia="en-US"/>
+          <w14:ligatures w14:val="standardContextual"/>
+        </w:rPr>
+        <w:t>Impact</w:t>
+      </w:r>
+      <w:proofErr w:type="spellEnd"/>
+      <w:r>
+        <w:rPr>
+          <w:rFonts w:asciiTheme="minorHAnsi" w:eastAsiaTheme="minorHAnsi" w:hAnsiTheme="minorHAnsi" w:cstheme="minorBidi"/>
+          <w:kern w:val="2"/>
+          <w:lang w:val="sk-SK" w:eastAsia="en-US"/>
+          <w14:ligatures w14:val="standardContextual"/>
+        </w:rPr>
+        <w:t xml:space="preserve"> of Different </w:t>
+      </w:r>
+      <w:proofErr w:type="spellStart"/>
+      <w:r>
+        <w:rPr>
+          <w:rFonts w:asciiTheme="minorHAnsi" w:eastAsiaTheme="minorHAnsi" w:hAnsiTheme="minorHAnsi" w:cstheme="minorBidi"/>
+          <w:kern w:val="2"/>
+          <w:lang w:val="sk-SK" w:eastAsia="en-US"/>
+          <w14:ligatures w14:val="standardContextual"/>
+        </w:rPr>
+        <w:t>Irradiance</w:t>
+      </w:r>
+      <w:proofErr w:type="spellEnd"/>
+      <w:r>
+        <w:rPr>
+          <w:rFonts w:asciiTheme="minorHAnsi" w:eastAsiaTheme="minorHAnsi" w:hAnsiTheme="minorHAnsi" w:cstheme="minorBidi"/>
+          <w:kern w:val="2"/>
+          <w:lang w:val="sk-SK" w:eastAsia="en-US"/>
+          <w14:ligatures w14:val="standardContextual"/>
+        </w:rPr>
+        <w:t xml:space="preserve"> </w:t>
+      </w:r>
+      <w:proofErr w:type="spellStart"/>
+      <w:r>
+        <w:rPr>
+          <w:rFonts w:asciiTheme="minorHAnsi" w:eastAsiaTheme="minorHAnsi" w:hAnsiTheme="minorHAnsi" w:cstheme="minorBidi"/>
+          <w:kern w:val="2"/>
+          <w:lang w:val="sk-SK" w:eastAsia="en-US"/>
+          <w14:ligatures w14:val="standardContextual"/>
+        </w:rPr>
+        <w:t>Forecasting</w:t>
+      </w:r>
+      <w:proofErr w:type="spellEnd"/>
+      <w:r>
+        <w:rPr>
+          <w:rFonts w:asciiTheme="minorHAnsi" w:eastAsiaTheme="minorHAnsi" w:hAnsiTheme="minorHAnsi" w:cstheme="minorBidi"/>
+          <w:kern w:val="2"/>
+          <w:lang w:val="sk-SK" w:eastAsia="en-US"/>
+          <w14:ligatures w14:val="standardContextual"/>
+        </w:rPr>
+        <w:t xml:space="preserve"> </w:t>
+      </w:r>
+      <w:proofErr w:type="spellStart"/>
+      <w:r>
+        <w:rPr>
+          <w:rFonts w:asciiTheme="minorHAnsi" w:eastAsiaTheme="minorHAnsi" w:hAnsiTheme="minorHAnsi" w:cstheme="minorBidi"/>
+          <w:kern w:val="2"/>
+          <w:lang w:val="sk-SK" w:eastAsia="en-US"/>
+          <w14:ligatures w14:val="standardContextual"/>
+        </w:rPr>
+        <w:t>Techniques</w:t>
+      </w:r>
+      <w:proofErr w:type="spellEnd"/>
+      <w:r>
+        <w:rPr>
+          <w:rFonts w:asciiTheme="minorHAnsi" w:eastAsiaTheme="minorHAnsi" w:hAnsiTheme="minorHAnsi" w:cstheme="minorBidi"/>
+          <w:kern w:val="2"/>
+          <w:lang w:val="sk-SK" w:eastAsia="en-US"/>
+          <w14:ligatures w14:val="standardContextual"/>
+        </w:rPr>
+        <w:t xml:space="preserve"> for </w:t>
+      </w:r>
+      <w:proofErr w:type="spellStart"/>
+      <w:r>
+        <w:rPr>
+          <w:rFonts w:asciiTheme="minorHAnsi" w:eastAsiaTheme="minorHAnsi" w:hAnsiTheme="minorHAnsi" w:cstheme="minorBidi"/>
+          <w:kern w:val="2"/>
+          <w:lang w:val="sk-SK" w:eastAsia="en-US"/>
+          <w14:ligatures w14:val="standardContextual"/>
+        </w:rPr>
+        <w:t>Solar</w:t>
+      </w:r>
+      <w:proofErr w:type="spellEnd"/>
+      <w:r>
+        <w:rPr>
+          <w:rFonts w:asciiTheme="minorHAnsi" w:eastAsiaTheme="minorHAnsi" w:hAnsiTheme="minorHAnsi" w:cstheme="minorBidi"/>
+          <w:kern w:val="2"/>
+          <w:lang w:val="sk-SK" w:eastAsia="en-US"/>
+          <w14:ligatures w14:val="standardContextual"/>
+        </w:rPr>
+        <w:t xml:space="preserve"> Energy Prediction, Big Data and </w:t>
+      </w:r>
+      <w:proofErr w:type="spellStart"/>
+      <w:r>
+        <w:rPr>
+          <w:rFonts w:asciiTheme="minorHAnsi" w:eastAsiaTheme="minorHAnsi" w:hAnsiTheme="minorHAnsi" w:cstheme="minorBidi"/>
+          <w:kern w:val="2"/>
+          <w:lang w:val="sk-SK" w:eastAsia="en-US"/>
+          <w14:ligatures w14:val="standardContextual"/>
+        </w:rPr>
+        <w:t>Advanced</w:t>
+      </w:r>
+      <w:proofErr w:type="spellEnd"/>
+      <w:r>
+        <w:rPr>
+          <w:rFonts w:asciiTheme="minorHAnsi" w:eastAsiaTheme="minorHAnsi" w:hAnsiTheme="minorHAnsi" w:cstheme="minorBidi"/>
+          <w:kern w:val="2"/>
+          <w:lang w:val="sk-SK" w:eastAsia="en-US"/>
+          <w14:ligatures w14:val="standardContextual"/>
+        </w:rPr>
+        <w:t xml:space="preserve"> </w:t>
+      </w:r>
+      <w:proofErr w:type="spellStart"/>
+      <w:r>
+        <w:rPr>
+          <w:rFonts w:asciiTheme="minorHAnsi" w:eastAsiaTheme="minorHAnsi" w:hAnsiTheme="minorHAnsi" w:cstheme="minorBidi"/>
+          <w:kern w:val="2"/>
+          <w:lang w:val="sk-SK" w:eastAsia="en-US"/>
+          <w14:ligatures w14:val="standardContextual"/>
+        </w:rPr>
+        <w:t>Analytics</w:t>
+      </w:r>
+      <w:proofErr w:type="spellEnd"/>
+      <w:r>
+        <w:rPr>
+          <w:rFonts w:asciiTheme="minorHAnsi" w:eastAsiaTheme="minorHAnsi" w:hAnsiTheme="minorHAnsi" w:cstheme="minorBidi"/>
+          <w:kern w:val="2"/>
+          <w:lang w:val="sk-SK" w:eastAsia="en-US"/>
+          <w14:ligatures w14:val="standardContextual"/>
+        </w:rPr>
+        <w:t xml:space="preserve"> in Energy Systems and Applications , </w:t>
+      </w:r>
+      <w:proofErr w:type="spellStart"/>
+      <w:r>
+        <w:rPr>
+          <w:rFonts w:asciiTheme="minorHAnsi" w:eastAsiaTheme="minorHAnsi" w:hAnsiTheme="minorHAnsi" w:cstheme="minorBidi"/>
+          <w:kern w:val="2"/>
+          <w:lang w:val="sk-SK" w:eastAsia="en-US"/>
+          <w14:ligatures w14:val="standardContextual"/>
+        </w:rPr>
+        <w:t>edited</w:t>
+      </w:r>
+      <w:proofErr w:type="spellEnd"/>
+      <w:r>
+        <w:rPr>
+          <w:rFonts w:asciiTheme="minorHAnsi" w:eastAsiaTheme="minorHAnsi" w:hAnsiTheme="minorHAnsi" w:cstheme="minorBidi"/>
+          <w:kern w:val="2"/>
+          <w:lang w:val="sk-SK" w:eastAsia="en-US"/>
+          <w14:ligatures w14:val="standardContextual"/>
+        </w:rPr>
+        <w:t xml:space="preserve"> by: Prof. Dr. </w:t>
+      </w:r>
+      <w:proofErr w:type="spellStart"/>
+      <w:r>
+        <w:rPr>
+          <w:rFonts w:asciiTheme="minorHAnsi" w:eastAsiaTheme="minorHAnsi" w:hAnsiTheme="minorHAnsi" w:cstheme="minorBidi"/>
+          <w:kern w:val="2"/>
+          <w:lang w:val="sk-SK" w:eastAsia="en-US"/>
+          <w14:ligatures w14:val="standardContextual"/>
+        </w:rPr>
+        <w:t>Constantinos</w:t>
+      </w:r>
+      <w:proofErr w:type="spellEnd"/>
+      <w:r>
+        <w:rPr>
+          <w:rFonts w:asciiTheme="minorHAnsi" w:eastAsiaTheme="minorHAnsi" w:hAnsiTheme="minorHAnsi" w:cstheme="minorBidi"/>
+          <w:kern w:val="2"/>
+          <w:lang w:val="sk-SK" w:eastAsia="en-US"/>
+          <w14:ligatures w14:val="standardContextual"/>
+        </w:rPr>
+        <w:t xml:space="preserve"> S. </w:t>
+      </w:r>
+      <w:proofErr w:type="spellStart"/>
+      <w:r>
+        <w:rPr>
+          <w:rFonts w:asciiTheme="minorHAnsi" w:eastAsiaTheme="minorHAnsi" w:hAnsiTheme="minorHAnsi" w:cstheme="minorBidi"/>
+          <w:kern w:val="2"/>
+          <w:lang w:val="sk-SK" w:eastAsia="en-US"/>
+          <w14:ligatures w14:val="standardContextual"/>
+        </w:rPr>
+        <w:t>Psomopoulos</w:t>
+      </w:r>
+      <w:proofErr w:type="spellEnd"/>
+      <w:r>
+        <w:rPr>
+          <w:rFonts w:asciiTheme="minorHAnsi" w:eastAsiaTheme="minorHAnsi" w:hAnsiTheme="minorHAnsi" w:cstheme="minorBidi"/>
+          <w:kern w:val="2"/>
+          <w:lang w:val="sk-SK" w:eastAsia="en-US"/>
+          <w14:ligatures w14:val="standardContextual"/>
+        </w:rPr>
+        <w:t xml:space="preserve">, Dr. </w:t>
+      </w:r>
+      <w:proofErr w:type="spellStart"/>
+      <w:r>
+        <w:rPr>
+          <w:rFonts w:asciiTheme="minorHAnsi" w:eastAsiaTheme="minorHAnsi" w:hAnsiTheme="minorHAnsi" w:cstheme="minorBidi"/>
+          <w:kern w:val="2"/>
+          <w:lang w:val="sk-SK" w:eastAsia="en-US"/>
+          <w14:ligatures w14:val="standardContextual"/>
+        </w:rPr>
+        <w:t>Helen</w:t>
+      </w:r>
+      <w:proofErr w:type="spellEnd"/>
+      <w:r>
+        <w:rPr>
+          <w:rFonts w:asciiTheme="minorHAnsi" w:eastAsiaTheme="minorHAnsi" w:hAnsiTheme="minorHAnsi" w:cstheme="minorBidi"/>
+          <w:kern w:val="2"/>
+          <w:lang w:val="sk-SK" w:eastAsia="en-US"/>
+          <w14:ligatures w14:val="standardContextual"/>
+        </w:rPr>
+        <w:t xml:space="preserve"> C. </w:t>
+      </w:r>
+      <w:proofErr w:type="spellStart"/>
+      <w:r>
+        <w:rPr>
+          <w:rFonts w:asciiTheme="minorHAnsi" w:eastAsiaTheme="minorHAnsi" w:hAnsiTheme="minorHAnsi" w:cstheme="minorBidi"/>
+          <w:kern w:val="2"/>
+          <w:lang w:val="sk-SK" w:eastAsia="en-US"/>
+          <w14:ligatures w14:val="standardContextual"/>
+        </w:rPr>
+        <w:t>Leligou</w:t>
+      </w:r>
+      <w:proofErr w:type="spellEnd"/>
+      <w:r>
+        <w:rPr>
+          <w:rFonts w:asciiTheme="minorHAnsi" w:eastAsiaTheme="minorHAnsi" w:hAnsiTheme="minorHAnsi" w:cstheme="minorBidi"/>
+          <w:kern w:val="2"/>
+          <w:lang w:val="sk-SK" w:eastAsia="en-US"/>
+          <w14:ligatures w14:val="standardContextual"/>
+        </w:rPr>
+        <w:t xml:space="preserve">, Prof. Dr. Ferdinanda </w:t>
+      </w:r>
+      <w:proofErr w:type="spellStart"/>
+      <w:r>
+        <w:rPr>
+          <w:rFonts w:asciiTheme="minorHAnsi" w:eastAsiaTheme="minorHAnsi" w:hAnsiTheme="minorHAnsi" w:cstheme="minorBidi"/>
+          <w:kern w:val="2"/>
+          <w:lang w:val="sk-SK" w:eastAsia="en-US"/>
+          <w14:ligatures w14:val="standardContextual"/>
+        </w:rPr>
+        <w:t>Ponci</w:t>
+      </w:r>
+      <w:proofErr w:type="spellEnd"/>
+      <w:r>
+        <w:rPr>
+          <w:rFonts w:asciiTheme="minorHAnsi" w:eastAsiaTheme="minorHAnsi" w:hAnsiTheme="minorHAnsi" w:cstheme="minorBidi"/>
+          <w:kern w:val="2"/>
+          <w:lang w:val="sk-SK" w:eastAsia="en-US"/>
+          <w14:ligatures w14:val="standardContextual"/>
+        </w:rPr>
+        <w:t xml:space="preserve">, Prof. Dr. </w:t>
+      </w:r>
+      <w:proofErr w:type="spellStart"/>
+      <w:r>
+        <w:rPr>
+          <w:rFonts w:asciiTheme="minorHAnsi" w:eastAsiaTheme="minorHAnsi" w:hAnsiTheme="minorHAnsi" w:cstheme="minorBidi"/>
+          <w:kern w:val="2"/>
+          <w:lang w:val="sk-SK" w:eastAsia="en-US"/>
+          <w14:ligatures w14:val="standardContextual"/>
+        </w:rPr>
+        <w:t>Josep</w:t>
+      </w:r>
+      <w:proofErr w:type="spellEnd"/>
+      <w:r>
+        <w:rPr>
+          <w:rFonts w:asciiTheme="minorHAnsi" w:eastAsiaTheme="minorHAnsi" w:hAnsiTheme="minorHAnsi" w:cstheme="minorBidi"/>
+          <w:kern w:val="2"/>
+          <w:lang w:val="sk-SK" w:eastAsia="en-US"/>
+          <w14:ligatures w14:val="standardContextual"/>
+        </w:rPr>
+        <w:t xml:space="preserve"> M. </w:t>
+      </w:r>
+      <w:proofErr w:type="spellStart"/>
+      <w:r>
+        <w:rPr>
+          <w:rFonts w:asciiTheme="minorHAnsi" w:eastAsiaTheme="minorHAnsi" w:hAnsiTheme="minorHAnsi" w:cstheme="minorBidi"/>
+          <w:kern w:val="2"/>
+          <w:lang w:val="sk-SK" w:eastAsia="en-US"/>
+          <w14:ligatures w14:val="standardContextual"/>
+        </w:rPr>
+        <w:t>Guerrero</w:t>
+      </w:r>
+      <w:proofErr w:type="spellEnd"/>
+      <w:r>
+        <w:rPr>
+          <w:rFonts w:asciiTheme="minorHAnsi" w:eastAsiaTheme="minorHAnsi" w:hAnsiTheme="minorHAnsi" w:cstheme="minorBidi"/>
+          <w:kern w:val="2"/>
+          <w:lang w:val="sk-SK" w:eastAsia="en-US"/>
+          <w14:ligatures w14:val="standardContextual"/>
+        </w:rPr>
+        <w:t xml:space="preserve"> and Prof. Dr. </w:t>
+      </w:r>
+      <w:proofErr w:type="spellStart"/>
+      <w:r>
+        <w:rPr>
+          <w:rFonts w:asciiTheme="minorHAnsi" w:eastAsiaTheme="minorHAnsi" w:hAnsiTheme="minorHAnsi" w:cstheme="minorBidi"/>
+          <w:kern w:val="2"/>
+          <w:lang w:val="sk-SK" w:eastAsia="en-US"/>
+          <w14:ligatures w14:val="standardContextual"/>
+        </w:rPr>
+        <w:t>Elisa</w:t>
+      </w:r>
+      <w:proofErr w:type="spellEnd"/>
+      <w:r>
+        <w:rPr>
+          <w:rFonts w:asciiTheme="minorHAnsi" w:eastAsiaTheme="minorHAnsi" w:hAnsiTheme="minorHAnsi" w:cstheme="minorBidi"/>
+          <w:kern w:val="2"/>
+          <w:lang w:val="sk-SK" w:eastAsia="en-US"/>
+          <w14:ligatures w14:val="standardContextual"/>
+        </w:rPr>
+        <w:t xml:space="preserve"> </w:t>
+      </w:r>
+      <w:proofErr w:type="spellStart"/>
+      <w:r>
+        <w:rPr>
+          <w:rFonts w:asciiTheme="minorHAnsi" w:eastAsiaTheme="minorHAnsi" w:hAnsiTheme="minorHAnsi" w:cstheme="minorBidi"/>
+          <w:kern w:val="2"/>
+          <w:lang w:val="sk-SK" w:eastAsia="en-US"/>
+          <w14:ligatures w14:val="standardContextual"/>
+        </w:rPr>
+        <w:t>Peñalvo-López</w:t>
+      </w:r>
+      <w:proofErr w:type="spellEnd"/>
+      <w:r>
+        <w:rPr>
+          <w:rFonts w:asciiTheme="minorHAnsi" w:eastAsiaTheme="minorHAnsi" w:hAnsiTheme="minorHAnsi" w:cstheme="minorBidi"/>
+          <w:kern w:val="2"/>
+          <w:lang w:val="sk-SK" w:eastAsia="en-US"/>
+          <w14:ligatures w14:val="standardContextual"/>
+        </w:rPr>
+        <w:t>, str.: 1</w:t>
       </w:r>
       <w:r>
         <w:rPr>
@@ -14651,6 +16478,33 @@
     </w:p>
     <w:p>
       <w:pPr>
+        <w:pStyle w:val="NormalWeb"/>
+        <w:shd w:val="clear" w:color="auto" w:fill="FFFFFF"/>
+        <w:spacing w:line="312" w:lineRule="auto"/>
+        <w:ind w:left="567" w:hanging="567"/>
+      </w:pPr>
+      <w:r>
+        <w:lastRenderedPageBreak/>
+        <w:t>[</w:t>
+      </w:r>
+      <w:r>
+        <w:rPr>
+          <w:lang w:val="sk-SK"/>
+        </w:rPr>
+        <w:t>20</w:t>
+      </w:r>
+      <w:r>
+        <w:t>]</w:t>
+      </w:r>
+      <w:r>
+        <w:tab/>
+      </w:r>
+      <w:r>
+        <w:t>https://optuna.org/</w:t>
+      </w:r>
+    </w:p>
+    <w:p>
+      <w:pPr>
         <w:pStyle w:val="TableofAuthorities"/>
         <w:spacing w:line="312" w:lineRule="auto"/>
       </w:pPr>
@@ -15073,12 +16927,12 @@
         <w:pStyle w:val="Nadpis1bezslovania"/>
         <w:spacing w:after="480"/>
       </w:pPr>
-      <w:bookmarkStart w:id="82" w:name="_Toc227512614"/>
+      <w:bookmarkStart w:id="92" w:name="_Toc227514447"/>
       <w:r>
         <w:lastRenderedPageBreak/>
         <w:t>Prílohy</w:t>
       </w:r>
-      <w:bookmarkEnd w:id="82"/>
+      <w:bookmarkEnd w:id="92"/>
     </w:p>
     <w:p>
       <w:pPr>
@@ -17420,6 +19274,119 @@
     </w:lvl>
   </w:abstractNum>
   <w:abstractNum w:abstractNumId="27" w15:restartNumberingAfterBreak="0">
+    <w:nsid w:val="47F24415"/>
+    <w:multiLevelType w:val="hybridMultilevel"/>
+    <w:tmpl w:val="59B87A6E"/>
+    <w:lvl w:ilvl="0" w:tplc="08090001">
+      <w:start w:val="1"/>
+      <w:numFmt w:val="bullet"/>
+      <w:lvlText w:val=""/>
+      <w:lvlJc w:val="left"/>
+      <w:pPr>
+        <w:ind w:left="1145" w:hanging="360"/>
+      </w:pPr>
+      <w:rPr>
+        <w:rFonts w:ascii="Symbol" w:hAnsi="Symbol" w:hint="default"/>
+      </w:rPr>
+    </w:lvl>
+    <w:lvl w:ilvl="1" w:tplc="08090003" w:tentative="1">
+      <w:start w:val="1"/>
+      <w:numFmt w:val="bullet"/>
+      <w:lvlText w:val="o"/>
+      <w:lvlJc w:val="left"/>
+      <w:pPr>
+        <w:ind w:left="1865" w:hanging="360"/>
+      </w:pPr>
+      <w:rPr>
+        <w:rFonts w:ascii="Courier New" w:hAnsi="Courier New" w:cs="Courier New" w:hint="default"/>
+      </w:rPr>
+    </w:lvl>
+    <w:lvl w:ilvl="2" w:tplc="08090005" w:tentative="1">
+      <w:start w:val="1"/>
+      <w:numFmt w:val="bullet"/>
+      <w:lvlText w:val=""/>
+      <w:lvlJc w:val="left"/>
+      <w:pPr>
+        <w:ind w:left="2585" w:hanging="360"/>
+      </w:pPr>
+      <w:rPr>
+        <w:rFonts w:ascii="Wingdings" w:hAnsi="Wingdings" w:hint="default"/>
+      </w:rPr>
+    </w:lvl>
+    <w:lvl w:ilvl="3" w:tplc="08090001" w:tentative="1">
+      <w:start w:val="1"/>
+      <w:numFmt w:val="bullet"/>
+      <w:lvlText w:val=""/>
+      <w:lvlJc w:val="left"/>
+      <w:pPr>
+        <w:ind w:left="3305" w:hanging="360"/>
+      </w:pPr>
+      <w:rPr>
+        <w:rFonts w:ascii="Symbol" w:hAnsi="Symbol" w:hint="default"/>
+      </w:rPr>
+    </w:lvl>
+    <w:lvl w:ilvl="4" w:tplc="08090003" w:tentative="1">
+      <w:start w:val="1"/>
+      <w:numFmt w:val="bullet"/>
+      <w:lvlText w:val="o"/>
+      <w:lvlJc w:val="left"/>
+      <w:pPr>
+        <w:ind w:left="4025" w:hanging="360"/>
+      </w:pPr>
+      <w:rPr>
+        <w:rFonts w:ascii="Courier New" w:hAnsi="Courier New" w:cs="Courier New" w:hint="default"/>
+      </w:rPr>
+    </w:lvl>
+    <w:lvl w:ilvl="5" w:tplc="08090005" w:tentative="1">
+      <w:start w:val="1"/>
+      <w:numFmt w:val="bullet"/>
+      <w:lvlText w:val=""/>
+      <w:lvlJc w:val="left"/>
+      <w:pPr>
+        <w:ind w:left="4745" w:hanging="360"/>
+      </w:pPr>
+      <w:rPr>
+        <w:rFonts w:ascii="Wingdings" w:hAnsi="Wingdings" w:hint="default"/>
+      </w:rPr>
+    </w:lvl>
+    <w:lvl w:ilvl="6" w:tplc="08090001" w:tentative="1">
+      <w:start w:val="1"/>
+      <w:numFmt w:val="bullet"/>
+      <w:lvlText w:val=""/>
+      <w:lvlJc w:val="left"/>
+      <w:pPr>
+        <w:ind w:left="5465" w:hanging="360"/>
+      </w:pPr>
+      <w:rPr>
+        <w:rFonts w:ascii="Symbol" w:hAnsi="Symbol" w:hint="default"/>
+      </w:rPr>
+    </w:lvl>
+    <w:lvl w:ilvl="7" w:tplc="08090003" w:tentative="1">
+      <w:start w:val="1"/>
+      <w:numFmt w:val="bullet"/>
+      <w:lvlText w:val="o"/>
+      <w:lvlJc w:val="left"/>
+      <w:pPr>
+        <w:ind w:left="6185" w:hanging="360"/>
+      </w:pPr>
+      <w:rPr>
+        <w:rFonts w:ascii="Courier New" w:hAnsi="Courier New" w:cs="Courier New" w:hint="default"/>
+      </w:rPr>
+    </w:lvl>
+    <w:lvl w:ilvl="8" w:tplc="08090005" w:tentative="1">
+      <w:start w:val="1"/>
+      <w:numFmt w:val="bullet"/>
+      <w:lvlText w:val=""/>
+      <w:lvlJc w:val="left"/>
+      <w:pPr>
+        <w:ind w:left="6905" w:hanging="360"/>
+      </w:pPr>
+      <w:rPr>
+        <w:rFonts w:ascii="Wingdings" w:hAnsi="Wingdings" w:hint="default"/>
+      </w:rPr>
+    </w:lvl>
+  </w:abstractNum>
+  <w:abstractNum w:abstractNumId="28" w15:restartNumberingAfterBreak="0">
     <w:nsid w:val="4AF27299"/>
     <w:multiLevelType w:val="hybridMultilevel"/>
     <w:tmpl w:val="CE087EBA"/>
@@ -17532,7 +19499,7 @@
       </w:rPr>
     </w:lvl>
   </w:abstractNum>
-  <w:abstractNum w:abstractNumId="28" w15:restartNumberingAfterBreak="0">
+  <w:abstractNum w:abstractNumId="29" w15:restartNumberingAfterBreak="0">
     <w:nsid w:val="4B356983"/>
     <w:multiLevelType w:val="hybridMultilevel"/>
     <w:tmpl w:val="3F725A78"/>
@@ -17645,7 +19612,7 @@
       </w:rPr>
     </w:lvl>
   </w:abstractNum>
-  <w:abstractNum w:abstractNumId="29" w15:restartNumberingAfterBreak="0">
+  <w:abstractNum w:abstractNumId="30" w15:restartNumberingAfterBreak="0">
     <w:nsid w:val="560C4C81"/>
     <w:multiLevelType w:val="multilevel"/>
     <w:tmpl w:val="B70E42AA"/>
@@ -17763,7 +19730,7 @@
       </w:rPr>
     </w:lvl>
   </w:abstractNum>
-  <w:abstractNum w:abstractNumId="30" w15:restartNumberingAfterBreak="0">
+  <w:abstractNum w:abstractNumId="31" w15:restartNumberingAfterBreak="0">
     <w:nsid w:val="611F40A2"/>
     <w:multiLevelType w:val="multilevel"/>
     <w:tmpl w:val="041B001D"/>
@@ -17849,7 +19816,7 @@
       </w:pPr>
     </w:lvl>
   </w:abstractNum>
-  <w:abstractNum w:abstractNumId="31" w15:restartNumberingAfterBreak="0">
+  <w:abstractNum w:abstractNumId="32" w15:restartNumberingAfterBreak="0">
     <w:nsid w:val="62593EFE"/>
     <w:multiLevelType w:val="hybridMultilevel"/>
     <w:tmpl w:val="B7AE2BDE"/>
@@ -17935,7 +19902,7 @@
       </w:pPr>
     </w:lvl>
   </w:abstractNum>
-  <w:abstractNum w:abstractNumId="32" w15:restartNumberingAfterBreak="0">
+  <w:abstractNum w:abstractNumId="33" w15:restartNumberingAfterBreak="0">
     <w:nsid w:val="633D6C51"/>
     <w:multiLevelType w:val="hybridMultilevel"/>
     <w:tmpl w:val="807472A4"/>
@@ -18021,7 +19988,7 @@
       </w:pPr>
     </w:lvl>
   </w:abstractNum>
-  <w:abstractNum w:abstractNumId="33" w15:restartNumberingAfterBreak="0">
+  <w:abstractNum w:abstractNumId="34" w15:restartNumberingAfterBreak="0">
     <w:nsid w:val="6416608A"/>
     <w:multiLevelType w:val="hybridMultilevel"/>
     <w:tmpl w:val="BFC45DC8"/>
@@ -18134,7 +20101,120 @@
       </w:rPr>
     </w:lvl>
   </w:abstractNum>
-  <w:abstractNum w:abstractNumId="34" w15:restartNumberingAfterBreak="0">
+  <w:abstractNum w:abstractNumId="35" w15:restartNumberingAfterBreak="0">
+    <w:nsid w:val="648874EA"/>
+    <w:multiLevelType w:val="hybridMultilevel"/>
+    <w:tmpl w:val="03A8A320"/>
+    <w:lvl w:ilvl="0" w:tplc="08090001">
+      <w:start w:val="1"/>
+      <w:numFmt w:val="bullet"/>
+      <w:lvlText w:val=""/>
+      <w:lvlJc w:val="left"/>
+      <w:pPr>
+        <w:ind w:left="720" w:hanging="360"/>
+      </w:pPr>
+      <w:rPr>
+        <w:rFonts w:ascii="Symbol" w:hAnsi="Symbol" w:hint="default"/>
+      </w:rPr>
+    </w:lvl>
+    <w:lvl w:ilvl="1" w:tplc="08090003" w:tentative="1">
+      <w:start w:val="1"/>
+      <w:numFmt w:val="bullet"/>
+      <w:lvlText w:val="o"/>
+      <w:lvlJc w:val="left"/>
+      <w:pPr>
+        <w:ind w:left="1440" w:hanging="360"/>
+      </w:pPr>
+      <w:rPr>
+        <w:rFonts w:ascii="Courier New" w:hAnsi="Courier New" w:cs="Courier New" w:hint="default"/>
+      </w:rPr>
+    </w:lvl>
+    <w:lvl w:ilvl="2" w:tplc="08090005" w:tentative="1">
+      <w:start w:val="1"/>
+      <w:numFmt w:val="bullet"/>
+      <w:lvlText w:val=""/>
+      <w:lvlJc w:val="left"/>
+      <w:pPr>
+        <w:ind w:left="2160" w:hanging="360"/>
+      </w:pPr>
+      <w:rPr>
+        <w:rFonts w:ascii="Wingdings" w:hAnsi="Wingdings" w:hint="default"/>
+      </w:rPr>
+    </w:lvl>
+    <w:lvl w:ilvl="3" w:tplc="08090001" w:tentative="1">
+      <w:start w:val="1"/>
+      <w:numFmt w:val="bullet"/>
+      <w:lvlText w:val=""/>
+      <w:lvlJc w:val="left"/>
+      <w:pPr>
+        <w:ind w:left="2880" w:hanging="360"/>
+      </w:pPr>
+      <w:rPr>
+        <w:rFonts w:ascii="Symbol" w:hAnsi="Symbol" w:hint="default"/>
+      </w:rPr>
+    </w:lvl>
+    <w:lvl w:ilvl="4" w:tplc="08090003" w:tentative="1">
+      <w:start w:val="1"/>
+      <w:numFmt w:val="bullet"/>
+      <w:lvlText w:val="o"/>
+      <w:lvlJc w:val="left"/>
+      <w:pPr>
+        <w:ind w:left="3600" w:hanging="360"/>
+      </w:pPr>
+      <w:rPr>
+        <w:rFonts w:ascii="Courier New" w:hAnsi="Courier New" w:cs="Courier New" w:hint="default"/>
+      </w:rPr>
+    </w:lvl>
+    <w:lvl w:ilvl="5" w:tplc="08090005" w:tentative="1">
+      <w:start w:val="1"/>
+      <w:numFmt w:val="bullet"/>
+      <w:lvlText w:val=""/>
+      <w:lvlJc w:val="left"/>
+      <w:pPr>
+        <w:ind w:left="4320" w:hanging="360"/>
+      </w:pPr>
+      <w:rPr>
+        <w:rFonts w:ascii="Wingdings" w:hAnsi="Wingdings" w:hint="default"/>
+      </w:rPr>
+    </w:lvl>
+    <w:lvl w:ilvl="6" w:tplc="08090001" w:tentative="1">
+      <w:start w:val="1"/>
+      <w:numFmt w:val="bullet"/>
+      <w:lvlText w:val=""/>
+      <w:lvlJc w:val="left"/>
+      <w:pPr>
+        <w:ind w:left="5040" w:hanging="360"/>
+      </w:pPr>
+      <w:rPr>
+        <w:rFonts w:ascii="Symbol" w:hAnsi="Symbol" w:hint="default"/>
+      </w:rPr>
+    </w:lvl>
+    <w:lvl w:ilvl="7" w:tplc="08090003" w:tentative="1">
+      <w:start w:val="1"/>
+      <w:numFmt w:val="bullet"/>
+      <w:lvlText w:val="o"/>
+      <w:lvlJc w:val="left"/>
+      <w:pPr>
+        <w:ind w:left="5760" w:hanging="360"/>
+      </w:pPr>
+      <w:rPr>
+        <w:rFonts w:ascii="Courier New" w:hAnsi="Courier New" w:cs="Courier New" w:hint="default"/>
+      </w:rPr>
+    </w:lvl>
+    <w:lvl w:ilvl="8" w:tplc="08090005" w:tentative="1">
+      <w:start w:val="1"/>
+      <w:numFmt w:val="bullet"/>
+      <w:lvlText w:val=""/>
+      <w:lvlJc w:val="left"/>
+      <w:pPr>
+        <w:ind w:left="6480" w:hanging="360"/>
+      </w:pPr>
+      <w:rPr>
+        <w:rFonts w:ascii="Wingdings" w:hAnsi="Wingdings" w:hint="default"/>
+      </w:rPr>
+    </w:lvl>
+  </w:abstractNum>
+  <w:abstractNum w:abstractNumId="36" w15:restartNumberingAfterBreak="0">
     <w:nsid w:val="680D043E"/>
     <w:multiLevelType w:val="multilevel"/>
     <w:tmpl w:val="041B001D"/>
@@ -18220,7 +20300,7 @@
       </w:pPr>
     </w:lvl>
   </w:abstractNum>
-  <w:abstractNum w:abstractNumId="35" w15:restartNumberingAfterBreak="0">
+  <w:abstractNum w:abstractNumId="37" w15:restartNumberingAfterBreak="0">
     <w:nsid w:val="68584894"/>
     <w:multiLevelType w:val="hybridMultilevel"/>
     <w:tmpl w:val="2FCE7350"/>
@@ -18432,7 +20512,7 @@
       </w:rPr>
     </w:lvl>
   </w:abstractNum>
-  <w:abstractNum w:abstractNumId="36" w15:restartNumberingAfterBreak="0">
+  <w:abstractNum w:abstractNumId="38" w15:restartNumberingAfterBreak="0">
     <w:nsid w:val="72784605"/>
     <w:multiLevelType w:val="hybridMultilevel"/>
     <w:tmpl w:val="E0885FF6"/>
@@ -18600,10 +20680,10 @@
     <w:abstractNumId w:val="4"/>
   </w:num>
   <w:num w:numId="19">
-    <w:abstractNumId w:val="30"/>
+    <w:abstractNumId w:val="31"/>
   </w:num>
   <w:num w:numId="20">
-    <w:abstractNumId w:val="31"/>
+    <w:abstractNumId w:val="32"/>
   </w:num>
   <w:num w:numId="21">
     <w:abstractNumId w:val="24"/>
@@ -18612,10 +20692,10 @@
     <w:abstractNumId w:val="19"/>
   </w:num>
   <w:num w:numId="23">
-    <w:abstractNumId w:val="36"/>
+    <w:abstractNumId w:val="38"/>
   </w:num>
   <w:num w:numId="24">
-    <w:abstractNumId w:val="33"/>
+    <w:abstractNumId w:val="34"/>
   </w:num>
   <w:num w:numId="25">
     <w:abstractNumId w:val="15"/>
@@ -18624,10 +20704,10 @@
     <w:abstractNumId w:val="12"/>
   </w:num>
   <w:num w:numId="27">
-    <w:abstractNumId w:val="35"/>
+    <w:abstractNumId w:val="37"/>
   </w:num>
   <w:num w:numId="28">
-    <w:abstractNumId w:val="27"/>
+    <w:abstractNumId w:val="28"/>
   </w:num>
   <w:num w:numId="29">
     <w:abstractNumId w:val="18"/>
@@ -18636,10 +20716,10 @@
     <w:abstractNumId w:val="25"/>
   </w:num>
   <w:num w:numId="31">
-    <w:abstractNumId w:val="29"/>
+    <w:abstractNumId w:val="30"/>
   </w:num>
   <w:num w:numId="32">
-    <w:abstractNumId w:val="34"/>
+    <w:abstractNumId w:val="36"/>
   </w:num>
   <w:num w:numId="33">
     <w:abstractNumId w:val="10"/>
@@ -18672,7 +20752,7 @@
     </w:lvlOverride>
   </w:num>
   <w:num w:numId="34">
-    <w:abstractNumId w:val="32"/>
+    <w:abstractNumId w:val="33"/>
   </w:num>
   <w:num w:numId="35">
     <w:abstractNumId w:val="20"/>
@@ -18708,13 +20788,19 @@
     </w:lvlOverride>
   </w:num>
   <w:num w:numId="37">
-    <w:abstractNumId w:val="28"/>
+    <w:abstractNumId w:val="29"/>
   </w:num>
   <w:num w:numId="38">
     <w:abstractNumId w:val="13"/>
   </w:num>
   <w:num w:numId="39">
     <w:abstractNumId w:val="16"/>
+  </w:num>
+  <w:num w:numId="40">
+    <w:abstractNumId w:val="27"/>
+  </w:num>
+  <w:num w:numId="41">
+    <w:abstractNumId w:val="35"/>
   </w:num>
 </w:numbering>
 </file>
@@ -19119,7 +21205,7 @@
   <w:style w:type="paragraph" w:default="1" w:styleId="Normal">
     <w:name w:val="Normal"/>
     <w:qFormat/>
-    <w:rsid w:val="00595BC4"/>
+    <w:rsid w:val="00A64AF3"/>
     <w:pPr>
       <w:spacing w:line="240" w:lineRule="auto"/>
     </w:pPr>

</xml_diff>

<commit_message>
MasterThesis: Thesis: Theory part + Current solutions analysis completed (8 chapters)
 - Added Chapter 8 - analysis of current solutions
 - Formating is on point
 - Image list and Chapters list up to date
</commit_message>
<xml_diff>
--- a/sumsala_diplomova_praca.docx
+++ b/sumsala_diplomova_praca.docx
@@ -1003,7 +1003,7 @@
         </w:rPr>
         <w:fldChar w:fldCharType="separate"/>
       </w:r>
-      <w:hyperlink w:anchor="_Toc227514379" w:history="1">
+      <w:hyperlink w:anchor="_Toc227520103" w:history="1">
         <w:r>
           <w:rPr>
             <w:rStyle w:val="Hyperlink"/>
@@ -1030,7 +1030,7 @@
             <w:noProof/>
             <w:webHidden/>
           </w:rPr>
-          <w:instrText xml:space="preserve"> PAGEREF _Toc227514379 \h </w:instrText>
+          <w:instrText xml:space="preserve"> PAGEREF _Toc227520103 \h </w:instrText>
         </w:r>
         <w:r>
           <w:rPr>
@@ -1071,7 +1071,7 @@
           <w:szCs w:val="24"/>
         </w:rPr>
       </w:pPr>
-      <w:hyperlink w:anchor="_Toc227514380" w:history="1">
+      <w:hyperlink w:anchor="_Toc227520104" w:history="1">
         <w:r>
           <w:rPr>
             <w:rStyle w:val="Hyperlink"/>
@@ -1098,7 +1098,7 @@
             <w:noProof/>
             <w:webHidden/>
           </w:rPr>
-          <w:instrText xml:space="preserve"> PAGEREF _Toc227514380 \h </w:instrText>
+          <w:instrText xml:space="preserve"> PAGEREF _Toc227520104 \h </w:instrText>
         </w:r>
         <w:r>
           <w:rPr>
@@ -1139,7 +1139,7 @@
           <w:szCs w:val="24"/>
         </w:rPr>
       </w:pPr>
-      <w:hyperlink w:anchor="_Toc227514381" w:history="1">
+      <w:hyperlink w:anchor="_Toc227520105" w:history="1">
         <w:r>
           <w:rPr>
             <w:rStyle w:val="Hyperlink"/>
@@ -1166,7 +1166,7 @@
             <w:noProof/>
             <w:webHidden/>
           </w:rPr>
-          <w:instrText xml:space="preserve"> PAGEREF _Toc227514381 \h </w:instrText>
+          <w:instrText xml:space="preserve"> PAGEREF _Toc227520105 \h </w:instrText>
         </w:r>
         <w:r>
           <w:rPr>
@@ -1210,7 +1210,7 @@
           <w:szCs w:val="24"/>
         </w:rPr>
       </w:pPr>
-      <w:hyperlink w:anchor="_Toc227514382" w:history="1">
+      <w:hyperlink w:anchor="_Toc227520106" w:history="1">
         <w:r>
           <w:rPr>
             <w:rStyle w:val="Hyperlink"/>
@@ -1237,7 +1237,7 @@
             <w:noProof/>
             <w:webHidden/>
           </w:rPr>
-          <w:instrText xml:space="preserve"> PAGEREF _Toc227514382 \h </w:instrText>
+          <w:instrText xml:space="preserve"> PAGEREF _Toc227520106 \h </w:instrText>
         </w:r>
         <w:r>
           <w:rPr>
@@ -1281,7 +1281,7 @@
           <w:szCs w:val="24"/>
         </w:rPr>
       </w:pPr>
-      <w:hyperlink w:anchor="_Toc227514383" w:history="1">
+      <w:hyperlink w:anchor="_Toc227520107" w:history="1">
         <w:r>
           <w:rPr>
             <w:rStyle w:val="Hyperlink"/>
@@ -1326,7 +1326,7 @@
             <w:noProof/>
             <w:webHidden/>
           </w:rPr>
-          <w:instrText xml:space="preserve"> PAGEREF _Toc227514383 \h </w:instrText>
+          <w:instrText xml:space="preserve"> PAGEREF _Toc227520107 \h </w:instrText>
         </w:r>
         <w:r>
           <w:rPr>
@@ -1367,7 +1367,7 @@
           <w:szCs w:val="24"/>
         </w:rPr>
       </w:pPr>
-      <w:hyperlink w:anchor="_Toc227514384" w:history="1">
+      <w:hyperlink w:anchor="_Toc227520108" w:history="1">
         <w:r>
           <w:rPr>
             <w:rStyle w:val="Hyperlink"/>
@@ -1394,7 +1394,7 @@
             <w:noProof/>
             <w:webHidden/>
           </w:rPr>
-          <w:instrText xml:space="preserve"> PAGEREF _Toc227514384 \h </w:instrText>
+          <w:instrText xml:space="preserve"> PAGEREF _Toc227520108 \h </w:instrText>
         </w:r>
         <w:r>
           <w:rPr>
@@ -1435,7 +1435,7 @@
           <w:szCs w:val="24"/>
         </w:rPr>
       </w:pPr>
-      <w:hyperlink w:anchor="_Toc227514385" w:history="1">
+      <w:hyperlink w:anchor="_Toc227520109" w:history="1">
         <w:r>
           <w:rPr>
             <w:rStyle w:val="Hyperlink"/>
@@ -1462,7 +1462,7 @@
             <w:noProof/>
             <w:webHidden/>
           </w:rPr>
-          <w:instrText xml:space="preserve"> PAGEREF _Toc227514385 \h </w:instrText>
+          <w:instrText xml:space="preserve"> PAGEREF _Toc227520109 \h </w:instrText>
         </w:r>
         <w:r>
           <w:rPr>
@@ -1503,7 +1503,7 @@
           <w:szCs w:val="24"/>
         </w:rPr>
       </w:pPr>
-      <w:hyperlink w:anchor="_Toc227514386" w:history="1">
+      <w:hyperlink w:anchor="_Toc227520110" w:history="1">
         <w:r>
           <w:rPr>
             <w:rStyle w:val="Hyperlink"/>
@@ -1530,7 +1530,7 @@
             <w:noProof/>
             <w:webHidden/>
           </w:rPr>
-          <w:instrText xml:space="preserve"> PAGEREF _Toc227514386 \h </w:instrText>
+          <w:instrText xml:space="preserve"> PAGEREF _Toc227520110 \h </w:instrText>
         </w:r>
         <w:r>
           <w:rPr>
@@ -1574,7 +1574,7 @@
           <w:szCs w:val="24"/>
         </w:rPr>
       </w:pPr>
-      <w:hyperlink w:anchor="_Toc227514387" w:history="1">
+      <w:hyperlink w:anchor="_Toc227520111" w:history="1">
         <w:r>
           <w:rPr>
             <w:rStyle w:val="Hyperlink"/>
@@ -1619,7 +1619,7 @@
             <w:noProof/>
             <w:webHidden/>
           </w:rPr>
-          <w:instrText xml:space="preserve"> PAGEREF _Toc227514387 \h </w:instrText>
+          <w:instrText xml:space="preserve"> PAGEREF _Toc227520111 \h </w:instrText>
         </w:r>
         <w:r>
           <w:rPr>
@@ -1660,7 +1660,7 @@
           <w:szCs w:val="24"/>
         </w:rPr>
       </w:pPr>
-      <w:hyperlink w:anchor="_Toc227514388" w:history="1">
+      <w:hyperlink w:anchor="_Toc227520112" w:history="1">
         <w:r>
           <w:rPr>
             <w:rStyle w:val="Hyperlink"/>
@@ -1687,7 +1687,7 @@
             <w:noProof/>
             <w:webHidden/>
           </w:rPr>
-          <w:instrText xml:space="preserve"> PAGEREF _Toc227514388 \h </w:instrText>
+          <w:instrText xml:space="preserve"> PAGEREF _Toc227520112 \h </w:instrText>
         </w:r>
         <w:r>
           <w:rPr>
@@ -1728,7 +1728,7 @@
           <w:szCs w:val="24"/>
         </w:rPr>
       </w:pPr>
-      <w:hyperlink w:anchor="_Toc227514389" w:history="1">
+      <w:hyperlink w:anchor="_Toc227520113" w:history="1">
         <w:r>
           <w:rPr>
             <w:rStyle w:val="Hyperlink"/>
@@ -1755,7 +1755,7 @@
             <w:noProof/>
             <w:webHidden/>
           </w:rPr>
-          <w:instrText xml:space="preserve"> PAGEREF _Toc227514389 \h </w:instrText>
+          <w:instrText xml:space="preserve"> PAGEREF _Toc227520113 \h </w:instrText>
         </w:r>
         <w:r>
           <w:rPr>
@@ -1799,7 +1799,7 @@
           <w:szCs w:val="24"/>
         </w:rPr>
       </w:pPr>
-      <w:hyperlink w:anchor="_Toc227514390" w:history="1">
+      <w:hyperlink w:anchor="_Toc227520114" w:history="1">
         <w:r>
           <w:rPr>
             <w:rStyle w:val="Hyperlink"/>
@@ -1844,7 +1844,7 @@
             <w:noProof/>
             <w:webHidden/>
           </w:rPr>
-          <w:instrText xml:space="preserve"> PAGEREF _Toc227514390 \h </w:instrText>
+          <w:instrText xml:space="preserve"> PAGEREF _Toc227520114 \h </w:instrText>
         </w:r>
         <w:r>
           <w:rPr>
@@ -1885,7 +1885,7 @@
           <w:szCs w:val="24"/>
         </w:rPr>
       </w:pPr>
-      <w:hyperlink w:anchor="_Toc227514391" w:history="1">
+      <w:hyperlink w:anchor="_Toc227520115" w:history="1">
         <w:r>
           <w:rPr>
             <w:rStyle w:val="Hyperlink"/>
@@ -1912,7 +1912,7 @@
             <w:noProof/>
             <w:webHidden/>
           </w:rPr>
-          <w:instrText xml:space="preserve"> PAGEREF _Toc227514391 \h </w:instrText>
+          <w:instrText xml:space="preserve"> PAGEREF _Toc227520115 \h </w:instrText>
         </w:r>
         <w:r>
           <w:rPr>
@@ -1952,7 +1952,7 @@
           <w:szCs w:val="24"/>
         </w:rPr>
       </w:pPr>
-      <w:hyperlink w:anchor="_Toc227514392" w:history="1">
+      <w:hyperlink w:anchor="_Toc227520116" w:history="1">
         <w:r>
           <w:rPr>
             <w:rStyle w:val="Hyperlink"/>
@@ -1979,7 +1979,7 @@
             <w:noProof/>
             <w:webHidden/>
           </w:rPr>
-          <w:instrText xml:space="preserve"> PAGEREF _Toc227514392 \h </w:instrText>
+          <w:instrText xml:space="preserve"> PAGEREF _Toc227520116 \h </w:instrText>
         </w:r>
         <w:r>
           <w:rPr>
@@ -2019,7 +2019,7 @@
           <w:szCs w:val="24"/>
         </w:rPr>
       </w:pPr>
-      <w:hyperlink w:anchor="_Toc227514393" w:history="1">
+      <w:hyperlink w:anchor="_Toc227520117" w:history="1">
         <w:r>
           <w:rPr>
             <w:rStyle w:val="Hyperlink"/>
@@ -2046,7 +2046,7 @@
             <w:noProof/>
             <w:webHidden/>
           </w:rPr>
-          <w:instrText xml:space="preserve"> PAGEREF _Toc227514393 \h </w:instrText>
+          <w:instrText xml:space="preserve"> PAGEREF _Toc227520117 \h </w:instrText>
         </w:r>
         <w:r>
           <w:rPr>
@@ -2086,7 +2086,7 @@
           <w:szCs w:val="24"/>
         </w:rPr>
       </w:pPr>
-      <w:hyperlink w:anchor="_Toc227514394" w:history="1">
+      <w:hyperlink w:anchor="_Toc227520118" w:history="1">
         <w:r>
           <w:rPr>
             <w:rStyle w:val="Hyperlink"/>
@@ -2113,7 +2113,7 @@
             <w:noProof/>
             <w:webHidden/>
           </w:rPr>
-          <w:instrText xml:space="preserve"> PAGEREF _Toc227514394 \h </w:instrText>
+          <w:instrText xml:space="preserve"> PAGEREF _Toc227520118 \h </w:instrText>
         </w:r>
         <w:r>
           <w:rPr>
@@ -2153,7 +2153,7 @@
           <w:szCs w:val="24"/>
         </w:rPr>
       </w:pPr>
-      <w:hyperlink w:anchor="_Toc227514395" w:history="1">
+      <w:hyperlink w:anchor="_Toc227520119" w:history="1">
         <w:r>
           <w:rPr>
             <w:rStyle w:val="Hyperlink"/>
@@ -2180,7 +2180,7 @@
             <w:noProof/>
             <w:webHidden/>
           </w:rPr>
-          <w:instrText xml:space="preserve"> PAGEREF _Toc227514395 \h </w:instrText>
+          <w:instrText xml:space="preserve"> PAGEREF _Toc227520119 \h </w:instrText>
         </w:r>
         <w:r>
           <w:rPr>
@@ -2220,7 +2220,7 @@
           <w:szCs w:val="24"/>
         </w:rPr>
       </w:pPr>
-      <w:hyperlink w:anchor="_Toc227514396" w:history="1">
+      <w:hyperlink w:anchor="_Toc227520120" w:history="1">
         <w:r>
           <w:rPr>
             <w:rStyle w:val="Hyperlink"/>
@@ -2247,7 +2247,7 @@
             <w:noProof/>
             <w:webHidden/>
           </w:rPr>
-          <w:instrText xml:space="preserve"> PAGEREF _Toc227514396 \h </w:instrText>
+          <w:instrText xml:space="preserve"> PAGEREF _Toc227520120 \h </w:instrText>
         </w:r>
         <w:r>
           <w:rPr>
@@ -2287,7 +2287,7 @@
           <w:szCs w:val="24"/>
         </w:rPr>
       </w:pPr>
-      <w:hyperlink w:anchor="_Toc227514397" w:history="1">
+      <w:hyperlink w:anchor="_Toc227520121" w:history="1">
         <w:r>
           <w:rPr>
             <w:rStyle w:val="Hyperlink"/>
@@ -2314,7 +2314,7 @@
             <w:noProof/>
             <w:webHidden/>
           </w:rPr>
-          <w:instrText xml:space="preserve"> PAGEREF _Toc227514397 \h </w:instrText>
+          <w:instrText xml:space="preserve"> PAGEREF _Toc227520121 \h </w:instrText>
         </w:r>
         <w:r>
           <w:rPr>
@@ -2354,7 +2354,7 @@
           <w:szCs w:val="24"/>
         </w:rPr>
       </w:pPr>
-      <w:hyperlink w:anchor="_Toc227514398" w:history="1">
+      <w:hyperlink w:anchor="_Toc227520122" w:history="1">
         <w:r>
           <w:rPr>
             <w:rStyle w:val="Hyperlink"/>
@@ -2381,7 +2381,7 @@
             <w:noProof/>
             <w:webHidden/>
           </w:rPr>
-          <w:instrText xml:space="preserve"> PAGEREF _Toc227514398 \h </w:instrText>
+          <w:instrText xml:space="preserve"> PAGEREF _Toc227520122 \h </w:instrText>
         </w:r>
         <w:r>
           <w:rPr>
@@ -2421,7 +2421,7 @@
           <w:szCs w:val="24"/>
         </w:rPr>
       </w:pPr>
-      <w:hyperlink w:anchor="_Toc227514399" w:history="1">
+      <w:hyperlink w:anchor="_Toc227520123" w:history="1">
         <w:r>
           <w:rPr>
             <w:rStyle w:val="Hyperlink"/>
@@ -2448,7 +2448,7 @@
             <w:noProof/>
             <w:webHidden/>
           </w:rPr>
-          <w:instrText xml:space="preserve"> PAGEREF _Toc227514399 \h </w:instrText>
+          <w:instrText xml:space="preserve"> PAGEREF _Toc227520123 \h </w:instrText>
         </w:r>
         <w:r>
           <w:rPr>
@@ -2489,7 +2489,7 @@
           <w:szCs w:val="24"/>
         </w:rPr>
       </w:pPr>
-      <w:hyperlink w:anchor="_Toc227514400" w:history="1">
+      <w:hyperlink w:anchor="_Toc227520124" w:history="1">
         <w:r>
           <w:rPr>
             <w:rStyle w:val="Hyperlink"/>
@@ -2516,7 +2516,7 @@
             <w:noProof/>
             <w:webHidden/>
           </w:rPr>
-          <w:instrText xml:space="preserve"> PAGEREF _Toc227514400 \h </w:instrText>
+          <w:instrText xml:space="preserve"> PAGEREF _Toc227520124 \h </w:instrText>
         </w:r>
         <w:r>
           <w:rPr>
@@ -2557,7 +2557,7 @@
           <w:szCs w:val="24"/>
         </w:rPr>
       </w:pPr>
-      <w:hyperlink w:anchor="_Toc227514401" w:history="1">
+      <w:hyperlink w:anchor="_Toc227520125" w:history="1">
         <w:r>
           <w:rPr>
             <w:rStyle w:val="Hyperlink"/>
@@ -2584,7 +2584,7 @@
             <w:noProof/>
             <w:webHidden/>
           </w:rPr>
-          <w:instrText xml:space="preserve"> PAGEREF _Toc227514401 \h </w:instrText>
+          <w:instrText xml:space="preserve"> PAGEREF _Toc227520125 \h </w:instrText>
         </w:r>
         <w:r>
           <w:rPr>
@@ -2624,7 +2624,7 @@
           <w:szCs w:val="24"/>
         </w:rPr>
       </w:pPr>
-      <w:hyperlink w:anchor="_Toc227514402" w:history="1">
+      <w:hyperlink w:anchor="_Toc227520126" w:history="1">
         <w:r>
           <w:rPr>
             <w:rStyle w:val="Hyperlink"/>
@@ -2651,7 +2651,7 @@
             <w:noProof/>
             <w:webHidden/>
           </w:rPr>
-          <w:instrText xml:space="preserve"> PAGEREF _Toc227514402 \h </w:instrText>
+          <w:instrText xml:space="preserve"> PAGEREF _Toc227520126 \h </w:instrText>
         </w:r>
         <w:r>
           <w:rPr>
@@ -2691,7 +2691,7 @@
           <w:szCs w:val="24"/>
         </w:rPr>
       </w:pPr>
-      <w:hyperlink w:anchor="_Toc227514403" w:history="1">
+      <w:hyperlink w:anchor="_Toc227520127" w:history="1">
         <w:r>
           <w:rPr>
             <w:rStyle w:val="Hyperlink"/>
@@ -2719,7 +2719,7 @@
             <w:noProof/>
             <w:webHidden/>
           </w:rPr>
-          <w:instrText xml:space="preserve"> PAGEREF _Toc227514403 \h </w:instrText>
+          <w:instrText xml:space="preserve"> PAGEREF _Toc227520127 \h </w:instrText>
         </w:r>
         <w:r>
           <w:rPr>
@@ -2759,7 +2759,7 @@
           <w:szCs w:val="24"/>
         </w:rPr>
       </w:pPr>
-      <w:hyperlink w:anchor="_Toc227514404" w:history="1">
+      <w:hyperlink w:anchor="_Toc227520128" w:history="1">
         <w:r>
           <w:rPr>
             <w:rStyle w:val="Hyperlink"/>
@@ -2787,7 +2787,7 @@
             <w:noProof/>
             <w:webHidden/>
           </w:rPr>
-          <w:instrText xml:space="preserve"> PAGEREF _Toc227514404 \h </w:instrText>
+          <w:instrText xml:space="preserve"> PAGEREF _Toc227520128 \h </w:instrText>
         </w:r>
         <w:r>
           <w:rPr>
@@ -2827,7 +2827,7 @@
           <w:szCs w:val="24"/>
         </w:rPr>
       </w:pPr>
-      <w:hyperlink w:anchor="_Toc227514405" w:history="1">
+      <w:hyperlink w:anchor="_Toc227520129" w:history="1">
         <w:r>
           <w:rPr>
             <w:rStyle w:val="Hyperlink"/>
@@ -2855,7 +2855,7 @@
             <w:noProof/>
             <w:webHidden/>
           </w:rPr>
-          <w:instrText xml:space="preserve"> PAGEREF _Toc227514405 \h </w:instrText>
+          <w:instrText xml:space="preserve"> PAGEREF _Toc227520129 \h </w:instrText>
         </w:r>
         <w:r>
           <w:rPr>
@@ -2896,7 +2896,7 @@
           <w:szCs w:val="24"/>
         </w:rPr>
       </w:pPr>
-      <w:hyperlink w:anchor="_Toc227514406" w:history="1">
+      <w:hyperlink w:anchor="_Toc227520130" w:history="1">
         <w:r>
           <w:rPr>
             <w:rStyle w:val="Hyperlink"/>
@@ -2938,7 +2938,7 @@
             <w:noProof/>
             <w:webHidden/>
           </w:rPr>
-          <w:instrText xml:space="preserve"> PAGEREF _Toc227514406 \h </w:instrText>
+          <w:instrText xml:space="preserve"> PAGEREF _Toc227520130 \h </w:instrText>
         </w:r>
         <w:r>
           <w:rPr>
@@ -2978,7 +2978,7 @@
           <w:szCs w:val="24"/>
         </w:rPr>
       </w:pPr>
-      <w:hyperlink w:anchor="_Toc227514407" w:history="1">
+      <w:hyperlink w:anchor="_Toc227520131" w:history="1">
         <w:r>
           <w:rPr>
             <w:rStyle w:val="Hyperlink"/>
@@ -3006,7 +3006,7 @@
             <w:noProof/>
             <w:webHidden/>
           </w:rPr>
-          <w:instrText xml:space="preserve"> PAGEREF _Toc227514407 \h </w:instrText>
+          <w:instrText xml:space="preserve"> PAGEREF _Toc227520131 \h </w:instrText>
         </w:r>
         <w:r>
           <w:rPr>
@@ -3046,7 +3046,7 @@
           <w:szCs w:val="24"/>
         </w:rPr>
       </w:pPr>
-      <w:hyperlink w:anchor="_Toc227514408" w:history="1">
+      <w:hyperlink w:anchor="_Toc227520132" w:history="1">
         <w:r>
           <w:rPr>
             <w:rStyle w:val="Hyperlink"/>
@@ -3074,7 +3074,7 @@
             <w:noProof/>
             <w:webHidden/>
           </w:rPr>
-          <w:instrText xml:space="preserve"> PAGEREF _Toc227514408 \h </w:instrText>
+          <w:instrText xml:space="preserve"> PAGEREF _Toc227520132 \h </w:instrText>
         </w:r>
         <w:r>
           <w:rPr>
@@ -3114,7 +3114,7 @@
           <w:szCs w:val="24"/>
         </w:rPr>
       </w:pPr>
-      <w:hyperlink w:anchor="_Toc227514409" w:history="1">
+      <w:hyperlink w:anchor="_Toc227520133" w:history="1">
         <w:r>
           <w:rPr>
             <w:rStyle w:val="Hyperlink"/>
@@ -3142,7 +3142,7 @@
             <w:noProof/>
             <w:webHidden/>
           </w:rPr>
-          <w:instrText xml:space="preserve"> PAGEREF _Toc227514409 \h </w:instrText>
+          <w:instrText xml:space="preserve"> PAGEREF _Toc227520133 \h </w:instrText>
         </w:r>
         <w:r>
           <w:rPr>
@@ -3183,7 +3183,7 @@
           <w:szCs w:val="24"/>
         </w:rPr>
       </w:pPr>
-      <w:hyperlink w:anchor="_Toc227514410" w:history="1">
+      <w:hyperlink w:anchor="_Toc227520134" w:history="1">
         <w:r>
           <w:rPr>
             <w:rStyle w:val="Hyperlink"/>
@@ -3218,7 +3218,7 @@
             <w:noProof/>
             <w:webHidden/>
           </w:rPr>
-          <w:instrText xml:space="preserve"> PAGEREF _Toc227514410 \h </w:instrText>
+          <w:instrText xml:space="preserve"> PAGEREF _Toc227520134 \h </w:instrText>
         </w:r>
         <w:r>
           <w:rPr>
@@ -3258,7 +3258,7 @@
           <w:szCs w:val="24"/>
         </w:rPr>
       </w:pPr>
-      <w:hyperlink w:anchor="_Toc227514411" w:history="1">
+      <w:hyperlink w:anchor="_Toc227520135" w:history="1">
         <w:r>
           <w:rPr>
             <w:rStyle w:val="Hyperlink"/>
@@ -3286,7 +3286,7 @@
             <w:noProof/>
             <w:webHidden/>
           </w:rPr>
-          <w:instrText xml:space="preserve"> PAGEREF _Toc227514411 \h </w:instrText>
+          <w:instrText xml:space="preserve"> PAGEREF _Toc227520135 \h </w:instrText>
         </w:r>
         <w:r>
           <w:rPr>
@@ -3326,7 +3326,7 @@
           <w:szCs w:val="24"/>
         </w:rPr>
       </w:pPr>
-      <w:hyperlink w:anchor="_Toc227514412" w:history="1">
+      <w:hyperlink w:anchor="_Toc227520136" w:history="1">
         <w:r>
           <w:rPr>
             <w:rStyle w:val="Hyperlink"/>
@@ -3354,7 +3354,7 @@
             <w:noProof/>
             <w:webHidden/>
           </w:rPr>
-          <w:instrText xml:space="preserve"> PAGEREF _Toc227514412 \h </w:instrText>
+          <w:instrText xml:space="preserve"> PAGEREF _Toc227520136 \h </w:instrText>
         </w:r>
         <w:r>
           <w:rPr>
@@ -3394,7 +3394,7 @@
           <w:szCs w:val="24"/>
         </w:rPr>
       </w:pPr>
-      <w:hyperlink w:anchor="_Toc227514413" w:history="1">
+      <w:hyperlink w:anchor="_Toc227520137" w:history="1">
         <w:r>
           <w:rPr>
             <w:rStyle w:val="Hyperlink"/>
@@ -3422,7 +3422,7 @@
             <w:noProof/>
             <w:webHidden/>
           </w:rPr>
-          <w:instrText xml:space="preserve"> PAGEREF _Toc227514413 \h </w:instrText>
+          <w:instrText xml:space="preserve"> PAGEREF _Toc227520137 \h </w:instrText>
         </w:r>
         <w:r>
           <w:rPr>
@@ -3462,7 +3462,7 @@
           <w:szCs w:val="24"/>
         </w:rPr>
       </w:pPr>
-      <w:hyperlink w:anchor="_Toc227514414" w:history="1">
+      <w:hyperlink w:anchor="_Toc227520138" w:history="1">
         <w:r>
           <w:rPr>
             <w:rStyle w:val="Hyperlink"/>
@@ -3490,7 +3490,7 @@
             <w:noProof/>
             <w:webHidden/>
           </w:rPr>
-          <w:instrText xml:space="preserve"> PAGEREF _Toc227514414 \h </w:instrText>
+          <w:instrText xml:space="preserve"> PAGEREF _Toc227520138 \h </w:instrText>
         </w:r>
         <w:r>
           <w:rPr>
@@ -3530,7 +3530,7 @@
           <w:szCs w:val="24"/>
         </w:rPr>
       </w:pPr>
-      <w:hyperlink w:anchor="_Toc227514415" w:history="1">
+      <w:hyperlink w:anchor="_Toc227520139" w:history="1">
         <w:r>
           <w:rPr>
             <w:rStyle w:val="Hyperlink"/>
@@ -3558,7 +3558,7 @@
             <w:noProof/>
             <w:webHidden/>
           </w:rPr>
-          <w:instrText xml:space="preserve"> PAGEREF _Toc227514415 \h </w:instrText>
+          <w:instrText xml:space="preserve"> PAGEREF _Toc227520139 \h </w:instrText>
         </w:r>
         <w:r>
           <w:rPr>
@@ -3602,7 +3602,7 @@
           <w:szCs w:val="24"/>
         </w:rPr>
       </w:pPr>
-      <w:hyperlink w:anchor="_Toc227514416" w:history="1">
+      <w:hyperlink w:anchor="_Toc227520140" w:history="1">
         <w:r>
           <w:rPr>
             <w:rStyle w:val="Hyperlink"/>
@@ -3649,7 +3649,7 @@
             <w:noProof/>
             <w:webHidden/>
           </w:rPr>
-          <w:instrText xml:space="preserve"> PAGEREF _Toc227514416 \h </w:instrText>
+          <w:instrText xml:space="preserve"> PAGEREF _Toc227520140 \h </w:instrText>
         </w:r>
         <w:r>
           <w:rPr>
@@ -3690,7 +3690,7 @@
           <w:szCs w:val="24"/>
         </w:rPr>
       </w:pPr>
-      <w:hyperlink w:anchor="_Toc227514417" w:history="1">
+      <w:hyperlink w:anchor="_Toc227520141" w:history="1">
         <w:r>
           <w:rPr>
             <w:rStyle w:val="Hyperlink"/>
@@ -3725,7 +3725,7 @@
             <w:noProof/>
             <w:webHidden/>
           </w:rPr>
-          <w:instrText xml:space="preserve"> PAGEREF _Toc227514417 \h </w:instrText>
+          <w:instrText xml:space="preserve"> PAGEREF _Toc227520141 \h </w:instrText>
         </w:r>
         <w:r>
           <w:rPr>
@@ -3765,7 +3765,7 @@
           <w:szCs w:val="24"/>
         </w:rPr>
       </w:pPr>
-      <w:hyperlink w:anchor="_Toc227514418" w:history="1">
+      <w:hyperlink w:anchor="_Toc227520142" w:history="1">
         <w:r>
           <w:rPr>
             <w:rStyle w:val="Hyperlink"/>
@@ -3800,7 +3800,7 @@
             <w:noProof/>
             <w:webHidden/>
           </w:rPr>
-          <w:instrText xml:space="preserve"> PAGEREF _Toc227514418 \h </w:instrText>
+          <w:instrText xml:space="preserve"> PAGEREF _Toc227520142 \h </w:instrText>
         </w:r>
         <w:r>
           <w:rPr>
@@ -3840,7 +3840,7 @@
           <w:szCs w:val="24"/>
         </w:rPr>
       </w:pPr>
-      <w:hyperlink w:anchor="_Toc227514419" w:history="1">
+      <w:hyperlink w:anchor="_Toc227520143" w:history="1">
         <w:r>
           <w:rPr>
             <w:rStyle w:val="Hyperlink"/>
@@ -3875,7 +3875,7 @@
             <w:noProof/>
             <w:webHidden/>
           </w:rPr>
-          <w:instrText xml:space="preserve"> PAGEREF _Toc227514419 \h </w:instrText>
+          <w:instrText xml:space="preserve"> PAGEREF _Toc227520143 \h </w:instrText>
         </w:r>
         <w:r>
           <w:rPr>
@@ -3915,7 +3915,7 @@
           <w:szCs w:val="24"/>
         </w:rPr>
       </w:pPr>
-      <w:hyperlink w:anchor="_Toc227514420" w:history="1">
+      <w:hyperlink w:anchor="_Toc227520144" w:history="1">
         <w:r>
           <w:rPr>
             <w:rStyle w:val="Hyperlink"/>
@@ -3950,7 +3950,7 @@
             <w:noProof/>
             <w:webHidden/>
           </w:rPr>
-          <w:instrText xml:space="preserve"> PAGEREF _Toc227514420 \h </w:instrText>
+          <w:instrText xml:space="preserve"> PAGEREF _Toc227520144 \h </w:instrText>
         </w:r>
         <w:r>
           <w:rPr>
@@ -3991,7 +3991,7 @@
           <w:szCs w:val="24"/>
         </w:rPr>
       </w:pPr>
-      <w:hyperlink w:anchor="_Toc227514421" w:history="1">
+      <w:hyperlink w:anchor="_Toc227520145" w:history="1">
         <w:r>
           <w:rPr>
             <w:rStyle w:val="Hyperlink"/>
@@ -4019,7 +4019,7 @@
             <w:noProof/>
             <w:webHidden/>
           </w:rPr>
-          <w:instrText xml:space="preserve"> PAGEREF _Toc227514421 \h </w:instrText>
+          <w:instrText xml:space="preserve"> PAGEREF _Toc227520145 \h </w:instrText>
         </w:r>
         <w:r>
           <w:rPr>
@@ -4059,7 +4059,7 @@
           <w:szCs w:val="24"/>
         </w:rPr>
       </w:pPr>
-      <w:hyperlink w:anchor="_Toc227514422" w:history="1">
+      <w:hyperlink w:anchor="_Toc227520146" w:history="1">
         <w:r>
           <w:rPr>
             <w:rStyle w:val="Hyperlink"/>
@@ -4094,7 +4094,7 @@
             <w:noProof/>
             <w:webHidden/>
           </w:rPr>
-          <w:instrText xml:space="preserve"> PAGEREF _Toc227514422 \h </w:instrText>
+          <w:instrText xml:space="preserve"> PAGEREF _Toc227520146 \h </w:instrText>
         </w:r>
         <w:r>
           <w:rPr>
@@ -4135,7 +4135,7 @@
           <w:szCs w:val="24"/>
         </w:rPr>
       </w:pPr>
-      <w:hyperlink w:anchor="_Toc227514423" w:history="1">
+      <w:hyperlink w:anchor="_Toc227520147" w:history="1">
         <w:r>
           <w:rPr>
             <w:rStyle w:val="Hyperlink"/>
@@ -4163,7 +4163,7 @@
             <w:noProof/>
             <w:webHidden/>
           </w:rPr>
-          <w:instrText xml:space="preserve"> PAGEREF _Toc227514423 \h </w:instrText>
+          <w:instrText xml:space="preserve"> PAGEREF _Toc227520147 \h </w:instrText>
         </w:r>
         <w:r>
           <w:rPr>
@@ -4203,7 +4203,7 @@
           <w:szCs w:val="24"/>
         </w:rPr>
       </w:pPr>
-      <w:hyperlink w:anchor="_Toc227514424" w:history="1">
+      <w:hyperlink w:anchor="_Toc227520148" w:history="1">
         <w:r>
           <w:rPr>
             <w:rStyle w:val="Hyperlink"/>
@@ -4231,7 +4231,7 @@
             <w:noProof/>
             <w:webHidden/>
           </w:rPr>
-          <w:instrText xml:space="preserve"> PAGEREF _Toc227514424 \h </w:instrText>
+          <w:instrText xml:space="preserve"> PAGEREF _Toc227520148 \h </w:instrText>
         </w:r>
         <w:r>
           <w:rPr>
@@ -4271,7 +4271,7 @@
           <w:szCs w:val="24"/>
         </w:rPr>
       </w:pPr>
-      <w:hyperlink w:anchor="_Toc227514425" w:history="1">
+      <w:hyperlink w:anchor="_Toc227520149" w:history="1">
         <w:r>
           <w:rPr>
             <w:rStyle w:val="Hyperlink"/>
@@ -4299,7 +4299,7 @@
             <w:noProof/>
             <w:webHidden/>
           </w:rPr>
-          <w:instrText xml:space="preserve"> PAGEREF _Toc227514425 \h </w:instrText>
+          <w:instrText xml:space="preserve"> PAGEREF _Toc227520149 \h </w:instrText>
         </w:r>
         <w:r>
           <w:rPr>
@@ -4339,7 +4339,7 @@
           <w:szCs w:val="24"/>
         </w:rPr>
       </w:pPr>
-      <w:hyperlink w:anchor="_Toc227514426" w:history="1">
+      <w:hyperlink w:anchor="_Toc227520150" w:history="1">
         <w:r>
           <w:rPr>
             <w:rStyle w:val="Hyperlink"/>
@@ -4367,7 +4367,7 @@
             <w:noProof/>
             <w:webHidden/>
           </w:rPr>
-          <w:instrText xml:space="preserve"> PAGEREF _Toc227514426 \h </w:instrText>
+          <w:instrText xml:space="preserve"> PAGEREF _Toc227520150 \h </w:instrText>
         </w:r>
         <w:r>
           <w:rPr>
@@ -4407,7 +4407,7 @@
           <w:szCs w:val="24"/>
         </w:rPr>
       </w:pPr>
-      <w:hyperlink w:anchor="_Toc227514427" w:history="1">
+      <w:hyperlink w:anchor="_Toc227520151" w:history="1">
         <w:r>
           <w:rPr>
             <w:rStyle w:val="Hyperlink"/>
@@ -4435,7 +4435,7 @@
             <w:noProof/>
             <w:webHidden/>
           </w:rPr>
-          <w:instrText xml:space="preserve"> PAGEREF _Toc227514427 \h </w:instrText>
+          <w:instrText xml:space="preserve"> PAGEREF _Toc227520151 \h </w:instrText>
         </w:r>
         <w:r>
           <w:rPr>
@@ -4476,7 +4476,7 @@
           <w:szCs w:val="24"/>
         </w:rPr>
       </w:pPr>
-      <w:hyperlink w:anchor="_Toc227514428" w:history="1">
+      <w:hyperlink w:anchor="_Toc227520152" w:history="1">
         <w:r>
           <w:rPr>
             <w:rStyle w:val="Hyperlink"/>
@@ -4504,7 +4504,7 @@
             <w:noProof/>
             <w:webHidden/>
           </w:rPr>
-          <w:instrText xml:space="preserve"> PAGEREF _Toc227514428 \h </w:instrText>
+          <w:instrText xml:space="preserve"> PAGEREF _Toc227520152 \h </w:instrText>
         </w:r>
         <w:r>
           <w:rPr>
@@ -4548,7 +4548,7 @@
           <w:szCs w:val="24"/>
         </w:rPr>
       </w:pPr>
-      <w:hyperlink w:anchor="_Toc227514429" w:history="1">
+      <w:hyperlink w:anchor="_Toc227520153" w:history="1">
         <w:r>
           <w:rPr>
             <w:rStyle w:val="Hyperlink"/>
@@ -4595,7 +4595,7 @@
             <w:noProof/>
             <w:webHidden/>
           </w:rPr>
-          <w:instrText xml:space="preserve"> PAGEREF _Toc227514429 \h </w:instrText>
+          <w:instrText xml:space="preserve"> PAGEREF _Toc227520153 \h </w:instrText>
         </w:r>
         <w:r>
           <w:rPr>
@@ -4636,7 +4636,7 @@
           <w:szCs w:val="24"/>
         </w:rPr>
       </w:pPr>
-      <w:hyperlink w:anchor="_Toc227514430" w:history="1">
+      <w:hyperlink w:anchor="_Toc227520154" w:history="1">
         <w:r>
           <w:rPr>
             <w:rStyle w:val="Hyperlink"/>
@@ -4664,7 +4664,7 @@
             <w:noProof/>
             <w:webHidden/>
           </w:rPr>
-          <w:instrText xml:space="preserve"> PAGEREF _Toc227514430 \h </w:instrText>
+          <w:instrText xml:space="preserve"> PAGEREF _Toc227520154 \h </w:instrText>
         </w:r>
         <w:r>
           <w:rPr>
@@ -4705,7 +4705,7 @@
           <w:szCs w:val="24"/>
         </w:rPr>
       </w:pPr>
-      <w:hyperlink w:anchor="_Toc227514431" w:history="1">
+      <w:hyperlink w:anchor="_Toc227520155" w:history="1">
         <w:r>
           <w:rPr>
             <w:rStyle w:val="Hyperlink"/>
@@ -4733,7 +4733,7 @@
             <w:noProof/>
             <w:webHidden/>
           </w:rPr>
-          <w:instrText xml:space="preserve"> PAGEREF _Toc227514431 \h </w:instrText>
+          <w:instrText xml:space="preserve"> PAGEREF _Toc227520155 \h </w:instrText>
         </w:r>
         <w:r>
           <w:rPr>
@@ -4774,7 +4774,7 @@
           <w:szCs w:val="24"/>
         </w:rPr>
       </w:pPr>
-      <w:hyperlink w:anchor="_Toc227514432" w:history="1">
+      <w:hyperlink w:anchor="_Toc227520156" w:history="1">
         <w:r>
           <w:rPr>
             <w:rStyle w:val="Hyperlink"/>
@@ -4832,7 +4832,7 @@
             <w:noProof/>
             <w:webHidden/>
           </w:rPr>
-          <w:instrText xml:space="preserve"> PAGEREF _Toc227514432 \h </w:instrText>
+          <w:instrText xml:space="preserve"> PAGEREF _Toc227520156 \h </w:instrText>
         </w:r>
         <w:r>
           <w:rPr>
@@ -4876,7 +4876,7 @@
           <w:szCs w:val="24"/>
         </w:rPr>
       </w:pPr>
-      <w:hyperlink w:anchor="_Toc227514433" w:history="1">
+      <w:hyperlink w:anchor="_Toc227520157" w:history="1">
         <w:r>
           <w:rPr>
             <w:rStyle w:val="Hyperlink"/>
@@ -4923,7 +4923,7 @@
             <w:noProof/>
             <w:webHidden/>
           </w:rPr>
-          <w:instrText xml:space="preserve"> PAGEREF _Toc227514433 \h </w:instrText>
+          <w:instrText xml:space="preserve"> PAGEREF _Toc227520157 \h </w:instrText>
         </w:r>
         <w:r>
           <w:rPr>
@@ -4967,7 +4967,7 @@
           <w:szCs w:val="24"/>
         </w:rPr>
       </w:pPr>
-      <w:hyperlink w:anchor="_Toc227514434" w:history="1">
+      <w:hyperlink w:anchor="_Toc227520158" w:history="1">
         <w:r>
           <w:rPr>
             <w:rStyle w:val="Hyperlink"/>
@@ -5014,7 +5014,7 @@
             <w:noProof/>
             <w:webHidden/>
           </w:rPr>
-          <w:instrText xml:space="preserve"> PAGEREF _Toc227514434 \h </w:instrText>
+          <w:instrText xml:space="preserve"> PAGEREF _Toc227520158 \h </w:instrText>
         </w:r>
         <w:r>
           <w:rPr>
@@ -5055,7 +5055,7 @@
           <w:szCs w:val="24"/>
         </w:rPr>
       </w:pPr>
-      <w:hyperlink w:anchor="_Toc227514435" w:history="1">
+      <w:hyperlink w:anchor="_Toc227520159" w:history="1">
         <w:r>
           <w:rPr>
             <w:rStyle w:val="Hyperlink"/>
@@ -5083,7 +5083,7 @@
             <w:noProof/>
             <w:webHidden/>
           </w:rPr>
-          <w:instrText xml:space="preserve"> PAGEREF _Toc227514435 \h </w:instrText>
+          <w:instrText xml:space="preserve"> PAGEREF _Toc227520159 \h </w:instrText>
         </w:r>
         <w:r>
           <w:rPr>
@@ -5124,7 +5124,7 @@
           <w:szCs w:val="24"/>
         </w:rPr>
       </w:pPr>
-      <w:hyperlink w:anchor="_Toc227514436" w:history="1">
+      <w:hyperlink w:anchor="_Toc227520160" w:history="1">
         <w:r>
           <w:rPr>
             <w:rStyle w:val="Hyperlink"/>
@@ -5152,7 +5152,7 @@
             <w:noProof/>
             <w:webHidden/>
           </w:rPr>
-          <w:instrText xml:space="preserve"> PAGEREF _Toc227514436 \h </w:instrText>
+          <w:instrText xml:space="preserve"> PAGEREF _Toc227520160 \h </w:instrText>
         </w:r>
         <w:r>
           <w:rPr>
@@ -5192,7 +5192,7 @@
           <w:szCs w:val="24"/>
         </w:rPr>
       </w:pPr>
-      <w:hyperlink w:anchor="_Toc227514437" w:history="1">
+      <w:hyperlink w:anchor="_Toc227520161" w:history="1">
         <w:r>
           <w:rPr>
             <w:rStyle w:val="Hyperlink"/>
@@ -5220,7 +5220,7 @@
             <w:noProof/>
             <w:webHidden/>
           </w:rPr>
-          <w:instrText xml:space="preserve"> PAGEREF _Toc227514437 \h </w:instrText>
+          <w:instrText xml:space="preserve"> PAGEREF _Toc227520161 \h </w:instrText>
         </w:r>
         <w:r>
           <w:rPr>
@@ -5260,7 +5260,7 @@
           <w:szCs w:val="24"/>
         </w:rPr>
       </w:pPr>
-      <w:hyperlink w:anchor="_Toc227514438" w:history="1">
+      <w:hyperlink w:anchor="_Toc227520162" w:history="1">
         <w:r>
           <w:rPr>
             <w:rStyle w:val="Hyperlink"/>
@@ -5288,7 +5288,7 @@
             <w:noProof/>
             <w:webHidden/>
           </w:rPr>
-          <w:instrText xml:space="preserve"> PAGEREF _Toc227514438 \h </w:instrText>
+          <w:instrText xml:space="preserve"> PAGEREF _Toc227520162 \h </w:instrText>
         </w:r>
         <w:r>
           <w:rPr>
@@ -5328,7 +5328,7 @@
           <w:szCs w:val="24"/>
         </w:rPr>
       </w:pPr>
-      <w:hyperlink w:anchor="_Toc227514439" w:history="1">
+      <w:hyperlink w:anchor="_Toc227520163" w:history="1">
         <w:r>
           <w:rPr>
             <w:rStyle w:val="Hyperlink"/>
@@ -5356,7 +5356,7 @@
             <w:noProof/>
             <w:webHidden/>
           </w:rPr>
-          <w:instrText xml:space="preserve"> PAGEREF _Toc227514439 \h </w:instrText>
+          <w:instrText xml:space="preserve"> PAGEREF _Toc227520163 \h </w:instrText>
         </w:r>
         <w:r>
           <w:rPr>
@@ -5396,7 +5396,7 @@
           <w:szCs w:val="24"/>
         </w:rPr>
       </w:pPr>
-      <w:hyperlink w:anchor="_Toc227514440" w:history="1">
+      <w:hyperlink w:anchor="_Toc227520164" w:history="1">
         <w:r>
           <w:rPr>
             <w:rStyle w:val="Hyperlink"/>
@@ -5424,7 +5424,7 @@
             <w:noProof/>
             <w:webHidden/>
           </w:rPr>
-          <w:instrText xml:space="preserve"> PAGEREF _Toc227514440 \h </w:instrText>
+          <w:instrText xml:space="preserve"> PAGEREF _Toc227520164 \h </w:instrText>
         </w:r>
         <w:r>
           <w:rPr>
@@ -5464,7 +5464,7 @@
           <w:szCs w:val="24"/>
         </w:rPr>
       </w:pPr>
-      <w:hyperlink w:anchor="_Toc227514441" w:history="1">
+      <w:hyperlink w:anchor="_Toc227520165" w:history="1">
         <w:r>
           <w:rPr>
             <w:rStyle w:val="Hyperlink"/>
@@ -5492,7 +5492,7 @@
             <w:noProof/>
             <w:webHidden/>
           </w:rPr>
-          <w:instrText xml:space="preserve"> PAGEREF _Toc227514441 \h </w:instrText>
+          <w:instrText xml:space="preserve"> PAGEREF _Toc227520165 \h </w:instrText>
         </w:r>
         <w:r>
           <w:rPr>
@@ -5532,7 +5532,7 @@
           <w:szCs w:val="24"/>
         </w:rPr>
       </w:pPr>
-      <w:hyperlink w:anchor="_Toc227514442" w:history="1">
+      <w:hyperlink w:anchor="_Toc227520166" w:history="1">
         <w:r>
           <w:rPr>
             <w:rStyle w:val="Hyperlink"/>
@@ -5560,7 +5560,7 @@
             <w:noProof/>
             <w:webHidden/>
           </w:rPr>
-          <w:instrText xml:space="preserve"> PAGEREF _Toc227514442 \h </w:instrText>
+          <w:instrText xml:space="preserve"> PAGEREF _Toc227520166 \h </w:instrText>
         </w:r>
         <w:r>
           <w:rPr>
@@ -5600,7 +5600,7 @@
           <w:szCs w:val="24"/>
         </w:rPr>
       </w:pPr>
-      <w:hyperlink w:anchor="_Toc227514443" w:history="1">
+      <w:hyperlink w:anchor="_Toc227520167" w:history="1">
         <w:r>
           <w:rPr>
             <w:rStyle w:val="Hyperlink"/>
@@ -5628,74 +5628,7 @@
             <w:noProof/>
             <w:webHidden/>
           </w:rPr>
-          <w:instrText xml:space="preserve"> PAGEREF _Toc227514443 \h </w:instrText>
-        </w:r>
-        <w:r>
-          <w:rPr>
-            <w:noProof/>
-            <w:webHidden/>
-          </w:rPr>
-        </w:r>
-        <w:r>
-          <w:rPr>
-            <w:noProof/>
-            <w:webHidden/>
-          </w:rPr>
-          <w:fldChar w:fldCharType="separate"/>
-        </w:r>
-        <w:r>
-          <w:rPr>
-            <w:noProof/>
-            <w:webHidden/>
-          </w:rPr>
-          <w:t>36</w:t>
-        </w:r>
-        <w:r>
-          <w:rPr>
-            <w:noProof/>
-            <w:webHidden/>
-          </w:rPr>
-          <w:fldChar w:fldCharType="end"/>
-        </w:r>
-      </w:hyperlink>
-    </w:p>
-    <w:p>
-      <w:pPr>
-        <w:pStyle w:val="TOC3"/>
-        <w:rPr>
-          <w:rFonts w:asciiTheme="minorHAnsi" w:eastAsiaTheme="minorEastAsia" w:hAnsiTheme="minorHAnsi" w:cstheme="minorBidi"/>
-          <w:noProof/>
-          <w:szCs w:val="24"/>
-        </w:rPr>
-      </w:pPr>
-      <w:hyperlink w:anchor="_Toc227514444" w:history="1">
-        <w:r>
-          <w:rPr>
-            <w:rStyle w:val="Hyperlink"/>
-            <w:noProof/>
-          </w:rPr>
-          <w:t>7.2.8 Záver</w:t>
-        </w:r>
-        <w:r>
-          <w:rPr>
-            <w:noProof/>
-            <w:webHidden/>
-          </w:rPr>
-          <w:tab/>
-        </w:r>
-        <w:r>
-          <w:rPr>
-            <w:noProof/>
-            <w:webHidden/>
-          </w:rPr>
-          <w:fldChar w:fldCharType="begin"/>
-        </w:r>
-        <w:r>
-          <w:rPr>
-            <w:noProof/>
-            <w:webHidden/>
-          </w:rPr>
-          <w:instrText xml:space="preserve"> PAGEREF _Toc227514444 \h </w:instrText>
+          <w:instrText xml:space="preserve"> PAGEREF _Toc227520167 \h </w:instrText>
         </w:r>
         <w:r>
           <w:rPr>
@@ -5739,23 +5672,43 @@
           <w:szCs w:val="24"/>
         </w:rPr>
       </w:pPr>
-      <w:hyperlink w:anchor="_Toc227514445" w:history="1">
+      <w:hyperlink w:anchor="_Toc227520168" w:history="1">
         <w:r>
           <w:rPr>
             <w:rStyle w:val="Hyperlink"/>
             <w:noProof/>
-          </w:rPr>
-          <w:t>Záver</w:t>
-        </w:r>
-        <w:r>
-          <w:rPr>
-            <w:noProof/>
-            <w:webHidden/>
+            <w:lang w:val="sk-SK"/>
+          </w:rPr>
+          <w:t>8</w:t>
+        </w:r>
+        <w:r>
+          <w:rPr>
+            <w:rFonts w:asciiTheme="minorHAnsi" w:eastAsiaTheme="minorEastAsia" w:hAnsiTheme="minorHAnsi" w:cstheme="minorBidi"/>
+            <w:b w:val="0"/>
+            <w:bCs w:val="0"/>
+            <w:noProof/>
+            <w:sz w:val="24"/>
+            <w:szCs w:val="24"/>
           </w:rPr>
           <w:tab/>
         </w:r>
         <w:r>
           <w:rPr>
+            <w:rStyle w:val="Hyperlink"/>
+            <w:noProof/>
+            <w:lang w:val="sk-SK"/>
+          </w:rPr>
+          <w:t>Analýza súčasného stavu problematiky</w:t>
+        </w:r>
+        <w:r>
+          <w:rPr>
+            <w:noProof/>
+            <w:webHidden/>
+          </w:rPr>
+          <w:tab/>
+        </w:r>
+        <w:r>
+          <w:rPr>
             <w:noProof/>
             <w:webHidden/>
           </w:rPr>
@@ -5766,7 +5719,7 @@
             <w:noProof/>
             <w:webHidden/>
           </w:rPr>
-          <w:instrText xml:space="preserve"> PAGEREF _Toc227514445 \h </w:instrText>
+          <w:instrText xml:space="preserve"> PAGEREF _Toc227520168 \h </w:instrText>
         </w:r>
         <w:r>
           <w:rPr>
@@ -5787,6 +5740,349 @@
             <w:webHidden/>
           </w:rPr>
           <w:t>37</w:t>
+        </w:r>
+        <w:r>
+          <w:rPr>
+            <w:noProof/>
+            <w:webHidden/>
+          </w:rPr>
+          <w:fldChar w:fldCharType="end"/>
+        </w:r>
+      </w:hyperlink>
+    </w:p>
+    <w:p>
+      <w:pPr>
+        <w:pStyle w:val="TOC2"/>
+        <w:rPr>
+          <w:rFonts w:asciiTheme="minorHAnsi" w:eastAsiaTheme="minorEastAsia" w:hAnsiTheme="minorHAnsi" w:cstheme="minorBidi"/>
+          <w:iCs w:val="0"/>
+          <w:noProof/>
+          <w:szCs w:val="24"/>
+        </w:rPr>
+      </w:pPr>
+      <w:hyperlink w:anchor="_Toc227520169" w:history="1">
+        <w:r>
+          <w:rPr>
+            <w:rStyle w:val="Hyperlink"/>
+            <w:noProof/>
+            <w:lang w:val="sk-SK"/>
+          </w:rPr>
+          <w:t>8.1 Prístup založený na transfer learningu a časových sekvenciách</w:t>
+        </w:r>
+        <w:r>
+          <w:rPr>
+            <w:noProof/>
+            <w:webHidden/>
+          </w:rPr>
+          <w:tab/>
+        </w:r>
+        <w:r>
+          <w:rPr>
+            <w:noProof/>
+            <w:webHidden/>
+          </w:rPr>
+          <w:fldChar w:fldCharType="begin"/>
+        </w:r>
+        <w:r>
+          <w:rPr>
+            <w:noProof/>
+            <w:webHidden/>
+          </w:rPr>
+          <w:instrText xml:space="preserve"> PAGEREF _Toc227520169 \h </w:instrText>
+        </w:r>
+        <w:r>
+          <w:rPr>
+            <w:noProof/>
+            <w:webHidden/>
+          </w:rPr>
+        </w:r>
+        <w:r>
+          <w:rPr>
+            <w:noProof/>
+            <w:webHidden/>
+          </w:rPr>
+          <w:fldChar w:fldCharType="separate"/>
+        </w:r>
+        <w:r>
+          <w:rPr>
+            <w:noProof/>
+            <w:webHidden/>
+          </w:rPr>
+          <w:t>37</w:t>
+        </w:r>
+        <w:r>
+          <w:rPr>
+            <w:noProof/>
+            <w:webHidden/>
+          </w:rPr>
+          <w:fldChar w:fldCharType="end"/>
+        </w:r>
+      </w:hyperlink>
+    </w:p>
+    <w:p>
+      <w:pPr>
+        <w:pStyle w:val="TOC2"/>
+        <w:rPr>
+          <w:rFonts w:asciiTheme="minorHAnsi" w:eastAsiaTheme="minorEastAsia" w:hAnsiTheme="minorHAnsi" w:cstheme="minorBidi"/>
+          <w:iCs w:val="0"/>
+          <w:noProof/>
+          <w:szCs w:val="24"/>
+        </w:rPr>
+      </w:pPr>
+      <w:hyperlink w:anchor="_Toc227520170" w:history="1">
+        <w:r>
+          <w:rPr>
+            <w:rStyle w:val="Hyperlink"/>
+            <w:noProof/>
+            <w:lang w:val="sk-SK"/>
+          </w:rPr>
+          <w:t>8.2 Predikcia vývoja oblohy a odstránenie fisheye deformácie snímok</w:t>
+        </w:r>
+        <w:r>
+          <w:rPr>
+            <w:noProof/>
+            <w:webHidden/>
+          </w:rPr>
+          <w:tab/>
+        </w:r>
+        <w:r>
+          <w:rPr>
+            <w:noProof/>
+            <w:webHidden/>
+          </w:rPr>
+          <w:fldChar w:fldCharType="begin"/>
+        </w:r>
+        <w:r>
+          <w:rPr>
+            <w:noProof/>
+            <w:webHidden/>
+          </w:rPr>
+          <w:instrText xml:space="preserve"> PAGEREF _Toc227520170 \h </w:instrText>
+        </w:r>
+        <w:r>
+          <w:rPr>
+            <w:noProof/>
+            <w:webHidden/>
+          </w:rPr>
+        </w:r>
+        <w:r>
+          <w:rPr>
+            <w:noProof/>
+            <w:webHidden/>
+          </w:rPr>
+          <w:fldChar w:fldCharType="separate"/>
+        </w:r>
+        <w:r>
+          <w:rPr>
+            <w:noProof/>
+            <w:webHidden/>
+          </w:rPr>
+          <w:t>37</w:t>
+        </w:r>
+        <w:r>
+          <w:rPr>
+            <w:noProof/>
+            <w:webHidden/>
+          </w:rPr>
+          <w:fldChar w:fldCharType="end"/>
+        </w:r>
+      </w:hyperlink>
+    </w:p>
+    <w:p>
+      <w:pPr>
+        <w:pStyle w:val="TOC2"/>
+        <w:rPr>
+          <w:rFonts w:asciiTheme="minorHAnsi" w:eastAsiaTheme="minorEastAsia" w:hAnsiTheme="minorHAnsi" w:cstheme="minorBidi"/>
+          <w:iCs w:val="0"/>
+          <w:noProof/>
+          <w:szCs w:val="24"/>
+        </w:rPr>
+      </w:pPr>
+      <w:hyperlink w:anchor="_Toc227520171" w:history="1">
+        <w:r>
+          <w:rPr>
+            <w:rStyle w:val="Hyperlink"/>
+            <w:noProof/>
+            <w:lang w:val="sk-SK"/>
+          </w:rPr>
+          <w:t>8.3 Kombinácia extrakcie príznakov a klasických metód</w:t>
+        </w:r>
+        <w:r>
+          <w:rPr>
+            <w:noProof/>
+            <w:webHidden/>
+          </w:rPr>
+          <w:tab/>
+        </w:r>
+        <w:r>
+          <w:rPr>
+            <w:noProof/>
+            <w:webHidden/>
+          </w:rPr>
+          <w:fldChar w:fldCharType="begin"/>
+        </w:r>
+        <w:r>
+          <w:rPr>
+            <w:noProof/>
+            <w:webHidden/>
+          </w:rPr>
+          <w:instrText xml:space="preserve"> PAGEREF _Toc227520171 \h </w:instrText>
+        </w:r>
+        <w:r>
+          <w:rPr>
+            <w:noProof/>
+            <w:webHidden/>
+          </w:rPr>
+        </w:r>
+        <w:r>
+          <w:rPr>
+            <w:noProof/>
+            <w:webHidden/>
+          </w:rPr>
+          <w:fldChar w:fldCharType="separate"/>
+        </w:r>
+        <w:r>
+          <w:rPr>
+            <w:noProof/>
+            <w:webHidden/>
+          </w:rPr>
+          <w:t>38</w:t>
+        </w:r>
+        <w:r>
+          <w:rPr>
+            <w:noProof/>
+            <w:webHidden/>
+          </w:rPr>
+          <w:fldChar w:fldCharType="end"/>
+        </w:r>
+      </w:hyperlink>
+    </w:p>
+    <w:p>
+      <w:pPr>
+        <w:pStyle w:val="TOC2"/>
+        <w:rPr>
+          <w:rFonts w:asciiTheme="minorHAnsi" w:eastAsiaTheme="minorEastAsia" w:hAnsiTheme="minorHAnsi" w:cstheme="minorBidi"/>
+          <w:iCs w:val="0"/>
+          <w:noProof/>
+          <w:szCs w:val="24"/>
+        </w:rPr>
+      </w:pPr>
+      <w:hyperlink w:anchor="_Toc227520172" w:history="1">
+        <w:r>
+          <w:rPr>
+            <w:rStyle w:val="Hyperlink"/>
+            <w:noProof/>
+            <w:lang w:val="sk-SK"/>
+          </w:rPr>
+          <w:t>8.4 Zhrnutie a porovnanie analyzovaných riešení</w:t>
+        </w:r>
+        <w:r>
+          <w:rPr>
+            <w:noProof/>
+            <w:webHidden/>
+          </w:rPr>
+          <w:tab/>
+        </w:r>
+        <w:r>
+          <w:rPr>
+            <w:noProof/>
+            <w:webHidden/>
+          </w:rPr>
+          <w:fldChar w:fldCharType="begin"/>
+        </w:r>
+        <w:r>
+          <w:rPr>
+            <w:noProof/>
+            <w:webHidden/>
+          </w:rPr>
+          <w:instrText xml:space="preserve"> PAGEREF _Toc227520172 \h </w:instrText>
+        </w:r>
+        <w:r>
+          <w:rPr>
+            <w:noProof/>
+            <w:webHidden/>
+          </w:rPr>
+        </w:r>
+        <w:r>
+          <w:rPr>
+            <w:noProof/>
+            <w:webHidden/>
+          </w:rPr>
+          <w:fldChar w:fldCharType="separate"/>
+        </w:r>
+        <w:r>
+          <w:rPr>
+            <w:noProof/>
+            <w:webHidden/>
+          </w:rPr>
+          <w:t>38</w:t>
+        </w:r>
+        <w:r>
+          <w:rPr>
+            <w:noProof/>
+            <w:webHidden/>
+          </w:rPr>
+          <w:fldChar w:fldCharType="end"/>
+        </w:r>
+      </w:hyperlink>
+    </w:p>
+    <w:p>
+      <w:pPr>
+        <w:pStyle w:val="TOC3"/>
+        <w:rPr>
+          <w:rFonts w:asciiTheme="minorHAnsi" w:eastAsiaTheme="minorEastAsia" w:hAnsiTheme="minorHAnsi" w:cstheme="minorBidi"/>
+          <w:noProof/>
+          <w:szCs w:val="24"/>
+        </w:rPr>
+      </w:pPr>
+      <w:hyperlink w:anchor="_Toc227520173" w:history="1">
+        <w:r>
+          <w:rPr>
+            <w:rStyle w:val="Hyperlink"/>
+            <w:noProof/>
+          </w:rPr>
+          <w:t>8.4.1 Záver</w:t>
+        </w:r>
+        <w:r>
+          <w:rPr>
+            <w:noProof/>
+            <w:webHidden/>
+          </w:rPr>
+          <w:tab/>
+        </w:r>
+        <w:r>
+          <w:rPr>
+            <w:noProof/>
+            <w:webHidden/>
+          </w:rPr>
+          <w:fldChar w:fldCharType="begin"/>
+        </w:r>
+        <w:r>
+          <w:rPr>
+            <w:noProof/>
+            <w:webHidden/>
+          </w:rPr>
+          <w:instrText xml:space="preserve"> PAGEREF _Toc227520173 \h </w:instrText>
+        </w:r>
+        <w:r>
+          <w:rPr>
+            <w:noProof/>
+            <w:webHidden/>
+          </w:rPr>
+        </w:r>
+        <w:r>
+          <w:rPr>
+            <w:noProof/>
+            <w:webHidden/>
+          </w:rPr>
+          <w:fldChar w:fldCharType="separate"/>
+        </w:r>
+        <w:r>
+          <w:rPr>
+            <w:noProof/>
+            <w:webHidden/>
+          </w:rPr>
+          <w:t>39</w:t>
         </w:r>
         <w:r>
           <w:rPr>
@@ -5810,13 +6106,13 @@
           <w:szCs w:val="24"/>
         </w:rPr>
       </w:pPr>
-      <w:hyperlink w:anchor="_Toc227514446" w:history="1">
+      <w:hyperlink w:anchor="_Toc227520174" w:history="1">
         <w:r>
           <w:rPr>
             <w:rStyle w:val="Hyperlink"/>
             <w:noProof/>
           </w:rPr>
-          <w:t>Literatúra</w:t>
+          <w:t>Záver</w:t>
         </w:r>
         <w:r>
           <w:rPr>
@@ -5837,7 +6133,7 @@
             <w:noProof/>
             <w:webHidden/>
           </w:rPr>
-          <w:instrText xml:space="preserve"> PAGEREF _Toc227514446 \h </w:instrText>
+          <w:instrText xml:space="preserve"> PAGEREF _Toc227520174 \h </w:instrText>
         </w:r>
         <w:r>
           <w:rPr>
@@ -5857,7 +6153,7 @@
             <w:noProof/>
             <w:webHidden/>
           </w:rPr>
-          <w:t>38</w:t>
+          <w:t>41</w:t>
         </w:r>
         <w:r>
           <w:rPr>
@@ -5881,12 +6177,83 @@
           <w:szCs w:val="24"/>
         </w:rPr>
       </w:pPr>
-      <w:hyperlink w:anchor="_Toc227514447" w:history="1">
+      <w:hyperlink w:anchor="_Toc227520175" w:history="1">
         <w:r>
           <w:rPr>
             <w:rStyle w:val="Hyperlink"/>
             <w:noProof/>
           </w:rPr>
+          <w:t>Literatúra</w:t>
+        </w:r>
+        <w:r>
+          <w:rPr>
+            <w:noProof/>
+            <w:webHidden/>
+          </w:rPr>
+          <w:tab/>
+        </w:r>
+        <w:r>
+          <w:rPr>
+            <w:noProof/>
+            <w:webHidden/>
+          </w:rPr>
+          <w:fldChar w:fldCharType="begin"/>
+        </w:r>
+        <w:r>
+          <w:rPr>
+            <w:noProof/>
+            <w:webHidden/>
+          </w:rPr>
+          <w:instrText xml:space="preserve"> PAGEREF _Toc227520175 \h </w:instrText>
+        </w:r>
+        <w:r>
+          <w:rPr>
+            <w:noProof/>
+            <w:webHidden/>
+          </w:rPr>
+        </w:r>
+        <w:r>
+          <w:rPr>
+            <w:noProof/>
+            <w:webHidden/>
+          </w:rPr>
+          <w:fldChar w:fldCharType="separate"/>
+        </w:r>
+        <w:r>
+          <w:rPr>
+            <w:noProof/>
+            <w:webHidden/>
+          </w:rPr>
+          <w:t>42</w:t>
+        </w:r>
+        <w:r>
+          <w:rPr>
+            <w:noProof/>
+            <w:webHidden/>
+          </w:rPr>
+          <w:fldChar w:fldCharType="end"/>
+        </w:r>
+      </w:hyperlink>
+    </w:p>
+    <w:p>
+      <w:pPr>
+        <w:pStyle w:val="TOC1"/>
+        <w:spacing w:before="240"/>
+        <w:rPr>
+          <w:rFonts w:asciiTheme="minorHAnsi" w:eastAsiaTheme="minorEastAsia" w:hAnsiTheme="minorHAnsi" w:cstheme="minorBidi"/>
+          <w:b w:val="0"/>
+          <w:bCs w:val="0"/>
+          <w:noProof/>
+          <w:sz w:val="24"/>
+          <w:szCs w:val="24"/>
+        </w:rPr>
+      </w:pPr>
+      <w:hyperlink w:anchor="_Toc227520176" w:history="1">
+        <w:r>
+          <w:rPr>
+            <w:rStyle w:val="Hyperlink"/>
+            <w:noProof/>
+          </w:rPr>
           <w:t>Prílohy</w:t>
         </w:r>
         <w:r>
@@ -5908,7 +6275,7 @@
             <w:noProof/>
             <w:webHidden/>
           </w:rPr>
-          <w:instrText xml:space="preserve"> PAGEREF _Toc227514447 \h </w:instrText>
+          <w:instrText xml:space="preserve"> PAGEREF _Toc227520176 \h </w:instrText>
         </w:r>
         <w:r>
           <w:rPr>
@@ -5928,7 +6295,7 @@
             <w:noProof/>
             <w:webHidden/>
           </w:rPr>
-          <w:t>43</w:t>
+          <w:t>47</w:t>
         </w:r>
         <w:r>
           <w:rPr>
@@ -5956,7 +6323,7 @@
         <w:lastRenderedPageBreak/>
         <w:fldChar w:fldCharType="end"/>
       </w:r>
-      <w:bookmarkStart w:id="4" w:name="_Toc227514379"/>
+      <w:bookmarkStart w:id="4" w:name="_Toc227520103"/>
       <w:r>
         <w:t>Zoznam obrázkov</w:t>
       </w:r>
@@ -5989,7 +6356,7 @@
         </w:rPr>
         <w:fldChar w:fldCharType="separate"/>
       </w:r>
-      <w:hyperlink w:anchor="_Toc227514366" w:history="1">
+      <w:hyperlink w:anchor="_Toc227520090" w:history="1">
         <w:r>
           <w:rPr>
             <w:rStyle w:val="Hyperlink"/>
@@ -6017,7 +6384,7 @@
             <w:noProof/>
             <w:webHidden/>
           </w:rPr>
-          <w:instrText xml:space="preserve"> PAGEREF _Toc227514366 \h </w:instrText>
+          <w:instrText xml:space="preserve"> PAGEREF _Toc227520090 \h </w:instrText>
         </w:r>
         <w:r>
           <w:rPr>
@@ -6060,7 +6427,7 @@
           <w:noProof/>
         </w:rPr>
       </w:pPr>
-      <w:hyperlink w:anchor="_Toc227514367" w:history="1">
+      <w:hyperlink w:anchor="_Toc227520091" w:history="1">
         <w:r>
           <w:rPr>
             <w:rStyle w:val="Hyperlink"/>
@@ -6088,7 +6455,7 @@
             <w:noProof/>
             <w:webHidden/>
           </w:rPr>
-          <w:instrText xml:space="preserve"> PAGEREF _Toc227514367 \h </w:instrText>
+          <w:instrText xml:space="preserve"> PAGEREF _Toc227520091 \h </w:instrText>
         </w:r>
         <w:r>
           <w:rPr>
@@ -6131,7 +6498,7 @@
           <w:noProof/>
         </w:rPr>
       </w:pPr>
-      <w:hyperlink w:anchor="_Toc227514368" w:history="1">
+      <w:hyperlink w:anchor="_Toc227520092" w:history="1">
         <w:r>
           <w:rPr>
             <w:rStyle w:val="Hyperlink"/>
@@ -6159,7 +6526,7 @@
             <w:noProof/>
             <w:webHidden/>
           </w:rPr>
-          <w:instrText xml:space="preserve"> PAGEREF _Toc227514368 \h </w:instrText>
+          <w:instrText xml:space="preserve"> PAGEREF _Toc227520092 \h </w:instrText>
         </w:r>
         <w:r>
           <w:rPr>
@@ -6202,7 +6569,7 @@
           <w:noProof/>
         </w:rPr>
       </w:pPr>
-      <w:hyperlink w:anchor="_Toc227514369" w:history="1">
+      <w:hyperlink w:anchor="_Toc227520093" w:history="1">
         <w:r>
           <w:rPr>
             <w:rStyle w:val="Hyperlink"/>
@@ -6230,7 +6597,7 @@
             <w:noProof/>
             <w:webHidden/>
           </w:rPr>
-          <w:instrText xml:space="preserve"> PAGEREF _Toc227514369 \h </w:instrText>
+          <w:instrText xml:space="preserve"> PAGEREF _Toc227520093 \h </w:instrText>
         </w:r>
         <w:r>
           <w:rPr>
@@ -6273,7 +6640,7 @@
           <w:noProof/>
         </w:rPr>
       </w:pPr>
-      <w:hyperlink w:anchor="_Toc227514370" w:history="1">
+      <w:hyperlink w:anchor="_Toc227520094" w:history="1">
         <w:r>
           <w:rPr>
             <w:rStyle w:val="Hyperlink"/>
@@ -6301,7 +6668,7 @@
             <w:noProof/>
             <w:webHidden/>
           </w:rPr>
-          <w:instrText xml:space="preserve"> PAGEREF _Toc227514370 \h </w:instrText>
+          <w:instrText xml:space="preserve"> PAGEREF _Toc227520094 \h </w:instrText>
         </w:r>
         <w:r>
           <w:rPr>
@@ -6344,7 +6711,7 @@
           <w:noProof/>
         </w:rPr>
       </w:pPr>
-      <w:hyperlink w:anchor="_Toc227514371" w:history="1">
+      <w:hyperlink w:anchor="_Toc227520095" w:history="1">
         <w:r>
           <w:rPr>
             <w:rStyle w:val="Hyperlink"/>
@@ -6372,7 +6739,7 @@
             <w:noProof/>
             <w:webHidden/>
           </w:rPr>
-          <w:instrText xml:space="preserve"> PAGEREF _Toc227514371 \h </w:instrText>
+          <w:instrText xml:space="preserve"> PAGEREF _Toc227520095 \h </w:instrText>
         </w:r>
         <w:r>
           <w:rPr>
@@ -6415,7 +6782,7 @@
           <w:noProof/>
         </w:rPr>
       </w:pPr>
-      <w:hyperlink w:anchor="_Toc227514372" w:history="1">
+      <w:hyperlink w:anchor="_Toc227520096" w:history="1">
         <w:r>
           <w:rPr>
             <w:rStyle w:val="Hyperlink"/>
@@ -6443,7 +6810,7 @@
             <w:noProof/>
             <w:webHidden/>
           </w:rPr>
-          <w:instrText xml:space="preserve"> PAGEREF _Toc227514372 \h </w:instrText>
+          <w:instrText xml:space="preserve"> PAGEREF _Toc227520096 \h </w:instrText>
         </w:r>
         <w:r>
           <w:rPr>
@@ -6486,7 +6853,7 @@
           <w:noProof/>
         </w:rPr>
       </w:pPr>
-      <w:hyperlink w:anchor="_Toc227514373" w:history="1">
+      <w:hyperlink w:anchor="_Toc227520097" w:history="1">
         <w:r>
           <w:rPr>
             <w:rStyle w:val="Hyperlink"/>
@@ -6548,7 +6915,7 @@
             <w:noProof/>
             <w:webHidden/>
           </w:rPr>
-          <w:instrText xml:space="preserve"> PAGEREF _Toc227514373 \h </w:instrText>
+          <w:instrText xml:space="preserve"> PAGEREF _Toc227520097 \h </w:instrText>
         </w:r>
         <w:r>
           <w:rPr>
@@ -6591,7 +6958,7 @@
           <w:noProof/>
         </w:rPr>
       </w:pPr>
-      <w:hyperlink w:anchor="_Toc227514374" w:history="1">
+      <w:hyperlink w:anchor="_Toc227520098" w:history="1">
         <w:r>
           <w:rPr>
             <w:rStyle w:val="Hyperlink"/>
@@ -6653,7 +7020,7 @@
             <w:noProof/>
             <w:webHidden/>
           </w:rPr>
-          <w:instrText xml:space="preserve"> PAGEREF _Toc227514374 \h </w:instrText>
+          <w:instrText xml:space="preserve"> PAGEREF _Toc227520098 \h </w:instrText>
         </w:r>
         <w:r>
           <w:rPr>
@@ -6696,7 +7063,7 @@
           <w:noProof/>
         </w:rPr>
       </w:pPr>
-      <w:hyperlink w:anchor="_Toc227514375" w:history="1">
+      <w:hyperlink w:anchor="_Toc227520099" w:history="1">
         <w:r>
           <w:rPr>
             <w:rStyle w:val="Hyperlink"/>
@@ -6758,7 +7125,7 @@
             <w:noProof/>
             <w:webHidden/>
           </w:rPr>
-          <w:instrText xml:space="preserve"> PAGEREF _Toc227514375 \h </w:instrText>
+          <w:instrText xml:space="preserve"> PAGEREF _Toc227520099 \h </w:instrText>
         </w:r>
         <w:r>
           <w:rPr>
@@ -6801,7 +7168,7 @@
           <w:noProof/>
         </w:rPr>
       </w:pPr>
-      <w:hyperlink w:anchor="_Toc227514376" w:history="1">
+      <w:hyperlink w:anchor="_Toc227520100" w:history="1">
         <w:r>
           <w:rPr>
             <w:rStyle w:val="Hyperlink"/>
@@ -6863,7 +7230,7 @@
             <w:noProof/>
             <w:webHidden/>
           </w:rPr>
-          <w:instrText xml:space="preserve"> PAGEREF _Toc227514376 \h </w:instrText>
+          <w:instrText xml:space="preserve"> PAGEREF _Toc227520100 \h </w:instrText>
         </w:r>
         <w:r>
           <w:rPr>
@@ -6906,7 +7273,7 @@
           <w:noProof/>
         </w:rPr>
       </w:pPr>
-      <w:hyperlink w:anchor="_Toc227514377" w:history="1">
+      <w:hyperlink w:anchor="_Toc227520101" w:history="1">
         <w:r>
           <w:rPr>
             <w:rStyle w:val="Hyperlink"/>
@@ -6943,7 +7310,7 @@
             <w:noProof/>
             <w:webHidden/>
           </w:rPr>
-          <w:instrText xml:space="preserve"> PAGEREF _Toc227514377 \h </w:instrText>
+          <w:instrText xml:space="preserve"> PAGEREF _Toc227520101 \h </w:instrText>
         </w:r>
         <w:r>
           <w:rPr>
@@ -6986,7 +7353,7 @@
           <w:noProof/>
         </w:rPr>
       </w:pPr>
-      <w:hyperlink w:anchor="_Toc227514378" w:history="1">
+      <w:hyperlink w:anchor="_Toc227520102" w:history="1">
         <w:r>
           <w:rPr>
             <w:rStyle w:val="Hyperlink"/>
@@ -7023,7 +7390,7 @@
             <w:noProof/>
             <w:webHidden/>
           </w:rPr>
-          <w:instrText xml:space="preserve"> PAGEREF _Toc227514378 \h </w:instrText>
+          <w:instrText xml:space="preserve"> PAGEREF _Toc227520102 \h </w:instrText>
         </w:r>
         <w:r>
           <w:rPr>
@@ -7064,7 +7431,7 @@
         <w:lastRenderedPageBreak/>
         <w:fldChar w:fldCharType="end"/>
       </w:r>
-      <w:bookmarkStart w:id="5" w:name="_Toc227514380"/>
+      <w:bookmarkStart w:id="5" w:name="_Toc227520104"/>
       <w:r>
         <w:t>Zoznam tabuliek</w:t>
       </w:r>
@@ -7398,7 +7765,7 @@
         <w:lastRenderedPageBreak/>
         <w:fldChar w:fldCharType="end"/>
       </w:r>
-      <w:bookmarkStart w:id="6" w:name="_Toc227514381"/>
+      <w:bookmarkStart w:id="6" w:name="_Toc227520105"/>
       <w:r>
         <w:t>Zoznam značiek a skratiek</w:t>
       </w:r>
@@ -8011,6 +8378,59 @@
           <w:lang w:val="sk-SK"/>
         </w:rPr>
       </w:pPr>
+      <w:r>
+        <w:rPr>
+          <w:rFonts w:eastAsiaTheme="minorEastAsia"/>
+          <w:lang w:val="sk-SK"/>
+        </w:rPr>
+        <w:t xml:space="preserve">TSI – označenie datasetu: celooblohový zobrazovač za angl. </w:t>
+      </w:r>
+      <w:r>
+        <w:rPr>
+          <w:rFonts w:eastAsiaTheme="minorEastAsia"/>
+          <w:i/>
+          <w:iCs/>
+          <w:lang w:val="sk-SK"/>
+        </w:rPr>
+        <w:t>Total Sky Imager</w:t>
+      </w:r>
+    </w:p>
+    <w:p>
+      <w:pPr>
+        <w:pStyle w:val="List"/>
+        <w:rPr>
+          <w:rFonts w:eastAsiaTheme="minorEastAsia"/>
+          <w:i/>
+          <w:iCs/>
+          <w:lang w:val="sk-SK"/>
+        </w:rPr>
+      </w:pPr>
+      <w:r>
+        <w:t>PSNR</w:t>
+      </w:r>
+      <w:r>
+        <w:rPr>
+          <w:lang w:val="sk-SK"/>
+        </w:rPr>
+        <w:t xml:space="preserve"> – špičkový pomer signálu k šumu z angl. </w:t>
+      </w:r>
+      <w:r>
+        <w:rPr>
+          <w:i/>
+          <w:iCs/>
+          <w:lang w:val="sk-SK"/>
+        </w:rPr>
+        <w:t>Peak Signal-to-Noise Ratio</w:t>
+      </w:r>
+    </w:p>
+    <w:p>
+      <w:pPr>
+        <w:pStyle w:val="List"/>
+        <w:rPr>
+          <w:rFonts w:eastAsiaTheme="minorEastAsia"/>
+          <w:lang w:val="sk-SK"/>
+        </w:rPr>
+      </w:pPr>
     </w:p>
     <w:p>
       <w:pPr>
@@ -8019,7 +8439,7 @@
       </w:pPr>
       <w:bookmarkStart w:id="7" w:name="_Toc173791394"/>
       <w:bookmarkStart w:id="8" w:name="_Toc173791533"/>
-      <w:bookmarkStart w:id="9" w:name="_Toc227514382"/>
+      <w:bookmarkStart w:id="9" w:name="_Toc227520106"/>
       <w:r>
         <w:lastRenderedPageBreak/>
         <w:t>Úvod</w:t>
@@ -8239,7 +8659,7 @@
       <w:r>
         <w:fldChar w:fldCharType="end"/>
       </w:r>
-      <w:bookmarkStart w:id="11" w:name="_Toc227514383"/>
+      <w:bookmarkStart w:id="11" w:name="_Toc227520107"/>
       <w:r>
         <w:t>Slnečné žiarenie a jeho význam</w:t>
       </w:r>
@@ -8250,7 +8670,7 @@
         <w:pStyle w:val="Heading2"/>
         <w:spacing w:before="480" w:after="240"/>
       </w:pPr>
-      <w:bookmarkStart w:id="12" w:name="_Toc227514384"/>
+      <w:bookmarkStart w:id="12" w:name="_Toc227520108"/>
       <w:r>
         <w:t>Charakteristika slnečného žiarenia</w:t>
       </w:r>
@@ -8295,7 +8715,7 @@
         <w:pStyle w:val="Heading2"/>
         <w:spacing w:before="480" w:after="240"/>
       </w:pPr>
-      <w:bookmarkStart w:id="13" w:name="_Toc227514385"/>
+      <w:bookmarkStart w:id="13" w:name="_Toc227520109"/>
       <w:r>
         <w:t>Význam a využitie v energetike</w:t>
       </w:r>
@@ -8437,7 +8857,7 @@
           <w14:ligatures w14:val="standardContextual"/>
         </w:rPr>
       </w:pPr>
-      <w:bookmarkStart w:id="14" w:name="_Toc227514366"/>
+      <w:bookmarkStart w:id="14" w:name="_Toc227520090"/>
       <w:r>
         <w:t xml:space="preserve">Obr. </w:t>
       </w:r>
@@ -8542,7 +8962,7 @@
           <w14:ligatures w14:val="standardContextual"/>
         </w:rPr>
       </w:pPr>
-      <w:bookmarkStart w:id="15" w:name="_Toc227514367"/>
+      <w:bookmarkStart w:id="15" w:name="_Toc227520091"/>
       <w:r>
         <w:t xml:space="preserve">Obr. </w:t>
       </w:r>
@@ -8640,7 +9060,7 @@
         <w:pStyle w:val="Heading2"/>
         <w:spacing w:before="480" w:after="240"/>
       </w:pPr>
-      <w:bookmarkStart w:id="16" w:name="_Toc227514386"/>
+      <w:bookmarkStart w:id="16" w:name="_Toc227520110"/>
       <w:r>
         <w:lastRenderedPageBreak/>
         <w:t>Meranie slnečného žiarenia</w:t>
@@ -8697,7 +9117,7 @@
       <w:r>
         <w:fldChar w:fldCharType="end"/>
       </w:r>
-      <w:bookmarkStart w:id="17" w:name="_Toc227514387"/>
+      <w:bookmarkStart w:id="17" w:name="_Toc227520111"/>
       <w:r>
         <w:t>Celooblohové zobrazovacie systémy</w:t>
       </w:r>
@@ -8750,7 +9170,7 @@
         <w:pStyle w:val="Heading2"/>
         <w:spacing w:before="480" w:after="240"/>
       </w:pPr>
-      <w:bookmarkStart w:id="18" w:name="_Toc227514388"/>
+      <w:bookmarkStart w:id="18" w:name="_Toc227520112"/>
       <w:r>
         <w:t>Fisheye kamery</w:t>
       </w:r>
@@ -8776,7 +9196,7 @@
         <w:pStyle w:val="Heading2"/>
         <w:spacing w:before="480" w:after="240"/>
       </w:pPr>
-      <w:bookmarkStart w:id="19" w:name="_Toc227514389"/>
+      <w:bookmarkStart w:id="19" w:name="_Toc227520113"/>
       <w:r>
         <w:t>Geometrické skreslenie a charakteristiky obrazu</w:t>
       </w:r>
@@ -8915,7 +9335,7 @@
           <w14:ligatures w14:val="standardContextual"/>
         </w:rPr>
       </w:pPr>
-      <w:bookmarkStart w:id="20" w:name="_Toc227514368"/>
+      <w:bookmarkStart w:id="20" w:name="_Toc227520092"/>
       <w:r>
         <w:t xml:space="preserve">Obr. </w:t>
       </w:r>
@@ -9001,7 +9421,7 @@
       <w:r>
         <w:fldChar w:fldCharType="end"/>
       </w:r>
-      <w:bookmarkStart w:id="21" w:name="_Toc227514390"/>
+      <w:bookmarkStart w:id="21" w:name="_Toc227520114"/>
       <w:r>
         <w:t>Predspracovanie obrazových dát</w:t>
       </w:r>
@@ -9012,7 +9432,7 @@
         <w:pStyle w:val="Heading2"/>
         <w:spacing w:before="480" w:after="240"/>
       </w:pPr>
-      <w:bookmarkStart w:id="22" w:name="_Toc227514391"/>
+      <w:bookmarkStart w:id="22" w:name="_Toc227520115"/>
       <w:r>
         <w:t>Základný postup predspracovania</w:t>
       </w:r>
@@ -9099,7 +9519,7 @@
       <w:pPr>
         <w:pStyle w:val="Heading3"/>
       </w:pPr>
-      <w:bookmarkStart w:id="23" w:name="_Toc227514392"/>
+      <w:bookmarkStart w:id="23" w:name="_Toc227520116"/>
       <w:r>
         <w:t>Zmena veľkosti obrazu</w:t>
       </w:r>
@@ -9124,7 +9544,7 @@
       <w:pPr>
         <w:pStyle w:val="Heading3"/>
       </w:pPr>
-      <w:bookmarkStart w:id="24" w:name="_Toc227514393"/>
+      <w:bookmarkStart w:id="24" w:name="_Toc227520117"/>
       <w:r>
         <w:t>Transformácia farebného obrazu</w:t>
       </w:r>
@@ -9234,7 +9654,7 @@
       <w:pPr>
         <w:pStyle w:val="Heading3"/>
       </w:pPr>
-      <w:bookmarkStart w:id="25" w:name="_Toc227514394"/>
+      <w:bookmarkStart w:id="25" w:name="_Toc227520118"/>
       <w:r>
         <w:lastRenderedPageBreak/>
         <w:t>Farebné priestory – RGB</w:t>
@@ -9346,7 +9766,7 @@
           <w14:ligatures w14:val="standardContextual"/>
         </w:rPr>
       </w:pPr>
-      <w:bookmarkStart w:id="26" w:name="_Toc227514369"/>
+      <w:bookmarkStart w:id="26" w:name="_Toc227520093"/>
       <w:r>
         <w:t xml:space="preserve">Obr. </w:t>
       </w:r>
@@ -9395,7 +9815,7 @@
       <w:pPr>
         <w:pStyle w:val="Heading3"/>
       </w:pPr>
-      <w:bookmarkStart w:id="27" w:name="_Toc227514395"/>
+      <w:bookmarkStart w:id="27" w:name="_Toc227520119"/>
       <w:r>
         <w:t>Farebné priestory – HSV</w:t>
       </w:r>
@@ -9500,7 +9920,7 @@
           <w14:ligatures w14:val="standardContextual"/>
         </w:rPr>
       </w:pPr>
-      <w:bookmarkStart w:id="28" w:name="_Toc227514370"/>
+      <w:bookmarkStart w:id="28" w:name="_Toc227520094"/>
       <w:r>
         <w:t xml:space="preserve">Obr. </w:t>
       </w:r>
@@ -9552,7 +9972,7 @@
       <w:pPr>
         <w:pStyle w:val="Heading3"/>
       </w:pPr>
-      <w:bookmarkStart w:id="29" w:name="_Toc227514396"/>
+      <w:bookmarkStart w:id="29" w:name="_Toc227520120"/>
       <w:r>
         <w:t>Farebné priestory – YCrCb</w:t>
       </w:r>
@@ -9846,7 +10266,7 @@
           <w14:ligatures w14:val="standardContextual"/>
         </w:rPr>
       </w:pPr>
-      <w:bookmarkStart w:id="30" w:name="_Toc227514371"/>
+      <w:bookmarkStart w:id="30" w:name="_Toc227520095"/>
       <w:r>
         <w:t xml:space="preserve">Obr. </w:t>
       </w:r>
@@ -9892,7 +10312,7 @@
       <w:pPr>
         <w:pStyle w:val="Heading3"/>
       </w:pPr>
-      <w:bookmarkStart w:id="31" w:name="_Toc227514397"/>
+      <w:bookmarkStart w:id="31" w:name="_Toc227520121"/>
       <w:r>
         <w:t>Farebné priestory – CMYK</w:t>
       </w:r>
@@ -10020,7 +10440,7 @@
       <w:pPr>
         <w:pStyle w:val="Caption"/>
       </w:pPr>
-      <w:bookmarkStart w:id="32" w:name="_Toc227514372"/>
+      <w:bookmarkStart w:id="32" w:name="_Toc227520096"/>
       <w:r>
         <w:t xml:space="preserve">Obr. </w:t>
       </w:r>
@@ -10066,7 +10486,7 @@
       <w:pPr>
         <w:pStyle w:val="Heading3"/>
       </w:pPr>
-      <w:bookmarkStart w:id="33" w:name="_Toc227514398"/>
+      <w:bookmarkStart w:id="33" w:name="_Toc227520122"/>
       <w:r>
         <w:t>Normalizácia dát</w:t>
       </w:r>
@@ -10109,7 +10529,7 @@
       <w:pPr>
         <w:pStyle w:val="Heading3"/>
       </w:pPr>
-      <w:bookmarkStart w:id="34" w:name="_Toc227514399"/>
+      <w:bookmarkStart w:id="34" w:name="_Toc227520123"/>
       <w:r>
         <w:lastRenderedPageBreak/>
         <w:t>Výber kanálu</w:t>
@@ -10139,7 +10559,7 @@
         <w:pStyle w:val="Heading2"/>
         <w:spacing w:before="480" w:after="240"/>
       </w:pPr>
-      <w:bookmarkStart w:id="35" w:name="_Toc227514400"/>
+      <w:bookmarkStart w:id="35" w:name="_Toc227520124"/>
       <w:r>
         <w:t>Dátové augmentácie</w:t>
       </w:r>
@@ -10219,7 +10639,7 @@
         <w:pStyle w:val="Heading2"/>
         <w:spacing w:before="480" w:after="240"/>
       </w:pPr>
-      <w:bookmarkStart w:id="36" w:name="_Toc227514401"/>
+      <w:bookmarkStart w:id="36" w:name="_Toc227520125"/>
       <w:r>
         <w:t>Geometrické augmentácie</w:t>
       </w:r>
@@ -10238,7 +10658,7 @@
       <w:pPr>
         <w:pStyle w:val="Heading3"/>
       </w:pPr>
-      <w:bookmarkStart w:id="37" w:name="_Toc227514402"/>
+      <w:bookmarkStart w:id="37" w:name="_Toc227520126"/>
       <w:r>
         <w:t>Rotácia</w:t>
       </w:r>
@@ -10260,7 +10680,7 @@
           <w:lang w:val="sk-SK"/>
         </w:rPr>
       </w:pPr>
-      <w:bookmarkStart w:id="38" w:name="_Toc227514403"/>
+      <w:bookmarkStart w:id="38" w:name="_Toc227520127"/>
       <w:r>
         <w:rPr>
           <w:lang w:val="sk-SK"/>
@@ -10291,7 +10711,7 @@
           <w:lang w:val="sk-SK"/>
         </w:rPr>
       </w:pPr>
-      <w:bookmarkStart w:id="39" w:name="_Toc227514404"/>
+      <w:bookmarkStart w:id="39" w:name="_Toc227520128"/>
       <w:r>
         <w:rPr>
           <w:lang w:val="sk-SK"/>
@@ -10333,7 +10753,7 @@
           <w:lang w:val="sk-SK"/>
         </w:rPr>
       </w:pPr>
-      <w:bookmarkStart w:id="40" w:name="_Toc227514405"/>
+      <w:bookmarkStart w:id="40" w:name="_Toc227520129"/>
       <w:r>
         <w:rPr>
           <w:lang w:val="sk-SK"/>
@@ -10357,7 +10777,7 @@
         <w:pStyle w:val="Heading2"/>
         <w:spacing w:before="480" w:after="240"/>
       </w:pPr>
-      <w:bookmarkStart w:id="41" w:name="_Toc227514406"/>
+      <w:bookmarkStart w:id="41" w:name="_Toc227520130"/>
       <w:r>
         <w:rPr>
           <w:lang w:val="sk-SK"/>
@@ -10385,7 +10805,7 @@
           <w:lang w:val="sk-SK"/>
         </w:rPr>
       </w:pPr>
-      <w:bookmarkStart w:id="42" w:name="_Toc227514407"/>
+      <w:bookmarkStart w:id="42" w:name="_Toc227520131"/>
       <w:r>
         <w:rPr>
           <w:lang w:val="sk-SK"/>
@@ -10410,7 +10830,7 @@
           <w:lang w:val="sk-SK"/>
         </w:rPr>
       </w:pPr>
-      <w:bookmarkStart w:id="43" w:name="_Toc227514408"/>
+      <w:bookmarkStart w:id="43" w:name="_Toc227520132"/>
       <w:r>
         <w:rPr>
           <w:lang w:val="sk-SK"/>
@@ -10435,7 +10855,7 @@
           <w:lang w:val="sk-SK"/>
         </w:rPr>
       </w:pPr>
-      <w:bookmarkStart w:id="44" w:name="_Toc227514409"/>
+      <w:bookmarkStart w:id="44" w:name="_Toc227520133"/>
       <w:r>
         <w:rPr>
           <w:lang w:val="sk-SK"/>
@@ -10573,7 +10993,7 @@
       <w:pPr>
         <w:pStyle w:val="Caption"/>
       </w:pPr>
-      <w:bookmarkStart w:id="45" w:name="_Toc227514373"/>
+      <w:bookmarkStart w:id="45" w:name="_Toc227520097"/>
       <w:r>
         <w:t xml:space="preserve">Obr. </w:t>
       </w:r>
@@ -10629,7 +11049,7 @@
         <w:pStyle w:val="Heading2"/>
         <w:spacing w:before="480" w:after="240"/>
       </w:pPr>
-      <w:bookmarkStart w:id="46" w:name="_Toc227514410"/>
+      <w:bookmarkStart w:id="46" w:name="_Toc227520134"/>
       <w:r>
         <w:rPr>
           <w:lang w:val="sk-SK"/>
@@ -10655,7 +11075,7 @@
           <w:lang w:val="sk-SK"/>
         </w:rPr>
       </w:pPr>
-      <w:bookmarkStart w:id="47" w:name="_Toc227514411"/>
+      <w:bookmarkStart w:id="47" w:name="_Toc227520135"/>
       <w:r>
         <w:rPr>
           <w:lang w:val="sk-SK"/>
@@ -10681,7 +11101,7 @@
           <w:lang w:val="sk-SK"/>
         </w:rPr>
       </w:pPr>
-      <w:bookmarkStart w:id="48" w:name="_Toc227514412"/>
+      <w:bookmarkStart w:id="48" w:name="_Toc227520136"/>
       <w:r>
         <w:rPr>
           <w:lang w:val="sk-SK"/>
@@ -10715,7 +11135,7 @@
           <w:lang w:val="sk-SK"/>
         </w:rPr>
       </w:pPr>
-      <w:bookmarkStart w:id="49" w:name="_Toc227514413"/>
+      <w:bookmarkStart w:id="49" w:name="_Toc227520137"/>
       <w:r>
         <w:rPr>
           <w:lang w:val="sk-SK"/>
@@ -10796,7 +11216,7 @@
       <w:pPr>
         <w:pStyle w:val="Caption"/>
       </w:pPr>
-      <w:bookmarkStart w:id="50" w:name="_Toc227514374"/>
+      <w:bookmarkStart w:id="50" w:name="_Toc227520098"/>
       <w:r>
         <w:t xml:space="preserve">Obr. </w:t>
       </w:r>
@@ -10857,7 +11277,7 @@
           <w:lang w:val="sk-SK"/>
         </w:rPr>
       </w:pPr>
-      <w:bookmarkStart w:id="51" w:name="_Toc227514414"/>
+      <w:bookmarkStart w:id="51" w:name="_Toc227520138"/>
       <w:r>
         <w:rPr>
           <w:lang w:val="sk-SK"/>
@@ -10938,7 +11358,7 @@
       <w:pPr>
         <w:pStyle w:val="Caption"/>
       </w:pPr>
-      <w:bookmarkStart w:id="52" w:name="_Toc227514375"/>
+      <w:bookmarkStart w:id="52" w:name="_Toc227520099"/>
       <w:r>
         <w:t xml:space="preserve">Obr. </w:t>
       </w:r>
@@ -11005,7 +11425,7 @@
           <w:lang w:val="sk-SK"/>
         </w:rPr>
       </w:pPr>
-      <w:bookmarkStart w:id="53" w:name="_Toc227514415"/>
+      <w:bookmarkStart w:id="53" w:name="_Toc227520139"/>
       <w:r>
         <w:rPr>
           <w:lang w:val="sk-SK"/>
@@ -11105,7 +11525,7 @@
       <w:pPr>
         <w:pStyle w:val="Caption"/>
       </w:pPr>
-      <w:bookmarkStart w:id="54" w:name="_Toc227514376"/>
+      <w:bookmarkStart w:id="54" w:name="_Toc227520100"/>
       <w:r>
         <w:t xml:space="preserve">Obr. </w:t>
       </w:r>
@@ -11175,7 +11595,7 @@
       <w:r>
         <w:fldChar w:fldCharType="end"/>
       </w:r>
-      <w:bookmarkStart w:id="55" w:name="_Toc227514416"/>
+      <w:bookmarkStart w:id="55" w:name="_Toc227520140"/>
       <w:r>
         <w:rPr>
           <w:lang w:val="sk-SK"/>
@@ -11195,7 +11615,7 @@
         <w:pStyle w:val="Heading2"/>
         <w:spacing w:before="480" w:after="240"/>
       </w:pPr>
-      <w:bookmarkStart w:id="56" w:name="_Toc227514417"/>
+      <w:bookmarkStart w:id="56" w:name="_Toc227520141"/>
       <w:r>
         <w:rPr>
           <w:lang w:val="sk-SK"/>
@@ -11235,7 +11655,7 @@
       <w:pPr>
         <w:pStyle w:val="Heading3"/>
       </w:pPr>
-      <w:bookmarkStart w:id="57" w:name="_Toc227514418"/>
+      <w:bookmarkStart w:id="57" w:name="_Toc227520142"/>
       <w:r>
         <w:rPr>
           <w:lang w:val="sk-SK"/>
@@ -11275,7 +11695,7 @@
       <w:pPr>
         <w:pStyle w:val="Heading3"/>
       </w:pPr>
-      <w:bookmarkStart w:id="58" w:name="_Toc227514419"/>
+      <w:bookmarkStart w:id="58" w:name="_Toc227520143"/>
       <w:r>
         <w:rPr>
           <w:lang w:val="sk-SK"/>
@@ -11337,7 +11757,7 @@
       <w:pPr>
         <w:pStyle w:val="Heading3"/>
       </w:pPr>
-      <w:bookmarkStart w:id="59" w:name="_Toc227514420"/>
+      <w:bookmarkStart w:id="59" w:name="_Toc227520144"/>
       <w:r>
         <w:rPr>
           <w:lang w:val="sk-SK"/>
@@ -11436,7 +11856,7 @@
           <w:lang w:val="sk-SK"/>
         </w:rPr>
       </w:pPr>
-      <w:bookmarkStart w:id="60" w:name="_Toc227514421"/>
+      <w:bookmarkStart w:id="60" w:name="_Toc227520145"/>
       <w:r>
         <w:rPr>
           <w:lang w:val="sk-SK"/>
@@ -11491,7 +11911,7 @@
       <w:pPr>
         <w:pStyle w:val="Heading3"/>
       </w:pPr>
-      <w:bookmarkStart w:id="61" w:name="_Toc227514422"/>
+      <w:bookmarkStart w:id="61" w:name="_Toc227520146"/>
       <w:r>
         <w:rPr>
           <w:lang w:val="sk-SK"/>
@@ -11698,7 +12118,7 @@
           <w:lang w:val="sk-SK"/>
         </w:rPr>
       </w:pPr>
-      <w:bookmarkStart w:id="62" w:name="_Toc227514423"/>
+      <w:bookmarkStart w:id="62" w:name="_Toc227520147"/>
       <w:r>
         <w:rPr>
           <w:lang w:val="sk-SK"/>
@@ -11779,7 +12199,7 @@
           <w:lang w:val="sk-SK"/>
         </w:rPr>
       </w:pPr>
-      <w:bookmarkStart w:id="63" w:name="_Toc227514424"/>
+      <w:bookmarkStart w:id="63" w:name="_Toc227520148"/>
       <w:r>
         <w:rPr>
           <w:lang w:val="sk-SK"/>
@@ -11843,7 +12263,7 @@
           <w:lang w:val="sk-SK"/>
         </w:rPr>
       </w:pPr>
-      <w:bookmarkStart w:id="64" w:name="_Toc227514425"/>
+      <w:bookmarkStart w:id="64" w:name="_Toc227520149"/>
       <w:r>
         <w:rPr>
           <w:lang w:val="sk-SK"/>
@@ -11898,7 +12318,7 @@
           <w:lang w:val="sk-SK"/>
         </w:rPr>
       </w:pPr>
-      <w:bookmarkStart w:id="65" w:name="_Toc227514426"/>
+      <w:bookmarkStart w:id="65" w:name="_Toc227520150"/>
       <w:r>
         <w:rPr>
           <w:lang w:val="sk-SK"/>
@@ -11945,7 +12365,7 @@
           <w:lang w:val="sk-SK"/>
         </w:rPr>
       </w:pPr>
-      <w:bookmarkStart w:id="66" w:name="_Toc227514427"/>
+      <w:bookmarkStart w:id="66" w:name="_Toc227520151"/>
       <w:r>
         <w:rPr>
           <w:lang w:val="sk-SK"/>
@@ -12056,7 +12476,7 @@
       <w:pPr>
         <w:pStyle w:val="Caption"/>
       </w:pPr>
-      <w:bookmarkStart w:id="67" w:name="_Toc227514377"/>
+      <w:bookmarkStart w:id="67" w:name="_Toc227520101"/>
       <w:r>
         <w:t xml:space="preserve">Obr. </w:t>
       </w:r>
@@ -12106,7 +12526,7 @@
           <w:lang w:val="sk-SK"/>
         </w:rPr>
       </w:pPr>
-      <w:bookmarkStart w:id="68" w:name="_Toc227514428"/>
+      <w:bookmarkStart w:id="68" w:name="_Toc227520152"/>
       <w:r>
         <w:rPr>
           <w:lang w:val="sk-SK"/>
@@ -12199,7 +12619,7 @@
       <w:r>
         <w:fldChar w:fldCharType="end"/>
       </w:r>
-      <w:bookmarkStart w:id="69" w:name="_Toc227514429"/>
+      <w:bookmarkStart w:id="69" w:name="_Toc227520153"/>
       <w:r>
         <w:rPr>
           <w:lang w:val="sk-SK"/>
@@ -12246,7 +12666,7 @@
           <w:lang w:val="sk-SK"/>
         </w:rPr>
       </w:pPr>
-      <w:bookmarkStart w:id="70" w:name="_Toc227514430"/>
+      <w:bookmarkStart w:id="70" w:name="_Toc227520154"/>
       <w:r>
         <w:rPr>
           <w:lang w:val="sk-SK"/>
@@ -12578,7 +12998,7 @@
           <w:lang w:val="sk-SK"/>
         </w:rPr>
       </w:pPr>
-      <w:bookmarkStart w:id="71" w:name="_Toc227514431"/>
+      <w:bookmarkStart w:id="71" w:name="_Toc227520155"/>
       <w:r>
         <w:rPr>
           <w:lang w:val="sk-SK"/>
@@ -12932,7 +13352,7 @@
           <w:lang w:val="sk-SK"/>
         </w:rPr>
       </w:pPr>
-      <w:bookmarkStart w:id="72" w:name="_Toc227514432"/>
+      <w:bookmarkStart w:id="72" w:name="_Toc227520156"/>
       <w:r>
         <w:rPr>
           <w:lang w:val="sk-SK"/>
@@ -13457,7 +13877,7 @@
       <w:r>
         <w:fldChar w:fldCharType="end"/>
       </w:r>
-      <w:bookmarkStart w:id="73" w:name="_Toc227514433"/>
+      <w:bookmarkStart w:id="73" w:name="_Toc227520157"/>
       <w:r>
         <w:rPr>
           <w:lang w:val="sk-SK"/>
@@ -13577,7 +13997,7 @@
       <w:pPr>
         <w:pStyle w:val="Caption"/>
       </w:pPr>
-      <w:bookmarkStart w:id="74" w:name="_Toc227514378"/>
+      <w:bookmarkStart w:id="74" w:name="_Toc227520102"/>
       <w:r>
         <w:t xml:space="preserve">Obr. </w:t>
       </w:r>
@@ -13641,7 +14061,7 @@
       <w:r>
         <w:fldChar w:fldCharType="end"/>
       </w:r>
-      <w:bookmarkStart w:id="75" w:name="_Toc227514434"/>
+      <w:bookmarkStart w:id="75" w:name="_Toc227520158"/>
       <w:r>
         <w:rPr>
           <w:lang w:val="sk-SK"/>
@@ -13667,7 +14087,7 @@
           <w:lang w:val="sk-SK"/>
         </w:rPr>
       </w:pPr>
-      <w:bookmarkStart w:id="76" w:name="_Toc227514435"/>
+      <w:bookmarkStart w:id="76" w:name="_Toc227520159"/>
       <w:r>
         <w:rPr>
           <w:lang w:val="sk-SK"/>
@@ -13739,7 +14159,7 @@
           <w:lang w:val="sk-SK"/>
         </w:rPr>
       </w:pPr>
-      <w:bookmarkStart w:id="77" w:name="_Toc227514436"/>
+      <w:bookmarkStart w:id="77" w:name="_Toc227520160"/>
       <w:r>
         <w:rPr>
           <w:lang w:val="sk-SK"/>
@@ -13883,7 +14303,7 @@
           <w:lang w:val="sk-SK"/>
         </w:rPr>
       </w:pPr>
-      <w:bookmarkStart w:id="78" w:name="_Toc227514437"/>
+      <w:bookmarkStart w:id="78" w:name="_Toc227520161"/>
       <w:r>
         <w:rPr>
           <w:lang w:val="sk-SK"/>
@@ -13909,18 +14329,12 @@
           <w:lang w:val="sk-SK"/>
         </w:rPr>
       </w:pPr>
-      <w:bookmarkStart w:id="79" w:name="_Toc227514438"/>
-      <w:r>
-        <w:rPr>
-          <w:lang w:val="sk-SK"/>
-        </w:rPr>
-        <w:t xml:space="preserve">Počet </w:t>
-      </w:r>
-      <w:r>
-        <w:rPr>
-          <w:lang w:val="sk-SK"/>
-        </w:rPr>
-        <w:t>epoc</w:t>
+      <w:bookmarkStart w:id="79" w:name="_Toc227520162"/>
+      <w:r>
+        <w:rPr>
+          <w:lang w:val="sk-SK"/>
+        </w:rPr>
+        <w:t>Počet epoc</w:t>
       </w:r>
       <w:r>
         <w:rPr>
@@ -13946,7 +14360,7 @@
           <w:lang w:val="sk-SK"/>
         </w:rPr>
       </w:pPr>
-      <w:bookmarkStart w:id="80" w:name="_Toc227514439"/>
+      <w:bookmarkStart w:id="80" w:name="_Toc227520163"/>
       <w:r>
         <w:rPr>
           <w:lang w:val="sk-SK"/>
@@ -13971,7 +14385,7 @@
           <w:lang w:val="sk-SK"/>
         </w:rPr>
       </w:pPr>
-      <w:bookmarkStart w:id="81" w:name="_Toc227514440"/>
+      <w:bookmarkStart w:id="81" w:name="_Toc227520164"/>
       <w:r>
         <w:rPr>
           <w:lang w:val="sk-SK"/>
@@ -13996,7 +14410,7 @@
           <w:lang w:val="sk-SK"/>
         </w:rPr>
       </w:pPr>
-      <w:bookmarkStart w:id="82" w:name="_Toc227514441"/>
+      <w:bookmarkStart w:id="82" w:name="_Toc227520165"/>
       <w:r>
         <w:rPr>
           <w:lang w:val="sk-SK"/>
@@ -14021,7 +14435,7 @@
           <w:lang w:val="sk-SK"/>
         </w:rPr>
       </w:pPr>
-      <w:bookmarkStart w:id="83" w:name="_Toc227514442"/>
+      <w:bookmarkStart w:id="83" w:name="_Toc227520166"/>
       <w:r>
         <w:rPr>
           <w:lang w:val="sk-SK"/>
@@ -14046,7 +14460,7 @@
           <w:lang w:val="sk-SK"/>
         </w:rPr>
       </w:pPr>
-      <w:bookmarkStart w:id="84" w:name="_Toc227514443"/>
+      <w:bookmarkStart w:id="84" w:name="_Toc227520167"/>
       <w:r>
         <w:rPr>
           <w:lang w:val="sk-SK"/>
@@ -14067,13 +14481,595 @@
     </w:p>
     <w:p>
       <w:pPr>
-        <w:rPr>
-          <w:lang w:val="sk-SK"/>
-        </w:rPr>
-      </w:pPr>
-    </w:p>
-    <w:p>
-      <w:pPr>
+        <w:pStyle w:val="Heading1"/>
+        <w:numPr>
+          <w:ilvl w:val="0"/>
+          <w:numId w:val="36"/>
+        </w:numPr>
+        <w:spacing w:after="480"/>
+        <w:rPr>
+          <w:lang w:val="sk-SK"/>
+        </w:rPr>
+      </w:pPr>
+      <w:r>
+        <w:lastRenderedPageBreak/>
+        <w:fldChar w:fldCharType="begin"/>
+      </w:r>
+      <w:r>
+        <w:instrText xml:space="preserve">  </w:instrText>
+      </w:r>
+      <w:r>
+        <w:fldChar w:fldCharType="end"/>
+      </w:r>
+      <w:bookmarkStart w:id="85" w:name="_Toc227520168"/>
+      <w:r>
+        <w:rPr>
+          <w:lang w:val="sk-SK"/>
+        </w:rPr>
+        <w:t>Analýza súčasného stavu problematiky</w:t>
+      </w:r>
+      <w:bookmarkEnd w:id="85"/>
+      <w:r>
+        <w:rPr>
+          <w:lang w:val="sk-SK"/>
+        </w:rPr>
+        <w:t xml:space="preserve"> </w:t>
+      </w:r>
+    </w:p>
+    <w:p>
+      <w:pPr>
+        <w:spacing w:line="312" w:lineRule="auto"/>
+        <w:jc w:val="both"/>
+      </w:pPr>
+      <w:r>
+        <w:t>Oblasť odhadu solárneho žiarenia na základe obrazových dát a meteorologických meraní v</w:t>
+      </w:r>
+      <w:r>
+        <w:rPr>
+          <w:lang w:val="sk-SK"/>
+        </w:rPr>
+        <w:t> </w:t>
+      </w:r>
+      <w:r>
+        <w:t>posledných rokoch výrazne napreduje, najmä vďaka rozvoju metód strojového a hlbokého učenia. Súčasné prístupy sa líšia použitými dátovými zdrojmi, architektúrami modelov, ako</w:t>
+      </w:r>
+      <w:r>
+        <w:rPr>
+          <w:lang w:val="sk-SK"/>
+        </w:rPr>
+        <w:t> </w:t>
+      </w:r>
+      <w:r>
+        <w:t>aj</w:t>
+      </w:r>
+      <w:r>
+        <w:rPr>
+          <w:lang w:val="sk-SK"/>
+        </w:rPr>
+        <w:t> </w:t>
+      </w:r>
+      <w:r>
+        <w:t>spôsobmi spracovania vstupných snímok. Spoločným cieľom týchto prístupov je zvýšenie presnosti predikcie a zníženie závislosti na klasických fyzikálnych modeloch. Nasledujúce práce predstavujú vybrané smery vývoja v tejto oblasti.</w:t>
+      </w:r>
+    </w:p>
+    <w:p>
+      <w:pPr>
+        <w:pStyle w:val="Heading2"/>
+        <w:spacing w:before="480" w:after="240"/>
+        <w:rPr>
+          <w:lang w:val="sk-SK"/>
+        </w:rPr>
+      </w:pPr>
+      <w:bookmarkStart w:id="86" w:name="_Toc227520169"/>
+      <w:r>
+        <w:rPr>
+          <w:lang w:val="sk-SK"/>
+        </w:rPr>
+        <w:t>Prístup založený na transfer learningu a časových sekvenciách</w:t>
+      </w:r>
+      <w:bookmarkEnd w:id="86"/>
+    </w:p>
+    <w:p>
+      <w:pPr>
+        <w:spacing w:line="312" w:lineRule="auto"/>
+        <w:jc w:val="both"/>
+      </w:pPr>
+      <w:r>
+        <w:rPr>
+          <w:lang w:val="sk-SK"/>
+        </w:rPr>
+        <w:t>P</w:t>
+      </w:r>
+      <w:r>
+        <w:t>ráca</w:t>
+      </w:r>
+      <w:r>
+        <w:rPr>
+          <w:lang w:val="sk-SK"/>
+        </w:rPr>
+        <w:t xml:space="preserve"> </w:t>
+      </w:r>
+      <w:r>
+        <w:t>[</w:t>
+      </w:r>
+      <w:r>
+        <w:rPr>
+          <w:lang w:val="sk-SK"/>
+        </w:rPr>
+        <w:t>21</w:t>
+      </w:r>
+      <w:r>
+        <w:t>]</w:t>
+      </w:r>
+      <w:r>
+        <w:rPr>
+          <w:lang w:val="sk-SK"/>
+        </w:rPr>
+        <w:t xml:space="preserve"> </w:t>
+      </w:r>
+      <w:r>
+        <w:t>sa zameriava na využitie hlbokého učenia s princípom transfer learningu, kde je model najprv trénovaný na všeobecných datasetoch a následne prispôsobený pre konkrétnu lokalitu. Použité datasety zahŕňajú Sirta, DEWA a Stanford dataset, pričom vstupné snímky majú rozlíšenie 64×64 px.</w:t>
+      </w:r>
+    </w:p>
+    <w:p>
+      <w:pPr>
+        <w:spacing w:line="312" w:lineRule="auto"/>
+        <w:ind w:firstLine="426"/>
+        <w:jc w:val="both"/>
+      </w:pPr>
+      <w:r>
+        <w:t>Model pracuje s časovými sekvenciami, kde na základe posledných 15 minút (vzorkovanie v 2-minútových intervaloch) predikuje nasledujúcich 15 minút vývoja žiarenia. Na tréning je použitý optimalizátor Adam a normalizácia dát. Výkon modelu je vyhodnocovaný pomocou 10-násobnej krížovej validácie, pričom sa sleduje predovšetkým RMSE ako hlavná metrika presnosti. Súčasťou hodnotenia je aj výpočtová náročnosť modelu. Výstupom sú predikcie globálneho horizontálneho žiarenia (W/m²).</w:t>
+      </w:r>
+    </w:p>
+    <w:p>
+      <w:pPr>
+        <w:pStyle w:val="Heading2"/>
+        <w:spacing w:before="480" w:after="240"/>
+        <w:rPr>
+          <w:lang w:val="sk-SK"/>
+        </w:rPr>
+      </w:pPr>
+      <w:bookmarkStart w:id="87" w:name="_Toc227520170"/>
+      <w:r>
+        <w:rPr>
+          <w:lang w:val="sk-SK"/>
+        </w:rPr>
+        <w:t>Predikcia vývoja oblohy a odstránenie fisheye deformácie snímo</w:t>
+      </w:r>
+      <w:r>
+        <w:rPr>
+          <w:lang w:val="sk-SK"/>
+        </w:rPr>
+        <w:t>k</w:t>
+      </w:r>
+      <w:bookmarkEnd w:id="87"/>
+    </w:p>
+    <w:p>
+      <w:pPr>
+        <w:spacing w:line="312" w:lineRule="auto"/>
+        <w:jc w:val="both"/>
+      </w:pPr>
+      <w:r>
+        <w:rPr>
+          <w:lang w:val="sk-SK"/>
+        </w:rPr>
+        <w:t xml:space="preserve">Práca </w:t>
+      </w:r>
+      <w:r>
+        <w:t>[</w:t>
+      </w:r>
+      <w:r>
+        <w:rPr>
+          <w:lang w:val="sk-SK"/>
+        </w:rPr>
+        <w:t>2</w:t>
+      </w:r>
+      <w:r>
+        <w:rPr>
+          <w:lang w:val="sk-SK"/>
+        </w:rPr>
+        <w:t>2</w:t>
+      </w:r>
+      <w:r>
+        <w:t>]</w:t>
+      </w:r>
+      <w:r>
+        <w:t xml:space="preserve"> sa zameriava na predikciu vývoja oblohy pomocou TSI datasetu (Total Sky Imager), pričom kľúčovým problémom sú geometrické deformácie spôsobené fisheye objektívmi a hemisférickými zrkadlami. Tieto deformácie ovplyvňujú konzistenciu </w:t>
+      </w:r>
+      <w:r>
+        <w:rPr>
+          <w:lang w:val="sk-SK"/>
+        </w:rPr>
+        <w:t>pixelovej reprezentácie rovnako veľkých</w:t>
+      </w:r>
+      <w:r>
+        <w:t xml:space="preserve"> oblakov, </w:t>
+      </w:r>
+      <w:r>
+        <w:rPr>
+          <w:lang w:val="sk-SK"/>
+        </w:rPr>
+        <w:t xml:space="preserve">a tým aj ich konzistenciu pohybu, </w:t>
+      </w:r>
+      <w:r>
+        <w:t>najmä v oblastiach blízko horizontu.</w:t>
+      </w:r>
+    </w:p>
+    <w:p>
+      <w:pPr>
+        <w:spacing w:line="312" w:lineRule="auto"/>
+        <w:ind w:firstLine="426"/>
+        <w:jc w:val="both"/>
+      </w:pPr>
+      <w:r>
+        <w:t>Autori navrhli uniformnú warping transformáciu, ktorá zjednocuje optický tok v obraze a zlepšuje konzistenciu pohybu oblakov naprieč scénou. Na modelovanie časového vývoja sa používajú sekvencie viacerých snímok, čím sa stabilizuje odhad pohybu.</w:t>
+      </w:r>
+    </w:p>
+    <w:p>
+      <w:pPr>
+        <w:spacing w:line="312" w:lineRule="auto"/>
+        <w:ind w:firstLine="426"/>
+        <w:jc w:val="both"/>
+      </w:pPr>
+      <w:r>
+        <w:t xml:space="preserve">Navrhnutá architektúra je založená na hlbokých neurónových sieťach, konkrétne U-Net a ConvLSTM variantoch (SkyNet). Modely sú trénované pomocou kombinácie </w:t>
+      </w:r>
+      <w:r>
+        <w:rPr>
+          <w:lang w:val="sk-SK"/>
+        </w:rPr>
+        <w:t>stratových</w:t>
+      </w:r>
+      <w:r>
+        <w:t xml:space="preserve"> </w:t>
+      </w:r>
+      <w:r>
+        <w:lastRenderedPageBreak/>
+        <w:t>funkcií založených na intenzite, gradientoch a optickom toku. Výsledky ukazujú výrazný pokles presnosti pri absencii warping transformácie, čo potvrdzuje jej význam. Hodnotenie je realizované pomocou metriky PSNR.</w:t>
+      </w:r>
+    </w:p>
+    <w:p>
+      <w:pPr>
+        <w:spacing w:line="312" w:lineRule="auto"/>
+        <w:ind w:firstLine="426"/>
+        <w:jc w:val="both"/>
+      </w:pPr>
+      <w:r>
+        <w:t>PSNR (Peak Signal-to-Noise Ratio) je metrika používaná na vyhodnotenie kvality rekonštruovaného alebo predikovaného obrazu voči referenčnému obrazu. Vyjadruje pomer medzi maximálnou možnou hodnotou signálu a veľkosťou šumu (chyby) medzi obrazmi. Vyššia hodnota PSNR znamená vyššiu podobnosť medzi predikovaným a skutočným obrazom, teda lepšiu kvalitu predikcie.</w:t>
+      </w:r>
+    </w:p>
+    <w:p>
+      <w:pPr>
+        <w:spacing w:line="312" w:lineRule="auto"/>
+        <w:ind w:firstLine="426"/>
+        <w:jc w:val="both"/>
+      </w:pPr>
+      <w:r>
+        <w:t xml:space="preserve">Na rozdiel od našej práce sa táto štúdia primárne nezameriava na odhad solárneho žiarenia, ale na predikciu obrazovej sekvencie vývoja oblohy. </w:t>
+      </w:r>
+      <w:r>
+        <w:rPr>
+          <w:lang w:val="sk-SK"/>
+        </w:rPr>
+        <w:t>Pritom</w:t>
+      </w:r>
+      <w:r>
+        <w:t xml:space="preserve"> rieši dôležitý problém spracovania fisheye snímok a geometrických deformácií, ktorý je priamo relevantný aj</w:t>
+      </w:r>
+      <w:r>
+        <w:rPr>
+          <w:lang w:val="sk-SK"/>
+        </w:rPr>
+        <w:t> </w:t>
+      </w:r>
+      <w:r>
+        <w:t>pre</w:t>
+      </w:r>
+      <w:r>
+        <w:rPr>
+          <w:lang w:val="sk-SK"/>
+        </w:rPr>
+        <w:t> </w:t>
+      </w:r>
+      <w:r>
+        <w:t>túto diplomovú prácu. Prístup založený na korekcii deformácie a analýze obrazových dát preto predstavuje významnú inšpiráciu, avšak v našej práci je zvolený jednoduchší a</w:t>
+      </w:r>
+      <w:r>
+        <w:rPr>
+          <w:lang w:val="sk-SK"/>
+        </w:rPr>
+        <w:t> </w:t>
+      </w:r>
+      <w:r>
+        <w:t>priamočiarejší prístup zameraný na predspracovanie vstupných snímok a regresný odhad žiarenia.</w:t>
+      </w:r>
+    </w:p>
+    <w:p>
+      <w:pPr>
+        <w:pStyle w:val="Heading2"/>
+        <w:spacing w:before="480" w:after="240"/>
+        <w:rPr>
+          <w:lang w:val="sk-SK"/>
+        </w:rPr>
+      </w:pPr>
+      <w:bookmarkStart w:id="88" w:name="_Toc227520171"/>
+      <w:r>
+        <w:rPr>
+          <w:lang w:val="sk-SK"/>
+        </w:rPr>
+        <w:t>Kombinácia extrakcie príznakov a klasických metód</w:t>
+      </w:r>
+      <w:bookmarkEnd w:id="88"/>
+    </w:p>
+    <w:p>
+      <w:pPr>
+        <w:spacing w:line="312" w:lineRule="auto"/>
+        <w:jc w:val="both"/>
+      </w:pPr>
+      <w:r>
+        <w:rPr>
+          <w:lang w:val="sk-SK"/>
+        </w:rPr>
+        <w:t xml:space="preserve">Práca </w:t>
+      </w:r>
+      <w:r>
+        <w:t>[</w:t>
+      </w:r>
+      <w:r>
+        <w:rPr>
+          <w:lang w:val="sk-SK"/>
+        </w:rPr>
+        <w:t>2</w:t>
+      </w:r>
+      <w:r>
+        <w:rPr>
+          <w:lang w:val="sk-SK"/>
+        </w:rPr>
+        <w:t>3</w:t>
+      </w:r>
+      <w:r>
+        <w:t>]</w:t>
+      </w:r>
+      <w:r>
+        <w:t xml:space="preserve"> </w:t>
+      </w:r>
+      <w:r>
+        <w:t>využíva rozsiahly dataset obsahujúci viac ako 350 000 snímok z obdobia 16 rokov, doplnený o merania globálneho horizontálneho žiarenia (GHI). Použité sú datasety TSI-880 a ASI-16.</w:t>
+      </w:r>
+    </w:p>
+    <w:p>
+      <w:pPr>
+        <w:spacing w:line="312" w:lineRule="auto"/>
+        <w:ind w:firstLine="426"/>
+        <w:jc w:val="both"/>
+      </w:pPr>
+      <w:r>
+        <w:t>Metodika je založená na dvojstupňovom prístupe: extrakcia príznakov a následná regresia. Vstupné snímky sú najprv konvertované a zmenšené na 32×32 RGB reprezentáciu, následne transformované do 1D vektorov.</w:t>
+      </w:r>
+    </w:p>
+    <w:p>
+      <w:pPr>
+        <w:spacing w:line="312" w:lineRule="auto"/>
+        <w:ind w:firstLine="426"/>
+        <w:jc w:val="both"/>
+      </w:pPr>
+      <w:r>
+        <w:t>Na regresiu sú použité klasické algoritmy strojového učenia, konkrétne Random Forest a K-Nearest Neighbors. Modely sú aplikované na nowcasting</w:t>
+      </w:r>
+      <w:r>
+        <w:rPr>
+          <w:lang w:val="sk-SK"/>
+        </w:rPr>
+        <w:t xml:space="preserve"> (krátkodobá predikcia v blízkej budúcnosti, z pravidla v rozsahu minút až desiatok minút)</w:t>
+      </w:r>
+      <w:r>
+        <w:t xml:space="preserve"> aj forecasting</w:t>
+      </w:r>
+      <w:r>
+        <w:rPr>
+          <w:lang w:val="sk-SK"/>
+        </w:rPr>
+        <w:t xml:space="preserve"> (dlhodobejšie predikcia, od desiatok minút až po hodiny)</w:t>
+      </w:r>
+      <w:r>
+        <w:t xml:space="preserve"> úlohy s rôznymi časovými horizontmi. Výkon je hodnotený pomocou RMSE a normalizovanej RMSE (nRMSE), čo</w:t>
+      </w:r>
+      <w:r>
+        <w:rPr>
+          <w:lang w:val="sk-SK"/>
+        </w:rPr>
+        <w:t> </w:t>
+      </w:r>
+      <w:r>
+        <w:t>umožňuje porovnanie naprieč rôznymi podmienkami.</w:t>
+      </w:r>
+    </w:p>
+    <w:p>
+      <w:pPr>
+        <w:pStyle w:val="Heading2"/>
+        <w:spacing w:before="480" w:after="240"/>
+        <w:rPr>
+          <w:lang w:val="sk-SK"/>
+        </w:rPr>
+      </w:pPr>
+      <w:bookmarkStart w:id="89" w:name="_Toc227520172"/>
+      <w:r>
+        <w:rPr>
+          <w:lang w:val="sk-SK"/>
+        </w:rPr>
+        <w:t>Zhrnutie a porovnanie analyzovaných riešení</w:t>
+      </w:r>
+      <w:bookmarkEnd w:id="89"/>
+    </w:p>
+    <w:p>
+      <w:pPr>
+        <w:spacing w:line="312" w:lineRule="auto"/>
+        <w:jc w:val="both"/>
+      </w:pPr>
+      <w:r>
+        <w:t>Analyzované prístupy ukazujú tri hlavné smery vývoja v oblasti odhadu solárneho žiarenia.</w:t>
+      </w:r>
+    </w:p>
+    <w:p>
+      <w:pPr>
+        <w:pStyle w:val="ListParagraph"/>
+        <w:numPr>
+          <w:ilvl w:val="0"/>
+          <w:numId w:val="42"/>
+        </w:numPr>
+        <w:spacing w:line="312" w:lineRule="auto"/>
+        <w:jc w:val="both"/>
+      </w:pPr>
+      <w:r>
+        <w:t>[</w:t>
+      </w:r>
+      <w:r>
+        <w:rPr>
+          <w:lang w:val="sk-SK"/>
+        </w:rPr>
+        <w:t>2</w:t>
+      </w:r>
+      <w:r>
+        <w:rPr>
+          <w:lang w:val="sk-SK"/>
+        </w:rPr>
+        <w:t>1</w:t>
+      </w:r>
+      <w:r>
+        <w:t>]</w:t>
+      </w:r>
+      <w:r>
+        <w:t xml:space="preserve"> </w:t>
+      </w:r>
+      <w:r>
+        <w:t>využíva hlboké neurónové siete s časovou informáciou a transfer learningom na</w:t>
+      </w:r>
+      <w:r>
+        <w:rPr>
+          <w:lang w:val="sk-SK"/>
+        </w:rPr>
+        <w:t> </w:t>
+      </w:r>
+      <w:r>
+        <w:t xml:space="preserve">zlepšenie generalizácie. </w:t>
+      </w:r>
+    </w:p>
+    <w:p>
+      <w:pPr>
+        <w:pStyle w:val="ListParagraph"/>
+        <w:numPr>
+          <w:ilvl w:val="0"/>
+          <w:numId w:val="42"/>
+        </w:numPr>
+        <w:spacing w:line="312" w:lineRule="auto"/>
+        <w:jc w:val="both"/>
+      </w:pPr>
+      <w:r>
+        <w:lastRenderedPageBreak/>
+        <w:t>[</w:t>
+      </w:r>
+      <w:r>
+        <w:rPr>
+          <w:lang w:val="sk-SK"/>
+        </w:rPr>
+        <w:t>2</w:t>
+      </w:r>
+      <w:r>
+        <w:rPr>
+          <w:lang w:val="sk-SK"/>
+        </w:rPr>
+        <w:t>2</w:t>
+      </w:r>
+      <w:r>
+        <w:t>]</w:t>
+      </w:r>
+      <w:r>
+        <w:t xml:space="preserve"> </w:t>
+      </w:r>
+      <w:r>
+        <w:t xml:space="preserve">sa zameriava na priestorovo-konzistentné spracovanie </w:t>
+      </w:r>
+      <w:r>
+        <w:rPr>
+          <w:lang w:val="sk-SK"/>
+        </w:rPr>
+        <w:t>celooblohových snímok</w:t>
+      </w:r>
+      <w:r>
+        <w:t>, najmä riešenie geometrických deformácií fisheye snímok a</w:t>
+      </w:r>
+      <w:r>
+        <w:rPr>
+          <w:lang w:val="sk-SK"/>
+        </w:rPr>
+        <w:t> </w:t>
+      </w:r>
+      <w:r>
+        <w:t xml:space="preserve">modelovanie časového vývoja pomocou sekvenčných architektúr. </w:t>
+      </w:r>
+    </w:p>
+    <w:p>
+      <w:pPr>
+        <w:pStyle w:val="ListParagraph"/>
+        <w:numPr>
+          <w:ilvl w:val="0"/>
+          <w:numId w:val="42"/>
+        </w:numPr>
+        <w:spacing w:line="312" w:lineRule="auto"/>
+        <w:jc w:val="both"/>
+      </w:pPr>
+      <w:r>
+        <w:t>[</w:t>
+      </w:r>
+      <w:r>
+        <w:rPr>
+          <w:lang w:val="sk-SK"/>
+        </w:rPr>
+        <w:t>23</w:t>
+      </w:r>
+      <w:r>
+        <w:t>]</w:t>
+      </w:r>
+      <w:r>
+        <w:t xml:space="preserve"> </w:t>
+      </w:r>
+      <w:r>
+        <w:t>kombinuje klasické metódy extrakcie príznakov so strojovým učením, pričom kladie dôraz na interpretovateľnosť a výpočtovú efektivitu.</w:t>
+      </w:r>
+    </w:p>
+    <w:p>
+      <w:pPr>
+        <w:spacing w:line="312" w:lineRule="auto"/>
+        <w:ind w:firstLine="426"/>
+        <w:jc w:val="both"/>
+      </w:pPr>
+      <w:r>
+        <w:t>Spoločným znakom všetkých prístupov je využitie obrazových dát z celooblohových kamier a snaha o presnú predikci</w:t>
+      </w:r>
+      <w:r>
+        <w:rPr>
+          <w:lang w:val="sk-SK"/>
+        </w:rPr>
+        <w:t>u</w:t>
+      </w:r>
+      <w:r>
+        <w:t>. Zároveň sa ukazuje, že kvalita predspracovania, reprezentácia dát a voľba modelovej architektúry majú zásadný vplyv na výslednú presnosť.</w:t>
+      </w:r>
+    </w:p>
+    <w:p>
+      <w:pPr>
+        <w:spacing w:line="312" w:lineRule="auto"/>
+        <w:ind w:firstLine="426"/>
+        <w:jc w:val="both"/>
+      </w:pPr>
+      <w:r>
+        <w:t>Na základe týchto poznatkov je v nasledujúcej časti práce navrhnutý vlastný prístup, ktorý kombinuje spracovanie fisheye snímok, konvolučné neurónové siete a optimalizačné metódy s cieľom dosiahnuť presnejší a robustnejší model pre odhad solárneho žiarenia.</w:t>
+      </w:r>
+    </w:p>
+    <w:p>
+      <w:pPr>
+        <w:spacing w:line="312" w:lineRule="auto"/>
+        <w:jc w:val="both"/>
         <w:rPr>
           <w:lang w:val="sk-SK"/>
         </w:rPr>
@@ -14159,7 +15155,40 @@
       <w:pPr>
         <w:spacing w:line="312" w:lineRule="auto"/>
         <w:jc w:val="both"/>
-      </w:pPr>
+        <w:rPr>
+          <w:lang w:val="sk-SK"/>
+        </w:rPr>
+      </w:pPr>
+      <w:r>
+        <w:rPr>
+          <w:lang w:val="sk-SK"/>
+        </w:rPr>
+        <w:t>TO MENTION: Pri odstraňovaní warpingu, ktorý nepriniesol zlepšenie spomenúť že pre pohyb oblakov ako v práci</w:t>
+      </w:r>
+      <w:r>
+        <w:rPr>
+          <w:lang w:val="sk-SK"/>
+        </w:rPr>
+        <w:t xml:space="preserve"> </w:t>
+      </w:r>
+      <w:r>
+        <w:t>[</w:t>
+      </w:r>
+      <w:r>
+        <w:rPr>
+          <w:lang w:val="sk-SK"/>
+        </w:rPr>
+        <w:t>22</w:t>
+      </w:r>
+      <w:r>
+        <w:t>]</w:t>
+      </w:r>
+      <w:r>
+        <w:rPr>
+          <w:lang w:val="sk-SK"/>
+        </w:rPr>
+        <w:t xml:space="preserve"> relevantný ale pre predikciu žiarenia nie, lebo... a spomenúť to čo vždy (taká fotka = také žiarenie...)</w:t>
+      </w:r>
     </w:p>
     <w:p>
       <w:pPr>
@@ -14176,11 +15205,11 @@
       <w:pPr>
         <w:pStyle w:val="Heading3"/>
       </w:pPr>
-      <w:bookmarkStart w:id="85" w:name="_Toc227514444"/>
+      <w:bookmarkStart w:id="90" w:name="_Toc227520173"/>
       <w:r>
         <w:t>Záver</w:t>
       </w:r>
-      <w:bookmarkEnd w:id="85"/>
+      <w:bookmarkEnd w:id="90"/>
     </w:p>
     <w:p>
       <w:pPr>
@@ -14190,10 +15219,10 @@
           <w:bCs/>
         </w:rPr>
       </w:pPr>
-      <w:bookmarkStart w:id="86" w:name="_Ref178418312"/>
-      <w:bookmarkStart w:id="87" w:name="_Toc181225510"/>
-      <w:bookmarkStart w:id="88" w:name="_Toc173791406"/>
-      <w:bookmarkStart w:id="89" w:name="_Toc173791545"/>
+      <w:bookmarkStart w:id="91" w:name="_Ref178418312"/>
+      <w:bookmarkStart w:id="92" w:name="_Toc181225510"/>
+      <w:bookmarkStart w:id="93" w:name="_Toc173791406"/>
+      <w:bookmarkStart w:id="94" w:name="_Toc173791545"/>
       <w:r>
         <w:rPr>
           <w:b/>
@@ -14238,7 +15267,7 @@
         </w:rPr>
         <w:fldChar w:fldCharType="end"/>
       </w:r>
-      <w:bookmarkEnd w:id="86"/>
+      <w:bookmarkEnd w:id="91"/>
       <w:r>
         <w:rPr>
           <w:b/>
@@ -14315,7 +15344,7 @@
         </w:rPr>
         <w:t>.</w:t>
       </w:r>
-      <w:bookmarkEnd w:id="87"/>
+      <w:bookmarkEnd w:id="92"/>
     </w:p>
     <w:tbl>
       <w:tblPr>
@@ -14730,6 +15759,7 @@
               <w:pStyle w:val="Textvtabuke"/>
             </w:pPr>
             <w:r>
+              <w:lastRenderedPageBreak/>
               <w:t>LED 3</w:t>
             </w:r>
           </w:p>
@@ -14894,12 +15924,12 @@
         <w:pStyle w:val="Nadpis1bezslovania"/>
         <w:spacing w:before="1440" w:after="480"/>
       </w:pPr>
-      <w:bookmarkStart w:id="90" w:name="_Toc227514445"/>
+      <w:bookmarkStart w:id="95" w:name="_Toc227520174"/>
       <w:r>
         <w:lastRenderedPageBreak/>
         <w:t>Záver</w:t>
       </w:r>
-      <w:bookmarkEnd w:id="90"/>
+      <w:bookmarkEnd w:id="95"/>
     </w:p>
     <w:p>
       <w:pPr>
@@ -14972,15 +16002,15 @@
         <w:pStyle w:val="Nadpis1bezslovania"/>
         <w:spacing w:before="1440" w:after="480"/>
       </w:pPr>
-      <w:bookmarkStart w:id="91" w:name="_Toc227514446"/>
+      <w:bookmarkStart w:id="96" w:name="_Toc227520175"/>
       <w:r>
         <w:lastRenderedPageBreak/>
         <w:t>Literatúra</w:t>
       </w:r>
-      <w:bookmarkEnd w:id="91"/>
-    </w:p>
-    <w:bookmarkEnd w:id="88"/>
-    <w:bookmarkEnd w:id="89"/>
+      <w:bookmarkEnd w:id="96"/>
+    </w:p>
+    <w:bookmarkEnd w:id="93"/>
+    <w:bookmarkEnd w:id="94"/>
     <w:p>
       <w:pPr>
         <w:pStyle w:val="NormalWeb"/>
@@ -16505,6 +17535,172 @@
     </w:p>
     <w:p>
       <w:pPr>
+        <w:pStyle w:val="NormalWeb"/>
+        <w:spacing w:line="312" w:lineRule="auto"/>
+        <w:ind w:left="567" w:hanging="567"/>
+      </w:pPr>
+      <w:r>
+        <w:t>[</w:t>
+      </w:r>
+      <w:r>
+        <w:rPr>
+          <w:lang w:val="sk-SK"/>
+        </w:rPr>
+        <w:t>2</w:t>
+      </w:r>
+      <w:r>
+        <w:rPr>
+          <w:lang w:val="sk-SK"/>
+        </w:rPr>
+        <w:t>1</w:t>
+      </w:r>
+      <w:r>
+        <w:t>]</w:t>
+      </w:r>
+      <w:r>
+        <w:tab/>
+      </w:r>
+      <w:r>
+        <w:rPr>
+          <w:rFonts w:ascii="TimesNewRomanPSMT" w:hAnsi="TimesNewRomanPSMT"/>
+        </w:rPr>
+        <w:t>(PDF in Articles Folder</w:t>
+      </w:r>
+      <w:r>
+        <w:rPr>
+          <w:rFonts w:ascii="Cambria" w:hAnsi="Cambria"/>
+          <w:sz w:val="26"/>
+          <w:szCs w:val="26"/>
+        </w:rPr>
+        <w:t xml:space="preserve">) </w:t>
+      </w:r>
+      <w:r>
+        <w:rPr>
+          <w:rFonts w:ascii="Calibri" w:hAnsi="Calibri" w:cs="Calibri"/>
+        </w:rPr>
+        <w:t xml:space="preserve">Sky image-based solar forecasting using deep learning with heterogeneous multi-location data: Dataset fusion versus transfer learning, Yuhao Nie, Quentin Paletta, Andea Scott, Luis Martin Pomares, Guillaume Arbod, Sgouris Sgouridis, Joan Lasenby, Adam Brandt </w:t>
+      </w:r>
+    </w:p>
+    <w:p>
+      <w:pPr>
+        <w:pStyle w:val="NormalWeb"/>
+        <w:spacing w:line="312" w:lineRule="auto"/>
+        <w:ind w:left="567" w:hanging="567"/>
+        <w:rPr>
+          <w:rFonts w:ascii="Calibri" w:hAnsi="Calibri" w:cs="Calibri"/>
+        </w:rPr>
+      </w:pPr>
+      <w:r>
+        <w:t>[</w:t>
+      </w:r>
+      <w:r>
+        <w:rPr>
+          <w:lang w:val="sk-SK"/>
+        </w:rPr>
+        <w:t>2</w:t>
+      </w:r>
+      <w:r>
+        <w:rPr>
+          <w:lang w:val="sk-SK"/>
+        </w:rPr>
+        <w:t>2</w:t>
+      </w:r>
+      <w:r>
+        <w:t>]</w:t>
+      </w:r>
+      <w:r>
+        <w:tab/>
+      </w:r>
+      <w:r>
+        <w:rPr>
+          <w:rFonts w:ascii="TimesNewRomanPSMT" w:hAnsi="TimesNewRomanPSMT"/>
+        </w:rPr>
+        <w:t>(PDF in Articles Folder</w:t>
+      </w:r>
+      <w:r>
+        <w:rPr>
+          <w:rFonts w:ascii="Cambria" w:hAnsi="Cambria"/>
+          <w:sz w:val="26"/>
+          <w:szCs w:val="26"/>
+        </w:rPr>
+        <w:t xml:space="preserve">) </w:t>
+      </w:r>
+      <w:r>
+        <w:rPr>
+          <w:rFonts w:ascii="Calibri" w:hAnsi="Calibri" w:cs="Calibri"/>
+        </w:rPr>
+        <w:t xml:space="preserve">Precise Forecasting of Sky Images Using Spatial Warping, Leron Julian Carnegie Mellon University, Aswin C. Sankaranarayanan Carnegie Mellon University </w:t>
+      </w:r>
+    </w:p>
+    <w:p>
+      <w:pPr>
+        <w:pStyle w:val="NormalWeb"/>
+        <w:spacing w:line="312" w:lineRule="auto"/>
+        <w:ind w:left="567" w:hanging="567"/>
+        <w:rPr>
+          <w:rFonts w:ascii="Calibri" w:hAnsi="Calibri" w:cs="Calibri"/>
+        </w:rPr>
+      </w:pPr>
+      <w:r>
+        <w:t>[</w:t>
+      </w:r>
+      <w:r>
+        <w:rPr>
+          <w:lang w:val="sk-SK"/>
+        </w:rPr>
+        <w:t>2</w:t>
+      </w:r>
+      <w:r>
+        <w:rPr>
+          <w:lang w:val="sk-SK"/>
+        </w:rPr>
+        <w:t>3</w:t>
+      </w:r>
+      <w:r>
+        <w:t>]</w:t>
+      </w:r>
+      <w:r>
+        <w:tab/>
+      </w:r>
+      <w:r>
+        <w:rPr>
+          <w:rFonts w:ascii="TimesNewRomanPSMT" w:hAnsi="TimesNewRomanPSMT"/>
+        </w:rPr>
+        <w:t xml:space="preserve">(PDF in Articles </w:t>
+      </w:r>
+      <w:r>
+        <w:rPr>
+          <w:rFonts w:ascii="Calibri" w:hAnsi="Calibri" w:cs="Calibri"/>
+        </w:rPr>
+        <w:t xml:space="preserve">Folder) Sky Imager-Based Forecast of Solar Irradiance Using Machine Learning, Anas Al-lahham, Obaidah Theeb , Khaled Elalem , Tariq A. Alshawi and Saleh A. Alshebeili </w:t>
+      </w:r>
+    </w:p>
+    <w:p>
+      <w:pPr>
+        <w:pStyle w:val="NormalWeb"/>
+        <w:spacing w:line="312" w:lineRule="auto"/>
+        <w:ind w:left="567" w:hanging="567"/>
+        <w:rPr>
+          <w:rFonts w:ascii="Calibri" w:hAnsi="Calibri" w:cs="Calibri"/>
+        </w:rPr>
+      </w:pPr>
+    </w:p>
+    <w:p>
+      <w:pPr>
+        <w:pStyle w:val="NormalWeb"/>
+        <w:spacing w:line="312" w:lineRule="auto"/>
+        <w:ind w:left="567" w:hanging="567"/>
+      </w:pPr>
+    </w:p>
+    <w:p>
+      <w:pPr>
+        <w:pStyle w:val="NormalWeb"/>
+        <w:spacing w:line="312" w:lineRule="auto"/>
+        <w:ind w:left="567" w:hanging="567"/>
+      </w:pPr>
+    </w:p>
+    <w:p>
+      <w:pPr>
         <w:pStyle w:val="TableofAuthorities"/>
         <w:spacing w:line="312" w:lineRule="auto"/>
       </w:pPr>
@@ -16927,12 +18123,12 @@
         <w:pStyle w:val="Nadpis1bezslovania"/>
         <w:spacing w:after="480"/>
       </w:pPr>
-      <w:bookmarkStart w:id="92" w:name="_Toc227514447"/>
+      <w:bookmarkStart w:id="97" w:name="_Toc227520176"/>
       <w:r>
         <w:lastRenderedPageBreak/>
         <w:t>Prílohy</w:t>
       </w:r>
-      <w:bookmarkEnd w:id="92"/>
+      <w:bookmarkEnd w:id="97"/>
     </w:p>
     <w:p>
       <w:pPr>
@@ -18786,6 +19982,92 @@
     </w:lvl>
   </w:abstractNum>
   <w:abstractNum w:abstractNumId="22" w15:restartNumberingAfterBreak="0">
+    <w:nsid w:val="33377D72"/>
+    <w:multiLevelType w:val="hybridMultilevel"/>
+    <w:tmpl w:val="979E264C"/>
+    <w:lvl w:ilvl="0" w:tplc="0809000F">
+      <w:start w:val="1"/>
+      <w:numFmt w:val="decimal"/>
+      <w:lvlText w:val="%1."/>
+      <w:lvlJc w:val="left"/>
+      <w:pPr>
+        <w:ind w:left="720" w:hanging="360"/>
+      </w:pPr>
+    </w:lvl>
+    <w:lvl w:ilvl="1" w:tplc="08090019" w:tentative="1">
+      <w:start w:val="1"/>
+      <w:numFmt w:val="lowerLetter"/>
+      <w:lvlText w:val="%2."/>
+      <w:lvlJc w:val="left"/>
+      <w:pPr>
+        <w:ind w:left="1440" w:hanging="360"/>
+      </w:pPr>
+    </w:lvl>
+    <w:lvl w:ilvl="2" w:tplc="0809001B" w:tentative="1">
+      <w:start w:val="1"/>
+      <w:numFmt w:val="lowerRoman"/>
+      <w:lvlText w:val="%3."/>
+      <w:lvlJc w:val="right"/>
+      <w:pPr>
+        <w:ind w:left="2160" w:hanging="180"/>
+      </w:pPr>
+    </w:lvl>
+    <w:lvl w:ilvl="3" w:tplc="0809000F" w:tentative="1">
+      <w:start w:val="1"/>
+      <w:numFmt w:val="decimal"/>
+      <w:lvlText w:val="%4."/>
+      <w:lvlJc w:val="left"/>
+      <w:pPr>
+        <w:ind w:left="2880" w:hanging="360"/>
+      </w:pPr>
+    </w:lvl>
+    <w:lvl w:ilvl="4" w:tplc="08090019" w:tentative="1">
+      <w:start w:val="1"/>
+      <w:numFmt w:val="lowerLetter"/>
+      <w:lvlText w:val="%5."/>
+      <w:lvlJc w:val="left"/>
+      <w:pPr>
+        <w:ind w:left="3600" w:hanging="360"/>
+      </w:pPr>
+    </w:lvl>
+    <w:lvl w:ilvl="5" w:tplc="0809001B" w:tentative="1">
+      <w:start w:val="1"/>
+      <w:numFmt w:val="lowerRoman"/>
+      <w:lvlText w:val="%6."/>
+      <w:lvlJc w:val="right"/>
+      <w:pPr>
+        <w:ind w:left="4320" w:hanging="180"/>
+      </w:pPr>
+    </w:lvl>
+    <w:lvl w:ilvl="6" w:tplc="0809000F" w:tentative="1">
+      <w:start w:val="1"/>
+      <w:numFmt w:val="decimal"/>
+      <w:lvlText w:val="%7."/>
+      <w:lvlJc w:val="left"/>
+      <w:pPr>
+        <w:ind w:left="5040" w:hanging="360"/>
+      </w:pPr>
+    </w:lvl>
+    <w:lvl w:ilvl="7" w:tplc="08090019" w:tentative="1">
+      <w:start w:val="1"/>
+      <w:numFmt w:val="lowerLetter"/>
+      <w:lvlText w:val="%8."/>
+      <w:lvlJc w:val="left"/>
+      <w:pPr>
+        <w:ind w:left="5760" w:hanging="360"/>
+      </w:pPr>
+    </w:lvl>
+    <w:lvl w:ilvl="8" w:tplc="0809001B" w:tentative="1">
+      <w:start w:val="1"/>
+      <w:numFmt w:val="lowerRoman"/>
+      <w:lvlText w:val="%9."/>
+      <w:lvlJc w:val="right"/>
+      <w:pPr>
+        <w:ind w:left="6480" w:hanging="180"/>
+      </w:pPr>
+    </w:lvl>
+  </w:abstractNum>
+  <w:abstractNum w:abstractNumId="23" w15:restartNumberingAfterBreak="0">
     <w:nsid w:val="337414E9"/>
     <w:multiLevelType w:val="multilevel"/>
     <w:tmpl w:val="80EC471A"/>
@@ -18898,7 +20180,7 @@
       </w:rPr>
     </w:lvl>
   </w:abstractNum>
-  <w:abstractNum w:abstractNumId="23" w15:restartNumberingAfterBreak="0">
+  <w:abstractNum w:abstractNumId="24" w15:restartNumberingAfterBreak="0">
     <w:nsid w:val="41AC2004"/>
     <w:multiLevelType w:val="multilevel"/>
     <w:tmpl w:val="041B001D"/>
@@ -18984,7 +20266,7 @@
       </w:pPr>
     </w:lvl>
   </w:abstractNum>
-  <w:abstractNum w:abstractNumId="24" w15:restartNumberingAfterBreak="0">
+  <w:abstractNum w:abstractNumId="25" w15:restartNumberingAfterBreak="0">
     <w:nsid w:val="4242221A"/>
     <w:multiLevelType w:val="hybridMultilevel"/>
     <w:tmpl w:val="03F8988A"/>
@@ -19073,7 +20355,7 @@
       </w:pPr>
     </w:lvl>
   </w:abstractNum>
-  <w:abstractNum w:abstractNumId="25" w15:restartNumberingAfterBreak="0">
+  <w:abstractNum w:abstractNumId="26" w15:restartNumberingAfterBreak="0">
     <w:nsid w:val="42475C47"/>
     <w:multiLevelType w:val="multilevel"/>
     <w:tmpl w:val="041B001D"/>
@@ -19160,7 +20442,7 @@
       </w:pPr>
     </w:lvl>
   </w:abstractNum>
-  <w:abstractNum w:abstractNumId="26" w15:restartNumberingAfterBreak="0">
+  <w:abstractNum w:abstractNumId="27" w15:restartNumberingAfterBreak="0">
     <w:nsid w:val="44C571BD"/>
     <w:multiLevelType w:val="hybridMultilevel"/>
     <w:tmpl w:val="5052E7F2"/>
@@ -19273,7 +20555,7 @@
       </w:rPr>
     </w:lvl>
   </w:abstractNum>
-  <w:abstractNum w:abstractNumId="27" w15:restartNumberingAfterBreak="0">
+  <w:abstractNum w:abstractNumId="28" w15:restartNumberingAfterBreak="0">
     <w:nsid w:val="47F24415"/>
     <w:multiLevelType w:val="hybridMultilevel"/>
     <w:tmpl w:val="59B87A6E"/>
@@ -19386,7 +20668,7 @@
       </w:rPr>
     </w:lvl>
   </w:abstractNum>
-  <w:abstractNum w:abstractNumId="28" w15:restartNumberingAfterBreak="0">
+  <w:abstractNum w:abstractNumId="29" w15:restartNumberingAfterBreak="0">
     <w:nsid w:val="4AF27299"/>
     <w:multiLevelType w:val="hybridMultilevel"/>
     <w:tmpl w:val="CE087EBA"/>
@@ -19499,7 +20781,7 @@
       </w:rPr>
     </w:lvl>
   </w:abstractNum>
-  <w:abstractNum w:abstractNumId="29" w15:restartNumberingAfterBreak="0">
+  <w:abstractNum w:abstractNumId="30" w15:restartNumberingAfterBreak="0">
     <w:nsid w:val="4B356983"/>
     <w:multiLevelType w:val="hybridMultilevel"/>
     <w:tmpl w:val="3F725A78"/>
@@ -19612,7 +20894,7 @@
       </w:rPr>
     </w:lvl>
   </w:abstractNum>
-  <w:abstractNum w:abstractNumId="30" w15:restartNumberingAfterBreak="0">
+  <w:abstractNum w:abstractNumId="31" w15:restartNumberingAfterBreak="0">
     <w:nsid w:val="560C4C81"/>
     <w:multiLevelType w:val="multilevel"/>
     <w:tmpl w:val="B70E42AA"/>
@@ -19730,7 +21012,7 @@
       </w:rPr>
     </w:lvl>
   </w:abstractNum>
-  <w:abstractNum w:abstractNumId="31" w15:restartNumberingAfterBreak="0">
+  <w:abstractNum w:abstractNumId="32" w15:restartNumberingAfterBreak="0">
     <w:nsid w:val="611F40A2"/>
     <w:multiLevelType w:val="multilevel"/>
     <w:tmpl w:val="041B001D"/>
@@ -19816,7 +21098,7 @@
       </w:pPr>
     </w:lvl>
   </w:abstractNum>
-  <w:abstractNum w:abstractNumId="32" w15:restartNumberingAfterBreak="0">
+  <w:abstractNum w:abstractNumId="33" w15:restartNumberingAfterBreak="0">
     <w:nsid w:val="62593EFE"/>
     <w:multiLevelType w:val="hybridMultilevel"/>
     <w:tmpl w:val="B7AE2BDE"/>
@@ -19902,7 +21184,7 @@
       </w:pPr>
     </w:lvl>
   </w:abstractNum>
-  <w:abstractNum w:abstractNumId="33" w15:restartNumberingAfterBreak="0">
+  <w:abstractNum w:abstractNumId="34" w15:restartNumberingAfterBreak="0">
     <w:nsid w:val="633D6C51"/>
     <w:multiLevelType w:val="hybridMultilevel"/>
     <w:tmpl w:val="807472A4"/>
@@ -19988,7 +21270,7 @@
       </w:pPr>
     </w:lvl>
   </w:abstractNum>
-  <w:abstractNum w:abstractNumId="34" w15:restartNumberingAfterBreak="0">
+  <w:abstractNum w:abstractNumId="35" w15:restartNumberingAfterBreak="0">
     <w:nsid w:val="6416608A"/>
     <w:multiLevelType w:val="hybridMultilevel"/>
     <w:tmpl w:val="BFC45DC8"/>
@@ -20101,7 +21383,7 @@
       </w:rPr>
     </w:lvl>
   </w:abstractNum>
-  <w:abstractNum w:abstractNumId="35" w15:restartNumberingAfterBreak="0">
+  <w:abstractNum w:abstractNumId="36" w15:restartNumberingAfterBreak="0">
     <w:nsid w:val="648874EA"/>
     <w:multiLevelType w:val="hybridMultilevel"/>
     <w:tmpl w:val="03A8A320"/>
@@ -20214,7 +21496,7 @@
       </w:rPr>
     </w:lvl>
   </w:abstractNum>
-  <w:abstractNum w:abstractNumId="36" w15:restartNumberingAfterBreak="0">
+  <w:abstractNum w:abstractNumId="37" w15:restartNumberingAfterBreak="0">
     <w:nsid w:val="680D043E"/>
     <w:multiLevelType w:val="multilevel"/>
     <w:tmpl w:val="041B001D"/>
@@ -20300,7 +21582,7 @@
       </w:pPr>
     </w:lvl>
   </w:abstractNum>
-  <w:abstractNum w:abstractNumId="37" w15:restartNumberingAfterBreak="0">
+  <w:abstractNum w:abstractNumId="38" w15:restartNumberingAfterBreak="0">
     <w:nsid w:val="68584894"/>
     <w:multiLevelType w:val="hybridMultilevel"/>
     <w:tmpl w:val="2FCE7350"/>
@@ -20512,7 +21794,7 @@
       </w:rPr>
     </w:lvl>
   </w:abstractNum>
-  <w:abstractNum w:abstractNumId="38" w15:restartNumberingAfterBreak="0">
+  <w:abstractNum w:abstractNumId="39" w15:restartNumberingAfterBreak="0">
     <w:nsid w:val="72784605"/>
     <w:multiLevelType w:val="hybridMultilevel"/>
     <w:tmpl w:val="E0885FF6"/>
@@ -20626,7 +21908,7 @@
     </w:lvl>
   </w:abstractNum>
   <w:num w:numId="1">
-    <w:abstractNumId w:val="23"/>
+    <w:abstractNumId w:val="24"/>
   </w:num>
   <w:num w:numId="2">
     <w:abstractNumId w:val="8"/>
@@ -20656,13 +21938,13 @@
     <w:abstractNumId w:val="21"/>
   </w:num>
   <w:num w:numId="11">
-    <w:abstractNumId w:val="26"/>
+    <w:abstractNumId w:val="27"/>
   </w:num>
   <w:num w:numId="12">
     <w:abstractNumId w:val="17"/>
   </w:num>
   <w:num w:numId="13">
-    <w:abstractNumId w:val="22"/>
+    <w:abstractNumId w:val="23"/>
   </w:num>
   <w:num w:numId="14">
     <w:abstractNumId w:val="9"/>
@@ -20680,22 +21962,22 @@
     <w:abstractNumId w:val="4"/>
   </w:num>
   <w:num w:numId="19">
-    <w:abstractNumId w:val="31"/>
+    <w:abstractNumId w:val="32"/>
   </w:num>
   <w:num w:numId="20">
-    <w:abstractNumId w:val="32"/>
+    <w:abstractNumId w:val="33"/>
   </w:num>
   <w:num w:numId="21">
-    <w:abstractNumId w:val="24"/>
+    <w:abstractNumId w:val="25"/>
   </w:num>
   <w:num w:numId="22">
     <w:abstractNumId w:val="19"/>
   </w:num>
   <w:num w:numId="23">
-    <w:abstractNumId w:val="38"/>
+    <w:abstractNumId w:val="39"/>
   </w:num>
   <w:num w:numId="24">
-    <w:abstractNumId w:val="34"/>
+    <w:abstractNumId w:val="35"/>
   </w:num>
   <w:num w:numId="25">
     <w:abstractNumId w:val="15"/>
@@ -20704,22 +21986,22 @@
     <w:abstractNumId w:val="12"/>
   </w:num>
   <w:num w:numId="27">
-    <w:abstractNumId w:val="37"/>
+    <w:abstractNumId w:val="38"/>
   </w:num>
   <w:num w:numId="28">
-    <w:abstractNumId w:val="28"/>
+    <w:abstractNumId w:val="29"/>
   </w:num>
   <w:num w:numId="29">
     <w:abstractNumId w:val="18"/>
   </w:num>
   <w:num w:numId="30">
-    <w:abstractNumId w:val="25"/>
+    <w:abstractNumId w:val="26"/>
   </w:num>
   <w:num w:numId="31">
-    <w:abstractNumId w:val="30"/>
+    <w:abstractNumId w:val="31"/>
   </w:num>
   <w:num w:numId="32">
-    <w:abstractNumId w:val="36"/>
+    <w:abstractNumId w:val="37"/>
   </w:num>
   <w:num w:numId="33">
     <w:abstractNumId w:val="10"/>
@@ -20752,7 +22034,7 @@
     </w:lvlOverride>
   </w:num>
   <w:num w:numId="34">
-    <w:abstractNumId w:val="33"/>
+    <w:abstractNumId w:val="34"/>
   </w:num>
   <w:num w:numId="35">
     <w:abstractNumId w:val="20"/>
@@ -20788,7 +22070,7 @@
     </w:lvlOverride>
   </w:num>
   <w:num w:numId="37">
-    <w:abstractNumId w:val="29"/>
+    <w:abstractNumId w:val="30"/>
   </w:num>
   <w:num w:numId="38">
     <w:abstractNumId w:val="13"/>
@@ -20797,10 +22079,13 @@
     <w:abstractNumId w:val="16"/>
   </w:num>
   <w:num w:numId="40">
-    <w:abstractNumId w:val="27"/>
+    <w:abstractNumId w:val="28"/>
   </w:num>
   <w:num w:numId="41">
-    <w:abstractNumId w:val="35"/>
+    <w:abstractNumId w:val="36"/>
+  </w:num>
+  <w:num w:numId="42">
+    <w:abstractNumId w:val="22"/>
   </w:num>
 </w:numbering>
 </file>
@@ -21205,7 +22490,7 @@
   <w:style w:type="paragraph" w:default="1" w:styleId="Normal">
     <w:name w:val="Normal"/>
     <w:qFormat/>
-    <w:rsid w:val="00A64AF3"/>
+    <w:rsid w:val="00417B66"/>
     <w:pPr>
       <w:spacing w:line="240" w:lineRule="auto"/>
     </w:pPr>

</xml_diff>

<commit_message>
MasterThesis: Thesis: replaced some english terms with proper ones in the theoretical part
 - for example: batch normalization -> normalizácia dávok
</commit_message>
<xml_diff>
--- a/sumsala_diplomova_praca.docx
+++ b/sumsala_diplomova_praca.docx
@@ -1003,7 +1003,7 @@
         </w:rPr>
         <w:fldChar w:fldCharType="separate"/>
       </w:r>
-      <w:hyperlink w:anchor="_Toc227610394" w:history="1">
+      <w:hyperlink w:anchor="_Toc227689611" w:history="1">
         <w:r>
           <w:rPr>
             <w:rStyle w:val="Hyperlink"/>
@@ -1030,7 +1030,7 @@
             <w:noProof/>
             <w:webHidden/>
           </w:rPr>
-          <w:instrText xml:space="preserve"> PAGEREF _Toc227610394 \h </w:instrText>
+          <w:instrText xml:space="preserve"> PAGEREF _Toc227689611 \h </w:instrText>
         </w:r>
         <w:r>
           <w:rPr>
@@ -1071,7 +1071,7 @@
           <w:szCs w:val="24"/>
         </w:rPr>
       </w:pPr>
-      <w:hyperlink w:anchor="_Toc227610395" w:history="1">
+      <w:hyperlink w:anchor="_Toc227689612" w:history="1">
         <w:r>
           <w:rPr>
             <w:rStyle w:val="Hyperlink"/>
@@ -1098,7 +1098,7 @@
             <w:noProof/>
             <w:webHidden/>
           </w:rPr>
-          <w:instrText xml:space="preserve"> PAGEREF _Toc227610395 \h </w:instrText>
+          <w:instrText xml:space="preserve"> PAGEREF _Toc227689612 \h </w:instrText>
         </w:r>
         <w:r>
           <w:rPr>
@@ -1139,7 +1139,7 @@
           <w:szCs w:val="24"/>
         </w:rPr>
       </w:pPr>
-      <w:hyperlink w:anchor="_Toc227610396" w:history="1">
+      <w:hyperlink w:anchor="_Toc227689613" w:history="1">
         <w:r>
           <w:rPr>
             <w:rStyle w:val="Hyperlink"/>
@@ -1166,7 +1166,7 @@
             <w:noProof/>
             <w:webHidden/>
           </w:rPr>
-          <w:instrText xml:space="preserve"> PAGEREF _Toc227610396 \h </w:instrText>
+          <w:instrText xml:space="preserve"> PAGEREF _Toc227689613 \h </w:instrText>
         </w:r>
         <w:r>
           <w:rPr>
@@ -1210,7 +1210,7 @@
           <w:szCs w:val="24"/>
         </w:rPr>
       </w:pPr>
-      <w:hyperlink w:anchor="_Toc227610397" w:history="1">
+      <w:hyperlink w:anchor="_Toc227689614" w:history="1">
         <w:r>
           <w:rPr>
             <w:rStyle w:val="Hyperlink"/>
@@ -1237,7 +1237,7 @@
             <w:noProof/>
             <w:webHidden/>
           </w:rPr>
-          <w:instrText xml:space="preserve"> PAGEREF _Toc227610397 \h </w:instrText>
+          <w:instrText xml:space="preserve"> PAGEREF _Toc227689614 \h </w:instrText>
         </w:r>
         <w:r>
           <w:rPr>
@@ -1281,7 +1281,7 @@
           <w:szCs w:val="24"/>
         </w:rPr>
       </w:pPr>
-      <w:hyperlink w:anchor="_Toc227610398" w:history="1">
+      <w:hyperlink w:anchor="_Toc227689615" w:history="1">
         <w:r>
           <w:rPr>
             <w:rStyle w:val="Hyperlink"/>
@@ -1326,7 +1326,7 @@
             <w:noProof/>
             <w:webHidden/>
           </w:rPr>
-          <w:instrText xml:space="preserve"> PAGEREF _Toc227610398 \h </w:instrText>
+          <w:instrText xml:space="preserve"> PAGEREF _Toc227689615 \h </w:instrText>
         </w:r>
         <w:r>
           <w:rPr>
@@ -1367,7 +1367,7 @@
           <w:szCs w:val="24"/>
         </w:rPr>
       </w:pPr>
-      <w:hyperlink w:anchor="_Toc227610399" w:history="1">
+      <w:hyperlink w:anchor="_Toc227689616" w:history="1">
         <w:r>
           <w:rPr>
             <w:rStyle w:val="Hyperlink"/>
@@ -1394,7 +1394,7 @@
             <w:noProof/>
             <w:webHidden/>
           </w:rPr>
-          <w:instrText xml:space="preserve"> PAGEREF _Toc227610399 \h </w:instrText>
+          <w:instrText xml:space="preserve"> PAGEREF _Toc227689616 \h </w:instrText>
         </w:r>
         <w:r>
           <w:rPr>
@@ -1435,7 +1435,7 @@
           <w:szCs w:val="24"/>
         </w:rPr>
       </w:pPr>
-      <w:hyperlink w:anchor="_Toc227610400" w:history="1">
+      <w:hyperlink w:anchor="_Toc227689617" w:history="1">
         <w:r>
           <w:rPr>
             <w:rStyle w:val="Hyperlink"/>
@@ -1477,7 +1477,7 @@
             <w:noProof/>
             <w:webHidden/>
           </w:rPr>
-          <w:instrText xml:space="preserve"> PAGEREF _Toc227610400 \h </w:instrText>
+          <w:instrText xml:space="preserve"> PAGEREF _Toc227689617 \h </w:instrText>
         </w:r>
         <w:r>
           <w:rPr>
@@ -1518,7 +1518,7 @@
           <w:szCs w:val="24"/>
         </w:rPr>
       </w:pPr>
-      <w:hyperlink w:anchor="_Toc227610401" w:history="1">
+      <w:hyperlink w:anchor="_Toc227689618" w:history="1">
         <w:r>
           <w:rPr>
             <w:rStyle w:val="Hyperlink"/>
@@ -1545,7 +1545,7 @@
             <w:noProof/>
             <w:webHidden/>
           </w:rPr>
-          <w:instrText xml:space="preserve"> PAGEREF _Toc227610401 \h </w:instrText>
+          <w:instrText xml:space="preserve"> PAGEREF _Toc227689618 \h </w:instrText>
         </w:r>
         <w:r>
           <w:rPr>
@@ -1586,7 +1586,7 @@
           <w:szCs w:val="24"/>
         </w:rPr>
       </w:pPr>
-      <w:hyperlink w:anchor="_Toc227610402" w:history="1">
+      <w:hyperlink w:anchor="_Toc227689619" w:history="1">
         <w:r>
           <w:rPr>
             <w:rStyle w:val="Hyperlink"/>
@@ -1613,7 +1613,7 @@
             <w:noProof/>
             <w:webHidden/>
           </w:rPr>
-          <w:instrText xml:space="preserve"> PAGEREF _Toc227610402 \h </w:instrText>
+          <w:instrText xml:space="preserve"> PAGEREF _Toc227689619 \h </w:instrText>
         </w:r>
         <w:r>
           <w:rPr>
@@ -1657,7 +1657,7 @@
           <w:szCs w:val="24"/>
         </w:rPr>
       </w:pPr>
-      <w:hyperlink w:anchor="_Toc227610403" w:history="1">
+      <w:hyperlink w:anchor="_Toc227689620" w:history="1">
         <w:r>
           <w:rPr>
             <w:rStyle w:val="Hyperlink"/>
@@ -1702,7 +1702,7 @@
             <w:noProof/>
             <w:webHidden/>
           </w:rPr>
-          <w:instrText xml:space="preserve"> PAGEREF _Toc227610403 \h </w:instrText>
+          <w:instrText xml:space="preserve"> PAGEREF _Toc227689620 \h </w:instrText>
         </w:r>
         <w:r>
           <w:rPr>
@@ -1743,7 +1743,7 @@
           <w:szCs w:val="24"/>
         </w:rPr>
       </w:pPr>
-      <w:hyperlink w:anchor="_Toc227610404" w:history="1">
+      <w:hyperlink w:anchor="_Toc227689621" w:history="1">
         <w:r>
           <w:rPr>
             <w:rStyle w:val="Hyperlink"/>
@@ -1770,7 +1770,7 @@
             <w:noProof/>
             <w:webHidden/>
           </w:rPr>
-          <w:instrText xml:space="preserve"> PAGEREF _Toc227610404 \h </w:instrText>
+          <w:instrText xml:space="preserve"> PAGEREF _Toc227689621 \h </w:instrText>
         </w:r>
         <w:r>
           <w:rPr>
@@ -1811,7 +1811,7 @@
           <w:szCs w:val="24"/>
         </w:rPr>
       </w:pPr>
-      <w:hyperlink w:anchor="_Toc227610405" w:history="1">
+      <w:hyperlink w:anchor="_Toc227689622" w:history="1">
         <w:r>
           <w:rPr>
             <w:rStyle w:val="Hyperlink"/>
@@ -1838,7 +1838,7 @@
             <w:noProof/>
             <w:webHidden/>
           </w:rPr>
-          <w:instrText xml:space="preserve"> PAGEREF _Toc227610405 \h </w:instrText>
+          <w:instrText xml:space="preserve"> PAGEREF _Toc227689622 \h </w:instrText>
         </w:r>
         <w:r>
           <w:rPr>
@@ -1882,7 +1882,7 @@
           <w:szCs w:val="24"/>
         </w:rPr>
       </w:pPr>
-      <w:hyperlink w:anchor="_Toc227610406" w:history="1">
+      <w:hyperlink w:anchor="_Toc227689623" w:history="1">
         <w:r>
           <w:rPr>
             <w:rStyle w:val="Hyperlink"/>
@@ -1927,7 +1927,7 @@
             <w:noProof/>
             <w:webHidden/>
           </w:rPr>
-          <w:instrText xml:space="preserve"> PAGEREF _Toc227610406 \h </w:instrText>
+          <w:instrText xml:space="preserve"> PAGEREF _Toc227689623 \h </w:instrText>
         </w:r>
         <w:r>
           <w:rPr>
@@ -1968,7 +1968,7 @@
           <w:szCs w:val="24"/>
         </w:rPr>
       </w:pPr>
-      <w:hyperlink w:anchor="_Toc227610407" w:history="1">
+      <w:hyperlink w:anchor="_Toc227689624" w:history="1">
         <w:r>
           <w:rPr>
             <w:rStyle w:val="Hyperlink"/>
@@ -1995,7 +1995,7 @@
             <w:noProof/>
             <w:webHidden/>
           </w:rPr>
-          <w:instrText xml:space="preserve"> PAGEREF _Toc227610407 \h </w:instrText>
+          <w:instrText xml:space="preserve"> PAGEREF _Toc227689624 \h </w:instrText>
         </w:r>
         <w:r>
           <w:rPr>
@@ -2035,7 +2035,7 @@
           <w:szCs w:val="24"/>
         </w:rPr>
       </w:pPr>
-      <w:hyperlink w:anchor="_Toc227610408" w:history="1">
+      <w:hyperlink w:anchor="_Toc227689625" w:history="1">
         <w:r>
           <w:rPr>
             <w:rStyle w:val="Hyperlink"/>
@@ -2062,7 +2062,7 @@
             <w:noProof/>
             <w:webHidden/>
           </w:rPr>
-          <w:instrText xml:space="preserve"> PAGEREF _Toc227610408 \h </w:instrText>
+          <w:instrText xml:space="preserve"> PAGEREF _Toc227689625 \h </w:instrText>
         </w:r>
         <w:r>
           <w:rPr>
@@ -2102,7 +2102,7 @@
           <w:szCs w:val="24"/>
         </w:rPr>
       </w:pPr>
-      <w:hyperlink w:anchor="_Toc227610409" w:history="1">
+      <w:hyperlink w:anchor="_Toc227689626" w:history="1">
         <w:r>
           <w:rPr>
             <w:rStyle w:val="Hyperlink"/>
@@ -2129,7 +2129,7 @@
             <w:noProof/>
             <w:webHidden/>
           </w:rPr>
-          <w:instrText xml:space="preserve"> PAGEREF _Toc227610409 \h </w:instrText>
+          <w:instrText xml:space="preserve"> PAGEREF _Toc227689626 \h </w:instrText>
         </w:r>
         <w:r>
           <w:rPr>
@@ -2169,7 +2169,7 @@
           <w:szCs w:val="24"/>
         </w:rPr>
       </w:pPr>
-      <w:hyperlink w:anchor="_Toc227610410" w:history="1">
+      <w:hyperlink w:anchor="_Toc227689627" w:history="1">
         <w:r>
           <w:rPr>
             <w:rStyle w:val="Hyperlink"/>
@@ -2196,7 +2196,7 @@
             <w:noProof/>
             <w:webHidden/>
           </w:rPr>
-          <w:instrText xml:space="preserve"> PAGEREF _Toc227610410 \h </w:instrText>
+          <w:instrText xml:space="preserve"> PAGEREF _Toc227689627 \h </w:instrText>
         </w:r>
         <w:r>
           <w:rPr>
@@ -2236,7 +2236,7 @@
           <w:szCs w:val="24"/>
         </w:rPr>
       </w:pPr>
-      <w:hyperlink w:anchor="_Toc227610411" w:history="1">
+      <w:hyperlink w:anchor="_Toc227689628" w:history="1">
         <w:r>
           <w:rPr>
             <w:rStyle w:val="Hyperlink"/>
@@ -2263,7 +2263,7 @@
             <w:noProof/>
             <w:webHidden/>
           </w:rPr>
-          <w:instrText xml:space="preserve"> PAGEREF _Toc227610411 \h </w:instrText>
+          <w:instrText xml:space="preserve"> PAGEREF _Toc227689628 \h </w:instrText>
         </w:r>
         <w:r>
           <w:rPr>
@@ -2303,7 +2303,7 @@
           <w:szCs w:val="24"/>
         </w:rPr>
       </w:pPr>
-      <w:hyperlink w:anchor="_Toc227610412" w:history="1">
+      <w:hyperlink w:anchor="_Toc227689629" w:history="1">
         <w:r>
           <w:rPr>
             <w:rStyle w:val="Hyperlink"/>
@@ -2330,7 +2330,7 @@
             <w:noProof/>
             <w:webHidden/>
           </w:rPr>
-          <w:instrText xml:space="preserve"> PAGEREF _Toc227610412 \h </w:instrText>
+          <w:instrText xml:space="preserve"> PAGEREF _Toc227689629 \h </w:instrText>
         </w:r>
         <w:r>
           <w:rPr>
@@ -2370,7 +2370,7 @@
           <w:szCs w:val="24"/>
         </w:rPr>
       </w:pPr>
-      <w:hyperlink w:anchor="_Toc227610413" w:history="1">
+      <w:hyperlink w:anchor="_Toc227689630" w:history="1">
         <w:r>
           <w:rPr>
             <w:rStyle w:val="Hyperlink"/>
@@ -2397,7 +2397,7 @@
             <w:noProof/>
             <w:webHidden/>
           </w:rPr>
-          <w:instrText xml:space="preserve"> PAGEREF _Toc227610413 \h </w:instrText>
+          <w:instrText xml:space="preserve"> PAGEREF _Toc227689630 \h </w:instrText>
         </w:r>
         <w:r>
           <w:rPr>
@@ -2437,7 +2437,7 @@
           <w:szCs w:val="24"/>
         </w:rPr>
       </w:pPr>
-      <w:hyperlink w:anchor="_Toc227610414" w:history="1">
+      <w:hyperlink w:anchor="_Toc227689631" w:history="1">
         <w:r>
           <w:rPr>
             <w:rStyle w:val="Hyperlink"/>
@@ -2464,7 +2464,7 @@
             <w:noProof/>
             <w:webHidden/>
           </w:rPr>
-          <w:instrText xml:space="preserve"> PAGEREF _Toc227610414 \h </w:instrText>
+          <w:instrText xml:space="preserve"> PAGEREF _Toc227689631 \h </w:instrText>
         </w:r>
         <w:r>
           <w:rPr>
@@ -2504,7 +2504,7 @@
           <w:szCs w:val="24"/>
         </w:rPr>
       </w:pPr>
-      <w:hyperlink w:anchor="_Toc227610415" w:history="1">
+      <w:hyperlink w:anchor="_Toc227689632" w:history="1">
         <w:r>
           <w:rPr>
             <w:rStyle w:val="Hyperlink"/>
@@ -2531,7 +2531,7 @@
             <w:noProof/>
             <w:webHidden/>
           </w:rPr>
-          <w:instrText xml:space="preserve"> PAGEREF _Toc227610415 \h </w:instrText>
+          <w:instrText xml:space="preserve"> PAGEREF _Toc227689632 \h </w:instrText>
         </w:r>
         <w:r>
           <w:rPr>
@@ -2572,7 +2572,7 @@
           <w:szCs w:val="24"/>
         </w:rPr>
       </w:pPr>
-      <w:hyperlink w:anchor="_Toc227610416" w:history="1">
+      <w:hyperlink w:anchor="_Toc227689633" w:history="1">
         <w:r>
           <w:rPr>
             <w:rStyle w:val="Hyperlink"/>
@@ -2599,7 +2599,7 @@
             <w:noProof/>
             <w:webHidden/>
           </w:rPr>
-          <w:instrText xml:space="preserve"> PAGEREF _Toc227610416 \h </w:instrText>
+          <w:instrText xml:space="preserve"> PAGEREF _Toc227689633 \h </w:instrText>
         </w:r>
         <w:r>
           <w:rPr>
@@ -2640,7 +2640,7 @@
           <w:szCs w:val="24"/>
         </w:rPr>
       </w:pPr>
-      <w:hyperlink w:anchor="_Toc227610417" w:history="1">
+      <w:hyperlink w:anchor="_Toc227689634" w:history="1">
         <w:r>
           <w:rPr>
             <w:rStyle w:val="Hyperlink"/>
@@ -2667,7 +2667,7 @@
             <w:noProof/>
             <w:webHidden/>
           </w:rPr>
-          <w:instrText xml:space="preserve"> PAGEREF _Toc227610417 \h </w:instrText>
+          <w:instrText xml:space="preserve"> PAGEREF _Toc227689634 \h </w:instrText>
         </w:r>
         <w:r>
           <w:rPr>
@@ -2707,7 +2707,7 @@
           <w:szCs w:val="24"/>
         </w:rPr>
       </w:pPr>
-      <w:hyperlink w:anchor="_Toc227610418" w:history="1">
+      <w:hyperlink w:anchor="_Toc227689635" w:history="1">
         <w:r>
           <w:rPr>
             <w:rStyle w:val="Hyperlink"/>
@@ -2734,7 +2734,7 @@
             <w:noProof/>
             <w:webHidden/>
           </w:rPr>
-          <w:instrText xml:space="preserve"> PAGEREF _Toc227610418 \h </w:instrText>
+          <w:instrText xml:space="preserve"> PAGEREF _Toc227689635 \h </w:instrText>
         </w:r>
         <w:r>
           <w:rPr>
@@ -2774,7 +2774,7 @@
           <w:szCs w:val="24"/>
         </w:rPr>
       </w:pPr>
-      <w:hyperlink w:anchor="_Toc227610419" w:history="1">
+      <w:hyperlink w:anchor="_Toc227689636" w:history="1">
         <w:r>
           <w:rPr>
             <w:rStyle w:val="Hyperlink"/>
@@ -2802,7 +2802,7 @@
             <w:noProof/>
             <w:webHidden/>
           </w:rPr>
-          <w:instrText xml:space="preserve"> PAGEREF _Toc227610419 \h </w:instrText>
+          <w:instrText xml:space="preserve"> PAGEREF _Toc227689636 \h </w:instrText>
         </w:r>
         <w:r>
           <w:rPr>
@@ -2842,7 +2842,7 @@
           <w:szCs w:val="24"/>
         </w:rPr>
       </w:pPr>
-      <w:hyperlink w:anchor="_Toc227610420" w:history="1">
+      <w:hyperlink w:anchor="_Toc227689637" w:history="1">
         <w:r>
           <w:rPr>
             <w:rStyle w:val="Hyperlink"/>
@@ -2870,7 +2870,7 @@
             <w:noProof/>
             <w:webHidden/>
           </w:rPr>
-          <w:instrText xml:space="preserve"> PAGEREF _Toc227610420 \h </w:instrText>
+          <w:instrText xml:space="preserve"> PAGEREF _Toc227689637 \h </w:instrText>
         </w:r>
         <w:r>
           <w:rPr>
@@ -2910,7 +2910,7 @@
           <w:szCs w:val="24"/>
         </w:rPr>
       </w:pPr>
-      <w:hyperlink w:anchor="_Toc227610421" w:history="1">
+      <w:hyperlink w:anchor="_Toc227689638" w:history="1">
         <w:r>
           <w:rPr>
             <w:rStyle w:val="Hyperlink"/>
@@ -2938,7 +2938,7 @@
             <w:noProof/>
             <w:webHidden/>
           </w:rPr>
-          <w:instrText xml:space="preserve"> PAGEREF _Toc227610421 \h </w:instrText>
+          <w:instrText xml:space="preserve"> PAGEREF _Toc227689638 \h </w:instrText>
         </w:r>
         <w:r>
           <w:rPr>
@@ -2979,7 +2979,7 @@
           <w:szCs w:val="24"/>
         </w:rPr>
       </w:pPr>
-      <w:hyperlink w:anchor="_Toc227610422" w:history="1">
+      <w:hyperlink w:anchor="_Toc227689639" w:history="1">
         <w:r>
           <w:rPr>
             <w:rStyle w:val="Hyperlink"/>
@@ -3021,7 +3021,7 @@
             <w:noProof/>
             <w:webHidden/>
           </w:rPr>
-          <w:instrText xml:space="preserve"> PAGEREF _Toc227610422 \h </w:instrText>
+          <w:instrText xml:space="preserve"> PAGEREF _Toc227689639 \h </w:instrText>
         </w:r>
         <w:r>
           <w:rPr>
@@ -3061,7 +3061,7 @@
           <w:szCs w:val="24"/>
         </w:rPr>
       </w:pPr>
-      <w:hyperlink w:anchor="_Toc227610423" w:history="1">
+      <w:hyperlink w:anchor="_Toc227689640" w:history="1">
         <w:r>
           <w:rPr>
             <w:rStyle w:val="Hyperlink"/>
@@ -3089,7 +3089,7 @@
             <w:noProof/>
             <w:webHidden/>
           </w:rPr>
-          <w:instrText xml:space="preserve"> PAGEREF _Toc227610423 \h </w:instrText>
+          <w:instrText xml:space="preserve"> PAGEREF _Toc227689640 \h </w:instrText>
         </w:r>
         <w:r>
           <w:rPr>
@@ -3129,7 +3129,7 @@
           <w:szCs w:val="24"/>
         </w:rPr>
       </w:pPr>
-      <w:hyperlink w:anchor="_Toc227610424" w:history="1">
+      <w:hyperlink w:anchor="_Toc227689641" w:history="1">
         <w:r>
           <w:rPr>
             <w:rStyle w:val="Hyperlink"/>
@@ -3157,7 +3157,7 @@
             <w:noProof/>
             <w:webHidden/>
           </w:rPr>
-          <w:instrText xml:space="preserve"> PAGEREF _Toc227610424 \h </w:instrText>
+          <w:instrText xml:space="preserve"> PAGEREF _Toc227689641 \h </w:instrText>
         </w:r>
         <w:r>
           <w:rPr>
@@ -3197,7 +3197,7 @@
           <w:szCs w:val="24"/>
         </w:rPr>
       </w:pPr>
-      <w:hyperlink w:anchor="_Toc227610425" w:history="1">
+      <w:hyperlink w:anchor="_Toc227689642" w:history="1">
         <w:r>
           <w:rPr>
             <w:rStyle w:val="Hyperlink"/>
@@ -3225,7 +3225,7 @@
             <w:noProof/>
             <w:webHidden/>
           </w:rPr>
-          <w:instrText xml:space="preserve"> PAGEREF _Toc227610425 \h </w:instrText>
+          <w:instrText xml:space="preserve"> PAGEREF _Toc227689642 \h </w:instrText>
         </w:r>
         <w:r>
           <w:rPr>
@@ -3266,7 +3266,7 @@
           <w:szCs w:val="24"/>
         </w:rPr>
       </w:pPr>
-      <w:hyperlink w:anchor="_Toc227610426" w:history="1">
+      <w:hyperlink w:anchor="_Toc227689643" w:history="1">
         <w:r>
           <w:rPr>
             <w:rStyle w:val="Hyperlink"/>
@@ -3301,7 +3301,7 @@
             <w:noProof/>
             <w:webHidden/>
           </w:rPr>
-          <w:instrText xml:space="preserve"> PAGEREF _Toc227610426 \h </w:instrText>
+          <w:instrText xml:space="preserve"> PAGEREF _Toc227689643 \h </w:instrText>
         </w:r>
         <w:r>
           <w:rPr>
@@ -3341,7 +3341,7 @@
           <w:szCs w:val="24"/>
         </w:rPr>
       </w:pPr>
-      <w:hyperlink w:anchor="_Toc227610427" w:history="1">
+      <w:hyperlink w:anchor="_Toc227689644" w:history="1">
         <w:r>
           <w:rPr>
             <w:rStyle w:val="Hyperlink"/>
@@ -3369,7 +3369,7 @@
             <w:noProof/>
             <w:webHidden/>
           </w:rPr>
-          <w:instrText xml:space="preserve"> PAGEREF _Toc227610427 \h </w:instrText>
+          <w:instrText xml:space="preserve"> PAGEREF _Toc227689644 \h </w:instrText>
         </w:r>
         <w:r>
           <w:rPr>
@@ -3409,7 +3409,7 @@
           <w:szCs w:val="24"/>
         </w:rPr>
       </w:pPr>
-      <w:hyperlink w:anchor="_Toc227610428" w:history="1">
+      <w:hyperlink w:anchor="_Toc227689645" w:history="1">
         <w:r>
           <w:rPr>
             <w:rStyle w:val="Hyperlink"/>
@@ -3437,7 +3437,7 @@
             <w:noProof/>
             <w:webHidden/>
           </w:rPr>
-          <w:instrText xml:space="preserve"> PAGEREF _Toc227610428 \h </w:instrText>
+          <w:instrText xml:space="preserve"> PAGEREF _Toc227689645 \h </w:instrText>
         </w:r>
         <w:r>
           <w:rPr>
@@ -3477,7 +3477,7 @@
           <w:szCs w:val="24"/>
         </w:rPr>
       </w:pPr>
-      <w:hyperlink w:anchor="_Toc227610429" w:history="1">
+      <w:hyperlink w:anchor="_Toc227689646" w:history="1">
         <w:r>
           <w:rPr>
             <w:rStyle w:val="Hyperlink"/>
@@ -3505,7 +3505,7 @@
             <w:noProof/>
             <w:webHidden/>
           </w:rPr>
-          <w:instrText xml:space="preserve"> PAGEREF _Toc227610429 \h </w:instrText>
+          <w:instrText xml:space="preserve"> PAGEREF _Toc227689646 \h </w:instrText>
         </w:r>
         <w:r>
           <w:rPr>
@@ -3545,7 +3545,7 @@
           <w:szCs w:val="24"/>
         </w:rPr>
       </w:pPr>
-      <w:hyperlink w:anchor="_Toc227610430" w:history="1">
+      <w:hyperlink w:anchor="_Toc227689647" w:history="1">
         <w:r>
           <w:rPr>
             <w:rStyle w:val="Hyperlink"/>
@@ -3573,7 +3573,7 @@
             <w:noProof/>
             <w:webHidden/>
           </w:rPr>
-          <w:instrText xml:space="preserve"> PAGEREF _Toc227610430 \h </w:instrText>
+          <w:instrText xml:space="preserve"> PAGEREF _Toc227689647 \h </w:instrText>
         </w:r>
         <w:r>
           <w:rPr>
@@ -3613,7 +3613,7 @@
           <w:szCs w:val="24"/>
         </w:rPr>
       </w:pPr>
-      <w:hyperlink w:anchor="_Toc227610431" w:history="1">
+      <w:hyperlink w:anchor="_Toc227689648" w:history="1">
         <w:r>
           <w:rPr>
             <w:rStyle w:val="Hyperlink"/>
@@ -3641,7 +3641,7 @@
             <w:noProof/>
             <w:webHidden/>
           </w:rPr>
-          <w:instrText xml:space="preserve"> PAGEREF _Toc227610431 \h </w:instrText>
+          <w:instrText xml:space="preserve"> PAGEREF _Toc227689648 \h </w:instrText>
         </w:r>
         <w:r>
           <w:rPr>
@@ -3685,7 +3685,7 @@
           <w:szCs w:val="24"/>
         </w:rPr>
       </w:pPr>
-      <w:hyperlink w:anchor="_Toc227610432" w:history="1">
+      <w:hyperlink w:anchor="_Toc227689649" w:history="1">
         <w:r>
           <w:rPr>
             <w:rStyle w:val="Hyperlink"/>
@@ -3732,7 +3732,7 @@
             <w:noProof/>
             <w:webHidden/>
           </w:rPr>
-          <w:instrText xml:space="preserve"> PAGEREF _Toc227610432 \h </w:instrText>
+          <w:instrText xml:space="preserve"> PAGEREF _Toc227689649 \h </w:instrText>
         </w:r>
         <w:r>
           <w:rPr>
@@ -3773,7 +3773,7 @@
           <w:szCs w:val="24"/>
         </w:rPr>
       </w:pPr>
-      <w:hyperlink w:anchor="_Toc227610433" w:history="1">
+      <w:hyperlink w:anchor="_Toc227689650" w:history="1">
         <w:r>
           <w:rPr>
             <w:rStyle w:val="Hyperlink"/>
@@ -3808,7 +3808,7 @@
             <w:noProof/>
             <w:webHidden/>
           </w:rPr>
-          <w:instrText xml:space="preserve"> PAGEREF _Toc227610433 \h </w:instrText>
+          <w:instrText xml:space="preserve"> PAGEREF _Toc227689650 \h </w:instrText>
         </w:r>
         <w:r>
           <w:rPr>
@@ -3848,7 +3848,7 @@
           <w:szCs w:val="24"/>
         </w:rPr>
       </w:pPr>
-      <w:hyperlink w:anchor="_Toc227610434" w:history="1">
+      <w:hyperlink w:anchor="_Toc227689651" w:history="1">
         <w:r>
           <w:rPr>
             <w:rStyle w:val="Hyperlink"/>
@@ -3883,7 +3883,7 @@
             <w:noProof/>
             <w:webHidden/>
           </w:rPr>
-          <w:instrText xml:space="preserve"> PAGEREF _Toc227610434 \h </w:instrText>
+          <w:instrText xml:space="preserve"> PAGEREF _Toc227689651 \h </w:instrText>
         </w:r>
         <w:r>
           <w:rPr>
@@ -3923,7 +3923,7 @@
           <w:szCs w:val="24"/>
         </w:rPr>
       </w:pPr>
-      <w:hyperlink w:anchor="_Toc227610435" w:history="1">
+      <w:hyperlink w:anchor="_Toc227689652" w:history="1">
         <w:r>
           <w:rPr>
             <w:rStyle w:val="Hyperlink"/>
@@ -3958,7 +3958,7 @@
             <w:noProof/>
             <w:webHidden/>
           </w:rPr>
-          <w:instrText xml:space="preserve"> PAGEREF _Toc227610435 \h </w:instrText>
+          <w:instrText xml:space="preserve"> PAGEREF _Toc227689652 \h </w:instrText>
         </w:r>
         <w:r>
           <w:rPr>
@@ -3998,7 +3998,7 @@
           <w:szCs w:val="24"/>
         </w:rPr>
       </w:pPr>
-      <w:hyperlink w:anchor="_Toc227610436" w:history="1">
+      <w:hyperlink w:anchor="_Toc227689653" w:history="1">
         <w:r>
           <w:rPr>
             <w:rStyle w:val="Hyperlink"/>
@@ -4033,7 +4033,7 @@
             <w:noProof/>
             <w:webHidden/>
           </w:rPr>
-          <w:instrText xml:space="preserve"> PAGEREF _Toc227610436 \h </w:instrText>
+          <w:instrText xml:space="preserve"> PAGEREF _Toc227689653 \h </w:instrText>
         </w:r>
         <w:r>
           <w:rPr>
@@ -4074,7 +4074,7 @@
           <w:szCs w:val="24"/>
         </w:rPr>
       </w:pPr>
-      <w:hyperlink w:anchor="_Toc227610437" w:history="1">
+      <w:hyperlink w:anchor="_Toc227689654" w:history="1">
         <w:r>
           <w:rPr>
             <w:rStyle w:val="Hyperlink"/>
@@ -4102,7 +4102,7 @@
             <w:noProof/>
             <w:webHidden/>
           </w:rPr>
-          <w:instrText xml:space="preserve"> PAGEREF _Toc227610437 \h </w:instrText>
+          <w:instrText xml:space="preserve"> PAGEREF _Toc227689654 \h </w:instrText>
         </w:r>
         <w:r>
           <w:rPr>
@@ -4142,7 +4142,7 @@
           <w:szCs w:val="24"/>
         </w:rPr>
       </w:pPr>
-      <w:hyperlink w:anchor="_Toc227610438" w:history="1">
+      <w:hyperlink w:anchor="_Toc227689655" w:history="1">
         <w:r>
           <w:rPr>
             <w:rStyle w:val="Hyperlink"/>
@@ -4177,7 +4177,7 @@
             <w:noProof/>
             <w:webHidden/>
           </w:rPr>
-          <w:instrText xml:space="preserve"> PAGEREF _Toc227610438 \h </w:instrText>
+          <w:instrText xml:space="preserve"> PAGEREF _Toc227689655 \h </w:instrText>
         </w:r>
         <w:r>
           <w:rPr>
@@ -4218,7 +4218,7 @@
           <w:szCs w:val="24"/>
         </w:rPr>
       </w:pPr>
-      <w:hyperlink w:anchor="_Toc227610439" w:history="1">
+      <w:hyperlink w:anchor="_Toc227689656" w:history="1">
         <w:r>
           <w:rPr>
             <w:rStyle w:val="Hyperlink"/>
@@ -4246,7 +4246,7 @@
             <w:noProof/>
             <w:webHidden/>
           </w:rPr>
-          <w:instrText xml:space="preserve"> PAGEREF _Toc227610439 \h </w:instrText>
+          <w:instrText xml:space="preserve"> PAGEREF _Toc227689656 \h </w:instrText>
         </w:r>
         <w:r>
           <w:rPr>
@@ -4286,7 +4286,7 @@
           <w:szCs w:val="24"/>
         </w:rPr>
       </w:pPr>
-      <w:hyperlink w:anchor="_Toc227610440" w:history="1">
+      <w:hyperlink w:anchor="_Toc227689657" w:history="1">
         <w:r>
           <w:rPr>
             <w:rStyle w:val="Hyperlink"/>
@@ -4314,7 +4314,7 @@
             <w:noProof/>
             <w:webHidden/>
           </w:rPr>
-          <w:instrText xml:space="preserve"> PAGEREF _Toc227610440 \h </w:instrText>
+          <w:instrText xml:space="preserve"> PAGEREF _Toc227689657 \h </w:instrText>
         </w:r>
         <w:r>
           <w:rPr>
@@ -4354,7 +4354,7 @@
           <w:szCs w:val="24"/>
         </w:rPr>
       </w:pPr>
-      <w:hyperlink w:anchor="_Toc227610441" w:history="1">
+      <w:hyperlink w:anchor="_Toc227689658" w:history="1">
         <w:r>
           <w:rPr>
             <w:rStyle w:val="Hyperlink"/>
@@ -4382,7 +4382,7 @@
             <w:noProof/>
             <w:webHidden/>
           </w:rPr>
-          <w:instrText xml:space="preserve"> PAGEREF _Toc227610441 \h </w:instrText>
+          <w:instrText xml:space="preserve"> PAGEREF _Toc227689658 \h </w:instrText>
         </w:r>
         <w:r>
           <w:rPr>
@@ -4422,7 +4422,7 @@
           <w:szCs w:val="24"/>
         </w:rPr>
       </w:pPr>
-      <w:hyperlink w:anchor="_Toc227610442" w:history="1">
+      <w:hyperlink w:anchor="_Toc227689659" w:history="1">
         <w:r>
           <w:rPr>
             <w:rStyle w:val="Hyperlink"/>
@@ -4450,7 +4450,7 @@
             <w:noProof/>
             <w:webHidden/>
           </w:rPr>
-          <w:instrText xml:space="preserve"> PAGEREF _Toc227610442 \h </w:instrText>
+          <w:instrText xml:space="preserve"> PAGEREF _Toc227689659 \h </w:instrText>
         </w:r>
         <w:r>
           <w:rPr>
@@ -4490,7 +4490,7 @@
           <w:szCs w:val="24"/>
         </w:rPr>
       </w:pPr>
-      <w:hyperlink w:anchor="_Toc227610443" w:history="1">
+      <w:hyperlink w:anchor="_Toc227689660" w:history="1">
         <w:r>
           <w:rPr>
             <w:rStyle w:val="Hyperlink"/>
@@ -4518,7 +4518,7 @@
             <w:noProof/>
             <w:webHidden/>
           </w:rPr>
-          <w:instrText xml:space="preserve"> PAGEREF _Toc227610443 \h </w:instrText>
+          <w:instrText xml:space="preserve"> PAGEREF _Toc227689660 \h </w:instrText>
         </w:r>
         <w:r>
           <w:rPr>
@@ -4559,7 +4559,7 @@
           <w:szCs w:val="24"/>
         </w:rPr>
       </w:pPr>
-      <w:hyperlink w:anchor="_Toc227610444" w:history="1">
+      <w:hyperlink w:anchor="_Toc227689661" w:history="1">
         <w:r>
           <w:rPr>
             <w:rStyle w:val="Hyperlink"/>
@@ -4587,7 +4587,7 @@
             <w:noProof/>
             <w:webHidden/>
           </w:rPr>
-          <w:instrText xml:space="preserve"> PAGEREF _Toc227610444 \h </w:instrText>
+          <w:instrText xml:space="preserve"> PAGEREF _Toc227689661 \h </w:instrText>
         </w:r>
         <w:r>
           <w:rPr>
@@ -4631,7 +4631,7 @@
           <w:szCs w:val="24"/>
         </w:rPr>
       </w:pPr>
-      <w:hyperlink w:anchor="_Toc227610445" w:history="1">
+      <w:hyperlink w:anchor="_Toc227689662" w:history="1">
         <w:r>
           <w:rPr>
             <w:rStyle w:val="Hyperlink"/>
@@ -4678,7 +4678,7 @@
             <w:noProof/>
             <w:webHidden/>
           </w:rPr>
-          <w:instrText xml:space="preserve"> PAGEREF _Toc227610445 \h </w:instrText>
+          <w:instrText xml:space="preserve"> PAGEREF _Toc227689662 \h </w:instrText>
         </w:r>
         <w:r>
           <w:rPr>
@@ -4719,7 +4719,7 @@
           <w:szCs w:val="24"/>
         </w:rPr>
       </w:pPr>
-      <w:hyperlink w:anchor="_Toc227610446" w:history="1">
+      <w:hyperlink w:anchor="_Toc227689663" w:history="1">
         <w:r>
           <w:rPr>
             <w:rStyle w:val="Hyperlink"/>
@@ -4747,7 +4747,7 @@
             <w:noProof/>
             <w:webHidden/>
           </w:rPr>
-          <w:instrText xml:space="preserve"> PAGEREF _Toc227610446 \h </w:instrText>
+          <w:instrText xml:space="preserve"> PAGEREF _Toc227689663 \h </w:instrText>
         </w:r>
         <w:r>
           <w:rPr>
@@ -4788,7 +4788,7 @@
           <w:szCs w:val="24"/>
         </w:rPr>
       </w:pPr>
-      <w:hyperlink w:anchor="_Toc227610447" w:history="1">
+      <w:hyperlink w:anchor="_Toc227689664" w:history="1">
         <w:r>
           <w:rPr>
             <w:rStyle w:val="Hyperlink"/>
@@ -4816,7 +4816,7 @@
             <w:noProof/>
             <w:webHidden/>
           </w:rPr>
-          <w:instrText xml:space="preserve"> PAGEREF _Toc227610447 \h </w:instrText>
+          <w:instrText xml:space="preserve"> PAGEREF _Toc227689664 \h </w:instrText>
         </w:r>
         <w:r>
           <w:rPr>
@@ -4857,7 +4857,7 @@
           <w:szCs w:val="24"/>
         </w:rPr>
       </w:pPr>
-      <w:hyperlink w:anchor="_Toc227610448" w:history="1">
+      <w:hyperlink w:anchor="_Toc227689665" w:history="1">
         <w:r>
           <w:rPr>
             <w:rStyle w:val="Hyperlink"/>
@@ -4915,7 +4915,7 @@
             <w:noProof/>
             <w:webHidden/>
           </w:rPr>
-          <w:instrText xml:space="preserve"> PAGEREF _Toc227610448 \h </w:instrText>
+          <w:instrText xml:space="preserve"> PAGEREF _Toc227689665 \h </w:instrText>
         </w:r>
         <w:r>
           <w:rPr>
@@ -4959,7 +4959,7 @@
           <w:szCs w:val="24"/>
         </w:rPr>
       </w:pPr>
-      <w:hyperlink w:anchor="_Toc227610449" w:history="1">
+      <w:hyperlink w:anchor="_Toc227689666" w:history="1">
         <w:r>
           <w:rPr>
             <w:rStyle w:val="Hyperlink"/>
@@ -5006,7 +5006,7 @@
             <w:noProof/>
             <w:webHidden/>
           </w:rPr>
-          <w:instrText xml:space="preserve"> PAGEREF _Toc227610449 \h </w:instrText>
+          <w:instrText xml:space="preserve"> PAGEREF _Toc227689666 \h </w:instrText>
         </w:r>
         <w:r>
           <w:rPr>
@@ -5050,7 +5050,7 @@
           <w:szCs w:val="24"/>
         </w:rPr>
       </w:pPr>
-      <w:hyperlink w:anchor="_Toc227610450" w:history="1">
+      <w:hyperlink w:anchor="_Toc227689667" w:history="1">
         <w:r>
           <w:rPr>
             <w:rStyle w:val="Hyperlink"/>
@@ -5097,7 +5097,7 @@
             <w:noProof/>
             <w:webHidden/>
           </w:rPr>
-          <w:instrText xml:space="preserve"> PAGEREF _Toc227610450 \h </w:instrText>
+          <w:instrText xml:space="preserve"> PAGEREF _Toc227689667 \h </w:instrText>
         </w:r>
         <w:r>
           <w:rPr>
@@ -5138,7 +5138,7 @@
           <w:szCs w:val="24"/>
         </w:rPr>
       </w:pPr>
-      <w:hyperlink w:anchor="_Toc227610451" w:history="1">
+      <w:hyperlink w:anchor="_Toc227689668" w:history="1">
         <w:r>
           <w:rPr>
             <w:rStyle w:val="Hyperlink"/>
@@ -5166,7 +5166,7 @@
             <w:noProof/>
             <w:webHidden/>
           </w:rPr>
-          <w:instrText xml:space="preserve"> PAGEREF _Toc227610451 \h </w:instrText>
+          <w:instrText xml:space="preserve"> PAGEREF _Toc227689668 \h </w:instrText>
         </w:r>
         <w:r>
           <w:rPr>
@@ -5207,7 +5207,7 @@
           <w:szCs w:val="24"/>
         </w:rPr>
       </w:pPr>
-      <w:hyperlink w:anchor="_Toc227610452" w:history="1">
+      <w:hyperlink w:anchor="_Toc227689669" w:history="1">
         <w:r>
           <w:rPr>
             <w:rStyle w:val="Hyperlink"/>
@@ -5235,7 +5235,7 @@
             <w:noProof/>
             <w:webHidden/>
           </w:rPr>
-          <w:instrText xml:space="preserve"> PAGEREF _Toc227610452 \h </w:instrText>
+          <w:instrText xml:space="preserve"> PAGEREF _Toc227689669 \h </w:instrText>
         </w:r>
         <w:r>
           <w:rPr>
@@ -5275,7 +5275,7 @@
           <w:szCs w:val="24"/>
         </w:rPr>
       </w:pPr>
-      <w:hyperlink w:anchor="_Toc227610453" w:history="1">
+      <w:hyperlink w:anchor="_Toc227689670" w:history="1">
         <w:r>
           <w:rPr>
             <w:rStyle w:val="Hyperlink"/>
@@ -5303,7 +5303,7 @@
             <w:noProof/>
             <w:webHidden/>
           </w:rPr>
-          <w:instrText xml:space="preserve"> PAGEREF _Toc227610453 \h </w:instrText>
+          <w:instrText xml:space="preserve"> PAGEREF _Toc227689670 \h </w:instrText>
         </w:r>
         <w:r>
           <w:rPr>
@@ -5343,7 +5343,7 @@
           <w:szCs w:val="24"/>
         </w:rPr>
       </w:pPr>
-      <w:hyperlink w:anchor="_Toc227610454" w:history="1">
+      <w:hyperlink w:anchor="_Toc227689671" w:history="1">
         <w:r>
           <w:rPr>
             <w:rStyle w:val="Hyperlink"/>
@@ -5371,7 +5371,7 @@
             <w:noProof/>
             <w:webHidden/>
           </w:rPr>
-          <w:instrText xml:space="preserve"> PAGEREF _Toc227610454 \h </w:instrText>
+          <w:instrText xml:space="preserve"> PAGEREF _Toc227689671 \h </w:instrText>
         </w:r>
         <w:r>
           <w:rPr>
@@ -5411,14 +5411,14 @@
           <w:szCs w:val="24"/>
         </w:rPr>
       </w:pPr>
-      <w:hyperlink w:anchor="_Toc227610455" w:history="1">
+      <w:hyperlink w:anchor="_Toc227689672" w:history="1">
         <w:r>
           <w:rPr>
             <w:rStyle w:val="Hyperlink"/>
             <w:noProof/>
             <w:lang w:val="sk-SK"/>
           </w:rPr>
-          <w:t>7.2.3 Batch normalizácia</w:t>
+          <w:t>7.2.3 Normalizácia dávok (batch normalization)</w:t>
         </w:r>
         <w:r>
           <w:rPr>
@@ -5439,7 +5439,7 @@
             <w:noProof/>
             <w:webHidden/>
           </w:rPr>
-          <w:instrText xml:space="preserve"> PAGEREF _Toc227610455 \h </w:instrText>
+          <w:instrText xml:space="preserve"> PAGEREF _Toc227689672 \h </w:instrText>
         </w:r>
         <w:r>
           <w:rPr>
@@ -5479,7 +5479,7 @@
           <w:szCs w:val="24"/>
         </w:rPr>
       </w:pPr>
-      <w:hyperlink w:anchor="_Toc227610456" w:history="1">
+      <w:hyperlink w:anchor="_Toc227689673" w:history="1">
         <w:r>
           <w:rPr>
             <w:rStyle w:val="Hyperlink"/>
@@ -5507,7 +5507,7 @@
             <w:noProof/>
             <w:webHidden/>
           </w:rPr>
-          <w:instrText xml:space="preserve"> PAGEREF _Toc227610456 \h </w:instrText>
+          <w:instrText xml:space="preserve"> PAGEREF _Toc227689673 \h </w:instrText>
         </w:r>
         <w:r>
           <w:rPr>
@@ -5547,7 +5547,7 @@
           <w:szCs w:val="24"/>
         </w:rPr>
       </w:pPr>
-      <w:hyperlink w:anchor="_Toc227610457" w:history="1">
+      <w:hyperlink w:anchor="_Toc227689674" w:history="1">
         <w:r>
           <w:rPr>
             <w:rStyle w:val="Hyperlink"/>
@@ -5575,7 +5575,7 @@
             <w:noProof/>
             <w:webHidden/>
           </w:rPr>
-          <w:instrText xml:space="preserve"> PAGEREF _Toc227610457 \h </w:instrText>
+          <w:instrText xml:space="preserve"> PAGEREF _Toc227689674 \h </w:instrText>
         </w:r>
         <w:r>
           <w:rPr>
@@ -5615,7 +5615,7 @@
           <w:szCs w:val="24"/>
         </w:rPr>
       </w:pPr>
-      <w:hyperlink w:anchor="_Toc227610458" w:history="1">
+      <w:hyperlink w:anchor="_Toc227689675" w:history="1">
         <w:r>
           <w:rPr>
             <w:rStyle w:val="Hyperlink"/>
@@ -5643,7 +5643,7 @@
             <w:noProof/>
             <w:webHidden/>
           </w:rPr>
-          <w:instrText xml:space="preserve"> PAGEREF _Toc227610458 \h </w:instrText>
+          <w:instrText xml:space="preserve"> PAGEREF _Toc227689675 \h </w:instrText>
         </w:r>
         <w:r>
           <w:rPr>
@@ -5683,14 +5683,14 @@
           <w:szCs w:val="24"/>
         </w:rPr>
       </w:pPr>
-      <w:hyperlink w:anchor="_Toc227610459" w:history="1">
+      <w:hyperlink w:anchor="_Toc227689676" w:history="1">
         <w:r>
           <w:rPr>
             <w:rStyle w:val="Hyperlink"/>
             <w:noProof/>
             <w:lang w:val="sk-SK"/>
           </w:rPr>
-          <w:t>7.2.7 Learning rate</w:t>
+          <w:t>7.2.7 Rýchlosť učenia</w:t>
         </w:r>
         <w:r>
           <w:rPr>
@@ -5711,7 +5711,7 @@
             <w:noProof/>
             <w:webHidden/>
           </w:rPr>
-          <w:instrText xml:space="preserve"> PAGEREF _Toc227610459 \h </w:instrText>
+          <w:instrText xml:space="preserve"> PAGEREF _Toc227689676 \h </w:instrText>
         </w:r>
         <w:r>
           <w:rPr>
@@ -5755,7 +5755,7 @@
           <w:szCs w:val="24"/>
         </w:rPr>
       </w:pPr>
-      <w:hyperlink w:anchor="_Toc227610460" w:history="1">
+      <w:hyperlink w:anchor="_Toc227689677" w:history="1">
         <w:r>
           <w:rPr>
             <w:rStyle w:val="Hyperlink"/>
@@ -5802,7 +5802,7 @@
             <w:noProof/>
             <w:webHidden/>
           </w:rPr>
-          <w:instrText xml:space="preserve"> PAGEREF _Toc227610460 \h </w:instrText>
+          <w:instrText xml:space="preserve"> PAGEREF _Toc227689677 \h </w:instrText>
         </w:r>
         <w:r>
           <w:rPr>
@@ -5843,7 +5843,7 @@
           <w:szCs w:val="24"/>
         </w:rPr>
       </w:pPr>
-      <w:hyperlink w:anchor="_Toc227610461" w:history="1">
+      <w:hyperlink w:anchor="_Toc227689678" w:history="1">
         <w:r>
           <w:rPr>
             <w:rStyle w:val="Hyperlink"/>
@@ -5871,7 +5871,7 @@
             <w:noProof/>
             <w:webHidden/>
           </w:rPr>
-          <w:instrText xml:space="preserve"> PAGEREF _Toc227610461 \h </w:instrText>
+          <w:instrText xml:space="preserve"> PAGEREF _Toc227689678 \h </w:instrText>
         </w:r>
         <w:r>
           <w:rPr>
@@ -5912,7 +5912,7 @@
           <w:szCs w:val="24"/>
         </w:rPr>
       </w:pPr>
-      <w:hyperlink w:anchor="_Toc227610462" w:history="1">
+      <w:hyperlink w:anchor="_Toc227689679" w:history="1">
         <w:r>
           <w:rPr>
             <w:rStyle w:val="Hyperlink"/>
@@ -5940,7 +5940,7 @@
             <w:noProof/>
             <w:webHidden/>
           </w:rPr>
-          <w:instrText xml:space="preserve"> PAGEREF _Toc227610462 \h </w:instrText>
+          <w:instrText xml:space="preserve"> PAGEREF _Toc227689679 \h </w:instrText>
         </w:r>
         <w:r>
           <w:rPr>
@@ -5981,7 +5981,7 @@
           <w:szCs w:val="24"/>
         </w:rPr>
       </w:pPr>
-      <w:hyperlink w:anchor="_Toc227610463" w:history="1">
+      <w:hyperlink w:anchor="_Toc227689680" w:history="1">
         <w:r>
           <w:rPr>
             <w:rStyle w:val="Hyperlink"/>
@@ -6009,7 +6009,7 @@
             <w:noProof/>
             <w:webHidden/>
           </w:rPr>
-          <w:instrText xml:space="preserve"> PAGEREF _Toc227610463 \h </w:instrText>
+          <w:instrText xml:space="preserve"> PAGEREF _Toc227689680 \h </w:instrText>
         </w:r>
         <w:r>
           <w:rPr>
@@ -6050,7 +6050,7 @@
           <w:szCs w:val="24"/>
         </w:rPr>
       </w:pPr>
-      <w:hyperlink w:anchor="_Toc227610464" w:history="1">
+      <w:hyperlink w:anchor="_Toc227689681" w:history="1">
         <w:r>
           <w:rPr>
             <w:rStyle w:val="Hyperlink"/>
@@ -6078,7 +6078,7 @@
             <w:noProof/>
             <w:webHidden/>
           </w:rPr>
-          <w:instrText xml:space="preserve"> PAGEREF _Toc227610464 \h </w:instrText>
+          <w:instrText xml:space="preserve"> PAGEREF _Toc227689681 \h </w:instrText>
         </w:r>
         <w:r>
           <w:rPr>
@@ -6118,7 +6118,7 @@
           <w:szCs w:val="24"/>
         </w:rPr>
       </w:pPr>
-      <w:hyperlink w:anchor="_Toc227610465" w:history="1">
+      <w:hyperlink w:anchor="_Toc227689682" w:history="1">
         <w:r>
           <w:rPr>
             <w:rStyle w:val="Hyperlink"/>
@@ -6145,7 +6145,7 @@
             <w:noProof/>
             <w:webHidden/>
           </w:rPr>
-          <w:instrText xml:space="preserve"> PAGEREF _Toc227610465 \h </w:instrText>
+          <w:instrText xml:space="preserve"> PAGEREF _Toc227689682 \h </w:instrText>
         </w:r>
         <w:r>
           <w:rPr>
@@ -6189,7 +6189,7 @@
           <w:szCs w:val="24"/>
         </w:rPr>
       </w:pPr>
-      <w:hyperlink w:anchor="_Toc227610466" w:history="1">
+      <w:hyperlink w:anchor="_Toc227689683" w:history="1">
         <w:r>
           <w:rPr>
             <w:rStyle w:val="Hyperlink"/>
@@ -6216,7 +6216,7 @@
             <w:noProof/>
             <w:webHidden/>
           </w:rPr>
-          <w:instrText xml:space="preserve"> PAGEREF _Toc227610466 \h </w:instrText>
+          <w:instrText xml:space="preserve"> PAGEREF _Toc227689683 \h </w:instrText>
         </w:r>
         <w:r>
           <w:rPr>
@@ -6260,7 +6260,7 @@
           <w:szCs w:val="24"/>
         </w:rPr>
       </w:pPr>
-      <w:hyperlink w:anchor="_Toc227610467" w:history="1">
+      <w:hyperlink w:anchor="_Toc227689684" w:history="1">
         <w:r>
           <w:rPr>
             <w:rStyle w:val="Hyperlink"/>
@@ -6287,7 +6287,7 @@
             <w:noProof/>
             <w:webHidden/>
           </w:rPr>
-          <w:instrText xml:space="preserve"> PAGEREF _Toc227610467 \h </w:instrText>
+          <w:instrText xml:space="preserve"> PAGEREF _Toc227689684 \h </w:instrText>
         </w:r>
         <w:r>
           <w:rPr>
@@ -6331,7 +6331,7 @@
           <w:szCs w:val="24"/>
         </w:rPr>
       </w:pPr>
-      <w:hyperlink w:anchor="_Toc227610468" w:history="1">
+      <w:hyperlink w:anchor="_Toc227689685" w:history="1">
         <w:r>
           <w:rPr>
             <w:rStyle w:val="Hyperlink"/>
@@ -6358,7 +6358,7 @@
             <w:noProof/>
             <w:webHidden/>
           </w:rPr>
-          <w:instrText xml:space="preserve"> PAGEREF _Toc227610468 \h </w:instrText>
+          <w:instrText xml:space="preserve"> PAGEREF _Toc227689685 \h </w:instrText>
         </w:r>
         <w:r>
           <w:rPr>
@@ -6406,7 +6406,7 @@
         <w:lastRenderedPageBreak/>
         <w:fldChar w:fldCharType="end"/>
       </w:r>
-      <w:bookmarkStart w:id="4" w:name="_Toc227610394"/>
+      <w:bookmarkStart w:id="4" w:name="_Toc227689611"/>
       <w:r>
         <w:t>Zoznam obrázkov</w:t>
       </w:r>
@@ -7514,7 +7514,7 @@
         <w:lastRenderedPageBreak/>
         <w:fldChar w:fldCharType="end"/>
       </w:r>
-      <w:bookmarkStart w:id="5" w:name="_Toc227610395"/>
+      <w:bookmarkStart w:id="5" w:name="_Toc227689612"/>
       <w:r>
         <w:t>Zoznam tabuliek</w:t>
       </w:r>
@@ -7848,7 +7848,7 @@
         <w:lastRenderedPageBreak/>
         <w:fldChar w:fldCharType="end"/>
       </w:r>
-      <w:bookmarkStart w:id="6" w:name="_Toc227610396"/>
+      <w:bookmarkStart w:id="6" w:name="_Toc227689613"/>
       <w:r>
         <w:t>Zoznam značiek a skratiek</w:t>
       </w:r>
@@ -8430,7 +8430,7 @@
       </w:pPr>
       <w:bookmarkStart w:id="7" w:name="_Toc173791394"/>
       <w:bookmarkStart w:id="8" w:name="_Toc173791533"/>
-      <w:bookmarkStart w:id="9" w:name="_Toc227610397"/>
+      <w:bookmarkStart w:id="9" w:name="_Toc227689614"/>
       <w:r>
         <w:lastRenderedPageBreak/>
         <w:t>Úvod</w:t>
@@ -8650,7 +8650,7 @@
       <w:r>
         <w:fldChar w:fldCharType="end"/>
       </w:r>
-      <w:bookmarkStart w:id="11" w:name="_Toc227610398"/>
+      <w:bookmarkStart w:id="11" w:name="_Toc227689615"/>
       <w:r>
         <w:t>Slnečné žiarenie a jeho význam</w:t>
       </w:r>
@@ -8661,7 +8661,7 @@
         <w:pStyle w:val="Heading2"/>
         <w:spacing w:before="480" w:after="240"/>
       </w:pPr>
-      <w:bookmarkStart w:id="12" w:name="_Toc227610399"/>
+      <w:bookmarkStart w:id="12" w:name="_Toc227689616"/>
       <w:r>
         <w:t>Charakteristika slnečného žiarenia</w:t>
       </w:r>
@@ -8712,7 +8712,7 @@
         <w:pStyle w:val="Heading2"/>
         <w:spacing w:before="480" w:after="240"/>
       </w:pPr>
-      <w:bookmarkStart w:id="13" w:name="_Toc227610400"/>
+      <w:bookmarkStart w:id="13" w:name="_Toc227689617"/>
       <w:r>
         <w:rPr>
           <w:lang w:val="en-US"/>
@@ -8742,7 +8742,7 @@
         <w:pStyle w:val="Heading2"/>
         <w:spacing w:before="480" w:after="240"/>
       </w:pPr>
-      <w:bookmarkStart w:id="14" w:name="_Toc227610401"/>
+      <w:bookmarkStart w:id="14" w:name="_Toc227689618"/>
       <w:r>
         <w:t>Význam a využitie v energetike</w:t>
       </w:r>
@@ -9091,7 +9091,7 @@
         <w:pStyle w:val="Heading2"/>
         <w:spacing w:before="480" w:after="240"/>
       </w:pPr>
-      <w:bookmarkStart w:id="17" w:name="_Toc227610402"/>
+      <w:bookmarkStart w:id="17" w:name="_Toc227689619"/>
       <w:r>
         <w:t>Meranie slnečného žiarenia</w:t>
       </w:r>
@@ -9256,7 +9256,7 @@
       <w:r>
         <w:fldChar w:fldCharType="end"/>
       </w:r>
-      <w:bookmarkStart w:id="18" w:name="_Toc227610403"/>
+      <w:bookmarkStart w:id="18" w:name="_Toc227689620"/>
       <w:r>
         <w:t>Celooblohové zobrazovacie systémy</w:t>
       </w:r>
@@ -9454,7 +9454,7 @@
         <w:pStyle w:val="Heading2"/>
         <w:spacing w:before="480" w:after="240"/>
       </w:pPr>
-      <w:bookmarkStart w:id="19" w:name="_Toc227610404"/>
+      <w:bookmarkStart w:id="19" w:name="_Toc227689621"/>
       <w:r>
         <w:t>Fisheye kamery</w:t>
       </w:r>
@@ -9480,7 +9480,7 @@
         <w:pStyle w:val="Heading2"/>
         <w:spacing w:before="480" w:after="240"/>
       </w:pPr>
-      <w:bookmarkStart w:id="20" w:name="_Toc227610405"/>
+      <w:bookmarkStart w:id="20" w:name="_Toc227689622"/>
       <w:r>
         <w:t>Geometrické skreslenie a charakteristiky obrazu</w:t>
       </w:r>
@@ -9674,7 +9674,7 @@
       <w:r>
         <w:fldChar w:fldCharType="end"/>
       </w:r>
-      <w:bookmarkStart w:id="22" w:name="_Toc227610406"/>
+      <w:bookmarkStart w:id="22" w:name="_Toc227689623"/>
       <w:r>
         <w:t>Predspracovanie obrazových dát</w:t>
       </w:r>
@@ -9685,7 +9685,7 @@
         <w:pStyle w:val="Heading2"/>
         <w:spacing w:before="480" w:after="240"/>
       </w:pPr>
-      <w:bookmarkStart w:id="23" w:name="_Toc227610407"/>
+      <w:bookmarkStart w:id="23" w:name="_Toc227689624"/>
       <w:r>
         <w:t>Základný postup predspracovania</w:t>
       </w:r>
@@ -9772,7 +9772,7 @@
       <w:pPr>
         <w:pStyle w:val="Heading3"/>
       </w:pPr>
-      <w:bookmarkStart w:id="24" w:name="_Toc227610408"/>
+      <w:bookmarkStart w:id="24" w:name="_Toc227689625"/>
       <w:r>
         <w:t>Zmena veľkosti obrazu</w:t>
       </w:r>
@@ -9791,7 +9791,7 @@
       <w:pPr>
         <w:pStyle w:val="Heading3"/>
       </w:pPr>
-      <w:bookmarkStart w:id="25" w:name="_Toc227610409"/>
+      <w:bookmarkStart w:id="25" w:name="_Toc227689626"/>
       <w:r>
         <w:t>Transformácia farebného obrazu</w:t>
       </w:r>
@@ -9901,7 +9901,7 @@
       <w:pPr>
         <w:pStyle w:val="Heading3"/>
       </w:pPr>
-      <w:bookmarkStart w:id="26" w:name="_Toc227610410"/>
+      <w:bookmarkStart w:id="26" w:name="_Toc227689627"/>
       <w:r>
         <w:lastRenderedPageBreak/>
         <w:t>Farebné priestory – RGB</w:t>
@@ -9926,19 +9926,7 @@
         <w:rPr>
           <w:lang w:val="sk-SK"/>
         </w:rPr>
-        <w:t xml:space="preserve">. </w:t>
-      </w:r>
-      <w:r>
-        <w:rPr>
-          <w:lang w:val="sk-SK"/>
-        </w:rPr>
-        <w:t xml:space="preserve">Prienik všetkých farieb tvorí </w:t>
-      </w:r>
-      <w:r>
-        <w:rPr>
-          <w:lang w:val="sk-SK"/>
-        </w:rPr>
-        <w:t xml:space="preserve">bielu </w:t>
+        <w:t xml:space="preserve">. Prienik všetkých farieb tvorí bielu </w:t>
       </w:r>
       <w:r>
         <w:t>[</w:t>
@@ -10074,7 +10062,7 @@
       <w:pPr>
         <w:pStyle w:val="Heading3"/>
       </w:pPr>
-      <w:bookmarkStart w:id="28" w:name="_Toc227610411"/>
+      <w:bookmarkStart w:id="28" w:name="_Toc227689628"/>
       <w:r>
         <w:t>Farebné priestory – HSV</w:t>
       </w:r>
@@ -10231,7 +10219,7 @@
       <w:pPr>
         <w:pStyle w:val="Heading3"/>
       </w:pPr>
-      <w:bookmarkStart w:id="30" w:name="_Toc227610412"/>
+      <w:bookmarkStart w:id="30" w:name="_Toc227689629"/>
       <w:r>
         <w:t>Farebné priestory – YCrCb</w:t>
       </w:r>
@@ -10571,7 +10559,7 @@
       <w:pPr>
         <w:pStyle w:val="Heading3"/>
       </w:pPr>
-      <w:bookmarkStart w:id="32" w:name="_Toc227610413"/>
+      <w:bookmarkStart w:id="32" w:name="_Toc227689630"/>
       <w:r>
         <w:t>Farebné priestory – CMYK</w:t>
       </w:r>
@@ -10745,7 +10733,7 @@
       <w:pPr>
         <w:pStyle w:val="Heading3"/>
       </w:pPr>
-      <w:bookmarkStart w:id="34" w:name="_Toc227610414"/>
+      <w:bookmarkStart w:id="34" w:name="_Toc227689631"/>
       <w:r>
         <w:t>Normalizácia dát</w:t>
       </w:r>
@@ -10814,7 +10802,7 @@
       <w:pPr>
         <w:pStyle w:val="Heading3"/>
       </w:pPr>
-      <w:bookmarkStart w:id="35" w:name="_Toc227610415"/>
+      <w:bookmarkStart w:id="35" w:name="_Toc227689632"/>
       <w:r>
         <w:t>Výber kanálu</w:t>
       </w:r>
@@ -10843,7 +10831,7 @@
         <w:pStyle w:val="Heading2"/>
         <w:spacing w:before="480" w:after="240"/>
       </w:pPr>
-      <w:bookmarkStart w:id="36" w:name="_Toc227610416"/>
+      <w:bookmarkStart w:id="36" w:name="_Toc227689633"/>
       <w:r>
         <w:t>Dátové augmentácie</w:t>
       </w:r>
@@ -10941,7 +10929,7 @@
         <w:pStyle w:val="Heading2"/>
         <w:spacing w:before="480" w:after="240"/>
       </w:pPr>
-      <w:bookmarkStart w:id="37" w:name="_Toc227610417"/>
+      <w:bookmarkStart w:id="37" w:name="_Toc227689634"/>
       <w:r>
         <w:t>Geometrické augmentácie</w:t>
       </w:r>
@@ -10960,7 +10948,7 @@
       <w:pPr>
         <w:pStyle w:val="Heading3"/>
       </w:pPr>
-      <w:bookmarkStart w:id="38" w:name="_Toc227610418"/>
+      <w:bookmarkStart w:id="38" w:name="_Toc227689635"/>
       <w:r>
         <w:t>Rotácia</w:t>
       </w:r>
@@ -10982,7 +10970,7 @@
           <w:lang w:val="sk-SK"/>
         </w:rPr>
       </w:pPr>
-      <w:bookmarkStart w:id="39" w:name="_Toc227610419"/>
+      <w:bookmarkStart w:id="39" w:name="_Toc227689636"/>
       <w:r>
         <w:rPr>
           <w:lang w:val="sk-SK"/>
@@ -11013,7 +11001,7 @@
           <w:lang w:val="sk-SK"/>
         </w:rPr>
       </w:pPr>
-      <w:bookmarkStart w:id="40" w:name="_Toc227610420"/>
+      <w:bookmarkStart w:id="40" w:name="_Toc227689637"/>
       <w:r>
         <w:rPr>
           <w:lang w:val="sk-SK"/>
@@ -11056,7 +11044,7 @@
           <w:lang w:val="sk-SK"/>
         </w:rPr>
       </w:pPr>
-      <w:bookmarkStart w:id="41" w:name="_Toc227610421"/>
+      <w:bookmarkStart w:id="41" w:name="_Toc227689638"/>
       <w:r>
         <w:rPr>
           <w:lang w:val="sk-SK"/>
@@ -11079,7 +11067,7 @@
         <w:pStyle w:val="Heading2"/>
         <w:spacing w:before="480" w:after="240"/>
       </w:pPr>
-      <w:bookmarkStart w:id="42" w:name="_Toc227610422"/>
+      <w:bookmarkStart w:id="42" w:name="_Toc227689639"/>
       <w:r>
         <w:rPr>
           <w:lang w:val="sk-SK"/>
@@ -11107,7 +11095,7 @@
           <w:lang w:val="sk-SK"/>
         </w:rPr>
       </w:pPr>
-      <w:bookmarkStart w:id="43" w:name="_Toc227610423"/>
+      <w:bookmarkStart w:id="43" w:name="_Toc227689640"/>
       <w:r>
         <w:rPr>
           <w:lang w:val="sk-SK"/>
@@ -11132,7 +11120,7 @@
           <w:lang w:val="sk-SK"/>
         </w:rPr>
       </w:pPr>
-      <w:bookmarkStart w:id="44" w:name="_Toc227610424"/>
+      <w:bookmarkStart w:id="44" w:name="_Toc227689641"/>
       <w:r>
         <w:rPr>
           <w:lang w:val="sk-SK"/>
@@ -11163,7 +11151,7 @@
           <w:lang w:val="sk-SK"/>
         </w:rPr>
       </w:pPr>
-      <w:bookmarkStart w:id="45" w:name="_Toc227610425"/>
+      <w:bookmarkStart w:id="45" w:name="_Toc227689642"/>
       <w:r>
         <w:rPr>
           <w:lang w:val="sk-SK"/>
@@ -11357,7 +11345,7 @@
         <w:pStyle w:val="Heading2"/>
         <w:spacing w:before="480" w:after="240"/>
       </w:pPr>
-      <w:bookmarkStart w:id="47" w:name="_Toc227610426"/>
+      <w:bookmarkStart w:id="47" w:name="_Toc227689643"/>
       <w:r>
         <w:rPr>
           <w:lang w:val="sk-SK"/>
@@ -11384,7 +11372,7 @@
           <w:lang w:val="sk-SK"/>
         </w:rPr>
       </w:pPr>
-      <w:bookmarkStart w:id="48" w:name="_Toc227610427"/>
+      <w:bookmarkStart w:id="48" w:name="_Toc227689644"/>
       <w:r>
         <w:rPr>
           <w:lang w:val="sk-SK"/>
@@ -11409,7 +11397,7 @@
           <w:lang w:val="sk-SK"/>
         </w:rPr>
       </w:pPr>
-      <w:bookmarkStart w:id="49" w:name="_Toc227610428"/>
+      <w:bookmarkStart w:id="49" w:name="_Toc227689645"/>
       <w:r>
         <w:rPr>
           <w:lang w:val="sk-SK"/>
@@ -11443,7 +11431,7 @@
           <w:lang w:val="sk-SK"/>
         </w:rPr>
       </w:pPr>
-      <w:bookmarkStart w:id="50" w:name="_Toc227610429"/>
+      <w:bookmarkStart w:id="50" w:name="_Toc227689646"/>
       <w:r>
         <w:rPr>
           <w:lang w:val="sk-SK"/>
@@ -11585,7 +11573,7 @@
           <w:lang w:val="sk-SK"/>
         </w:rPr>
       </w:pPr>
-      <w:bookmarkStart w:id="52" w:name="_Toc227610430"/>
+      <w:bookmarkStart w:id="52" w:name="_Toc227689647"/>
       <w:r>
         <w:rPr>
           <w:lang w:val="sk-SK"/>
@@ -11734,7 +11722,7 @@
           <w:lang w:val="sk-SK"/>
         </w:rPr>
       </w:pPr>
-      <w:bookmarkStart w:id="54" w:name="_Toc227610431"/>
+      <w:bookmarkStart w:id="54" w:name="_Toc227689648"/>
       <w:r>
         <w:rPr>
           <w:lang w:val="sk-SK"/>
@@ -11903,7 +11891,7 @@
       <w:r>
         <w:fldChar w:fldCharType="end"/>
       </w:r>
-      <w:bookmarkStart w:id="56" w:name="_Toc227610432"/>
+      <w:bookmarkStart w:id="56" w:name="_Toc227689649"/>
       <w:r>
         <w:rPr>
           <w:lang w:val="sk-SK"/>
@@ -11923,7 +11911,7 @@
         <w:pStyle w:val="Heading2"/>
         <w:spacing w:before="480" w:after="240"/>
       </w:pPr>
-      <w:bookmarkStart w:id="57" w:name="_Toc227610433"/>
+      <w:bookmarkStart w:id="57" w:name="_Toc227689650"/>
       <w:r>
         <w:rPr>
           <w:lang w:val="sk-SK"/>
@@ -11969,7 +11957,7 @@
       <w:pPr>
         <w:pStyle w:val="Heading3"/>
       </w:pPr>
-      <w:bookmarkStart w:id="58" w:name="_Toc227610434"/>
+      <w:bookmarkStart w:id="58" w:name="_Toc227689651"/>
       <w:r>
         <w:rPr>
           <w:lang w:val="sk-SK"/>
@@ -12015,7 +12003,7 @@
       <w:pPr>
         <w:pStyle w:val="Heading3"/>
       </w:pPr>
-      <w:bookmarkStart w:id="59" w:name="_Toc227610435"/>
+      <w:bookmarkStart w:id="59" w:name="_Toc227689652"/>
       <w:r>
         <w:rPr>
           <w:lang w:val="sk-SK"/>
@@ -12083,7 +12071,7 @@
       <w:pPr>
         <w:pStyle w:val="Heading3"/>
       </w:pPr>
-      <w:bookmarkStart w:id="60" w:name="_Toc227610436"/>
+      <w:bookmarkStart w:id="60" w:name="_Toc227689653"/>
       <w:r>
         <w:rPr>
           <w:lang w:val="sk-SK"/>
@@ -12188,7 +12176,7 @@
           <w:lang w:val="sk-SK"/>
         </w:rPr>
       </w:pPr>
-      <w:bookmarkStart w:id="61" w:name="_Toc227610437"/>
+      <w:bookmarkStart w:id="61" w:name="_Toc227689654"/>
       <w:r>
         <w:rPr>
           <w:lang w:val="sk-SK"/>
@@ -12243,7 +12231,7 @@
       <w:pPr>
         <w:pStyle w:val="Heading3"/>
       </w:pPr>
-      <w:bookmarkStart w:id="62" w:name="_Toc227610438"/>
+      <w:bookmarkStart w:id="62" w:name="_Toc227689655"/>
       <w:r>
         <w:rPr>
           <w:lang w:val="sk-SK"/>
@@ -12480,7 +12468,7 @@
           <w:lang w:val="sk-SK"/>
         </w:rPr>
       </w:pPr>
-      <w:bookmarkStart w:id="63" w:name="_Toc227610439"/>
+      <w:bookmarkStart w:id="63" w:name="_Toc227689656"/>
       <w:r>
         <w:rPr>
           <w:lang w:val="sk-SK"/>
@@ -12561,7 +12549,7 @@
           <w:lang w:val="sk-SK"/>
         </w:rPr>
       </w:pPr>
-      <w:bookmarkStart w:id="64" w:name="_Toc227610440"/>
+      <w:bookmarkStart w:id="64" w:name="_Toc227689657"/>
       <w:r>
         <w:rPr>
           <w:lang w:val="sk-SK"/>
@@ -12625,7 +12613,7 @@
           <w:lang w:val="sk-SK"/>
         </w:rPr>
       </w:pPr>
-      <w:bookmarkStart w:id="65" w:name="_Toc227610441"/>
+      <w:bookmarkStart w:id="65" w:name="_Toc227689658"/>
       <w:r>
         <w:rPr>
           <w:lang w:val="sk-SK"/>
@@ -12680,7 +12668,7 @@
           <w:lang w:val="sk-SK"/>
         </w:rPr>
       </w:pPr>
-      <w:bookmarkStart w:id="66" w:name="_Toc227610442"/>
+      <w:bookmarkStart w:id="66" w:name="_Toc227689659"/>
       <w:r>
         <w:rPr>
           <w:lang w:val="sk-SK"/>
@@ -12727,7 +12715,7 @@
           <w:lang w:val="sk-SK"/>
         </w:rPr>
       </w:pPr>
-      <w:bookmarkStart w:id="67" w:name="_Toc227610443"/>
+      <w:bookmarkStart w:id="67" w:name="_Toc227689660"/>
       <w:r>
         <w:rPr>
           <w:lang w:val="sk-SK"/>
@@ -12888,7 +12876,7 @@
           <w:lang w:val="sk-SK"/>
         </w:rPr>
       </w:pPr>
-      <w:bookmarkStart w:id="69" w:name="_Toc227610444"/>
+      <w:bookmarkStart w:id="69" w:name="_Toc227689661"/>
       <w:r>
         <w:rPr>
           <w:lang w:val="sk-SK"/>
@@ -12981,7 +12969,7 @@
       <w:r>
         <w:fldChar w:fldCharType="end"/>
       </w:r>
-      <w:bookmarkStart w:id="70" w:name="_Toc227610445"/>
+      <w:bookmarkStart w:id="70" w:name="_Toc227689662"/>
       <w:r>
         <w:rPr>
           <w:lang w:val="sk-SK"/>
@@ -13028,7 +13016,7 @@
           <w:lang w:val="sk-SK"/>
         </w:rPr>
       </w:pPr>
-      <w:bookmarkStart w:id="71" w:name="_Toc227610446"/>
+      <w:bookmarkStart w:id="71" w:name="_Toc227689663"/>
       <w:r>
         <w:rPr>
           <w:lang w:val="sk-SK"/>
@@ -13360,7 +13348,7 @@
           <w:lang w:val="sk-SK"/>
         </w:rPr>
       </w:pPr>
-      <w:bookmarkStart w:id="72" w:name="_Toc227610447"/>
+      <w:bookmarkStart w:id="72" w:name="_Toc227689664"/>
       <w:r>
         <w:rPr>
           <w:lang w:val="sk-SK"/>
@@ -13714,7 +13702,7 @@
           <w:lang w:val="sk-SK"/>
         </w:rPr>
       </w:pPr>
-      <w:bookmarkStart w:id="73" w:name="_Toc227610448"/>
+      <w:bookmarkStart w:id="73" w:name="_Toc227689665"/>
       <w:r>
         <w:rPr>
           <w:lang w:val="sk-SK"/>
@@ -14239,7 +14227,7 @@
       <w:r>
         <w:fldChar w:fldCharType="end"/>
       </w:r>
-      <w:bookmarkStart w:id="74" w:name="_Toc227610449"/>
+      <w:bookmarkStart w:id="74" w:name="_Toc227689666"/>
       <w:r>
         <w:rPr>
           <w:lang w:val="sk-SK"/>
@@ -14423,7 +14411,7 @@
       <w:r>
         <w:fldChar w:fldCharType="end"/>
       </w:r>
-      <w:bookmarkStart w:id="76" w:name="_Toc227610450"/>
+      <w:bookmarkStart w:id="76" w:name="_Toc227689667"/>
       <w:r>
         <w:rPr>
           <w:lang w:val="sk-SK"/>
@@ -14449,7 +14437,7 @@
           <w:lang w:val="sk-SK"/>
         </w:rPr>
       </w:pPr>
-      <w:bookmarkStart w:id="77" w:name="_Toc227610451"/>
+      <w:bookmarkStart w:id="77" w:name="_Toc227689668"/>
       <w:r>
         <w:rPr>
           <w:lang w:val="sk-SK"/>
@@ -14527,7 +14515,7 @@
           <w:lang w:val="sk-SK"/>
         </w:rPr>
       </w:pPr>
-      <w:bookmarkStart w:id="78" w:name="_Toc227610452"/>
+      <w:bookmarkStart w:id="78" w:name="_Toc227689669"/>
       <w:r>
         <w:rPr>
           <w:lang w:val="sk-SK"/>
@@ -14593,7 +14581,25 @@
         <w:rPr>
           <w:lang w:val="sk-SK"/>
         </w:rPr>
-        <w:t>použitie batch normalizácie</w:t>
+        <w:t>použitie normalizácie</w:t>
+      </w:r>
+      <w:r>
+        <w:rPr>
+          <w:lang w:val="sk-SK"/>
+        </w:rPr>
+        <w:t xml:space="preserve"> dávok (batch normaliz</w:t>
+      </w:r>
+      <w:r>
+        <w:rPr>
+          <w:lang w:val="sk-SK"/>
+        </w:rPr>
+        <w:t>ation</w:t>
+      </w:r>
+      <w:r>
+        <w:rPr>
+          <w:lang w:val="sk-SK"/>
+        </w:rPr>
+        <w:t>)</w:t>
       </w:r>
     </w:p>
     <w:p>
@@ -14661,7 +14667,7 @@
         <w:rPr>
           <w:lang w:val="sk-SK"/>
         </w:rPr>
-        <w:t>learning rate</w:t>
+        <w:t>rýchlosť učenia</w:t>
       </w:r>
     </w:p>
     <w:p>
@@ -14671,7 +14677,7 @@
           <w:lang w:val="sk-SK"/>
         </w:rPr>
       </w:pPr>
-      <w:bookmarkStart w:id="79" w:name="_Toc227610453"/>
+      <w:bookmarkStart w:id="79" w:name="_Toc227689670"/>
       <w:r>
         <w:rPr>
           <w:lang w:val="sk-SK"/>
@@ -14697,7 +14703,7 @@
           <w:lang w:val="sk-SK"/>
         </w:rPr>
       </w:pPr>
-      <w:bookmarkStart w:id="80" w:name="_Toc227610454"/>
+      <w:bookmarkStart w:id="80" w:name="_Toc227689671"/>
       <w:r>
         <w:rPr>
           <w:lang w:val="sk-SK"/>
@@ -14728,12 +14734,24 @@
           <w:lang w:val="sk-SK"/>
         </w:rPr>
       </w:pPr>
-      <w:bookmarkStart w:id="81" w:name="_Toc227610455"/>
-      <w:r>
-        <w:rPr>
-          <w:lang w:val="sk-SK"/>
-        </w:rPr>
-        <w:t>Batch normalizácia</w:t>
+      <w:bookmarkStart w:id="81" w:name="_Toc227689672"/>
+      <w:r>
+        <w:rPr>
+          <w:lang w:val="sk-SK"/>
+        </w:rPr>
+        <w:t>N</w:t>
+      </w:r>
+      <w:r>
+        <w:rPr>
+          <w:lang w:val="sk-SK"/>
+        </w:rPr>
+        <w:t>ormalizácia</w:t>
+      </w:r>
+      <w:r>
+        <w:rPr>
+          <w:lang w:val="sk-SK"/>
+        </w:rPr>
+        <w:t xml:space="preserve"> dávok (batch normalization)</w:t>
       </w:r>
       <w:bookmarkEnd w:id="81"/>
     </w:p>
@@ -14743,7 +14761,22 @@
         <w:jc w:val="both"/>
       </w:pPr>
       <w:r>
-        <w:t>Batch normalizácia slúži na stabilizáciu a zrýchlenie procesu učenia. Normalizuje aktivácie jednotlivých vrstiev počas tréningu, čím znižuje citlivosť modelu na počiatočné nastavenia váh.</w:t>
+        <w:rPr>
+          <w:lang w:val="sk-SK"/>
+        </w:rPr>
+        <w:t>N</w:t>
+      </w:r>
+      <w:r>
+        <w:t>ormalizácia</w:t>
+      </w:r>
+      <w:r>
+        <w:rPr>
+          <w:lang w:val="sk-SK"/>
+        </w:rPr>
+        <w:t xml:space="preserve"> dávok</w:t>
+      </w:r>
+      <w:r>
+        <w:t xml:space="preserve"> slúži na stabilizáciu a zrýchlenie procesu učenia. Normalizuje aktivácie jednotlivých vrstiev počas tréningu, čím znižuje citlivosť modelu na počiatočné nastavenia váh.</w:t>
       </w:r>
     </w:p>
     <w:p>
@@ -14753,7 +14786,7 @@
           <w:lang w:val="sk-SK"/>
         </w:rPr>
       </w:pPr>
-      <w:bookmarkStart w:id="82" w:name="_Toc227610456"/>
+      <w:bookmarkStart w:id="82" w:name="_Toc227689673"/>
       <w:r>
         <w:rPr>
           <w:lang w:val="sk-SK"/>
@@ -14778,7 +14811,7 @@
           <w:lang w:val="sk-SK"/>
         </w:rPr>
       </w:pPr>
-      <w:bookmarkStart w:id="83" w:name="_Toc227610457"/>
+      <w:bookmarkStart w:id="83" w:name="_Toc227689674"/>
       <w:r>
         <w:rPr>
           <w:lang w:val="sk-SK"/>
@@ -14803,7 +14836,7 @@
           <w:lang w:val="sk-SK"/>
         </w:rPr>
       </w:pPr>
-      <w:bookmarkStart w:id="84" w:name="_Toc227610458"/>
+      <w:bookmarkStart w:id="84" w:name="_Toc227689675"/>
       <w:r>
         <w:rPr>
           <w:lang w:val="sk-SK"/>
@@ -14828,13 +14861,13 @@
           <w:lang w:val="sk-SK"/>
         </w:rPr>
       </w:pPr>
-      <w:bookmarkStart w:id="85" w:name="_Toc227610459"/>
+      <w:bookmarkStart w:id="85" w:name="_Toc227689676"/>
       <w:r>
         <w:rPr>
           <w:lang w:val="sk-SK"/>
         </w:rPr>
         <w:lastRenderedPageBreak/>
-        <w:t>Learning rate</w:t>
+        <w:t>Rýchlosť učenia</w:t>
       </w:r>
       <w:bookmarkEnd w:id="85"/>
     </w:p>
@@ -14844,7 +14877,13 @@
         <w:jc w:val="both"/>
       </w:pPr>
       <w:r>
-        <w:t>Learning rate určuje rýchlosť aktualizácie váh počas tréningu. Príliš vysoká hodnota môže spôsobiť nestabilné učenie, zatiaľ čo príliš nízka hodnota môže spomaliť konvergenciu modelu.</w:t>
+        <w:rPr>
+          <w:lang w:val="sk-SK"/>
+        </w:rPr>
+        <w:t>Rýchlosť učenia</w:t>
+      </w:r>
+      <w:r>
+        <w:t xml:space="preserve"> určuje rýchlosť aktualizácie váh počas tréningu. Príliš vysoká hodnota môže spôsobiť nestabilné učenie, zatiaľ čo príliš nízka hodnota môže spomaliť konvergenciu modelu.</w:t>
       </w:r>
     </w:p>
     <w:p>
@@ -14869,7 +14908,7 @@
       <w:r>
         <w:fldChar w:fldCharType="end"/>
       </w:r>
-      <w:bookmarkStart w:id="86" w:name="_Toc227610460"/>
+      <w:bookmarkStart w:id="86" w:name="_Toc227689677"/>
       <w:r>
         <w:rPr>
           <w:lang w:val="sk-SK"/>
@@ -14928,7 +14967,7 @@
           <w:lang w:val="sk-SK"/>
         </w:rPr>
       </w:pPr>
-      <w:bookmarkStart w:id="87" w:name="_Toc227610461"/>
+      <w:bookmarkStart w:id="87" w:name="_Toc227689678"/>
       <w:r>
         <w:rPr>
           <w:lang w:val="sk-SK"/>
@@ -15003,7 +15042,7 @@
           <w:lang w:val="sk-SK"/>
         </w:rPr>
       </w:pPr>
-      <w:bookmarkStart w:id="88" w:name="_Toc227610462"/>
+      <w:bookmarkStart w:id="88" w:name="_Toc227689679"/>
       <w:r>
         <w:rPr>
           <w:lang w:val="sk-SK"/>
@@ -15076,7 +15115,30 @@
         <w:jc w:val="both"/>
       </w:pPr>
       <w:r>
-        <w:t>Autori navrhli uniformnú warping transformáciu, ktorá zjednocuje optický tok v obraze a zlepšuje konzistenciu pohybu oblakov naprieč scénou. Na modelovanie časového vývoja sa používajú sekvencie viacerých snímok, čím sa stabilizuje odhad pohybu.</w:t>
+        <w:t xml:space="preserve">Autori navrhli uniformnú </w:t>
+      </w:r>
+      <w:r>
+        <w:rPr>
+          <w:lang w:val="sk-SK"/>
+        </w:rPr>
+        <w:t xml:space="preserve">warping (z angl. </w:t>
+      </w:r>
+      <w:r>
+        <w:rPr>
+          <w:i/>
+          <w:iCs/>
+          <w:lang w:val="sk-SK"/>
+        </w:rPr>
+        <w:t>warping</w:t>
+      </w:r>
+      <w:r>
+        <w:rPr>
+          <w:lang w:val="sk-SK"/>
+        </w:rPr>
+        <w:t xml:space="preserve"> – termín popisujúci geometrickú deformáciu obrazu)</w:t>
+      </w:r>
+      <w:r>
+        <w:t xml:space="preserve"> transformáciu, ktorá zjednocuje optický tok v obraze a zlepšuje konzistenciu pohybu oblakov naprieč scénou. Na modelovanie časového vývoja sa používajú sekvencie viacerých snímok, čím sa stabilizuje odhad pohybu.</w:t>
       </w:r>
     </w:p>
     <w:p>
@@ -15086,6 +15148,7 @@
         <w:jc w:val="both"/>
       </w:pPr>
       <w:r>
+        <w:lastRenderedPageBreak/>
         <w:t xml:space="preserve">Navrhnutá architektúra je založená na hlbokých neurónových sieťach, konkrétne U-Net a ConvLSTM variantoch (SkyNet). Modely sú trénované pomocou kombinácie </w:t>
       </w:r>
       <w:r>
@@ -15095,11 +15158,7 @@
         <w:t>stratových</w:t>
       </w:r>
       <w:r>
-        <w:t xml:space="preserve"> </w:t>
-      </w:r>
-      <w:r>
-        <w:lastRenderedPageBreak/>
-        <w:t>funkcií založených na intenzite, gradientoch a optickom toku. Výsledky ukazujú výrazný pokles presnosti pri absencii warping transformácie, čo potvrdzuje jej význam. Hodnotenie je realizované pomocou metriky PSNR.</w:t>
+        <w:t xml:space="preserve"> funkcií založených na intenzite, gradientoch a optickom toku. Výsledky ukazujú výrazný pokles presnosti pri absencii warping transformácie, čo potvrdzuje jej význam. Hodnotenie je realizované pomocou metriky PSNR.</w:t>
       </w:r>
     </w:p>
     <w:p>
@@ -15166,7 +15225,7 @@
           <w:lang w:val="sk-SK"/>
         </w:rPr>
       </w:pPr>
-      <w:bookmarkStart w:id="89" w:name="_Toc227610463"/>
+      <w:bookmarkStart w:id="89" w:name="_Toc227689680"/>
       <w:r>
         <w:rPr>
           <w:lang w:val="sk-SK"/>
@@ -15266,7 +15325,7 @@
           <w:lang w:val="sk-SK"/>
         </w:rPr>
       </w:pPr>
-      <w:bookmarkStart w:id="90" w:name="_Toc227610464"/>
+      <w:bookmarkStart w:id="90" w:name="_Toc227689681"/>
       <w:r>
         <w:rPr>
           <w:lang w:val="sk-SK"/>
@@ -15298,6 +15357,7 @@
         <w:rPr>
           <w:lang w:val="sk-SK"/>
         </w:rPr>
+        <w:lastRenderedPageBreak/>
         <w:t xml:space="preserve">Práca </w:t>
       </w:r>
       <w:r>
@@ -15348,7 +15408,6 @@
         <w:rPr>
           <w:lang w:val="sk-SK"/>
         </w:rPr>
-        <w:lastRenderedPageBreak/>
         <w:t xml:space="preserve">Práca </w:t>
       </w:r>
       <w:r>
@@ -15597,8 +15656,9 @@
       <w:pPr>
         <w:pStyle w:val="Heading3"/>
       </w:pPr>
-      <w:bookmarkStart w:id="91" w:name="_Toc227610465"/>
-      <w:r>
+      <w:bookmarkStart w:id="91" w:name="_Toc227689682"/>
+      <w:r>
+        <w:lastRenderedPageBreak/>
         <w:t>Záver</w:t>
       </w:r>
       <w:bookmarkEnd w:id="91"/>
@@ -16151,7 +16211,6 @@
               <w:pStyle w:val="Textvtabuke"/>
             </w:pPr>
             <w:r>
-              <w:lastRenderedPageBreak/>
               <w:t>LED 3</w:t>
             </w:r>
           </w:p>
@@ -16316,7 +16375,7 @@
         <w:pStyle w:val="Nadpis1bezslovania"/>
         <w:spacing w:before="1440" w:after="480"/>
       </w:pPr>
-      <w:bookmarkStart w:id="96" w:name="_Toc227610466"/>
+      <w:bookmarkStart w:id="96" w:name="_Toc227689683"/>
       <w:r>
         <w:lastRenderedPageBreak/>
         <w:t>Záver</w:t>
@@ -16394,7 +16453,7 @@
         <w:pStyle w:val="Nadpis1bezslovania"/>
         <w:spacing w:before="1440" w:after="480"/>
       </w:pPr>
-      <w:bookmarkStart w:id="97" w:name="_Toc227610467"/>
+      <w:bookmarkStart w:id="97" w:name="_Toc227689684"/>
       <w:r>
         <w:lastRenderedPageBreak/>
         <w:t>Literatúra</w:t>
@@ -18565,7 +18624,7 @@
         <w:pStyle w:val="Nadpis1bezslovania"/>
         <w:spacing w:after="480"/>
       </w:pPr>
-      <w:bookmarkStart w:id="98" w:name="_Toc227610468"/>
+      <w:bookmarkStart w:id="98" w:name="_Toc227689685"/>
       <w:r>
         <w:lastRenderedPageBreak/>
         <w:t>Prílohy</w:t>

</xml_diff>